<commit_message>
Update about me text and IT resume
</commit_message>
<xml_diff>
--- a/assets/pdf/noah_hamblen_portfolio_resume1.docx
+++ b/assets/pdf/noah_hamblen_portfolio_resume1.docx
@@ -1748,6 +1748,16 @@
           <w:szCs w:val="28"/>
         </w:rPr>
         <w:t>, Printer Troubleshooting</w:t>
+      </w:r>
+      <w:r>
+        <w:rPr>
+          <w:rFonts w:ascii="Garamond" w:hAnsi="Garamond"/>
+          <w:bCs/>
+          <w:color w:val="auto"/>
+          <w:sz w:val="28"/>
+          <w:szCs w:val="28"/>
+        </w:rPr>
+        <w:t>, PC Building</w:t>
       </w:r>
     </w:p>
     <w:p>

</xml_diff>

<commit_message>
Update resume, projects, and README
Updated to include new certificates on resume, academic group project "IMS", and IMS is included on the README
</commit_message>
<xml_diff>
--- a/assets/pdf/noah_hamblen_portfolio_resume1.docx
+++ b/assets/pdf/noah_hamblen_portfolio_resume1.docx
@@ -12,7 +12,8 @@
           <w:rFonts w:ascii="Garamond" w:hAnsi="Garamond"/>
           <w:b/>
           <w:color w:val="auto"/>
-          <w:szCs w:val="16"/>
+          <w:sz w:val="22"/>
+          <w:szCs w:val="14"/>
         </w:rPr>
       </w:pPr>
     </w:p>
@@ -26,17 +27,17 @@
           <w:rFonts w:ascii="Garamond" w:hAnsi="Garamond"/>
           <w:b/>
           <w:color w:val="auto"/>
-          <w:sz w:val="72"/>
-          <w:szCs w:val="44"/>
-        </w:rPr>
-      </w:pPr>
-      <w:r>
-        <w:rPr>
-          <w:rFonts w:ascii="Garamond" w:hAnsi="Garamond"/>
-          <w:b/>
-          <w:color w:val="auto"/>
-          <w:sz w:val="72"/>
-          <w:szCs w:val="44"/>
+          <w:sz w:val="60"/>
+          <w:szCs w:val="60"/>
+        </w:rPr>
+      </w:pPr>
+      <w:r>
+        <w:rPr>
+          <w:rFonts w:ascii="Garamond" w:hAnsi="Garamond"/>
+          <w:b/>
+          <w:color w:val="auto"/>
+          <w:sz w:val="60"/>
+          <w:szCs w:val="60"/>
         </w:rPr>
         <w:t>Noah Hamblen</w:t>
       </w:r>
@@ -47,7 +48,8 @@
         <w:rPr>
           <w:rFonts w:ascii="Garamond" w:hAnsi="Garamond"/>
           <w:color w:val="auto"/>
-          <w:szCs w:val="32"/>
+          <w:sz w:val="22"/>
+          <w:szCs w:val="28"/>
         </w:rPr>
       </w:pPr>
     </w:p>
@@ -59,6 +61,8 @@
         </w:pBdr>
         <w:rPr>
           <w:rFonts w:ascii="Garamond" w:hAnsi="Garamond"/>
+          <w:sz w:val="22"/>
+          <w:szCs w:val="22"/>
         </w:rPr>
       </w:pPr>
       <w:hyperlink r:id="rId8" w:history="1">
@@ -66,6 +70,8 @@
           <w:rPr>
             <w:rStyle w:val="Hyperlink"/>
             <w:rFonts w:ascii="Garamond" w:hAnsi="Garamond"/>
+            <w:sz w:val="22"/>
+            <w:szCs w:val="22"/>
           </w:rPr>
           <w:t>Nhamblen21@gmail.com</w:t>
         </w:r>
@@ -73,12 +79,17 @@
       <w:r>
         <w:rPr>
           <w:rFonts w:ascii="Garamond" w:hAnsi="Garamond"/>
+          <w:sz w:val="22"/>
+          <w:szCs w:val="22"/>
         </w:rPr>
         <w:t xml:space="preserve"> </w:t>
       </w:r>
       <w:r>
         <w:rPr>
           <w:rFonts w:ascii="Segoe UI Symbol" w:hAnsi="Segoe UI Symbol" w:cs="Segoe UI Symbol"/>
+          <w:color w:val="auto"/>
+          <w:sz w:val="22"/>
+          <w:szCs w:val="22"/>
         </w:rPr>
         <w:t>★</w:t>
       </w:r>
@@ -86,211 +97,158 @@
         <w:rPr>
           <w:rFonts w:ascii="Garamond" w:hAnsi="Garamond"/>
           <w:color w:val="auto"/>
+          <w:sz w:val="22"/>
+          <w:szCs w:val="22"/>
+        </w:rPr>
+        <w:t xml:space="preserve"> Omaha, NE </w:t>
+      </w:r>
+      <w:r>
+        <w:rPr>
+          <w:rFonts w:ascii="Segoe UI Symbol" w:hAnsi="Segoe UI Symbol" w:cs="Segoe UI Symbol"/>
+          <w:color w:val="auto"/>
+          <w:sz w:val="22"/>
+          <w:szCs w:val="22"/>
+        </w:rPr>
+        <w:t>★</w:t>
+      </w:r>
+      <w:r>
+        <w:rPr>
+          <w:rFonts w:ascii="Garamond" w:hAnsi="Garamond"/>
+          <w:sz w:val="22"/>
+          <w:szCs w:val="22"/>
         </w:rPr>
         <w:t xml:space="preserve"> </w:t>
+      </w:r>
+      <w:r>
+        <w:rPr>
+          <w:rFonts w:ascii="Garamond" w:hAnsi="Garamond"/>
+          <w:color w:val="auto"/>
+          <w:sz w:val="22"/>
+          <w:szCs w:val="22"/>
+        </w:rPr>
+        <w:t xml:space="preserve">Portfolio: </w:t>
       </w:r>
       <w:hyperlink r:id="rId9" w:history="1">
         <w:r>
           <w:rPr>
             <w:rStyle w:val="Hyperlink"/>
             <w:rFonts w:ascii="Garamond" w:hAnsi="Garamond"/>
+            <w:sz w:val="22"/>
+            <w:szCs w:val="22"/>
           </w:rPr>
-          <w:t>(</w:t>
-        </w:r>
-        <w:r>
-          <w:rPr>
-            <w:rStyle w:val="Hyperlink"/>
-            <w:rFonts w:ascii="Garamond" w:hAnsi="Garamond"/>
-          </w:rPr>
-          <w:t>402</w:t>
-        </w:r>
-        <w:r>
-          <w:rPr>
-            <w:rStyle w:val="Hyperlink"/>
-            <w:rFonts w:ascii="Garamond" w:hAnsi="Garamond"/>
-          </w:rPr>
-          <w:t>)</w:t>
-        </w:r>
-        <w:r>
-          <w:rPr>
-            <w:rStyle w:val="Hyperlink"/>
-            <w:rFonts w:ascii="Garamond" w:hAnsi="Garamond"/>
-          </w:rPr>
-          <w:t xml:space="preserve"> </w:t>
-        </w:r>
-        <w:r>
-          <w:rPr>
-            <w:rStyle w:val="Hyperlink"/>
-            <w:rFonts w:ascii="Garamond" w:hAnsi="Garamond"/>
-          </w:rPr>
-          <w:t>889-1210</w:t>
+          <w:t>noahhamblen.com</w:t>
         </w:r>
       </w:hyperlink>
       <w:r>
         <w:rPr>
           <w:rFonts w:ascii="Garamond" w:hAnsi="Garamond"/>
-          <w:color w:val="auto"/>
+          <w:sz w:val="22"/>
+          <w:szCs w:val="22"/>
         </w:rPr>
         <w:t xml:space="preserve"> </w:t>
       </w:r>
       <w:r>
         <w:rPr>
           <w:rFonts w:ascii="Segoe UI Symbol" w:hAnsi="Segoe UI Symbol" w:cs="Segoe UI Symbol"/>
-          <w:color w:val="auto"/>
+          <w:sz w:val="22"/>
+          <w:szCs w:val="22"/>
         </w:rPr>
         <w:t>★</w:t>
       </w:r>
       <w:r>
         <w:rPr>
           <w:rFonts w:ascii="Garamond" w:hAnsi="Garamond"/>
-          <w:color w:val="auto"/>
+          <w:b/>
+          <w:color w:val="auto"/>
+          <w:sz w:val="22"/>
+          <w:szCs w:val="22"/>
         </w:rPr>
         <w:t xml:space="preserve"> </w:t>
       </w:r>
       <w:r>
         <w:rPr>
           <w:rFonts w:ascii="Garamond" w:hAnsi="Garamond"/>
-          <w:color w:val="auto"/>
-        </w:rPr>
-        <w:t>Omaha</w:t>
-      </w:r>
-      <w:r>
-        <w:rPr>
-          <w:rFonts w:ascii="Garamond" w:hAnsi="Garamond"/>
-          <w:color w:val="auto"/>
-        </w:rPr>
-        <w:t xml:space="preserve">, </w:t>
-      </w:r>
-      <w:r>
-        <w:rPr>
-          <w:rFonts w:ascii="Garamond" w:hAnsi="Garamond"/>
-          <w:color w:val="auto"/>
-        </w:rPr>
-        <w:t xml:space="preserve">NE </w:t>
-      </w:r>
-      <w:r>
-        <w:rPr>
-          <w:rFonts w:ascii="Segoe UI Symbol" w:hAnsi="Segoe UI Symbol" w:cs="Segoe UI Symbol"/>
-          <w:color w:val="auto"/>
-        </w:rPr>
-        <w:t>★</w:t>
-      </w:r>
-      <w:r>
-        <w:rPr>
-          <w:rFonts w:ascii="Garamond" w:hAnsi="Garamond"/>
-        </w:rPr>
-        <w:t xml:space="preserve"> </w:t>
-      </w:r>
-      <w:r>
-        <w:rPr>
-          <w:rFonts w:ascii="Garamond" w:hAnsi="Garamond"/>
-          <w:color w:val="auto"/>
-        </w:rPr>
-        <w:t xml:space="preserve">Portfolio: </w:t>
+          <w:sz w:val="22"/>
+          <w:szCs w:val="22"/>
+        </w:rPr>
+        <w:t xml:space="preserve">LinkedIn: </w:t>
       </w:r>
       <w:hyperlink r:id="rId10" w:history="1">
         <w:r>
           <w:rPr>
             <w:rStyle w:val="Hyperlink"/>
             <w:rFonts w:ascii="Garamond" w:hAnsi="Garamond"/>
+            <w:sz w:val="22"/>
+            <w:szCs w:val="22"/>
           </w:rPr>
-          <w:t>noahhamblen.com</w:t>
+          <w:t>linkedin.com/in/</w:t>
         </w:r>
+        <w:proofErr w:type="spellStart"/>
+        <w:r>
+          <w:rPr>
+            <w:rStyle w:val="Hyperlink"/>
+            <w:rFonts w:ascii="Garamond" w:hAnsi="Garamond"/>
+            <w:sz w:val="22"/>
+            <w:szCs w:val="22"/>
+          </w:rPr>
+          <w:t>noahhamblen</w:t>
+        </w:r>
+        <w:proofErr w:type="spellEnd"/>
       </w:hyperlink>
       <w:r>
         <w:rPr>
           <w:rFonts w:ascii="Garamond" w:hAnsi="Garamond"/>
+          <w:sz w:val="22"/>
+          <w:szCs w:val="22"/>
         </w:rPr>
         <w:t xml:space="preserve"> </w:t>
       </w:r>
       <w:r>
         <w:rPr>
           <w:rFonts w:ascii="Segoe UI Symbol" w:hAnsi="Segoe UI Symbol" w:cs="Segoe UI Symbol"/>
+          <w:sz w:val="22"/>
+          <w:szCs w:val="22"/>
         </w:rPr>
         <w:t>★</w:t>
       </w:r>
       <w:r>
         <w:rPr>
           <w:rFonts w:ascii="Garamond" w:hAnsi="Garamond"/>
-          <w:b/>
-          <w:color w:val="auto"/>
+          <w:color w:val="auto"/>
+          <w:sz w:val="22"/>
+          <w:szCs w:val="22"/>
         </w:rPr>
         <w:t xml:space="preserve"> </w:t>
       </w:r>
       <w:r>
         <w:rPr>
           <w:rFonts w:ascii="Garamond" w:hAnsi="Garamond"/>
-        </w:rPr>
-        <w:t>LinkedIn</w:t>
-      </w:r>
-      <w:r>
-        <w:rPr>
-          <w:rFonts w:ascii="Garamond" w:hAnsi="Garamond"/>
-        </w:rPr>
-        <w:t xml:space="preserve">: </w:t>
+          <w:sz w:val="22"/>
+          <w:szCs w:val="22"/>
+        </w:rPr>
+        <w:t xml:space="preserve">GitHub: </w:t>
       </w:r>
       <w:hyperlink r:id="rId11" w:history="1">
         <w:r>
           <w:rPr>
             <w:rStyle w:val="Hyperlink"/>
             <w:rFonts w:ascii="Garamond" w:hAnsi="Garamond"/>
+            <w:sz w:val="22"/>
+            <w:szCs w:val="22"/>
           </w:rPr>
-          <w:t>linkedin.com/in/noahhamblen</w:t>
+          <w:t>github.com/</w:t>
         </w:r>
-      </w:hyperlink>
-      <w:r>
-        <w:rPr>
-          <w:rFonts w:ascii="Garamond" w:hAnsi="Garamond"/>
-        </w:rPr>
-        <w:t xml:space="preserve"> </w:t>
-      </w:r>
-      <w:r>
-        <w:rPr>
-          <w:rFonts w:ascii="Segoe UI Symbol" w:hAnsi="Segoe UI Symbol" w:cs="Segoe UI Symbol"/>
-        </w:rPr>
-        <w:t>★</w:t>
-      </w:r>
-      <w:r>
-        <w:rPr>
-          <w:rFonts w:ascii="Garamond" w:hAnsi="Garamond"/>
-          <w:color w:val="auto"/>
-        </w:rPr>
-        <w:t xml:space="preserve"> </w:t>
-      </w:r>
-      <w:r>
-        <w:rPr>
-          <w:rFonts w:ascii="Garamond" w:hAnsi="Garamond"/>
-        </w:rPr>
-        <w:t>GitHub</w:t>
-      </w:r>
-      <w:r>
-        <w:rPr>
-          <w:rFonts w:ascii="Garamond" w:hAnsi="Garamond"/>
-        </w:rPr>
-        <w:t xml:space="preserve">: </w:t>
-      </w:r>
-      <w:hyperlink r:id="rId12" w:history="1">
+        <w:proofErr w:type="spellStart"/>
         <w:r>
           <w:rPr>
             <w:rStyle w:val="Hyperlink"/>
             <w:rFonts w:ascii="Garamond" w:hAnsi="Garamond"/>
+            <w:sz w:val="22"/>
+            <w:szCs w:val="22"/>
           </w:rPr>
-          <w:t>github.com/</w:t>
+          <w:t>nhamblen</w:t>
         </w:r>
-        <w:r>
-          <w:rPr>
-            <w:rStyle w:val="Hyperlink"/>
-            <w:rFonts w:ascii="Garamond" w:hAnsi="Garamond"/>
-          </w:rPr>
-          <w:t>n</w:t>
-        </w:r>
-        <w:r>
-          <w:rPr>
-            <w:rStyle w:val="Hyperlink"/>
-            <w:rFonts w:ascii="Garamond" w:hAnsi="Garamond"/>
-          </w:rPr>
-          <w:t>hamblen</w:t>
-        </w:r>
+        <w:proofErr w:type="spellEnd"/>
       </w:hyperlink>
     </w:p>
     <w:p>
@@ -301,6 +259,8 @@
         </w:pBdr>
         <w:rPr>
           <w:rFonts w:ascii="Garamond" w:hAnsi="Garamond"/>
+          <w:sz w:val="22"/>
+          <w:szCs w:val="22"/>
         </w:rPr>
       </w:pPr>
     </w:p>
@@ -312,6 +272,8 @@
         </w:pBdr>
         <w:rPr>
           <w:rFonts w:ascii="Garamond" w:hAnsi="Garamond"/>
+          <w:sz w:val="22"/>
+          <w:szCs w:val="22"/>
         </w:rPr>
       </w:pPr>
     </w:p>
@@ -326,18 +288,18 @@
           <w:b/>
           <w:bCs/>
           <w:color w:val="auto"/>
-          <w:sz w:val="32"/>
-          <w:szCs w:val="32"/>
-        </w:rPr>
-      </w:pPr>
-      <w:r>
-        <w:rPr>
-          <w:rFonts w:ascii="Garamond" w:hAnsi="Garamond"/>
-          <w:b/>
-          <w:bCs/>
-          <w:color w:val="auto"/>
-          <w:sz w:val="32"/>
-          <w:szCs w:val="32"/>
+          <w:sz w:val="28"/>
+          <w:szCs w:val="28"/>
+        </w:rPr>
+      </w:pPr>
+      <w:r>
+        <w:rPr>
+          <w:rFonts w:ascii="Garamond" w:hAnsi="Garamond"/>
+          <w:b/>
+          <w:bCs/>
+          <w:color w:val="auto"/>
+          <w:sz w:val="28"/>
+          <w:szCs w:val="28"/>
         </w:rPr>
         <w:t>CERTIFICATIONS</w:t>
       </w:r>
@@ -352,6 +314,8 @@
           <w:b/>
           <w:bCs/>
           <w:color w:val="auto"/>
+          <w:sz w:val="22"/>
+          <w:szCs w:val="22"/>
         </w:rPr>
       </w:pPr>
     </w:p>
@@ -362,60 +326,179 @@
         <w:jc w:val="both"/>
         <w:rPr>
           <w:rFonts w:ascii="Garamond" w:hAnsi="Garamond"/>
-          <w:color w:val="auto"/>
-        </w:rPr>
-      </w:pPr>
-      <w:r>
-        <w:rPr>
-          <w:rFonts w:ascii="Garamond" w:hAnsi="Garamond"/>
-          <w:b/>
-          <w:bCs/>
-          <w:color w:val="auto"/>
-        </w:rPr>
-        <w:t>CompTIA A+</w:t>
-      </w:r>
-      <w:r>
-        <w:rPr>
-          <w:rFonts w:ascii="Garamond" w:hAnsi="Garamond"/>
-          <w:b/>
-          <w:bCs/>
-          <w:color w:val="auto"/>
-        </w:rPr>
-        <w:t xml:space="preserve">                                                                                                             </w:t>
-      </w:r>
-      <w:r>
-        <w:rPr>
-          <w:rFonts w:ascii="Garamond" w:hAnsi="Garamond"/>
-          <w:b/>
-          <w:bCs/>
-          <w:color w:val="auto"/>
-        </w:rPr>
-        <w:t xml:space="preserve">                          </w:t>
-      </w:r>
-      <w:r>
-        <w:rPr>
-          <w:rFonts w:ascii="Garamond" w:hAnsi="Garamond"/>
-          <w:b/>
-          <w:bCs/>
-          <w:color w:val="auto"/>
-        </w:rPr>
-        <w:t>February 2025</w:t>
+          <w:b/>
+          <w:bCs/>
+          <w:color w:val="auto"/>
+          <w:sz w:val="22"/>
+          <w:szCs w:val="22"/>
+        </w:rPr>
+      </w:pPr>
+      <w:r>
+        <w:rPr>
+          <w:rFonts w:ascii="Garamond" w:hAnsi="Garamond"/>
+          <w:b/>
+          <w:bCs/>
+          <w:sz w:val="22"/>
+          <w:szCs w:val="22"/>
+        </w:rPr>
+        <w:t>CompTIA Network+</w:t>
+      </w:r>
+      <w:r>
+        <w:rPr>
+          <w:rFonts w:ascii="Garamond" w:hAnsi="Garamond"/>
+          <w:b/>
+          <w:bCs/>
+          <w:sz w:val="22"/>
+          <w:szCs w:val="22"/>
+        </w:rPr>
+        <w:tab/>
+      </w:r>
+      <w:r>
+        <w:rPr>
+          <w:rFonts w:ascii="Garamond" w:hAnsi="Garamond"/>
+          <w:b/>
+          <w:bCs/>
+          <w:sz w:val="22"/>
+          <w:szCs w:val="22"/>
+        </w:rPr>
+        <w:tab/>
+      </w:r>
+      <w:r>
+        <w:rPr>
+          <w:rFonts w:ascii="Garamond" w:hAnsi="Garamond"/>
+          <w:b/>
+          <w:bCs/>
+          <w:sz w:val="22"/>
+          <w:szCs w:val="22"/>
+        </w:rPr>
+        <w:tab/>
+      </w:r>
+      <w:r>
+        <w:rPr>
+          <w:rFonts w:ascii="Garamond" w:hAnsi="Garamond"/>
+          <w:b/>
+          <w:bCs/>
+          <w:sz w:val="22"/>
+          <w:szCs w:val="22"/>
+        </w:rPr>
+        <w:tab/>
+      </w:r>
+      <w:r>
+        <w:rPr>
+          <w:rFonts w:ascii="Garamond" w:hAnsi="Garamond"/>
+          <w:b/>
+          <w:bCs/>
+          <w:sz w:val="22"/>
+          <w:szCs w:val="22"/>
+        </w:rPr>
+        <w:tab/>
+      </w:r>
+      <w:r>
+        <w:rPr>
+          <w:rFonts w:ascii="Garamond" w:hAnsi="Garamond"/>
+          <w:b/>
+          <w:bCs/>
+          <w:sz w:val="22"/>
+          <w:szCs w:val="22"/>
+        </w:rPr>
+        <w:tab/>
+      </w:r>
+      <w:r>
+        <w:rPr>
+          <w:rFonts w:ascii="Garamond" w:hAnsi="Garamond"/>
+          <w:b/>
+          <w:bCs/>
+          <w:sz w:val="22"/>
+          <w:szCs w:val="22"/>
+        </w:rPr>
+        <w:tab/>
+      </w:r>
+      <w:r>
+        <w:rPr>
+          <w:rFonts w:ascii="Garamond" w:hAnsi="Garamond"/>
+          <w:b/>
+          <w:bCs/>
+          <w:sz w:val="22"/>
+          <w:szCs w:val="22"/>
+        </w:rPr>
+        <w:t xml:space="preserve">                      </w:t>
+      </w:r>
+      <w:r>
+        <w:rPr>
+          <w:rFonts w:ascii="Garamond" w:hAnsi="Garamond"/>
+          <w:b/>
+          <w:bCs/>
+          <w:sz w:val="22"/>
+          <w:szCs w:val="22"/>
+        </w:rPr>
+        <w:t>December 2025</w:t>
+      </w:r>
+      <w:r>
+        <w:rPr>
+          <w:rFonts w:ascii="Garamond" w:hAnsi="Garamond"/>
+          <w:b/>
+          <w:bCs/>
+          <w:sz w:val="22"/>
+          <w:szCs w:val="22"/>
+        </w:rPr>
+        <w:t xml:space="preserve"> – December 2028</w:t>
       </w:r>
     </w:p>
     <w:p>
       <w:pPr>
         <w:pStyle w:val="Default"/>
-        <w:rPr>
-          <w:rFonts w:ascii="Garamond" w:hAnsi="Garamond"/>
-          <w:color w:val="auto"/>
-          <w:sz w:val="20"/>
-        </w:rPr>
-      </w:pPr>
-      <w:r>
-        <w:rPr>
-          <w:rFonts w:ascii="Garamond" w:hAnsi="Garamond"/>
-        </w:rPr>
-        <w:t>(More in progress)</w:t>
+        <w:spacing w:after="3"/>
+        <w:jc w:val="both"/>
+        <w:rPr>
+          <w:rFonts w:ascii="Garamond" w:hAnsi="Garamond"/>
+          <w:color w:val="auto"/>
+          <w:sz w:val="22"/>
+          <w:szCs w:val="22"/>
+        </w:rPr>
+      </w:pPr>
+      <w:r>
+        <w:rPr>
+          <w:rFonts w:ascii="Garamond" w:hAnsi="Garamond"/>
+          <w:b/>
+          <w:bCs/>
+          <w:color w:val="auto"/>
+          <w:sz w:val="22"/>
+          <w:szCs w:val="22"/>
+        </w:rPr>
+        <w:t xml:space="preserve">CompTIA A+                                                                                                                        </w:t>
+      </w:r>
+      <w:r>
+        <w:rPr>
+          <w:rFonts w:ascii="Garamond" w:hAnsi="Garamond"/>
+          <w:b/>
+          <w:bCs/>
+          <w:color w:val="auto"/>
+          <w:sz w:val="22"/>
+          <w:szCs w:val="22"/>
+        </w:rPr>
+        <w:t xml:space="preserve"> </w:t>
+      </w:r>
+      <w:r>
+        <w:rPr>
+          <w:rFonts w:ascii="Garamond" w:hAnsi="Garamond"/>
+          <w:b/>
+          <w:bCs/>
+          <w:color w:val="auto"/>
+          <w:sz w:val="22"/>
+          <w:szCs w:val="22"/>
+        </w:rPr>
+        <w:t>February 2025</w:t>
+      </w:r>
+      <w:r>
+        <w:rPr>
+          <w:rFonts w:ascii="Garamond" w:hAnsi="Garamond"/>
+          <w:b/>
+          <w:bCs/>
+          <w:color w:val="auto"/>
+          <w:sz w:val="22"/>
+          <w:szCs w:val="22"/>
+        </w:rPr>
+        <w:t xml:space="preserve"> – December 2028</w:t>
       </w:r>
     </w:p>
     <w:p>
@@ -424,7 +507,8 @@
         <w:rPr>
           <w:rFonts w:ascii="Garamond" w:hAnsi="Garamond"/>
           <w:color w:val="auto"/>
-          <w:szCs w:val="32"/>
+          <w:sz w:val="22"/>
+          <w:szCs w:val="28"/>
         </w:rPr>
       </w:pPr>
     </w:p>
@@ -434,7 +518,8 @@
         <w:rPr>
           <w:rFonts w:ascii="Garamond" w:hAnsi="Garamond"/>
           <w:color w:val="auto"/>
-          <w:szCs w:val="32"/>
+          <w:sz w:val="22"/>
+          <w:szCs w:val="28"/>
         </w:rPr>
       </w:pPr>
     </w:p>
@@ -447,18 +532,18 @@
         <w:rPr>
           <w:rFonts w:ascii="Garamond" w:hAnsi="Garamond"/>
           <w:color w:val="auto"/>
-          <w:sz w:val="32"/>
-          <w:szCs w:val="32"/>
-        </w:rPr>
-      </w:pPr>
-      <w:r>
-        <w:rPr>
-          <w:rFonts w:ascii="Garamond" w:hAnsi="Garamond"/>
-          <w:b/>
-          <w:bCs/>
-          <w:color w:val="auto"/>
-          <w:sz w:val="32"/>
-          <w:szCs w:val="32"/>
+          <w:sz w:val="28"/>
+          <w:szCs w:val="28"/>
+        </w:rPr>
+      </w:pPr>
+      <w:r>
+        <w:rPr>
+          <w:rFonts w:ascii="Garamond" w:hAnsi="Garamond"/>
+          <w:b/>
+          <w:bCs/>
+          <w:color w:val="auto"/>
+          <w:sz w:val="28"/>
+          <w:szCs w:val="28"/>
         </w:rPr>
         <w:t>EDUCATION</w:t>
       </w:r>
@@ -474,18 +559,18 @@
           <w:b/>
           <w:bCs/>
           <w:color w:val="auto"/>
-          <w:sz w:val="4"/>
-          <w:szCs w:val="4"/>
-        </w:rPr>
-      </w:pPr>
-      <w:r>
-        <w:rPr>
-          <w:rFonts w:ascii="Garamond" w:hAnsi="Garamond"/>
-          <w:b/>
-          <w:bCs/>
-          <w:color w:val="auto"/>
-          <w:sz w:val="4"/>
-          <w:szCs w:val="4"/>
+          <w:sz w:val="2"/>
+          <w:szCs w:val="2"/>
+        </w:rPr>
+      </w:pPr>
+      <w:r>
+        <w:rPr>
+          <w:rFonts w:ascii="Garamond" w:hAnsi="Garamond"/>
+          <w:b/>
+          <w:bCs/>
+          <w:color w:val="auto"/>
+          <w:sz w:val="2"/>
+          <w:szCs w:val="2"/>
         </w:rPr>
         <w:tab/>
       </w:r>
@@ -498,6 +583,8 @@
           <w:b/>
           <w:bCs/>
           <w:color w:val="auto"/>
+          <w:sz w:val="22"/>
+          <w:szCs w:val="22"/>
         </w:rPr>
       </w:pPr>
     </w:p>
@@ -509,14 +596,18 @@
           <w:b/>
           <w:bCs/>
           <w:color w:val="auto"/>
-        </w:rPr>
-      </w:pPr>
-      <w:r>
-        <w:rPr>
-          <w:rFonts w:ascii="Garamond" w:hAnsi="Garamond"/>
-          <w:b/>
-          <w:bCs/>
-          <w:color w:val="auto"/>
+          <w:sz w:val="22"/>
+          <w:szCs w:val="22"/>
+        </w:rPr>
+      </w:pPr>
+      <w:r>
+        <w:rPr>
+          <w:rFonts w:ascii="Garamond" w:hAnsi="Garamond"/>
+          <w:b/>
+          <w:bCs/>
+          <w:color w:val="auto"/>
+          <w:sz w:val="22"/>
+          <w:szCs w:val="22"/>
         </w:rPr>
         <w:t xml:space="preserve">Bellevue University </w:t>
       </w:r>
@@ -526,6 +617,8 @@
           <w:b/>
           <w:bCs/>
           <w:color w:val="auto"/>
+          <w:sz w:val="22"/>
+          <w:szCs w:val="22"/>
         </w:rPr>
         <w:tab/>
       </w:r>
@@ -535,6 +628,8 @@
           <w:b/>
           <w:bCs/>
           <w:color w:val="auto"/>
+          <w:sz w:val="22"/>
+          <w:szCs w:val="22"/>
         </w:rPr>
         <w:tab/>
       </w:r>
@@ -544,6 +639,8 @@
           <w:b/>
           <w:bCs/>
           <w:color w:val="auto"/>
+          <w:sz w:val="22"/>
+          <w:szCs w:val="22"/>
         </w:rPr>
         <w:tab/>
       </w:r>
@@ -553,6 +650,20 @@
           <w:b/>
           <w:bCs/>
           <w:color w:val="auto"/>
+          <w:sz w:val="22"/>
+          <w:szCs w:val="22"/>
+        </w:rPr>
+        <w:tab/>
+        <w:t xml:space="preserve">          </w:t>
+      </w:r>
+      <w:r>
+        <w:rPr>
+          <w:rFonts w:ascii="Garamond" w:hAnsi="Garamond"/>
+          <w:b/>
+          <w:bCs/>
+          <w:color w:val="auto"/>
+          <w:sz w:val="22"/>
+          <w:szCs w:val="22"/>
         </w:rPr>
         <w:tab/>
         <w:t xml:space="preserve">        </w:t>
@@ -563,80 +674,42 @@
           <w:b/>
           <w:bCs/>
           <w:color w:val="auto"/>
-        </w:rPr>
-        <w:t xml:space="preserve"> </w:t>
-      </w:r>
-      <w:r>
-        <w:rPr>
-          <w:rFonts w:ascii="Garamond" w:hAnsi="Garamond"/>
-          <w:b/>
-          <w:bCs/>
-          <w:color w:val="auto"/>
-        </w:rPr>
-        <w:t xml:space="preserve"> </w:t>
-      </w:r>
-      <w:r>
-        <w:rPr>
-          <w:rFonts w:ascii="Garamond" w:hAnsi="Garamond"/>
-          <w:b/>
-          <w:bCs/>
-          <w:color w:val="auto"/>
+          <w:sz w:val="22"/>
+          <w:szCs w:val="22"/>
         </w:rPr>
         <w:tab/>
-        <w:t xml:space="preserve">        </w:t>
-      </w:r>
-      <w:r>
-        <w:rPr>
-          <w:rFonts w:ascii="Garamond" w:hAnsi="Garamond"/>
-          <w:b/>
-          <w:bCs/>
-          <w:color w:val="auto"/>
+      </w:r>
+      <w:r>
+        <w:rPr>
+          <w:rFonts w:ascii="Garamond" w:hAnsi="Garamond"/>
+          <w:b/>
+          <w:bCs/>
+          <w:color w:val="auto"/>
+          <w:sz w:val="22"/>
+          <w:szCs w:val="22"/>
         </w:rPr>
         <w:tab/>
-      </w:r>
-      <w:r>
-        <w:rPr>
-          <w:rFonts w:ascii="Garamond" w:hAnsi="Garamond"/>
-          <w:b/>
-          <w:bCs/>
-          <w:color w:val="auto"/>
-        </w:rPr>
-        <w:tab/>
-        <w:t xml:space="preserve">   </w:t>
-      </w:r>
-      <w:r>
-        <w:rPr>
-          <w:rFonts w:ascii="Garamond" w:hAnsi="Garamond"/>
-          <w:b/>
-          <w:bCs/>
-          <w:color w:val="auto"/>
-        </w:rPr>
-        <w:t xml:space="preserve">     </w:t>
-      </w:r>
-      <w:r>
-        <w:rPr>
-          <w:rFonts w:ascii="Garamond" w:hAnsi="Garamond"/>
-          <w:b/>
-          <w:bCs/>
-          <w:color w:val="auto"/>
-        </w:rPr>
-        <w:t xml:space="preserve">    </w:t>
-      </w:r>
-      <w:r>
-        <w:rPr>
-          <w:rFonts w:ascii="Garamond" w:hAnsi="Garamond"/>
-          <w:b/>
-          <w:bCs/>
-          <w:color w:val="auto"/>
-        </w:rPr>
-        <w:t xml:space="preserve">                    </w:t>
-      </w:r>
-      <w:r>
-        <w:rPr>
-          <w:rFonts w:ascii="Garamond" w:hAnsi="Garamond"/>
-          <w:b/>
-          <w:bCs/>
-          <w:color w:val="auto"/>
+        <w:t xml:space="preserve">                                </w:t>
+      </w:r>
+      <w:r>
+        <w:rPr>
+          <w:rFonts w:ascii="Garamond" w:hAnsi="Garamond"/>
+          <w:b/>
+          <w:bCs/>
+          <w:color w:val="auto"/>
+          <w:sz w:val="22"/>
+          <w:szCs w:val="22"/>
+        </w:rPr>
+        <w:t xml:space="preserve">       </w:t>
+      </w:r>
+      <w:r>
+        <w:rPr>
+          <w:rFonts w:ascii="Garamond" w:hAnsi="Garamond"/>
+          <w:b/>
+          <w:bCs/>
+          <w:color w:val="auto"/>
+          <w:sz w:val="22"/>
+          <w:szCs w:val="22"/>
         </w:rPr>
         <w:t xml:space="preserve">October 2024 – Present </w:t>
       </w:r>
@@ -649,6 +722,8 @@
           <w:i/>
           <w:iCs/>
           <w:color w:val="auto"/>
+          <w:sz w:val="22"/>
+          <w:szCs w:val="22"/>
         </w:rPr>
       </w:pPr>
       <w:r>
@@ -657,8 +732,10 @@
           <w:i/>
           <w:iCs/>
           <w:color w:val="auto"/>
-        </w:rPr>
-        <w:t xml:space="preserve">Bachelor of Science (B.S.) </w:t>
+          <w:sz w:val="22"/>
+          <w:szCs w:val="22"/>
+        </w:rPr>
+        <w:t xml:space="preserve">Bachelor of Science (B.S.) in Web Development                                                                                                           </w:t>
       </w:r>
       <w:r>
         <w:rPr>
@@ -666,8 +743,10 @@
           <w:i/>
           <w:iCs/>
           <w:color w:val="auto"/>
-        </w:rPr>
-        <w:t>in Web Developmen</w:t>
+          <w:sz w:val="22"/>
+          <w:szCs w:val="22"/>
+        </w:rPr>
+        <w:t xml:space="preserve">                </w:t>
       </w:r>
       <w:r>
         <w:rPr>
@@ -675,26 +754,128 @@
           <w:i/>
           <w:iCs/>
           <w:color w:val="auto"/>
-        </w:rPr>
-        <w:t xml:space="preserve">t           </w:t>
-      </w:r>
-      <w:r>
+          <w:sz w:val="22"/>
+          <w:szCs w:val="22"/>
+        </w:rPr>
+        <w:t>Remote</w:t>
+      </w:r>
+    </w:p>
+    <w:p>
+      <w:pPr>
+        <w:pStyle w:val="Default"/>
+        <w:rPr>
+          <w:rFonts w:ascii="Garamond" w:hAnsi="Garamond"/>
+          <w:b/>
+          <w:bCs/>
+          <w:color w:val="auto"/>
+          <w:sz w:val="22"/>
+          <w:szCs w:val="22"/>
+        </w:rPr>
+      </w:pPr>
+    </w:p>
+    <w:p>
+      <w:pPr>
+        <w:pStyle w:val="Default"/>
+        <w:rPr>
+          <w:rFonts w:ascii="Garamond" w:hAnsi="Garamond"/>
+          <w:b/>
+          <w:bCs/>
+          <w:color w:val="auto"/>
+          <w:sz w:val="22"/>
+          <w:szCs w:val="22"/>
+        </w:rPr>
+      </w:pPr>
+      <w:r>
+        <w:rPr>
+          <w:rFonts w:ascii="Garamond" w:hAnsi="Garamond"/>
+          <w:b/>
+          <w:bCs/>
+          <w:color w:val="auto"/>
+          <w:sz w:val="22"/>
+          <w:szCs w:val="22"/>
+        </w:rPr>
+        <w:t xml:space="preserve">Metropolitan Community College </w:t>
+      </w:r>
+      <w:r>
+        <w:rPr>
+          <w:rFonts w:ascii="Garamond" w:hAnsi="Garamond"/>
+          <w:b/>
+          <w:bCs/>
+          <w:color w:val="auto"/>
+          <w:sz w:val="22"/>
+          <w:szCs w:val="22"/>
+        </w:rPr>
+        <w:tab/>
+      </w:r>
+      <w:r>
+        <w:rPr>
+          <w:rFonts w:ascii="Garamond" w:hAnsi="Garamond"/>
+          <w:b/>
+          <w:bCs/>
+          <w:color w:val="auto"/>
+          <w:sz w:val="22"/>
+          <w:szCs w:val="22"/>
+        </w:rPr>
+        <w:tab/>
+        <w:t xml:space="preserve">                     </w:t>
+      </w:r>
+      <w:r>
+        <w:rPr>
+          <w:rFonts w:ascii="Garamond" w:hAnsi="Garamond"/>
+          <w:b/>
+          <w:bCs/>
+          <w:color w:val="auto"/>
+          <w:sz w:val="22"/>
+          <w:szCs w:val="22"/>
+        </w:rPr>
+        <w:tab/>
+        <w:t xml:space="preserve">                                                                    </w:t>
+      </w:r>
+      <w:r>
+        <w:rPr>
+          <w:rFonts w:ascii="Garamond" w:hAnsi="Garamond"/>
+          <w:b/>
+          <w:bCs/>
+          <w:color w:val="auto"/>
+          <w:sz w:val="22"/>
+          <w:szCs w:val="22"/>
+        </w:rPr>
+        <w:t xml:space="preserve">       </w:t>
+      </w:r>
+      <w:r>
+        <w:rPr>
+          <w:rFonts w:ascii="Garamond" w:hAnsi="Garamond"/>
+          <w:b/>
+          <w:bCs/>
+          <w:color w:val="auto"/>
+          <w:sz w:val="22"/>
+          <w:szCs w:val="22"/>
+        </w:rPr>
+        <w:t xml:space="preserve">May 2024  </w:t>
+      </w:r>
+    </w:p>
+    <w:p>
+      <w:pPr>
+        <w:pStyle w:val="Default"/>
         <w:rPr>
           <w:rFonts w:ascii="Garamond" w:hAnsi="Garamond"/>
           <w:i/>
           <w:iCs/>
           <w:color w:val="auto"/>
-        </w:rPr>
-        <w:t xml:space="preserve"> </w:t>
-      </w:r>
+          <w:sz w:val="22"/>
+          <w:szCs w:val="22"/>
+        </w:rPr>
+      </w:pPr>
       <w:r>
         <w:rPr>
           <w:rFonts w:ascii="Garamond" w:hAnsi="Garamond"/>
           <w:i/>
           <w:iCs/>
           <w:color w:val="auto"/>
-        </w:rPr>
-        <w:t xml:space="preserve">                           </w:t>
+          <w:sz w:val="22"/>
+          <w:szCs w:val="22"/>
+        </w:rPr>
+        <w:t xml:space="preserve">Associate of Applied Science (A.A.S.) in Information Technology – Computer Programming                                      </w:t>
       </w:r>
       <w:r>
         <w:rPr>
@@ -702,8 +883,10 @@
           <w:i/>
           <w:iCs/>
           <w:color w:val="auto"/>
-        </w:rPr>
-        <w:t xml:space="preserve"> </w:t>
+          <w:sz w:val="22"/>
+          <w:szCs w:val="22"/>
+        </w:rPr>
+        <w:t xml:space="preserve">                 </w:t>
       </w:r>
       <w:r>
         <w:rPr>
@@ -711,44 +894,10 @@
           <w:i/>
           <w:iCs/>
           <w:color w:val="auto"/>
-        </w:rPr>
-        <w:t xml:space="preserve">                        </w:t>
-      </w:r>
-      <w:r>
-        <w:rPr>
-          <w:rFonts w:ascii="Garamond" w:hAnsi="Garamond"/>
-          <w:i/>
-          <w:iCs/>
-          <w:color w:val="auto"/>
-        </w:rPr>
-        <w:t xml:space="preserve">              </w:t>
-      </w:r>
-      <w:r>
-        <w:rPr>
-          <w:rFonts w:ascii="Garamond" w:hAnsi="Garamond"/>
-          <w:i/>
-          <w:iCs/>
-          <w:color w:val="auto"/>
-        </w:rPr>
-        <w:t xml:space="preserve">   </w:t>
-      </w:r>
-      <w:r>
-        <w:rPr>
-          <w:rFonts w:ascii="Garamond" w:hAnsi="Garamond"/>
-          <w:i/>
-          <w:iCs/>
-          <w:color w:val="auto"/>
-        </w:rPr>
-        <w:t xml:space="preserve">                          </w:t>
-      </w:r>
-      <w:r>
-        <w:rPr>
-          <w:rFonts w:ascii="Garamond" w:hAnsi="Garamond"/>
-          <w:i/>
-          <w:iCs/>
-          <w:color w:val="auto"/>
-        </w:rPr>
-        <w:t>Remote</w:t>
+          <w:sz w:val="22"/>
+          <w:szCs w:val="22"/>
+        </w:rPr>
+        <w:t>Omaha, NE</w:t>
       </w:r>
     </w:p>
     <w:p>
@@ -756,9 +905,9 @@
         <w:pStyle w:val="Default"/>
         <w:rPr>
           <w:rFonts w:ascii="Garamond" w:hAnsi="Garamond"/>
-          <w:b/>
-          <w:bCs/>
-          <w:color w:val="auto"/>
+          <w:color w:val="auto"/>
+          <w:sz w:val="22"/>
+          <w:szCs w:val="28"/>
         </w:rPr>
       </w:pPr>
     </w:p>
@@ -767,159 +916,9 @@
         <w:pStyle w:val="Default"/>
         <w:rPr>
           <w:rFonts w:ascii="Garamond" w:hAnsi="Garamond"/>
-          <w:b/>
-          <w:bCs/>
-          <w:color w:val="auto"/>
-        </w:rPr>
-      </w:pPr>
-      <w:r>
-        <w:rPr>
-          <w:rFonts w:ascii="Garamond" w:hAnsi="Garamond"/>
-          <w:b/>
-          <w:bCs/>
-          <w:color w:val="auto"/>
-        </w:rPr>
-        <w:t xml:space="preserve">Metropolitan Community College </w:t>
-      </w:r>
-      <w:r>
-        <w:rPr>
-          <w:rFonts w:ascii="Garamond" w:hAnsi="Garamond"/>
-          <w:b/>
-          <w:bCs/>
-          <w:color w:val="auto"/>
-        </w:rPr>
-        <w:tab/>
-      </w:r>
-      <w:r>
-        <w:rPr>
-          <w:rFonts w:ascii="Garamond" w:hAnsi="Garamond"/>
-          <w:b/>
-          <w:bCs/>
-          <w:color w:val="auto"/>
-        </w:rPr>
-        <w:tab/>
-        <w:t xml:space="preserve">                     </w:t>
-      </w:r>
-      <w:r>
-        <w:rPr>
-          <w:rFonts w:ascii="Garamond" w:hAnsi="Garamond"/>
-          <w:b/>
-          <w:bCs/>
-          <w:color w:val="auto"/>
-        </w:rPr>
-        <w:tab/>
-        <w:t xml:space="preserve">                     </w:t>
-      </w:r>
-      <w:r>
-        <w:rPr>
-          <w:rFonts w:ascii="Garamond" w:hAnsi="Garamond"/>
-          <w:b/>
-          <w:bCs/>
-          <w:color w:val="auto"/>
-        </w:rPr>
-        <w:t xml:space="preserve">    </w:t>
-      </w:r>
-      <w:r>
-        <w:rPr>
-          <w:rFonts w:ascii="Garamond" w:hAnsi="Garamond"/>
-          <w:b/>
-          <w:bCs/>
-          <w:color w:val="auto"/>
-        </w:rPr>
-        <w:t xml:space="preserve">         </w:t>
-      </w:r>
-      <w:r>
-        <w:rPr>
-          <w:rFonts w:ascii="Garamond" w:hAnsi="Garamond"/>
-          <w:b/>
-          <w:bCs/>
-          <w:color w:val="auto"/>
-        </w:rPr>
-        <w:t xml:space="preserve"> </w:t>
-      </w:r>
-      <w:r>
-        <w:rPr>
-          <w:rFonts w:ascii="Garamond" w:hAnsi="Garamond"/>
-          <w:b/>
-          <w:bCs/>
-          <w:color w:val="auto"/>
-        </w:rPr>
-        <w:t xml:space="preserve">                                 </w:t>
-      </w:r>
-      <w:r>
-        <w:rPr>
-          <w:rFonts w:ascii="Garamond" w:hAnsi="Garamond"/>
-          <w:b/>
-          <w:bCs/>
-          <w:color w:val="auto"/>
-        </w:rPr>
-        <w:t xml:space="preserve">May 2024  </w:t>
-      </w:r>
-    </w:p>
-    <w:p>
-      <w:pPr>
-        <w:pStyle w:val="Default"/>
-        <w:rPr>
-          <w:rFonts w:ascii="Garamond" w:hAnsi="Garamond"/>
-          <w:i/>
-          <w:iCs/>
-          <w:color w:val="auto"/>
-        </w:rPr>
-      </w:pPr>
-      <w:r>
-        <w:rPr>
-          <w:rFonts w:ascii="Garamond" w:hAnsi="Garamond"/>
-          <w:i/>
-          <w:iCs/>
-          <w:color w:val="auto"/>
-        </w:rPr>
-        <w:t xml:space="preserve">Associate of Applied Science (A.A.S.) </w:t>
-      </w:r>
-      <w:r>
-        <w:rPr>
-          <w:rFonts w:ascii="Garamond" w:hAnsi="Garamond"/>
-          <w:i/>
-          <w:iCs/>
-          <w:color w:val="auto"/>
-        </w:rPr>
-        <w:t xml:space="preserve">in Information Technology – Computer Programming             </w:t>
-      </w:r>
-      <w:r>
-        <w:rPr>
-          <w:rFonts w:ascii="Garamond" w:hAnsi="Garamond"/>
-          <w:i/>
-          <w:iCs/>
-          <w:color w:val="auto"/>
-        </w:rPr>
-        <w:t xml:space="preserve">                         </w:t>
-      </w:r>
-      <w:r>
-        <w:rPr>
-          <w:rFonts w:ascii="Garamond" w:hAnsi="Garamond"/>
-          <w:i/>
-          <w:iCs/>
-          <w:color w:val="auto"/>
-        </w:rPr>
-        <w:t>Omaha, NE</w:t>
-      </w:r>
-    </w:p>
-    <w:p>
-      <w:pPr>
-        <w:pStyle w:val="Default"/>
-        <w:rPr>
-          <w:rFonts w:ascii="Garamond" w:hAnsi="Garamond"/>
-          <w:color w:val="auto"/>
-          <w:szCs w:val="32"/>
-        </w:rPr>
-      </w:pPr>
-    </w:p>
-    <w:p>
-      <w:pPr>
-        <w:pStyle w:val="Default"/>
-        <w:rPr>
-          <w:rFonts w:ascii="Garamond" w:hAnsi="Garamond"/>
-          <w:color w:val="auto"/>
-          <w:szCs w:val="32"/>
+          <w:color w:val="auto"/>
+          <w:sz w:val="22"/>
+          <w:szCs w:val="28"/>
         </w:rPr>
       </w:pPr>
     </w:p>
@@ -934,18 +933,18 @@
           <w:b/>
           <w:bCs/>
           <w:color w:val="auto"/>
-          <w:sz w:val="32"/>
-          <w:szCs w:val="32"/>
-        </w:rPr>
-      </w:pPr>
-      <w:r>
-        <w:rPr>
-          <w:rFonts w:ascii="Garamond" w:hAnsi="Garamond"/>
-          <w:b/>
-          <w:bCs/>
-          <w:color w:val="auto"/>
-          <w:sz w:val="32"/>
-          <w:szCs w:val="32"/>
+          <w:sz w:val="28"/>
+          <w:szCs w:val="28"/>
+        </w:rPr>
+      </w:pPr>
+      <w:r>
+        <w:rPr>
+          <w:rFonts w:ascii="Garamond" w:hAnsi="Garamond"/>
+          <w:b/>
+          <w:bCs/>
+          <w:color w:val="auto"/>
+          <w:sz w:val="28"/>
+          <w:szCs w:val="28"/>
         </w:rPr>
         <w:t>WORK EXPERIENCE</w:t>
       </w:r>
@@ -958,8 +957,8 @@
           <w:b/>
           <w:bCs/>
           <w:color w:val="auto"/>
-          <w:sz w:val="4"/>
-          <w:szCs w:val="4"/>
+          <w:sz w:val="2"/>
+          <w:szCs w:val="2"/>
           <w:u w:val="single"/>
         </w:rPr>
       </w:pPr>
@@ -972,6 +971,8 @@
           <w:b/>
           <w:bCs/>
           <w:color w:val="auto"/>
+          <w:sz w:val="22"/>
+          <w:szCs w:val="22"/>
         </w:rPr>
       </w:pPr>
     </w:p>
@@ -983,23 +984,29 @@
           <w:b/>
           <w:bCs/>
           <w:color w:val="auto"/>
-        </w:rPr>
-      </w:pPr>
-      <w:r>
-        <w:rPr>
-          <w:rFonts w:ascii="Garamond" w:hAnsi="Garamond"/>
-          <w:b/>
-          <w:bCs/>
-          <w:color w:val="auto"/>
-        </w:rPr>
-        <w:t>FedEx Office</w:t>
-      </w:r>
-      <w:r>
-        <w:rPr>
-          <w:rFonts w:ascii="Garamond" w:hAnsi="Garamond"/>
-          <w:b/>
-          <w:bCs/>
-          <w:color w:val="auto"/>
+          <w:sz w:val="22"/>
+          <w:szCs w:val="22"/>
+        </w:rPr>
+      </w:pPr>
+      <w:r>
+        <w:rPr>
+          <w:rFonts w:ascii="Garamond" w:hAnsi="Garamond"/>
+          <w:b/>
+          <w:bCs/>
+          <w:color w:val="auto"/>
+          <w:sz w:val="22"/>
+          <w:szCs w:val="22"/>
+        </w:rPr>
+        <w:t>Baird Holm</w:t>
+      </w:r>
+      <w:r>
+        <w:rPr>
+          <w:rFonts w:ascii="Garamond" w:hAnsi="Garamond"/>
+          <w:b/>
+          <w:bCs/>
+          <w:color w:val="auto"/>
+          <w:sz w:val="22"/>
+          <w:szCs w:val="22"/>
         </w:rPr>
         <w:tab/>
       </w:r>
@@ -1009,6 +1016,8 @@
           <w:b/>
           <w:bCs/>
           <w:color w:val="auto"/>
+          <w:sz w:val="22"/>
+          <w:szCs w:val="22"/>
         </w:rPr>
         <w:tab/>
       </w:r>
@@ -1018,6 +1027,8 @@
           <w:b/>
           <w:bCs/>
           <w:color w:val="auto"/>
+          <w:sz w:val="22"/>
+          <w:szCs w:val="22"/>
         </w:rPr>
         <w:tab/>
       </w:r>
@@ -1027,36 +1038,33 @@
           <w:b/>
           <w:bCs/>
           <w:color w:val="auto"/>
+          <w:sz w:val="22"/>
+          <w:szCs w:val="22"/>
         </w:rPr>
         <w:tab/>
-      </w:r>
-      <w:r>
-        <w:rPr>
-          <w:rFonts w:ascii="Garamond" w:hAnsi="Garamond"/>
-          <w:b/>
-          <w:bCs/>
-          <w:color w:val="auto"/>
-        </w:rPr>
-        <w:tab/>
-        <w:t xml:space="preserve">                                             </w:t>
-      </w:r>
-      <w:r>
-        <w:rPr>
-          <w:rFonts w:ascii="Garamond" w:hAnsi="Garamond"/>
-          <w:b/>
-          <w:bCs/>
-          <w:color w:val="auto"/>
-        </w:rPr>
-        <w:t xml:space="preserve">                         </w:t>
-      </w:r>
-      <w:r>
-        <w:rPr>
-          <w:rFonts w:ascii="Garamond" w:hAnsi="Garamond"/>
-          <w:b/>
-          <w:bCs/>
-          <w:color w:val="auto"/>
-        </w:rPr>
-        <w:t xml:space="preserve"> March 2025 – Present</w:t>
+        <w:t xml:space="preserve">                                                                                </w:t>
+      </w:r>
+      <w:r>
+        <w:rPr>
+          <w:rFonts w:ascii="Garamond" w:hAnsi="Garamond"/>
+          <w:b/>
+          <w:bCs/>
+          <w:color w:val="auto"/>
+          <w:sz w:val="22"/>
+          <w:szCs w:val="22"/>
+        </w:rPr>
+        <w:t xml:space="preserve">           </w:t>
+      </w:r>
+      <w:r>
+        <w:rPr>
+          <w:rFonts w:ascii="Garamond" w:hAnsi="Garamond"/>
+          <w:b/>
+          <w:bCs/>
+          <w:color w:val="auto"/>
+          <w:sz w:val="22"/>
+          <w:szCs w:val="22"/>
+        </w:rPr>
+        <w:t>October 2025 – Present</w:t>
       </w:r>
     </w:p>
     <w:p>
@@ -1066,6 +1074,8 @@
           <w:rFonts w:ascii="Garamond" w:hAnsi="Garamond"/>
           <w:bCs/>
           <w:i/>
+          <w:sz w:val="22"/>
+          <w:szCs w:val="22"/>
         </w:rPr>
       </w:pPr>
       <w:r>
@@ -1074,14 +1084,19 @@
           <w:bCs/>
           <w:i/>
           <w:color w:val="auto"/>
-        </w:rPr>
-        <w:t>Retail Customer Service Associate</w:t>
+          <w:sz w:val="22"/>
+          <w:szCs w:val="22"/>
+        </w:rPr>
+        <w:t xml:space="preserve">IT Help Desk Specialist                          </w:t>
       </w:r>
       <w:r>
         <w:rPr>
           <w:rFonts w:ascii="Garamond" w:hAnsi="Garamond"/>
           <w:bCs/>
           <w:i/>
+          <w:color w:val="auto"/>
+          <w:sz w:val="22"/>
+          <w:szCs w:val="22"/>
         </w:rPr>
         <w:tab/>
       </w:r>
@@ -1091,6 +1106,8 @@
           <w:bCs/>
           <w:i/>
           <w:color w:val="auto"/>
+          <w:sz w:val="22"/>
+          <w:szCs w:val="22"/>
         </w:rPr>
         <w:tab/>
       </w:r>
@@ -1100,6 +1117,8 @@
           <w:bCs/>
           <w:i/>
           <w:color w:val="auto"/>
+          <w:sz w:val="22"/>
+          <w:szCs w:val="22"/>
         </w:rPr>
         <w:tab/>
       </w:r>
@@ -1109,15 +1128,8 @@
           <w:bCs/>
           <w:i/>
           <w:color w:val="auto"/>
-        </w:rPr>
-        <w:tab/>
-      </w:r>
-      <w:r>
-        <w:rPr>
-          <w:rFonts w:ascii="Garamond" w:hAnsi="Garamond"/>
-          <w:bCs/>
-          <w:i/>
-          <w:color w:val="auto"/>
+          <w:sz w:val="22"/>
+          <w:szCs w:val="22"/>
         </w:rPr>
         <w:tab/>
         <w:t xml:space="preserve"> </w:t>
@@ -1128,6 +1140,8 @@
           <w:bCs/>
           <w:i/>
           <w:color w:val="auto"/>
+          <w:sz w:val="22"/>
+          <w:szCs w:val="22"/>
         </w:rPr>
         <w:tab/>
       </w:r>
@@ -1137,6 +1151,8 @@
           <w:bCs/>
           <w:i/>
           <w:color w:val="auto"/>
+          <w:sz w:val="22"/>
+          <w:szCs w:val="22"/>
         </w:rPr>
         <w:tab/>
       </w:r>
@@ -1146,6 +1162,8 @@
           <w:bCs/>
           <w:i/>
           <w:color w:val="auto"/>
+          <w:sz w:val="22"/>
+          <w:szCs w:val="22"/>
         </w:rPr>
         <w:tab/>
         <w:t xml:space="preserve">          </w:t>
@@ -1156,9 +1174,11 @@
           <w:bCs/>
           <w:i/>
           <w:color w:val="auto"/>
+          <w:sz w:val="22"/>
+          <w:szCs w:val="22"/>
         </w:rPr>
         <w:tab/>
-        <w:t xml:space="preserve">  </w:t>
+        <w:t xml:space="preserve">                  </w:t>
       </w:r>
       <w:r>
         <w:rPr>
@@ -1166,8 +1186,10 @@
           <w:bCs/>
           <w:i/>
           <w:color w:val="auto"/>
-        </w:rPr>
-        <w:t xml:space="preserve">                </w:t>
+          <w:sz w:val="22"/>
+          <w:szCs w:val="22"/>
+        </w:rPr>
+        <w:t xml:space="preserve">   </w:t>
       </w:r>
       <w:r>
         <w:rPr>
@@ -1175,6 +1197,8 @@
           <w:bCs/>
           <w:i/>
           <w:color w:val="auto"/>
+          <w:sz w:val="22"/>
+          <w:szCs w:val="22"/>
         </w:rPr>
         <w:t>Omaha, NE</w:t>
       </w:r>
@@ -1189,49 +1213,18 @@
         <w:rPr>
           <w:rFonts w:ascii="Garamond" w:hAnsi="Garamond"/>
           <w:bCs/>
-        </w:rPr>
-      </w:pPr>
-      <w:r>
-        <w:rPr>
-          <w:rFonts w:ascii="Garamond" w:hAnsi="Garamond"/>
-          <w:bCs/>
-        </w:rPr>
-        <w:t>Support</w:t>
-      </w:r>
-      <w:r>
-        <w:rPr>
-          <w:rFonts w:ascii="Garamond" w:hAnsi="Garamond"/>
-          <w:bCs/>
-        </w:rPr>
-        <w:t>s</w:t>
-      </w:r>
-      <w:r>
-        <w:rPr>
-          <w:rFonts w:ascii="Garamond" w:hAnsi="Garamond"/>
-          <w:bCs/>
-        </w:rPr>
-        <w:t xml:space="preserve"> customers with </w:t>
-      </w:r>
-      <w:r>
-        <w:rPr>
-          <w:rFonts w:ascii="Garamond" w:hAnsi="Garamond"/>
-          <w:bCs/>
-        </w:rPr>
-        <w:t xml:space="preserve">shipping, </w:t>
-      </w:r>
-      <w:r>
-        <w:rPr>
-          <w:rFonts w:ascii="Garamond" w:hAnsi="Garamond"/>
-          <w:bCs/>
-        </w:rPr>
-        <w:t>digital printing services, file formatting, and troubleshooting basic tech issues</w:t>
-      </w:r>
-      <w:r>
-        <w:rPr>
-          <w:rFonts w:ascii="Garamond" w:hAnsi="Garamond"/>
-          <w:bCs/>
-        </w:rPr>
-        <w:t>.</w:t>
+          <w:sz w:val="22"/>
+          <w:szCs w:val="22"/>
+        </w:rPr>
+      </w:pPr>
+      <w:r>
+        <w:rPr>
+          <w:rFonts w:ascii="Garamond" w:hAnsi="Garamond"/>
+          <w:bCs/>
+          <w:sz w:val="22"/>
+          <w:szCs w:val="22"/>
+        </w:rPr>
+        <w:t>Assist in troubleshooting hardware, software, and connectivity issues to support end users.</w:t>
       </w:r>
     </w:p>
     <w:p>
@@ -1244,42 +1237,18 @@
         <w:rPr>
           <w:rFonts w:ascii="Garamond" w:hAnsi="Garamond"/>
           <w:bCs/>
-        </w:rPr>
-      </w:pPr>
-      <w:r>
-        <w:rPr>
-          <w:rFonts w:ascii="Garamond" w:hAnsi="Garamond"/>
-          <w:bCs/>
-        </w:rPr>
-        <w:t>Operate</w:t>
-      </w:r>
-      <w:r>
-        <w:rPr>
-          <w:rFonts w:ascii="Garamond" w:hAnsi="Garamond"/>
-          <w:bCs/>
-        </w:rPr>
-        <w:t>s</w:t>
-      </w:r>
-      <w:r>
-        <w:rPr>
-          <w:rFonts w:ascii="Garamond" w:hAnsi="Garamond"/>
-          <w:bCs/>
-        </w:rPr>
-        <w:t xml:space="preserve"> and maintain</w:t>
-      </w:r>
-      <w:r>
-        <w:rPr>
-          <w:rFonts w:ascii="Garamond" w:hAnsi="Garamond"/>
-          <w:bCs/>
-        </w:rPr>
-        <w:t>s</w:t>
-      </w:r>
-      <w:r>
-        <w:rPr>
-          <w:rFonts w:ascii="Garamond" w:hAnsi="Garamond"/>
-          <w:bCs/>
-        </w:rPr>
-        <w:t xml:space="preserve"> networked printers, copiers, and shipping systems, ensuring prompt service.</w:t>
+          <w:sz w:val="22"/>
+          <w:szCs w:val="22"/>
+        </w:rPr>
+      </w:pPr>
+      <w:r>
+        <w:rPr>
+          <w:rFonts w:ascii="Garamond" w:hAnsi="Garamond"/>
+          <w:bCs/>
+          <w:sz w:val="22"/>
+          <w:szCs w:val="22"/>
+        </w:rPr>
+        <w:t>Perform asset management by tracking, organizing, and maintaining IT equipment and inventory.</w:t>
       </w:r>
     </w:p>
     <w:p>
@@ -1294,402 +1263,27 @@
           <w:b/>
           <w:bCs/>
           <w:color w:val="auto"/>
-          <w:sz w:val="22"/>
-          <w:szCs w:val="22"/>
-        </w:rPr>
-      </w:pPr>
-      <w:r>
-        <w:rPr>
-          <w:rFonts w:ascii="Garamond" w:hAnsi="Garamond"/>
-          <w:bCs/>
-        </w:rPr>
-        <w:t>Utilize</w:t>
-      </w:r>
-      <w:r>
-        <w:rPr>
-          <w:rFonts w:ascii="Garamond" w:hAnsi="Garamond"/>
-          <w:bCs/>
-        </w:rPr>
-        <w:t>s</w:t>
-      </w:r>
-      <w:r>
-        <w:rPr>
-          <w:rFonts w:ascii="Garamond" w:hAnsi="Garamond"/>
-          <w:bCs/>
-        </w:rPr>
-        <w:t xml:space="preserve"> internal systems to manage orders, track shipments, and resolve technical or service-related inquiries</w:t>
-      </w:r>
-      <w:r>
-        <w:rPr>
-          <w:rFonts w:ascii="Garamond" w:hAnsi="Garamond"/>
-          <w:bCs/>
+          <w:sz w:val="20"/>
+          <w:szCs w:val="20"/>
+        </w:rPr>
+      </w:pPr>
+      <w:r>
+        <w:rPr>
+          <w:rFonts w:ascii="Garamond" w:hAnsi="Garamond"/>
+          <w:bCs/>
+          <w:sz w:val="22"/>
+          <w:szCs w:val="22"/>
+        </w:rPr>
+        <w:t>Gain hands-on experience imaging and configuring phones, IGEL thin clients, and other devices</w:t>
+      </w:r>
+      <w:r>
+        <w:rPr>
+          <w:rFonts w:ascii="Garamond" w:hAnsi="Garamond"/>
+          <w:bCs/>
+          <w:sz w:val="22"/>
+          <w:szCs w:val="22"/>
         </w:rPr>
         <w:t>.</w:t>
-      </w:r>
-    </w:p>
-    <w:p>
-      <w:pPr>
-        <w:pStyle w:val="Default"/>
-        <w:rPr>
-          <w:rFonts w:ascii="Garamond" w:hAnsi="Garamond"/>
-          <w:b/>
-          <w:bCs/>
-          <w:color w:val="auto"/>
-        </w:rPr>
-      </w:pPr>
-    </w:p>
-    <w:p>
-      <w:pPr>
-        <w:pStyle w:val="Default"/>
-        <w:rPr>
-          <w:rFonts w:ascii="Garamond" w:hAnsi="Garamond"/>
-          <w:b/>
-          <w:bCs/>
-          <w:color w:val="auto"/>
-        </w:rPr>
-      </w:pPr>
-      <w:r>
-        <w:rPr>
-          <w:rFonts w:ascii="Garamond" w:hAnsi="Garamond"/>
-          <w:b/>
-          <w:bCs/>
-          <w:color w:val="auto"/>
-        </w:rPr>
-        <w:t>TELUS</w:t>
-      </w:r>
-      <w:r>
-        <w:rPr>
-          <w:rFonts w:ascii="Garamond" w:hAnsi="Garamond"/>
-          <w:b/>
-          <w:bCs/>
-          <w:color w:val="auto"/>
-        </w:rPr>
-        <w:t xml:space="preserve"> Digital</w:t>
-      </w:r>
-      <w:r>
-        <w:rPr>
-          <w:rFonts w:ascii="Garamond" w:hAnsi="Garamond"/>
-          <w:b/>
-          <w:bCs/>
-          <w:color w:val="auto"/>
-        </w:rPr>
-        <w:tab/>
-      </w:r>
-      <w:r>
-        <w:rPr>
-          <w:rFonts w:ascii="Garamond" w:hAnsi="Garamond"/>
-          <w:b/>
-          <w:bCs/>
-          <w:color w:val="auto"/>
-        </w:rPr>
-        <w:tab/>
-      </w:r>
-      <w:r>
-        <w:rPr>
-          <w:rFonts w:ascii="Garamond" w:hAnsi="Garamond"/>
-          <w:b/>
-          <w:bCs/>
-          <w:color w:val="auto"/>
-        </w:rPr>
-        <w:tab/>
-      </w:r>
-      <w:r>
-        <w:rPr>
-          <w:rFonts w:ascii="Garamond" w:hAnsi="Garamond"/>
-          <w:b/>
-          <w:bCs/>
-          <w:color w:val="auto"/>
-        </w:rPr>
-        <w:tab/>
-      </w:r>
-      <w:r>
-        <w:rPr>
-          <w:rFonts w:ascii="Garamond" w:hAnsi="Garamond"/>
-          <w:b/>
-          <w:bCs/>
-          <w:color w:val="auto"/>
-        </w:rPr>
-        <w:tab/>
-      </w:r>
-      <w:r>
-        <w:rPr>
-          <w:rFonts w:ascii="Garamond" w:hAnsi="Garamond"/>
-          <w:b/>
-          <w:bCs/>
-          <w:color w:val="auto"/>
-        </w:rPr>
-        <w:t xml:space="preserve">                          </w:t>
-      </w:r>
-      <w:r>
-        <w:rPr>
-          <w:rFonts w:ascii="Garamond" w:hAnsi="Garamond"/>
-          <w:b/>
-          <w:bCs/>
-          <w:color w:val="auto"/>
-        </w:rPr>
-        <w:t xml:space="preserve">             </w:t>
-      </w:r>
-      <w:r>
-        <w:rPr>
-          <w:rFonts w:ascii="Garamond" w:hAnsi="Garamond"/>
-          <w:b/>
-          <w:bCs/>
-          <w:color w:val="auto"/>
-        </w:rPr>
-        <w:t>Dec</w:t>
-      </w:r>
-      <w:r>
-        <w:rPr>
-          <w:rFonts w:ascii="Garamond" w:hAnsi="Garamond"/>
-          <w:b/>
-          <w:bCs/>
-          <w:color w:val="auto"/>
-        </w:rPr>
-        <w:t>ember</w:t>
-      </w:r>
-      <w:r>
-        <w:rPr>
-          <w:rFonts w:ascii="Garamond" w:hAnsi="Garamond"/>
-          <w:b/>
-          <w:bCs/>
-          <w:color w:val="auto"/>
-        </w:rPr>
-        <w:t xml:space="preserve"> 20</w:t>
-      </w:r>
-      <w:r>
-        <w:rPr>
-          <w:rFonts w:ascii="Garamond" w:hAnsi="Garamond"/>
-          <w:b/>
-          <w:bCs/>
-          <w:color w:val="auto"/>
-        </w:rPr>
-        <w:t>2</w:t>
-      </w:r>
-      <w:r>
-        <w:rPr>
-          <w:rFonts w:ascii="Garamond" w:hAnsi="Garamond"/>
-          <w:b/>
-          <w:bCs/>
-          <w:color w:val="auto"/>
-        </w:rPr>
-        <w:t>3</w:t>
-      </w:r>
-      <w:r>
-        <w:rPr>
-          <w:rFonts w:ascii="Garamond" w:hAnsi="Garamond"/>
-          <w:b/>
-          <w:bCs/>
-          <w:color w:val="auto"/>
-        </w:rPr>
-        <w:t xml:space="preserve"> – </w:t>
-      </w:r>
-      <w:r>
-        <w:rPr>
-          <w:rFonts w:ascii="Garamond" w:hAnsi="Garamond"/>
-          <w:b/>
-          <w:bCs/>
-          <w:color w:val="auto"/>
-        </w:rPr>
-        <w:t>Dec</w:t>
-      </w:r>
-      <w:r>
-        <w:rPr>
-          <w:rFonts w:ascii="Garamond" w:hAnsi="Garamond"/>
-          <w:b/>
-          <w:bCs/>
-          <w:color w:val="auto"/>
-        </w:rPr>
-        <w:t>ember</w:t>
-      </w:r>
-      <w:r>
-        <w:rPr>
-          <w:rFonts w:ascii="Garamond" w:hAnsi="Garamond"/>
-          <w:b/>
-          <w:bCs/>
-          <w:color w:val="auto"/>
-        </w:rPr>
-        <w:t xml:space="preserve"> 2024</w:t>
-      </w:r>
-    </w:p>
-    <w:p>
-      <w:pPr>
-        <w:pStyle w:val="Default"/>
-        <w:rPr>
-          <w:rFonts w:ascii="Garamond" w:hAnsi="Garamond"/>
-          <w:bCs/>
-          <w:i/>
-        </w:rPr>
-      </w:pPr>
-      <w:r>
-        <w:rPr>
-          <w:rFonts w:ascii="Garamond" w:hAnsi="Garamond"/>
-          <w:bCs/>
-          <w:i/>
-          <w:color w:val="auto"/>
-        </w:rPr>
-        <w:t>AI and Web Analyst</w:t>
-      </w:r>
-      <w:r>
-        <w:rPr>
-          <w:rFonts w:ascii="Garamond" w:hAnsi="Garamond"/>
-          <w:bCs/>
-          <w:i/>
-        </w:rPr>
-        <w:tab/>
-      </w:r>
-      <w:r>
-        <w:rPr>
-          <w:rFonts w:ascii="Garamond" w:hAnsi="Garamond"/>
-          <w:bCs/>
-          <w:i/>
-        </w:rPr>
-        <w:tab/>
-      </w:r>
-      <w:r>
-        <w:rPr>
-          <w:rFonts w:ascii="Garamond" w:hAnsi="Garamond"/>
-          <w:bCs/>
-          <w:i/>
-          <w:color w:val="auto"/>
-        </w:rPr>
-        <w:tab/>
-      </w:r>
-      <w:r>
-        <w:rPr>
-          <w:rFonts w:ascii="Garamond" w:hAnsi="Garamond"/>
-          <w:bCs/>
-          <w:i/>
-          <w:color w:val="auto"/>
-        </w:rPr>
-        <w:tab/>
-      </w:r>
-      <w:r>
-        <w:rPr>
-          <w:rFonts w:ascii="Garamond" w:hAnsi="Garamond"/>
-          <w:bCs/>
-          <w:i/>
-          <w:color w:val="auto"/>
-        </w:rPr>
-        <w:tab/>
-      </w:r>
-      <w:r>
-        <w:rPr>
-          <w:rFonts w:ascii="Garamond" w:hAnsi="Garamond"/>
-          <w:bCs/>
-          <w:i/>
-          <w:color w:val="auto"/>
-        </w:rPr>
-        <w:tab/>
-      </w:r>
-      <w:r>
-        <w:rPr>
-          <w:rFonts w:ascii="Garamond" w:hAnsi="Garamond"/>
-          <w:bCs/>
-          <w:i/>
-          <w:color w:val="auto"/>
-        </w:rPr>
-        <w:t xml:space="preserve"> </w:t>
-      </w:r>
-      <w:r>
-        <w:rPr>
-          <w:rFonts w:ascii="Garamond" w:hAnsi="Garamond"/>
-          <w:bCs/>
-          <w:i/>
-          <w:color w:val="auto"/>
-        </w:rPr>
-        <w:tab/>
-      </w:r>
-      <w:r>
-        <w:rPr>
-          <w:rFonts w:ascii="Garamond" w:hAnsi="Garamond"/>
-          <w:bCs/>
-          <w:i/>
-          <w:color w:val="auto"/>
-        </w:rPr>
-        <w:tab/>
-      </w:r>
-      <w:r>
-        <w:rPr>
-          <w:rFonts w:ascii="Garamond" w:hAnsi="Garamond"/>
-          <w:bCs/>
-          <w:i/>
-          <w:color w:val="auto"/>
-        </w:rPr>
-        <w:tab/>
-        <w:t xml:space="preserve">  </w:t>
-      </w:r>
-      <w:r>
-        <w:rPr>
-          <w:rFonts w:ascii="Garamond" w:hAnsi="Garamond"/>
-          <w:bCs/>
-          <w:i/>
-          <w:color w:val="auto"/>
-        </w:rPr>
-        <w:t xml:space="preserve">     </w:t>
-      </w:r>
-      <w:r>
-        <w:rPr>
-          <w:rFonts w:ascii="Garamond" w:hAnsi="Garamond"/>
-          <w:bCs/>
-          <w:i/>
-          <w:color w:val="auto"/>
-        </w:rPr>
-        <w:t xml:space="preserve">   </w:t>
-      </w:r>
-      <w:r>
-        <w:rPr>
-          <w:rFonts w:ascii="Garamond" w:hAnsi="Garamond"/>
-          <w:bCs/>
-          <w:i/>
-          <w:color w:val="auto"/>
-        </w:rPr>
-        <w:tab/>
-        <w:t xml:space="preserve">       </w:t>
-      </w:r>
-      <w:r>
-        <w:rPr>
-          <w:rFonts w:ascii="Garamond" w:hAnsi="Garamond"/>
-          <w:bCs/>
-          <w:i/>
-          <w:color w:val="auto"/>
-        </w:rPr>
-        <w:t xml:space="preserve">      </w:t>
-      </w:r>
-      <w:r>
-        <w:rPr>
-          <w:rFonts w:ascii="Garamond" w:hAnsi="Garamond"/>
-          <w:bCs/>
-          <w:i/>
-          <w:color w:val="auto"/>
-        </w:rPr>
-        <w:t xml:space="preserve">       </w:t>
-      </w:r>
-      <w:r>
-        <w:rPr>
-          <w:rFonts w:ascii="Garamond" w:hAnsi="Garamond"/>
-          <w:bCs/>
-          <w:i/>
-          <w:color w:val="auto"/>
-        </w:rPr>
-        <w:t xml:space="preserve"> </w:t>
-      </w:r>
-      <w:r>
-        <w:rPr>
-          <w:rFonts w:ascii="Garamond" w:hAnsi="Garamond"/>
-          <w:bCs/>
-          <w:i/>
-          <w:color w:val="auto"/>
-        </w:rPr>
-        <w:t xml:space="preserve">     </w:t>
-      </w:r>
-      <w:r>
-        <w:rPr>
-          <w:rFonts w:ascii="Garamond" w:hAnsi="Garamond"/>
-          <w:bCs/>
-          <w:i/>
-          <w:color w:val="auto"/>
-        </w:rPr>
-        <w:t>Remote</w:t>
       </w:r>
     </w:p>
     <w:p>
@@ -1701,29 +1295,290 @@
         </w:numPr>
         <w:rPr>
           <w:rFonts w:ascii="Garamond" w:hAnsi="Garamond"/>
-          <w:bCs/>
-        </w:rPr>
-      </w:pPr>
-      <w:r>
-        <w:rPr>
-          <w:rFonts w:ascii="Garamond" w:hAnsi="Garamond"/>
-          <w:bCs/>
-        </w:rPr>
-        <w:t xml:space="preserve">Analyzed and provided detailed feedback </w:t>
-      </w:r>
-      <w:r>
-        <w:rPr>
-          <w:rFonts w:ascii="Garamond" w:hAnsi="Garamond"/>
-          <w:bCs/>
-        </w:rPr>
-        <w:t>to ensure quality standards across various digital assets</w:t>
-      </w:r>
-      <w:r>
-        <w:rPr>
-          <w:rFonts w:ascii="Garamond" w:hAnsi="Garamond"/>
-          <w:bCs/>
-        </w:rPr>
-        <w:t>.</w:t>
+          <w:b/>
+          <w:bCs/>
+          <w:color w:val="auto"/>
+          <w:sz w:val="20"/>
+          <w:szCs w:val="20"/>
+        </w:rPr>
+      </w:pPr>
+      <w:r>
+        <w:rPr>
+          <w:rFonts w:ascii="Garamond" w:hAnsi="Garamond"/>
+          <w:sz w:val="22"/>
+          <w:szCs w:val="22"/>
+        </w:rPr>
+        <w:t xml:space="preserve">Support </w:t>
+      </w:r>
+      <w:r>
+        <w:rPr>
+          <w:rFonts w:ascii="Garamond" w:hAnsi="Garamond"/>
+          <w:bCs/>
+          <w:sz w:val="22"/>
+          <w:szCs w:val="22"/>
+        </w:rPr>
+        <w:t>with documentation, physical setup, and network configuration for the new Lincoln office.</w:t>
+      </w:r>
+    </w:p>
+    <w:p>
+      <w:pPr>
+        <w:pStyle w:val="Default"/>
+        <w:rPr>
+          <w:rFonts w:ascii="Garamond" w:hAnsi="Garamond"/>
+          <w:b/>
+          <w:bCs/>
+          <w:color w:val="auto"/>
+          <w:sz w:val="22"/>
+          <w:szCs w:val="22"/>
+        </w:rPr>
+      </w:pPr>
+    </w:p>
+    <w:p>
+      <w:pPr>
+        <w:pStyle w:val="Default"/>
+        <w:rPr>
+          <w:rFonts w:ascii="Garamond" w:hAnsi="Garamond"/>
+          <w:b/>
+          <w:bCs/>
+          <w:color w:val="auto"/>
+          <w:sz w:val="22"/>
+          <w:szCs w:val="22"/>
+        </w:rPr>
+      </w:pPr>
+      <w:r>
+        <w:rPr>
+          <w:rFonts w:ascii="Garamond" w:hAnsi="Garamond"/>
+          <w:b/>
+          <w:bCs/>
+          <w:color w:val="auto"/>
+          <w:sz w:val="22"/>
+          <w:szCs w:val="22"/>
+        </w:rPr>
+        <w:t>FedEx Office</w:t>
+      </w:r>
+      <w:r>
+        <w:rPr>
+          <w:rFonts w:ascii="Garamond" w:hAnsi="Garamond"/>
+          <w:b/>
+          <w:bCs/>
+          <w:color w:val="auto"/>
+          <w:sz w:val="22"/>
+          <w:szCs w:val="22"/>
+        </w:rPr>
+        <w:tab/>
+      </w:r>
+      <w:r>
+        <w:rPr>
+          <w:rFonts w:ascii="Garamond" w:hAnsi="Garamond"/>
+          <w:b/>
+          <w:bCs/>
+          <w:color w:val="auto"/>
+          <w:sz w:val="22"/>
+          <w:szCs w:val="22"/>
+        </w:rPr>
+        <w:tab/>
+      </w:r>
+      <w:r>
+        <w:rPr>
+          <w:rFonts w:ascii="Garamond" w:hAnsi="Garamond"/>
+          <w:b/>
+          <w:bCs/>
+          <w:color w:val="auto"/>
+          <w:sz w:val="22"/>
+          <w:szCs w:val="22"/>
+        </w:rPr>
+        <w:tab/>
+      </w:r>
+      <w:r>
+        <w:rPr>
+          <w:rFonts w:ascii="Garamond" w:hAnsi="Garamond"/>
+          <w:b/>
+          <w:bCs/>
+          <w:color w:val="auto"/>
+          <w:sz w:val="22"/>
+          <w:szCs w:val="22"/>
+        </w:rPr>
+        <w:tab/>
+      </w:r>
+      <w:r>
+        <w:rPr>
+          <w:rFonts w:ascii="Garamond" w:hAnsi="Garamond"/>
+          <w:b/>
+          <w:bCs/>
+          <w:color w:val="auto"/>
+          <w:sz w:val="22"/>
+          <w:szCs w:val="22"/>
+        </w:rPr>
+        <w:tab/>
+        <w:t xml:space="preserve">                                                              </w:t>
+      </w:r>
+      <w:r>
+        <w:rPr>
+          <w:rFonts w:ascii="Garamond" w:hAnsi="Garamond"/>
+          <w:b/>
+          <w:bCs/>
+          <w:color w:val="auto"/>
+          <w:sz w:val="22"/>
+          <w:szCs w:val="22"/>
+        </w:rPr>
+        <w:t xml:space="preserve">         </w:t>
+      </w:r>
+      <w:r>
+        <w:rPr>
+          <w:rFonts w:ascii="Garamond" w:hAnsi="Garamond"/>
+          <w:b/>
+          <w:bCs/>
+          <w:color w:val="auto"/>
+          <w:sz w:val="22"/>
+          <w:szCs w:val="22"/>
+        </w:rPr>
+        <w:t>March 2025 – October 2025</w:t>
+      </w:r>
+    </w:p>
+    <w:p>
+      <w:pPr>
+        <w:pStyle w:val="Default"/>
+        <w:rPr>
+          <w:rFonts w:ascii="Garamond" w:hAnsi="Garamond"/>
+          <w:bCs/>
+          <w:i/>
+          <w:sz w:val="22"/>
+          <w:szCs w:val="22"/>
+        </w:rPr>
+      </w:pPr>
+      <w:r>
+        <w:rPr>
+          <w:rFonts w:ascii="Garamond" w:hAnsi="Garamond"/>
+          <w:bCs/>
+          <w:i/>
+          <w:color w:val="auto"/>
+          <w:sz w:val="22"/>
+          <w:szCs w:val="22"/>
+        </w:rPr>
+        <w:t>Retail Customer Service Associate</w:t>
+      </w:r>
+      <w:r>
+        <w:rPr>
+          <w:rFonts w:ascii="Garamond" w:hAnsi="Garamond"/>
+          <w:bCs/>
+          <w:i/>
+          <w:sz w:val="22"/>
+          <w:szCs w:val="22"/>
+        </w:rPr>
+        <w:tab/>
+      </w:r>
+      <w:r>
+        <w:rPr>
+          <w:rFonts w:ascii="Garamond" w:hAnsi="Garamond"/>
+          <w:bCs/>
+          <w:i/>
+          <w:color w:val="auto"/>
+          <w:sz w:val="22"/>
+          <w:szCs w:val="22"/>
+        </w:rPr>
+        <w:tab/>
+      </w:r>
+      <w:r>
+        <w:rPr>
+          <w:rFonts w:ascii="Garamond" w:hAnsi="Garamond"/>
+          <w:bCs/>
+          <w:i/>
+          <w:color w:val="auto"/>
+          <w:sz w:val="22"/>
+          <w:szCs w:val="22"/>
+        </w:rPr>
+        <w:tab/>
+      </w:r>
+      <w:r>
+        <w:rPr>
+          <w:rFonts w:ascii="Garamond" w:hAnsi="Garamond"/>
+          <w:bCs/>
+          <w:i/>
+          <w:color w:val="auto"/>
+          <w:sz w:val="22"/>
+          <w:szCs w:val="22"/>
+        </w:rPr>
+        <w:tab/>
+      </w:r>
+      <w:r>
+        <w:rPr>
+          <w:rFonts w:ascii="Garamond" w:hAnsi="Garamond"/>
+          <w:bCs/>
+          <w:i/>
+          <w:color w:val="auto"/>
+          <w:sz w:val="22"/>
+          <w:szCs w:val="22"/>
+        </w:rPr>
+        <w:tab/>
+        <w:t xml:space="preserve"> </w:t>
+      </w:r>
+      <w:r>
+        <w:rPr>
+          <w:rFonts w:ascii="Garamond" w:hAnsi="Garamond"/>
+          <w:bCs/>
+          <w:i/>
+          <w:color w:val="auto"/>
+          <w:sz w:val="22"/>
+          <w:szCs w:val="22"/>
+        </w:rPr>
+        <w:tab/>
+      </w:r>
+      <w:r>
+        <w:rPr>
+          <w:rFonts w:ascii="Garamond" w:hAnsi="Garamond"/>
+          <w:bCs/>
+          <w:i/>
+          <w:color w:val="auto"/>
+          <w:sz w:val="22"/>
+          <w:szCs w:val="22"/>
+        </w:rPr>
+        <w:tab/>
+      </w:r>
+      <w:r>
+        <w:rPr>
+          <w:rFonts w:ascii="Garamond" w:hAnsi="Garamond"/>
+          <w:bCs/>
+          <w:i/>
+          <w:color w:val="auto"/>
+          <w:sz w:val="22"/>
+          <w:szCs w:val="22"/>
+        </w:rPr>
+        <w:tab/>
+        <w:t xml:space="preserve">          </w:t>
+      </w:r>
+      <w:r>
+        <w:rPr>
+          <w:rFonts w:ascii="Garamond" w:hAnsi="Garamond"/>
+          <w:bCs/>
+          <w:i/>
+          <w:color w:val="auto"/>
+          <w:sz w:val="22"/>
+          <w:szCs w:val="22"/>
+        </w:rPr>
+        <w:tab/>
+        <w:t xml:space="preserve">                  </w:t>
+      </w:r>
+      <w:r>
+        <w:rPr>
+          <w:rFonts w:ascii="Garamond" w:hAnsi="Garamond"/>
+          <w:bCs/>
+          <w:i/>
+          <w:color w:val="auto"/>
+          <w:sz w:val="22"/>
+          <w:szCs w:val="22"/>
+        </w:rPr>
+        <w:t xml:space="preserve">   </w:t>
+      </w:r>
+      <w:r>
+        <w:rPr>
+          <w:rFonts w:ascii="Garamond" w:hAnsi="Garamond"/>
+          <w:bCs/>
+          <w:i/>
+          <w:color w:val="auto"/>
+          <w:sz w:val="22"/>
+          <w:szCs w:val="22"/>
+        </w:rPr>
+        <w:t>Omaha, NE</w:t>
       </w:r>
     </w:p>
     <w:p>
@@ -1736,28 +1591,36 @@
         <w:rPr>
           <w:rFonts w:ascii="Garamond" w:hAnsi="Garamond"/>
           <w:bCs/>
-        </w:rPr>
-      </w:pPr>
-      <w:r>
-        <w:rPr>
-          <w:rFonts w:ascii="Garamond" w:hAnsi="Garamond"/>
-          <w:bCs/>
-        </w:rPr>
-        <w:t>Used online tools to evaluate AI performance</w:t>
-      </w:r>
-      <w:r>
-        <w:rPr>
-          <w:rFonts w:ascii="Garamond" w:hAnsi="Garamond"/>
-          <w:bCs/>
-        </w:rPr>
-        <w:t xml:space="preserve"> and webpages</w:t>
-      </w:r>
-      <w:r>
-        <w:rPr>
-          <w:rFonts w:ascii="Garamond" w:hAnsi="Garamond"/>
-          <w:bCs/>
-        </w:rPr>
-        <w:t>, identifying areas for improvement, and ensuring alignment with expected standards.</w:t>
+          <w:sz w:val="22"/>
+          <w:szCs w:val="22"/>
+        </w:rPr>
+      </w:pPr>
+      <w:r>
+        <w:rPr>
+          <w:rFonts w:ascii="Garamond" w:hAnsi="Garamond"/>
+          <w:bCs/>
+          <w:sz w:val="22"/>
+          <w:szCs w:val="22"/>
+        </w:rPr>
+        <w:t>Support</w:t>
+      </w:r>
+      <w:r>
+        <w:rPr>
+          <w:rFonts w:ascii="Garamond" w:hAnsi="Garamond"/>
+          <w:bCs/>
+          <w:sz w:val="22"/>
+          <w:szCs w:val="22"/>
+        </w:rPr>
+        <w:t>ed</w:t>
+      </w:r>
+      <w:r>
+        <w:rPr>
+          <w:rFonts w:ascii="Garamond" w:hAnsi="Garamond"/>
+          <w:bCs/>
+          <w:sz w:val="22"/>
+          <w:szCs w:val="22"/>
+        </w:rPr>
+        <w:t xml:space="preserve"> customers with shipping, digital printing services, file formatting, and troubleshooting basic tech issues.</w:t>
       </w:r>
     </w:p>
     <w:p>
@@ -1770,29 +1633,460 @@
         <w:rPr>
           <w:rFonts w:ascii="Garamond" w:hAnsi="Garamond"/>
           <w:bCs/>
-        </w:rPr>
-      </w:pPr>
-      <w:r>
-        <w:rPr>
-          <w:rFonts w:ascii="Garamond" w:hAnsi="Garamond"/>
-          <w:bCs/>
-        </w:rPr>
-        <w:t>Independently analyzed and provided feedback on many AI models/webpages per day while managing task prioritization in a fast-paced remote role.</w:t>
+          <w:sz w:val="22"/>
+          <w:szCs w:val="22"/>
+        </w:rPr>
+      </w:pPr>
+      <w:r>
+        <w:rPr>
+          <w:rFonts w:ascii="Garamond" w:hAnsi="Garamond"/>
+          <w:bCs/>
+          <w:sz w:val="22"/>
+          <w:szCs w:val="22"/>
+        </w:rPr>
+        <w:t>Operate</w:t>
+      </w:r>
+      <w:r>
+        <w:rPr>
+          <w:rFonts w:ascii="Garamond" w:hAnsi="Garamond"/>
+          <w:bCs/>
+          <w:sz w:val="22"/>
+          <w:szCs w:val="22"/>
+        </w:rPr>
+        <w:t>d</w:t>
+      </w:r>
+      <w:r>
+        <w:rPr>
+          <w:rFonts w:ascii="Garamond" w:hAnsi="Garamond"/>
+          <w:bCs/>
+          <w:sz w:val="22"/>
+          <w:szCs w:val="22"/>
+        </w:rPr>
+        <w:t xml:space="preserve"> and maintain</w:t>
+      </w:r>
+      <w:r>
+        <w:rPr>
+          <w:rFonts w:ascii="Garamond" w:hAnsi="Garamond"/>
+          <w:bCs/>
+          <w:sz w:val="22"/>
+          <w:szCs w:val="22"/>
+        </w:rPr>
+        <w:t>ed</w:t>
+      </w:r>
+      <w:r>
+        <w:rPr>
+          <w:rFonts w:ascii="Garamond" w:hAnsi="Garamond"/>
+          <w:bCs/>
+          <w:sz w:val="22"/>
+          <w:szCs w:val="22"/>
+        </w:rPr>
+        <w:t xml:space="preserve"> networked printers, copiers, and shipping systems, ensuring prompt service.</w:t>
       </w:r>
     </w:p>
     <w:p>
       <w:pPr>
         <w:pStyle w:val="Default"/>
-        <w:rPr>
-          <w:rFonts w:ascii="Garamond" w:hAnsi="Garamond"/>
-        </w:rPr>
-      </w:pPr>
+        <w:numPr>
+          <w:ilvl w:val="0"/>
+          <w:numId w:val="19"/>
+        </w:numPr>
+        <w:rPr>
+          <w:rFonts w:ascii="Garamond" w:hAnsi="Garamond"/>
+          <w:b/>
+          <w:bCs/>
+          <w:color w:val="auto"/>
+          <w:sz w:val="20"/>
+          <w:szCs w:val="20"/>
+        </w:rPr>
+      </w:pPr>
+      <w:r>
+        <w:rPr>
+          <w:rFonts w:ascii="Garamond" w:hAnsi="Garamond"/>
+          <w:bCs/>
+          <w:sz w:val="22"/>
+          <w:szCs w:val="22"/>
+        </w:rPr>
+        <w:t>Utilize</w:t>
+      </w:r>
+      <w:r>
+        <w:rPr>
+          <w:rFonts w:ascii="Garamond" w:hAnsi="Garamond"/>
+          <w:bCs/>
+          <w:sz w:val="22"/>
+          <w:szCs w:val="22"/>
+        </w:rPr>
+        <w:t>d</w:t>
+      </w:r>
+      <w:r>
+        <w:rPr>
+          <w:rFonts w:ascii="Garamond" w:hAnsi="Garamond"/>
+          <w:bCs/>
+          <w:sz w:val="22"/>
+          <w:szCs w:val="22"/>
+        </w:rPr>
+        <w:t xml:space="preserve"> internal systems to manage orders, track shipments, and resolve technical or service-related inquiries.</w:t>
+      </w:r>
     </w:p>
     <w:p>
       <w:pPr>
         <w:pStyle w:val="Default"/>
         <w:rPr>
           <w:rFonts w:ascii="Garamond" w:hAnsi="Garamond"/>
+          <w:b/>
+          <w:bCs/>
+          <w:color w:val="auto"/>
+          <w:sz w:val="22"/>
+          <w:szCs w:val="22"/>
+        </w:rPr>
+      </w:pPr>
+    </w:p>
+    <w:p>
+      <w:pPr>
+        <w:pStyle w:val="Default"/>
+        <w:rPr>
+          <w:rFonts w:ascii="Garamond" w:hAnsi="Garamond"/>
+          <w:b/>
+          <w:bCs/>
+          <w:color w:val="auto"/>
+          <w:sz w:val="22"/>
+          <w:szCs w:val="22"/>
+        </w:rPr>
+      </w:pPr>
+      <w:r>
+        <w:rPr>
+          <w:rFonts w:ascii="Garamond" w:hAnsi="Garamond"/>
+          <w:b/>
+          <w:bCs/>
+          <w:color w:val="auto"/>
+          <w:sz w:val="22"/>
+          <w:szCs w:val="22"/>
+        </w:rPr>
+        <w:t>TELUS Digital</w:t>
+      </w:r>
+      <w:r>
+        <w:rPr>
+          <w:rFonts w:ascii="Garamond" w:hAnsi="Garamond"/>
+          <w:b/>
+          <w:bCs/>
+          <w:color w:val="auto"/>
+          <w:sz w:val="22"/>
+          <w:szCs w:val="22"/>
+        </w:rPr>
+        <w:tab/>
+      </w:r>
+      <w:r>
+        <w:rPr>
+          <w:rFonts w:ascii="Garamond" w:hAnsi="Garamond"/>
+          <w:b/>
+          <w:bCs/>
+          <w:color w:val="auto"/>
+          <w:sz w:val="22"/>
+          <w:szCs w:val="22"/>
+        </w:rPr>
+        <w:tab/>
+      </w:r>
+      <w:r>
+        <w:rPr>
+          <w:rFonts w:ascii="Garamond" w:hAnsi="Garamond"/>
+          <w:b/>
+          <w:bCs/>
+          <w:color w:val="auto"/>
+          <w:sz w:val="22"/>
+          <w:szCs w:val="22"/>
+        </w:rPr>
+        <w:tab/>
+      </w:r>
+      <w:r>
+        <w:rPr>
+          <w:rFonts w:ascii="Garamond" w:hAnsi="Garamond"/>
+          <w:b/>
+          <w:bCs/>
+          <w:color w:val="auto"/>
+          <w:sz w:val="22"/>
+          <w:szCs w:val="22"/>
+        </w:rPr>
+        <w:tab/>
+      </w:r>
+      <w:r>
+        <w:rPr>
+          <w:rFonts w:ascii="Garamond" w:hAnsi="Garamond"/>
+          <w:b/>
+          <w:bCs/>
+          <w:color w:val="auto"/>
+          <w:sz w:val="22"/>
+          <w:szCs w:val="22"/>
+        </w:rPr>
+        <w:tab/>
+        <w:t xml:space="preserve">                                       </w:t>
+      </w:r>
+      <w:r>
+        <w:rPr>
+          <w:rFonts w:ascii="Garamond" w:hAnsi="Garamond"/>
+          <w:b/>
+          <w:bCs/>
+          <w:color w:val="auto"/>
+          <w:sz w:val="22"/>
+          <w:szCs w:val="22"/>
+        </w:rPr>
+        <w:t xml:space="preserve">                      </w:t>
+      </w:r>
+      <w:r>
+        <w:rPr>
+          <w:rFonts w:ascii="Garamond" w:hAnsi="Garamond"/>
+          <w:b/>
+          <w:bCs/>
+          <w:color w:val="auto"/>
+          <w:sz w:val="22"/>
+          <w:szCs w:val="22"/>
+        </w:rPr>
+        <w:t>December 2023 – December 2024</w:t>
+      </w:r>
+    </w:p>
+    <w:p>
+      <w:pPr>
+        <w:pStyle w:val="Default"/>
+        <w:rPr>
+          <w:rFonts w:ascii="Garamond" w:hAnsi="Garamond"/>
+          <w:bCs/>
+          <w:i/>
+          <w:sz w:val="22"/>
+          <w:szCs w:val="22"/>
+        </w:rPr>
+      </w:pPr>
+      <w:r>
+        <w:rPr>
+          <w:rFonts w:ascii="Garamond" w:hAnsi="Garamond"/>
+          <w:bCs/>
+          <w:i/>
+          <w:color w:val="auto"/>
+          <w:sz w:val="22"/>
+          <w:szCs w:val="22"/>
+        </w:rPr>
+        <w:t>AI and Web Analyst</w:t>
+      </w:r>
+      <w:r>
+        <w:rPr>
+          <w:rFonts w:ascii="Garamond" w:hAnsi="Garamond"/>
+          <w:bCs/>
+          <w:i/>
+          <w:sz w:val="22"/>
+          <w:szCs w:val="22"/>
+        </w:rPr>
+        <w:tab/>
+      </w:r>
+      <w:r>
+        <w:rPr>
+          <w:rFonts w:ascii="Garamond" w:hAnsi="Garamond"/>
+          <w:bCs/>
+          <w:i/>
+          <w:sz w:val="22"/>
+          <w:szCs w:val="22"/>
+        </w:rPr>
+        <w:tab/>
+      </w:r>
+      <w:r>
+        <w:rPr>
+          <w:rFonts w:ascii="Garamond" w:hAnsi="Garamond"/>
+          <w:bCs/>
+          <w:i/>
+          <w:color w:val="auto"/>
+          <w:sz w:val="22"/>
+          <w:szCs w:val="22"/>
+        </w:rPr>
+        <w:tab/>
+      </w:r>
+      <w:r>
+        <w:rPr>
+          <w:rFonts w:ascii="Garamond" w:hAnsi="Garamond"/>
+          <w:bCs/>
+          <w:i/>
+          <w:color w:val="auto"/>
+          <w:sz w:val="22"/>
+          <w:szCs w:val="22"/>
+        </w:rPr>
+        <w:tab/>
+      </w:r>
+      <w:r>
+        <w:rPr>
+          <w:rFonts w:ascii="Garamond" w:hAnsi="Garamond"/>
+          <w:bCs/>
+          <w:i/>
+          <w:color w:val="auto"/>
+          <w:sz w:val="22"/>
+          <w:szCs w:val="22"/>
+        </w:rPr>
+        <w:tab/>
+      </w:r>
+      <w:r>
+        <w:rPr>
+          <w:rFonts w:ascii="Garamond" w:hAnsi="Garamond"/>
+          <w:bCs/>
+          <w:i/>
+          <w:color w:val="auto"/>
+          <w:sz w:val="22"/>
+          <w:szCs w:val="22"/>
+        </w:rPr>
+        <w:tab/>
+        <w:t xml:space="preserve"> </w:t>
+      </w:r>
+      <w:r>
+        <w:rPr>
+          <w:rFonts w:ascii="Garamond" w:hAnsi="Garamond"/>
+          <w:bCs/>
+          <w:i/>
+          <w:color w:val="auto"/>
+          <w:sz w:val="22"/>
+          <w:szCs w:val="22"/>
+        </w:rPr>
+        <w:tab/>
+      </w:r>
+      <w:r>
+        <w:rPr>
+          <w:rFonts w:ascii="Garamond" w:hAnsi="Garamond"/>
+          <w:bCs/>
+          <w:i/>
+          <w:color w:val="auto"/>
+          <w:sz w:val="22"/>
+          <w:szCs w:val="22"/>
+        </w:rPr>
+        <w:tab/>
+      </w:r>
+      <w:r>
+        <w:rPr>
+          <w:rFonts w:ascii="Garamond" w:hAnsi="Garamond"/>
+          <w:bCs/>
+          <w:i/>
+          <w:color w:val="auto"/>
+          <w:sz w:val="22"/>
+          <w:szCs w:val="22"/>
+        </w:rPr>
+        <w:tab/>
+        <w:t xml:space="preserve">          </w:t>
+      </w:r>
+      <w:r>
+        <w:rPr>
+          <w:rFonts w:ascii="Garamond" w:hAnsi="Garamond"/>
+          <w:bCs/>
+          <w:i/>
+          <w:color w:val="auto"/>
+          <w:sz w:val="22"/>
+          <w:szCs w:val="22"/>
+        </w:rPr>
+        <w:tab/>
+        <w:t xml:space="preserve">                          </w:t>
+      </w:r>
+      <w:r>
+        <w:rPr>
+          <w:rFonts w:ascii="Garamond" w:hAnsi="Garamond"/>
+          <w:bCs/>
+          <w:i/>
+          <w:color w:val="auto"/>
+          <w:sz w:val="22"/>
+          <w:szCs w:val="22"/>
+        </w:rPr>
+        <w:t xml:space="preserve">   </w:t>
+      </w:r>
+      <w:r>
+        <w:rPr>
+          <w:rFonts w:ascii="Garamond" w:hAnsi="Garamond"/>
+          <w:bCs/>
+          <w:i/>
+          <w:color w:val="auto"/>
+          <w:sz w:val="22"/>
+          <w:szCs w:val="22"/>
+        </w:rPr>
+        <w:t>Remote</w:t>
+      </w:r>
+    </w:p>
+    <w:p>
+      <w:pPr>
+        <w:pStyle w:val="Default"/>
+        <w:numPr>
+          <w:ilvl w:val="0"/>
+          <w:numId w:val="19"/>
+        </w:numPr>
+        <w:rPr>
+          <w:rFonts w:ascii="Garamond" w:hAnsi="Garamond"/>
+          <w:bCs/>
+          <w:sz w:val="22"/>
+          <w:szCs w:val="22"/>
+        </w:rPr>
+      </w:pPr>
+      <w:r>
+        <w:rPr>
+          <w:rFonts w:ascii="Garamond" w:hAnsi="Garamond"/>
+          <w:bCs/>
+          <w:sz w:val="22"/>
+          <w:szCs w:val="22"/>
+        </w:rPr>
+        <w:t>Analyzed and provided detailed feedback to ensure quality standards across various digital assets.</w:t>
+      </w:r>
+    </w:p>
+    <w:p>
+      <w:pPr>
+        <w:pStyle w:val="Default"/>
+        <w:numPr>
+          <w:ilvl w:val="0"/>
+          <w:numId w:val="19"/>
+        </w:numPr>
+        <w:rPr>
+          <w:rFonts w:ascii="Garamond" w:hAnsi="Garamond"/>
+          <w:bCs/>
+          <w:sz w:val="22"/>
+          <w:szCs w:val="22"/>
+        </w:rPr>
+      </w:pPr>
+      <w:r>
+        <w:rPr>
+          <w:rFonts w:ascii="Garamond" w:hAnsi="Garamond"/>
+          <w:bCs/>
+          <w:sz w:val="22"/>
+          <w:szCs w:val="22"/>
+        </w:rPr>
+        <w:t>Used online tools to evaluate AI performance and webpages, identifying areas for improvement, and ensuring alignment with expected standards.</w:t>
+      </w:r>
+    </w:p>
+    <w:p>
+      <w:pPr>
+        <w:pStyle w:val="Default"/>
+        <w:numPr>
+          <w:ilvl w:val="0"/>
+          <w:numId w:val="19"/>
+        </w:numPr>
+        <w:rPr>
+          <w:rFonts w:ascii="Garamond" w:hAnsi="Garamond"/>
+          <w:bCs/>
+          <w:sz w:val="22"/>
+          <w:szCs w:val="22"/>
+        </w:rPr>
+      </w:pPr>
+      <w:r>
+        <w:rPr>
+          <w:rFonts w:ascii="Garamond" w:hAnsi="Garamond"/>
+          <w:bCs/>
+          <w:sz w:val="22"/>
+          <w:szCs w:val="22"/>
+        </w:rPr>
+        <w:t>Independently analyzed and provided feedback on many AI models/webpages per day while managing task prioritization in a fast-paced remote role.</w:t>
+      </w:r>
+    </w:p>
+    <w:p>
+      <w:pPr>
+        <w:pStyle w:val="Default"/>
+        <w:rPr>
+          <w:rFonts w:ascii="Garamond" w:hAnsi="Garamond"/>
+          <w:sz w:val="22"/>
+          <w:szCs w:val="22"/>
+        </w:rPr>
+      </w:pPr>
+    </w:p>
+    <w:p>
+      <w:pPr>
+        <w:pStyle w:val="Default"/>
+        <w:rPr>
+          <w:rFonts w:ascii="Garamond" w:hAnsi="Garamond"/>
+          <w:sz w:val="22"/>
+          <w:szCs w:val="22"/>
         </w:rPr>
       </w:pPr>
     </w:p>
@@ -1807,18 +2101,18 @@
           <w:b/>
           <w:bCs/>
           <w:color w:val="auto"/>
-          <w:sz w:val="32"/>
-          <w:szCs w:val="32"/>
-        </w:rPr>
-      </w:pPr>
-      <w:r>
-        <w:rPr>
-          <w:rFonts w:ascii="Garamond" w:hAnsi="Garamond"/>
-          <w:b/>
-          <w:bCs/>
-          <w:color w:val="auto"/>
-          <w:sz w:val="32"/>
-          <w:szCs w:val="32"/>
+          <w:sz w:val="28"/>
+          <w:szCs w:val="28"/>
+        </w:rPr>
+      </w:pPr>
+      <w:r>
+        <w:rPr>
+          <w:rFonts w:ascii="Garamond" w:hAnsi="Garamond"/>
+          <w:b/>
+          <w:bCs/>
+          <w:color w:val="auto"/>
+          <w:sz w:val="28"/>
+          <w:szCs w:val="28"/>
         </w:rPr>
         <w:t>SKILLS &amp; INTERESTS</w:t>
       </w:r>
@@ -1831,6 +2125,8 @@
         <w:rPr>
           <w:rFonts w:ascii="Garamond" w:hAnsi="Garamond"/>
           <w:color w:val="auto"/>
+          <w:sz w:val="22"/>
+          <w:szCs w:val="22"/>
         </w:rPr>
       </w:pPr>
     </w:p>
@@ -1843,14 +2139,18 @@
           <w:rFonts w:ascii="Garamond" w:hAnsi="Garamond"/>
           <w:bCs/>
           <w:color w:val="auto"/>
-        </w:rPr>
-      </w:pPr>
-      <w:r>
-        <w:rPr>
-          <w:rFonts w:ascii="Garamond" w:hAnsi="Garamond"/>
-          <w:b/>
-          <w:bCs/>
-          <w:color w:val="auto"/>
+          <w:sz w:val="22"/>
+          <w:szCs w:val="22"/>
+        </w:rPr>
+      </w:pPr>
+      <w:r>
+        <w:rPr>
+          <w:rFonts w:ascii="Garamond" w:hAnsi="Garamond"/>
+          <w:b/>
+          <w:bCs/>
+          <w:color w:val="auto"/>
+          <w:sz w:val="22"/>
+          <w:szCs w:val="22"/>
         </w:rPr>
         <w:t>Skills:</w:t>
       </w:r>
@@ -1859,6 +2159,18 @@
           <w:rFonts w:ascii="Garamond" w:hAnsi="Garamond"/>
           <w:bCs/>
           <w:color w:val="auto"/>
+          <w:sz w:val="22"/>
+          <w:szCs w:val="22"/>
+        </w:rPr>
+        <w:t xml:space="preserve"> Operating Systems (Windows, Linux, macOS), Microsoft Office, Network Security, Protocols (TCP/IP, UDP, DNS, HTTP/HTTPS), Troubleshooting (Hardware, Software), Technical Support,</w:t>
+      </w:r>
+      <w:r>
+        <w:rPr>
+          <w:rFonts w:ascii="Garamond" w:hAnsi="Garamond"/>
+          <w:bCs/>
+          <w:color w:val="auto"/>
+          <w:sz w:val="22"/>
+          <w:szCs w:val="22"/>
         </w:rPr>
         <w:t xml:space="preserve"> </w:t>
       </w:r>
@@ -1867,136 +2179,20 @@
           <w:rFonts w:ascii="Garamond" w:hAnsi="Garamond"/>
           <w:bCs/>
           <w:color w:val="auto"/>
-        </w:rPr>
-        <w:t>Operating Systems (Windows, Linux, macOS)</w:t>
-      </w:r>
-      <w:r>
-        <w:rPr>
-          <w:rFonts w:ascii="Garamond" w:hAnsi="Garamond"/>
-          <w:bCs/>
-          <w:color w:val="auto"/>
-        </w:rPr>
-        <w:t>,</w:t>
-      </w:r>
-      <w:r>
-        <w:rPr>
-          <w:rFonts w:ascii="Garamond" w:hAnsi="Garamond"/>
-          <w:bCs/>
-          <w:color w:val="auto"/>
-        </w:rPr>
-        <w:t xml:space="preserve"> Microsoft </w:t>
-      </w:r>
-      <w:r>
-        <w:rPr>
-          <w:rFonts w:ascii="Garamond" w:hAnsi="Garamond"/>
-          <w:bCs/>
-          <w:color w:val="auto"/>
-        </w:rPr>
-        <w:t>Office</w:t>
-      </w:r>
-      <w:r>
-        <w:rPr>
-          <w:rFonts w:ascii="Garamond" w:hAnsi="Garamond"/>
-          <w:bCs/>
-          <w:color w:val="auto"/>
-        </w:rPr>
-        <w:t>,</w:t>
-      </w:r>
-      <w:r>
-        <w:rPr>
-          <w:rFonts w:ascii="Garamond" w:hAnsi="Garamond"/>
-          <w:bCs/>
-          <w:color w:val="auto"/>
-        </w:rPr>
-        <w:t xml:space="preserve"> Network</w:t>
-      </w:r>
-      <w:r>
-        <w:rPr>
-          <w:rFonts w:ascii="Garamond" w:hAnsi="Garamond"/>
-          <w:bCs/>
-          <w:color w:val="auto"/>
-        </w:rPr>
-        <w:t xml:space="preserve"> Security</w:t>
-      </w:r>
-      <w:r>
-        <w:rPr>
-          <w:rFonts w:ascii="Garamond" w:hAnsi="Garamond"/>
-          <w:bCs/>
-          <w:color w:val="auto"/>
-        </w:rPr>
-        <w:t>,</w:t>
-      </w:r>
-      <w:r>
-        <w:rPr>
-          <w:rFonts w:ascii="Garamond" w:hAnsi="Garamond"/>
-          <w:bCs/>
-          <w:color w:val="auto"/>
-        </w:rPr>
-        <w:t xml:space="preserve"> Protocols</w:t>
-      </w:r>
-      <w:r>
-        <w:rPr>
-          <w:rFonts w:ascii="Garamond" w:hAnsi="Garamond"/>
-          <w:bCs/>
-          <w:color w:val="auto"/>
-        </w:rPr>
-        <w:t xml:space="preserve"> (TCP/IP, UDP, DNS, HTTP/HTTPS)</w:t>
-      </w:r>
-      <w:r>
-        <w:rPr>
-          <w:rFonts w:ascii="Garamond" w:hAnsi="Garamond"/>
-          <w:bCs/>
-          <w:color w:val="auto"/>
-        </w:rPr>
-        <w:t>,</w:t>
-      </w:r>
-      <w:r>
-        <w:rPr>
-          <w:rFonts w:ascii="Garamond" w:hAnsi="Garamond"/>
-          <w:bCs/>
-          <w:color w:val="auto"/>
-        </w:rPr>
-        <w:t xml:space="preserve"> Troubleshooting</w:t>
-      </w:r>
-      <w:r>
-        <w:rPr>
-          <w:rFonts w:ascii="Garamond" w:hAnsi="Garamond"/>
-          <w:bCs/>
-          <w:color w:val="auto"/>
-        </w:rPr>
-        <w:t xml:space="preserve"> (Hardware, Software)</w:t>
-      </w:r>
-      <w:r>
-        <w:rPr>
-          <w:rFonts w:ascii="Garamond" w:hAnsi="Garamond"/>
-          <w:bCs/>
-          <w:color w:val="auto"/>
-        </w:rPr>
-        <w:t>,</w:t>
-      </w:r>
-      <w:r>
-        <w:rPr>
-          <w:rFonts w:ascii="Garamond" w:hAnsi="Garamond"/>
-          <w:bCs/>
-          <w:color w:val="auto"/>
-        </w:rPr>
-        <w:t xml:space="preserve"> </w:t>
-      </w:r>
-      <w:r>
-        <w:rPr>
-          <w:rFonts w:ascii="Garamond" w:hAnsi="Garamond"/>
-          <w:bCs/>
-          <w:color w:val="auto"/>
-        </w:rPr>
-        <w:t>Technical Support</w:t>
-      </w:r>
-      <w:r>
-        <w:rPr>
-          <w:rFonts w:ascii="Garamond" w:hAnsi="Garamond"/>
-          <w:bCs/>
-          <w:color w:val="auto"/>
-        </w:rPr>
-        <w:t>,</w:t>
+          <w:sz w:val="22"/>
+          <w:szCs w:val="22"/>
+        </w:rPr>
+        <w:t>Printer Troubleshooting, PC Building</w:t>
+      </w:r>
+      <w:r>
+        <w:rPr>
+          <w:rFonts w:ascii="Garamond" w:hAnsi="Garamond"/>
+          <w:bCs/>
+          <w:color w:val="auto"/>
+          <w:sz w:val="22"/>
+          <w:szCs w:val="22"/>
+        </w:rPr>
+        <w:t>, IGEL/thin client support</w:t>
       </w:r>
     </w:p>
     <w:p>
@@ -2007,32 +2203,10 @@
         <w:rPr>
           <w:rFonts w:ascii="Garamond" w:hAnsi="Garamond"/>
           <w:color w:val="auto"/>
-        </w:rPr>
-      </w:pPr>
-      <w:r>
-        <w:rPr>
-          <w:rFonts w:ascii="Garamond" w:hAnsi="Garamond"/>
-          <w:bCs/>
-          <w:color w:val="auto"/>
-        </w:rPr>
-        <w:t xml:space="preserve">Printer </w:t>
-      </w:r>
-      <w:r>
-        <w:rPr>
-          <w:rFonts w:ascii="Garamond" w:hAnsi="Garamond"/>
-          <w:bCs/>
-          <w:color w:val="auto"/>
-        </w:rPr>
-        <w:t>Troubleshooting</w:t>
-      </w:r>
-      <w:r>
-        <w:rPr>
-          <w:rFonts w:ascii="Garamond" w:hAnsi="Garamond"/>
-          <w:bCs/>
-          <w:color w:val="auto"/>
-        </w:rPr>
-        <w:t>, PC Building</w:t>
-      </w:r>
+          <w:sz w:val="22"/>
+          <w:szCs w:val="22"/>
+        </w:rPr>
+      </w:pPr>
     </w:p>
     <w:p>
       <w:pPr>
@@ -2042,8 +2216,31 @@
         <w:rPr>
           <w:rFonts w:ascii="Garamond" w:hAnsi="Garamond"/>
           <w:color w:val="auto"/>
-        </w:rPr>
-      </w:pPr>
+          <w:sz w:val="22"/>
+          <w:szCs w:val="22"/>
+        </w:rPr>
+      </w:pPr>
+      <w:r>
+        <w:rPr>
+          <w:rFonts w:ascii="Garamond" w:hAnsi="Garamond"/>
+          <w:b/>
+          <w:bCs/>
+          <w:color w:val="auto"/>
+          <w:sz w:val="22"/>
+          <w:szCs w:val="22"/>
+        </w:rPr>
+        <w:t>Soft Skills:</w:t>
+      </w:r>
+      <w:r>
+        <w:rPr>
+          <w:rFonts w:ascii="Garamond" w:hAnsi="Garamond"/>
+          <w:bCs/>
+          <w:color w:val="auto"/>
+          <w:sz w:val="22"/>
+          <w:szCs w:val="22"/>
+        </w:rPr>
+        <w:t xml:space="preserve"> Time Management, Teamwork, Collaboration, Communication, Customer Service, Adaptability, Problem-Solving, Attention to Detail, Self-Motivation, Analytical Thinking</w:t>
+      </w:r>
     </w:p>
     <w:p>
       <w:pPr>
@@ -2053,348 +2250,40 @@
         <w:rPr>
           <w:rFonts w:ascii="Garamond" w:hAnsi="Garamond"/>
           <w:color w:val="auto"/>
-        </w:rPr>
-      </w:pPr>
-      <w:r>
-        <w:rPr>
-          <w:rFonts w:ascii="Garamond" w:hAnsi="Garamond"/>
-          <w:b/>
-          <w:bCs/>
-          <w:color w:val="auto"/>
-        </w:rPr>
-        <w:t>Soft</w:t>
-      </w:r>
-      <w:r>
-        <w:rPr>
-          <w:rFonts w:ascii="Garamond" w:hAnsi="Garamond"/>
-          <w:b/>
-          <w:bCs/>
-          <w:color w:val="auto"/>
-        </w:rPr>
-        <w:t xml:space="preserve"> </w:t>
-      </w:r>
-      <w:r>
-        <w:rPr>
-          <w:rFonts w:ascii="Garamond" w:hAnsi="Garamond"/>
-          <w:b/>
-          <w:bCs/>
-          <w:color w:val="auto"/>
-        </w:rPr>
-        <w:t>Skills:</w:t>
-      </w:r>
-      <w:r>
-        <w:rPr>
-          <w:rFonts w:ascii="Garamond" w:hAnsi="Garamond"/>
-          <w:bCs/>
-          <w:color w:val="auto"/>
-        </w:rPr>
-        <w:t xml:space="preserve"> </w:t>
-      </w:r>
-      <w:r>
-        <w:rPr>
-          <w:rFonts w:ascii="Garamond" w:hAnsi="Garamond"/>
-          <w:bCs/>
-          <w:color w:val="auto"/>
-        </w:rPr>
-        <w:t>Time Management</w:t>
-      </w:r>
-      <w:r>
-        <w:rPr>
-          <w:rFonts w:ascii="Garamond" w:hAnsi="Garamond"/>
-          <w:bCs/>
-          <w:color w:val="auto"/>
-        </w:rPr>
-        <w:t>,</w:t>
-      </w:r>
-      <w:r>
-        <w:rPr>
-          <w:rFonts w:ascii="Garamond" w:hAnsi="Garamond"/>
-          <w:bCs/>
-          <w:color w:val="auto"/>
-        </w:rPr>
-        <w:t xml:space="preserve"> Teamwork</w:t>
-      </w:r>
-      <w:r>
-        <w:rPr>
-          <w:rFonts w:ascii="Garamond" w:hAnsi="Garamond"/>
-          <w:bCs/>
-          <w:color w:val="auto"/>
-        </w:rPr>
-        <w:t>,</w:t>
-      </w:r>
-      <w:r>
-        <w:rPr>
-          <w:rFonts w:ascii="Garamond" w:hAnsi="Garamond"/>
-          <w:bCs/>
-          <w:color w:val="auto"/>
-        </w:rPr>
-        <w:t xml:space="preserve"> Collaboration</w:t>
-      </w:r>
-      <w:r>
-        <w:rPr>
-          <w:rFonts w:ascii="Garamond" w:hAnsi="Garamond"/>
-          <w:bCs/>
-          <w:color w:val="auto"/>
-        </w:rPr>
-        <w:t>,</w:t>
-      </w:r>
-      <w:r>
-        <w:rPr>
-          <w:rFonts w:ascii="Garamond" w:hAnsi="Garamond"/>
-          <w:bCs/>
-          <w:color w:val="auto"/>
-        </w:rPr>
-        <w:t xml:space="preserve"> Communication</w:t>
-      </w:r>
-      <w:r>
-        <w:rPr>
-          <w:rFonts w:ascii="Garamond" w:hAnsi="Garamond"/>
-          <w:bCs/>
-          <w:color w:val="auto"/>
-        </w:rPr>
-        <w:t>,</w:t>
-      </w:r>
-      <w:r>
-        <w:rPr>
-          <w:rFonts w:ascii="Garamond" w:hAnsi="Garamond"/>
-          <w:bCs/>
-          <w:color w:val="auto"/>
-        </w:rPr>
-        <w:t xml:space="preserve"> </w:t>
-      </w:r>
-      <w:r>
-        <w:rPr>
-          <w:rFonts w:ascii="Garamond" w:hAnsi="Garamond"/>
-          <w:bCs/>
-          <w:color w:val="auto"/>
-        </w:rPr>
-        <w:t xml:space="preserve">Customer Service, </w:t>
-      </w:r>
-      <w:r>
-        <w:rPr>
-          <w:rFonts w:ascii="Garamond" w:hAnsi="Garamond"/>
-          <w:bCs/>
-          <w:color w:val="auto"/>
-        </w:rPr>
-        <w:t>Adaptability</w:t>
-      </w:r>
-      <w:r>
-        <w:rPr>
-          <w:rFonts w:ascii="Garamond" w:hAnsi="Garamond"/>
-          <w:bCs/>
-          <w:color w:val="auto"/>
-        </w:rPr>
-        <w:t>,</w:t>
-      </w:r>
-      <w:r>
-        <w:rPr>
-          <w:rFonts w:ascii="Garamond" w:hAnsi="Garamond"/>
-          <w:bCs/>
-          <w:color w:val="auto"/>
-        </w:rPr>
-        <w:t xml:space="preserve"> </w:t>
-      </w:r>
-      <w:r>
-        <w:rPr>
-          <w:rFonts w:ascii="Garamond" w:hAnsi="Garamond"/>
-          <w:bCs/>
-          <w:color w:val="auto"/>
-        </w:rPr>
-        <w:t>Problem-Solving</w:t>
-      </w:r>
-      <w:r>
-        <w:rPr>
-          <w:rFonts w:ascii="Garamond" w:hAnsi="Garamond"/>
-          <w:bCs/>
-          <w:color w:val="auto"/>
-        </w:rPr>
-        <w:t>,</w:t>
-      </w:r>
-      <w:r>
-        <w:rPr>
-          <w:rFonts w:ascii="Garamond" w:hAnsi="Garamond"/>
-          <w:bCs/>
-          <w:color w:val="auto"/>
-        </w:rPr>
-        <w:t xml:space="preserve"> </w:t>
-      </w:r>
-      <w:r>
-        <w:rPr>
-          <w:rFonts w:ascii="Garamond" w:hAnsi="Garamond"/>
-          <w:bCs/>
-          <w:color w:val="auto"/>
-        </w:rPr>
-        <w:t>Attention to Detail</w:t>
-      </w:r>
-      <w:r>
-        <w:rPr>
-          <w:rFonts w:ascii="Garamond" w:hAnsi="Garamond"/>
-          <w:bCs/>
-          <w:color w:val="auto"/>
-        </w:rPr>
-        <w:t>,</w:t>
-      </w:r>
-      <w:r>
-        <w:rPr>
-          <w:rFonts w:ascii="Garamond" w:hAnsi="Garamond"/>
-          <w:bCs/>
-          <w:color w:val="auto"/>
-        </w:rPr>
-        <w:t xml:space="preserve"> Self-Motivation</w:t>
-      </w:r>
-      <w:r>
-        <w:rPr>
-          <w:rFonts w:ascii="Garamond" w:hAnsi="Garamond"/>
-          <w:bCs/>
-          <w:color w:val="auto"/>
-        </w:rPr>
-        <w:t>,</w:t>
-      </w:r>
-      <w:r>
-        <w:rPr>
-          <w:rFonts w:ascii="Garamond" w:hAnsi="Garamond"/>
-          <w:bCs/>
-          <w:color w:val="auto"/>
-        </w:rPr>
-        <w:t xml:space="preserve"> Analytical Thinking</w:t>
-      </w:r>
+          <w:sz w:val="22"/>
+          <w:szCs w:val="22"/>
+        </w:rPr>
+      </w:pPr>
     </w:p>
     <w:p>
       <w:pPr>
         <w:pStyle w:val="Default"/>
-        <w:spacing w:after="3"/>
-        <w:jc w:val="both"/>
-        <w:rPr>
-          <w:rFonts w:ascii="Garamond" w:hAnsi="Garamond"/>
-          <w:color w:val="auto"/>
-        </w:rPr>
-      </w:pPr>
-    </w:p>
-    <w:p>
-      <w:pPr>
-        <w:pStyle w:val="Default"/>
-        <w:rPr>
-          <w:rFonts w:ascii="Garamond" w:hAnsi="Garamond"/>
-          <w:color w:val="auto"/>
-        </w:rPr>
-      </w:pPr>
-      <w:r>
-        <w:rPr>
-          <w:rFonts w:ascii="Garamond" w:hAnsi="Garamond"/>
-          <w:b/>
-          <w:bCs/>
-          <w:color w:val="auto"/>
-        </w:rPr>
-        <w:t>Interests</w:t>
-      </w:r>
-      <w:r>
-        <w:rPr>
-          <w:rFonts w:ascii="Garamond" w:hAnsi="Garamond"/>
-          <w:b/>
-          <w:bCs/>
-          <w:color w:val="auto"/>
-        </w:rPr>
-        <w:t>:</w:t>
-      </w:r>
-      <w:r>
-        <w:rPr>
-          <w:rFonts w:ascii="Garamond" w:hAnsi="Garamond"/>
-          <w:b/>
-          <w:bCs/>
-          <w:color w:val="auto"/>
-        </w:rPr>
-        <w:t xml:space="preserve"> </w:t>
-      </w:r>
-      <w:r>
-        <w:rPr>
-          <w:rFonts w:ascii="Garamond" w:hAnsi="Garamond"/>
-          <w:color w:val="auto"/>
-        </w:rPr>
-        <w:t>Gaming</w:t>
-      </w:r>
-      <w:r>
-        <w:rPr>
-          <w:rFonts w:ascii="Garamond" w:hAnsi="Garamond"/>
-          <w:color w:val="auto"/>
-        </w:rPr>
-        <w:t>,</w:t>
-      </w:r>
-      <w:r>
-        <w:rPr>
-          <w:rFonts w:ascii="Garamond" w:hAnsi="Garamond"/>
-          <w:color w:val="auto"/>
-        </w:rPr>
-        <w:t xml:space="preserve"> Tech,</w:t>
-      </w:r>
-      <w:r>
-        <w:rPr>
-          <w:rFonts w:ascii="Garamond" w:hAnsi="Garamond"/>
-          <w:color w:val="auto"/>
-        </w:rPr>
-        <w:t xml:space="preserve"> </w:t>
-      </w:r>
-      <w:r>
-        <w:rPr>
-          <w:rFonts w:ascii="Garamond" w:hAnsi="Garamond"/>
-          <w:color w:val="auto"/>
-        </w:rPr>
-        <w:t xml:space="preserve">Web, </w:t>
-      </w:r>
-      <w:r>
-        <w:rPr>
-          <w:rFonts w:ascii="Garamond" w:hAnsi="Garamond"/>
-          <w:color w:val="auto"/>
-        </w:rPr>
-        <w:t>Reading</w:t>
-      </w:r>
-      <w:r>
-        <w:rPr>
-          <w:rFonts w:ascii="Garamond" w:hAnsi="Garamond"/>
-          <w:color w:val="auto"/>
-        </w:rPr>
-        <w:t>,</w:t>
-      </w:r>
-      <w:r>
-        <w:rPr>
-          <w:rFonts w:ascii="Garamond" w:hAnsi="Garamond"/>
-          <w:color w:val="auto"/>
-        </w:rPr>
-        <w:t xml:space="preserve"> </w:t>
-      </w:r>
-      <w:r>
-        <w:rPr>
-          <w:rFonts w:ascii="Garamond" w:hAnsi="Garamond"/>
-          <w:color w:val="auto"/>
-        </w:rPr>
-        <w:t>Running</w:t>
-      </w:r>
-      <w:r>
-        <w:rPr>
-          <w:rFonts w:ascii="Garamond" w:hAnsi="Garamond"/>
-          <w:color w:val="auto"/>
-        </w:rPr>
-        <w:t>,</w:t>
-      </w:r>
-      <w:r>
-        <w:rPr>
-          <w:rFonts w:ascii="Garamond" w:hAnsi="Garamond"/>
-          <w:color w:val="auto"/>
-        </w:rPr>
-        <w:t xml:space="preserve"> Hiking</w:t>
-      </w:r>
-      <w:r>
-        <w:rPr>
-          <w:rFonts w:ascii="Garamond" w:hAnsi="Garamond"/>
-          <w:color w:val="auto"/>
-        </w:rPr>
-        <w:t>,</w:t>
-      </w:r>
-      <w:r>
-        <w:rPr>
-          <w:rFonts w:ascii="Garamond" w:hAnsi="Garamond"/>
-          <w:color w:val="auto"/>
-        </w:rPr>
-        <w:t xml:space="preserve"> Meditation</w:t>
+        <w:rPr>
+          <w:rFonts w:ascii="Garamond" w:hAnsi="Garamond"/>
+          <w:color w:val="auto"/>
+          <w:sz w:val="22"/>
+          <w:szCs w:val="22"/>
+        </w:rPr>
+      </w:pPr>
+      <w:r>
+        <w:rPr>
+          <w:rFonts w:ascii="Garamond" w:hAnsi="Garamond"/>
+          <w:b/>
+          <w:bCs/>
+          <w:color w:val="auto"/>
+          <w:sz w:val="22"/>
+          <w:szCs w:val="22"/>
+        </w:rPr>
+        <w:t xml:space="preserve">Interests: </w:t>
+      </w:r>
+      <w:r>
+        <w:rPr>
+          <w:rFonts w:ascii="Garamond" w:hAnsi="Garamond"/>
+          <w:color w:val="auto"/>
+          <w:sz w:val="22"/>
+          <w:szCs w:val="22"/>
+        </w:rPr>
+        <w:t>Gaming, Tech, Web, Reading, Running, Hiking, Meditation</w:t>
       </w:r>
     </w:p>
     <w:sectPr>

</xml_diff>

<commit_message>
Update resumes, certificate links, and hero image
</commit_message>
<xml_diff>
--- a/assets/pdf/noah_hamblen_portfolio_resume1.docx
+++ b/assets/pdf/noah_hamblen_portfolio_resume1.docx
@@ -181,19 +181,8 @@
             <w:sz w:val="22"/>
             <w:szCs w:val="22"/>
           </w:rPr>
-          <w:t>linkedin.com/in/</w:t>
+          <w:t>linkedin.com/in/noahhamblen</w:t>
         </w:r>
-        <w:proofErr w:type="spellStart"/>
-        <w:r>
-          <w:rPr>
-            <w:rStyle w:val="Hyperlink"/>
-            <w:rFonts w:ascii="Garamond" w:hAnsi="Garamond"/>
-            <w:sz w:val="22"/>
-            <w:szCs w:val="22"/>
-          </w:rPr>
-          <w:t>noahhamblen</w:t>
-        </w:r>
-        <w:proofErr w:type="spellEnd"/>
       </w:hyperlink>
       <w:r>
         <w:rPr>
@@ -236,19 +225,8 @@
             <w:sz w:val="22"/>
             <w:szCs w:val="22"/>
           </w:rPr>
-          <w:t>github.com/</w:t>
+          <w:t>github.com/nhamblen</w:t>
         </w:r>
-        <w:proofErr w:type="spellStart"/>
-        <w:r>
-          <w:rPr>
-            <w:rStyle w:val="Hyperlink"/>
-            <w:rFonts w:ascii="Garamond" w:hAnsi="Garamond"/>
-            <w:sz w:val="22"/>
-            <w:szCs w:val="22"/>
-          </w:rPr>
-          <w:t>nhamblen</w:t>
-        </w:r>
-        <w:proofErr w:type="spellEnd"/>
       </w:hyperlink>
     </w:p>
     <w:p>
@@ -338,6 +316,129 @@
           <w:rFonts w:ascii="Garamond" w:hAnsi="Garamond"/>
           <w:b/>
           <w:bCs/>
+          <w:color w:val="auto"/>
+          <w:sz w:val="22"/>
+          <w:szCs w:val="22"/>
+        </w:rPr>
+        <w:t xml:space="preserve">IGEL Certified Professional </w:t>
+      </w:r>
+      <w:r>
+        <w:rPr>
+          <w:rFonts w:ascii="Garamond" w:hAnsi="Garamond"/>
+          <w:b/>
+          <w:bCs/>
+          <w:color w:val="auto"/>
+          <w:sz w:val="22"/>
+          <w:szCs w:val="22"/>
+        </w:rPr>
+        <w:tab/>
+      </w:r>
+      <w:r>
+        <w:rPr>
+          <w:rFonts w:ascii="Garamond" w:hAnsi="Garamond"/>
+          <w:b/>
+          <w:bCs/>
+          <w:color w:val="auto"/>
+          <w:sz w:val="22"/>
+          <w:szCs w:val="22"/>
+        </w:rPr>
+        <w:tab/>
+      </w:r>
+      <w:r>
+        <w:rPr>
+          <w:rFonts w:ascii="Garamond" w:hAnsi="Garamond"/>
+          <w:b/>
+          <w:bCs/>
+          <w:color w:val="auto"/>
+          <w:sz w:val="22"/>
+          <w:szCs w:val="22"/>
+        </w:rPr>
+        <w:tab/>
+      </w:r>
+      <w:r>
+        <w:rPr>
+          <w:rFonts w:ascii="Garamond" w:hAnsi="Garamond"/>
+          <w:b/>
+          <w:bCs/>
+          <w:color w:val="auto"/>
+          <w:sz w:val="22"/>
+          <w:szCs w:val="22"/>
+        </w:rPr>
+        <w:tab/>
+      </w:r>
+      <w:r>
+        <w:rPr>
+          <w:rFonts w:ascii="Garamond" w:hAnsi="Garamond"/>
+          <w:b/>
+          <w:bCs/>
+          <w:color w:val="auto"/>
+          <w:sz w:val="22"/>
+          <w:szCs w:val="22"/>
+        </w:rPr>
+        <w:tab/>
+      </w:r>
+      <w:r>
+        <w:rPr>
+          <w:rFonts w:ascii="Garamond" w:hAnsi="Garamond"/>
+          <w:b/>
+          <w:bCs/>
+          <w:color w:val="auto"/>
+          <w:sz w:val="22"/>
+          <w:szCs w:val="22"/>
+        </w:rPr>
+        <w:tab/>
+        <w:t xml:space="preserve">                       </w:t>
+      </w:r>
+      <w:r>
+        <w:rPr>
+          <w:rFonts w:ascii="Garamond" w:hAnsi="Garamond"/>
+          <w:b/>
+          <w:bCs/>
+          <w:sz w:val="22"/>
+          <w:szCs w:val="22"/>
+        </w:rPr>
+        <w:t>December 2025</w:t>
+      </w:r>
+      <w:r>
+        <w:rPr>
+          <w:rFonts w:ascii="Garamond" w:hAnsi="Garamond"/>
+          <w:b/>
+          <w:bCs/>
+          <w:sz w:val="22"/>
+          <w:szCs w:val="22"/>
+        </w:rPr>
+        <w:t xml:space="preserve"> – December 202</w:t>
+      </w:r>
+      <w:r>
+        <w:rPr>
+          <w:rFonts w:ascii="Garamond" w:hAnsi="Garamond"/>
+          <w:b/>
+          <w:bCs/>
+          <w:sz w:val="22"/>
+          <w:szCs w:val="22"/>
+        </w:rPr>
+        <w:t>7</w:t>
+      </w:r>
+    </w:p>
+    <w:p>
+      <w:pPr>
+        <w:pStyle w:val="Default"/>
+        <w:spacing w:after="3"/>
+        <w:jc w:val="both"/>
+        <w:rPr>
+          <w:rFonts w:ascii="Garamond" w:hAnsi="Garamond"/>
+          <w:b/>
+          <w:bCs/>
+          <w:color w:val="auto"/>
+          <w:sz w:val="22"/>
+          <w:szCs w:val="22"/>
+        </w:rPr>
+      </w:pPr>
+      <w:r>
+        <w:rPr>
+          <w:rFonts w:ascii="Garamond" w:hAnsi="Garamond"/>
+          <w:b/>
+          <w:bCs/>
           <w:sz w:val="22"/>
           <w:szCs w:val="22"/>
         </w:rPr>
@@ -422,6 +523,16 @@
           <w:szCs w:val="22"/>
         </w:rPr>
         <w:t xml:space="preserve">                      </w:t>
+      </w:r>
+      <w:r>
+        <w:rPr>
+          <w:rFonts w:ascii="Garamond" w:hAnsi="Garamond"/>
+          <w:b/>
+          <w:bCs/>
+          <w:sz w:val="22"/>
+          <w:szCs w:val="22"/>
+        </w:rPr>
+        <w:t xml:space="preserve"> </w:t>
       </w:r>
       <w:r>
         <w:rPr>
@@ -1274,7 +1385,25 @@
           <w:sz w:val="22"/>
           <w:szCs w:val="22"/>
         </w:rPr>
-        <w:t>Gain hands-on experience imaging and configuring phones, IGEL thin clients, and other devices</w:t>
+        <w:t>Gain</w:t>
+      </w:r>
+      <w:r>
+        <w:rPr>
+          <w:rFonts w:ascii="Garamond" w:hAnsi="Garamond"/>
+          <w:bCs/>
+          <w:sz w:val="22"/>
+          <w:szCs w:val="22"/>
+        </w:rPr>
+        <w:t>ing</w:t>
+      </w:r>
+      <w:r>
+        <w:rPr>
+          <w:rFonts w:ascii="Garamond" w:hAnsi="Garamond"/>
+          <w:bCs/>
+          <w:sz w:val="22"/>
+          <w:szCs w:val="22"/>
+        </w:rPr>
+        <w:t xml:space="preserve"> hands-on experience imaging and configuring phones, IGEL thin clients, and other devices</w:t>
       </w:r>
       <w:r>
         <w:rPr>
@@ -1725,349 +1854,6 @@
           <w:szCs w:val="22"/>
         </w:rPr>
         <w:t xml:space="preserve"> internal systems to manage orders, track shipments, and resolve technical or service-related inquiries.</w:t>
-      </w:r>
-    </w:p>
-    <w:p>
-      <w:pPr>
-        <w:pStyle w:val="Default"/>
-        <w:rPr>
-          <w:rFonts w:ascii="Garamond" w:hAnsi="Garamond"/>
-          <w:b/>
-          <w:bCs/>
-          <w:color w:val="auto"/>
-          <w:sz w:val="22"/>
-          <w:szCs w:val="22"/>
-        </w:rPr>
-      </w:pPr>
-    </w:p>
-    <w:p>
-      <w:pPr>
-        <w:pStyle w:val="Default"/>
-        <w:rPr>
-          <w:rFonts w:ascii="Garamond" w:hAnsi="Garamond"/>
-          <w:b/>
-          <w:bCs/>
-          <w:color w:val="auto"/>
-          <w:sz w:val="22"/>
-          <w:szCs w:val="22"/>
-        </w:rPr>
-      </w:pPr>
-      <w:r>
-        <w:rPr>
-          <w:rFonts w:ascii="Garamond" w:hAnsi="Garamond"/>
-          <w:b/>
-          <w:bCs/>
-          <w:color w:val="auto"/>
-          <w:sz w:val="22"/>
-          <w:szCs w:val="22"/>
-        </w:rPr>
-        <w:t>TELUS Digital</w:t>
-      </w:r>
-      <w:r>
-        <w:rPr>
-          <w:rFonts w:ascii="Garamond" w:hAnsi="Garamond"/>
-          <w:b/>
-          <w:bCs/>
-          <w:color w:val="auto"/>
-          <w:sz w:val="22"/>
-          <w:szCs w:val="22"/>
-        </w:rPr>
-        <w:tab/>
-      </w:r>
-      <w:r>
-        <w:rPr>
-          <w:rFonts w:ascii="Garamond" w:hAnsi="Garamond"/>
-          <w:b/>
-          <w:bCs/>
-          <w:color w:val="auto"/>
-          <w:sz w:val="22"/>
-          <w:szCs w:val="22"/>
-        </w:rPr>
-        <w:tab/>
-      </w:r>
-      <w:r>
-        <w:rPr>
-          <w:rFonts w:ascii="Garamond" w:hAnsi="Garamond"/>
-          <w:b/>
-          <w:bCs/>
-          <w:color w:val="auto"/>
-          <w:sz w:val="22"/>
-          <w:szCs w:val="22"/>
-        </w:rPr>
-        <w:tab/>
-      </w:r>
-      <w:r>
-        <w:rPr>
-          <w:rFonts w:ascii="Garamond" w:hAnsi="Garamond"/>
-          <w:b/>
-          <w:bCs/>
-          <w:color w:val="auto"/>
-          <w:sz w:val="22"/>
-          <w:szCs w:val="22"/>
-        </w:rPr>
-        <w:tab/>
-      </w:r>
-      <w:r>
-        <w:rPr>
-          <w:rFonts w:ascii="Garamond" w:hAnsi="Garamond"/>
-          <w:b/>
-          <w:bCs/>
-          <w:color w:val="auto"/>
-          <w:sz w:val="22"/>
-          <w:szCs w:val="22"/>
-        </w:rPr>
-        <w:tab/>
-        <w:t xml:space="preserve">                                       </w:t>
-      </w:r>
-      <w:r>
-        <w:rPr>
-          <w:rFonts w:ascii="Garamond" w:hAnsi="Garamond"/>
-          <w:b/>
-          <w:bCs/>
-          <w:color w:val="auto"/>
-          <w:sz w:val="22"/>
-          <w:szCs w:val="22"/>
-        </w:rPr>
-        <w:t xml:space="preserve">                      </w:t>
-      </w:r>
-      <w:r>
-        <w:rPr>
-          <w:rFonts w:ascii="Garamond" w:hAnsi="Garamond"/>
-          <w:b/>
-          <w:bCs/>
-          <w:color w:val="auto"/>
-          <w:sz w:val="22"/>
-          <w:szCs w:val="22"/>
-        </w:rPr>
-        <w:t>December 2023 – December 2024</w:t>
-      </w:r>
-    </w:p>
-    <w:p>
-      <w:pPr>
-        <w:pStyle w:val="Default"/>
-        <w:rPr>
-          <w:rFonts w:ascii="Garamond" w:hAnsi="Garamond"/>
-          <w:bCs/>
-          <w:i/>
-          <w:sz w:val="22"/>
-          <w:szCs w:val="22"/>
-        </w:rPr>
-      </w:pPr>
-      <w:r>
-        <w:rPr>
-          <w:rFonts w:ascii="Garamond" w:hAnsi="Garamond"/>
-          <w:bCs/>
-          <w:i/>
-          <w:color w:val="auto"/>
-          <w:sz w:val="22"/>
-          <w:szCs w:val="22"/>
-        </w:rPr>
-        <w:t>AI and Web Analyst</w:t>
-      </w:r>
-      <w:r>
-        <w:rPr>
-          <w:rFonts w:ascii="Garamond" w:hAnsi="Garamond"/>
-          <w:bCs/>
-          <w:i/>
-          <w:sz w:val="22"/>
-          <w:szCs w:val="22"/>
-        </w:rPr>
-        <w:tab/>
-      </w:r>
-      <w:r>
-        <w:rPr>
-          <w:rFonts w:ascii="Garamond" w:hAnsi="Garamond"/>
-          <w:bCs/>
-          <w:i/>
-          <w:sz w:val="22"/>
-          <w:szCs w:val="22"/>
-        </w:rPr>
-        <w:tab/>
-      </w:r>
-      <w:r>
-        <w:rPr>
-          <w:rFonts w:ascii="Garamond" w:hAnsi="Garamond"/>
-          <w:bCs/>
-          <w:i/>
-          <w:color w:val="auto"/>
-          <w:sz w:val="22"/>
-          <w:szCs w:val="22"/>
-        </w:rPr>
-        <w:tab/>
-      </w:r>
-      <w:r>
-        <w:rPr>
-          <w:rFonts w:ascii="Garamond" w:hAnsi="Garamond"/>
-          <w:bCs/>
-          <w:i/>
-          <w:color w:val="auto"/>
-          <w:sz w:val="22"/>
-          <w:szCs w:val="22"/>
-        </w:rPr>
-        <w:tab/>
-      </w:r>
-      <w:r>
-        <w:rPr>
-          <w:rFonts w:ascii="Garamond" w:hAnsi="Garamond"/>
-          <w:bCs/>
-          <w:i/>
-          <w:color w:val="auto"/>
-          <w:sz w:val="22"/>
-          <w:szCs w:val="22"/>
-        </w:rPr>
-        <w:tab/>
-      </w:r>
-      <w:r>
-        <w:rPr>
-          <w:rFonts w:ascii="Garamond" w:hAnsi="Garamond"/>
-          <w:bCs/>
-          <w:i/>
-          <w:color w:val="auto"/>
-          <w:sz w:val="22"/>
-          <w:szCs w:val="22"/>
-        </w:rPr>
-        <w:tab/>
-        <w:t xml:space="preserve"> </w:t>
-      </w:r>
-      <w:r>
-        <w:rPr>
-          <w:rFonts w:ascii="Garamond" w:hAnsi="Garamond"/>
-          <w:bCs/>
-          <w:i/>
-          <w:color w:val="auto"/>
-          <w:sz w:val="22"/>
-          <w:szCs w:val="22"/>
-        </w:rPr>
-        <w:tab/>
-      </w:r>
-      <w:r>
-        <w:rPr>
-          <w:rFonts w:ascii="Garamond" w:hAnsi="Garamond"/>
-          <w:bCs/>
-          <w:i/>
-          <w:color w:val="auto"/>
-          <w:sz w:val="22"/>
-          <w:szCs w:val="22"/>
-        </w:rPr>
-        <w:tab/>
-      </w:r>
-      <w:r>
-        <w:rPr>
-          <w:rFonts w:ascii="Garamond" w:hAnsi="Garamond"/>
-          <w:bCs/>
-          <w:i/>
-          <w:color w:val="auto"/>
-          <w:sz w:val="22"/>
-          <w:szCs w:val="22"/>
-        </w:rPr>
-        <w:tab/>
-        <w:t xml:space="preserve">          </w:t>
-      </w:r>
-      <w:r>
-        <w:rPr>
-          <w:rFonts w:ascii="Garamond" w:hAnsi="Garamond"/>
-          <w:bCs/>
-          <w:i/>
-          <w:color w:val="auto"/>
-          <w:sz w:val="22"/>
-          <w:szCs w:val="22"/>
-        </w:rPr>
-        <w:tab/>
-        <w:t xml:space="preserve">                          </w:t>
-      </w:r>
-      <w:r>
-        <w:rPr>
-          <w:rFonts w:ascii="Garamond" w:hAnsi="Garamond"/>
-          <w:bCs/>
-          <w:i/>
-          <w:color w:val="auto"/>
-          <w:sz w:val="22"/>
-          <w:szCs w:val="22"/>
-        </w:rPr>
-        <w:t xml:space="preserve">   </w:t>
-      </w:r>
-      <w:r>
-        <w:rPr>
-          <w:rFonts w:ascii="Garamond" w:hAnsi="Garamond"/>
-          <w:bCs/>
-          <w:i/>
-          <w:color w:val="auto"/>
-          <w:sz w:val="22"/>
-          <w:szCs w:val="22"/>
-        </w:rPr>
-        <w:t>Remote</w:t>
-      </w:r>
-    </w:p>
-    <w:p>
-      <w:pPr>
-        <w:pStyle w:val="Default"/>
-        <w:numPr>
-          <w:ilvl w:val="0"/>
-          <w:numId w:val="19"/>
-        </w:numPr>
-        <w:rPr>
-          <w:rFonts w:ascii="Garamond" w:hAnsi="Garamond"/>
-          <w:bCs/>
-          <w:sz w:val="22"/>
-          <w:szCs w:val="22"/>
-        </w:rPr>
-      </w:pPr>
-      <w:r>
-        <w:rPr>
-          <w:rFonts w:ascii="Garamond" w:hAnsi="Garamond"/>
-          <w:bCs/>
-          <w:sz w:val="22"/>
-          <w:szCs w:val="22"/>
-        </w:rPr>
-        <w:t>Analyzed and provided detailed feedback to ensure quality standards across various digital assets.</w:t>
-      </w:r>
-    </w:p>
-    <w:p>
-      <w:pPr>
-        <w:pStyle w:val="Default"/>
-        <w:numPr>
-          <w:ilvl w:val="0"/>
-          <w:numId w:val="19"/>
-        </w:numPr>
-        <w:rPr>
-          <w:rFonts w:ascii="Garamond" w:hAnsi="Garamond"/>
-          <w:bCs/>
-          <w:sz w:val="22"/>
-          <w:szCs w:val="22"/>
-        </w:rPr>
-      </w:pPr>
-      <w:r>
-        <w:rPr>
-          <w:rFonts w:ascii="Garamond" w:hAnsi="Garamond"/>
-          <w:bCs/>
-          <w:sz w:val="22"/>
-          <w:szCs w:val="22"/>
-        </w:rPr>
-        <w:t>Used online tools to evaluate AI performance and webpages, identifying areas for improvement, and ensuring alignment with expected standards.</w:t>
-      </w:r>
-    </w:p>
-    <w:p>
-      <w:pPr>
-        <w:pStyle w:val="Default"/>
-        <w:numPr>
-          <w:ilvl w:val="0"/>
-          <w:numId w:val="19"/>
-        </w:numPr>
-        <w:rPr>
-          <w:rFonts w:ascii="Garamond" w:hAnsi="Garamond"/>
-          <w:bCs/>
-          <w:sz w:val="22"/>
-          <w:szCs w:val="22"/>
-        </w:rPr>
-      </w:pPr>
-      <w:r>
-        <w:rPr>
-          <w:rFonts w:ascii="Garamond" w:hAnsi="Garamond"/>
-          <w:bCs/>
-          <w:sz w:val="22"/>
-          <w:szCs w:val="22"/>
-        </w:rPr>
-        <w:t>Independently analyzed and provided feedback on many AI models/webpages per day while managing task prioritization in a fast-paced remote role.</w:t>
       </w:r>
     </w:p>
     <w:p>

</xml_diff>

<commit_message>
Fixed error in date
</commit_message>
<xml_diff>
--- a/assets/pdf/noah_hamblen_portfolio_resume1.docx
+++ b/assets/pdf/noah_hamblen_portfolio_resume1.docx
@@ -474,7 +474,29 @@
           <w:szCs w:val="22"/>
         </w:rPr>
         <w:tab/>
-        <w:t xml:space="preserve">                                                                                           October 2025 – Present</w:t>
+        <w:t xml:space="preserve">                                                                                       </w:t>
+      </w:r>
+      <w:r>
+        <w:rPr>
+          <w:rFonts w:ascii="Garamond" w:hAnsi="Garamond"/>
+          <w:b/>
+          <w:bCs/>
+          <w:color w:val="auto"/>
+          <w:sz w:val="22"/>
+          <w:szCs w:val="22"/>
+        </w:rPr>
+        <w:t>September</w:t>
+      </w:r>
+      <w:r>
+        <w:rPr>
+          <w:rFonts w:ascii="Garamond" w:hAnsi="Garamond"/>
+          <w:b/>
+          <w:bCs/>
+          <w:color w:val="auto"/>
+          <w:sz w:val="22"/>
+          <w:szCs w:val="22"/>
+        </w:rPr>
+        <w:t xml:space="preserve"> 2025 – Present</w:t>
       </w:r>
     </w:p>
     <w:p>

</xml_diff>

<commit_message>
Updated resume to include new certification
</commit_message>
<xml_diff>
--- a/assets/pdf/noah_hamblen_portfolio_resume1.docx
+++ b/assets/pdf/noah_hamblen_portfolio_resume1.docx
@@ -1,6 +1,6 @@
 
 <file path=word/document.xml><?xml version="1.0" encoding="utf-8"?>
-<w:document xmlns:wpc="http://schemas.microsoft.com/office/word/2010/wordprocessingCanvas" xmlns:cx="http://schemas.microsoft.com/office/drawing/2014/chartex" xmlns:cx1="http://schemas.microsoft.com/office/drawing/2015/9/8/chartex" xmlns:cx2="http://schemas.microsoft.com/office/drawing/2015/10/21/chartex" xmlns:cx3="http://schemas.microsoft.com/office/drawing/2016/5/9/chartex" xmlns:cx4="http://schemas.microsoft.com/office/drawing/2016/5/10/chartex" xmlns:cx5="http://schemas.microsoft.com/office/drawing/2016/5/11/chartex" xmlns:cx6="http://schemas.microsoft.com/office/drawing/2016/5/12/chartex" xmlns:cx7="http://schemas.microsoft.com/office/drawing/2016/5/13/chartex" xmlns:cx8="http://schemas.microsoft.com/office/drawing/2016/5/14/chartex" xmlns:mc="http://schemas.openxmlformats.org/markup-compatibility/2006" xmlns:aink="http://schemas.microsoft.com/office/drawing/2016/ink" xmlns:am3d="http://schemas.microsoft.com/office/drawing/2017/model3d" xmlns:o="urn:schemas-microsoft-com:office:office" xmlns:oel="http://schemas.microsoft.com/office/2019/extlst" xmlns:r="http://schemas.openxmlformats.org/officeDocument/2006/relationships" xmlns:m="http://schemas.openxmlformats.org/officeDocument/2006/math" xmlns:v="urn:schemas-microsoft-com:vml" xmlns:wp14="http://schemas.microsoft.com/office/word/2010/wordprocessingDrawing" xmlns:wp="http://schemas.openxmlformats.org/drawingml/2006/wordprocessingDrawing" xmlns:w10="urn:schemas-microsoft-com:office:word" xmlns:w="http://schemas.openxmlformats.org/wordprocessingml/2006/main" xmlns:w14="http://schemas.microsoft.com/office/word/2010/wordml" xmlns:w15="http://schemas.microsoft.com/office/word/2012/wordml" xmlns:w16cex="http://schemas.microsoft.com/office/word/2018/wordml/cex" xmlns:w16cid="http://schemas.microsoft.com/office/word/2016/wordml/cid" xmlns:w16="http://schemas.microsoft.com/office/word/2018/wordml" xmlns:w16du="http://schemas.microsoft.com/office/word/2023/wordml/word16du" xmlns:w16sdtdh="http://schemas.microsoft.com/office/word/2020/wordml/sdtdatahash" xmlns:w16sdtfl="http://schemas.microsoft.com/office/word/2024/wordml/sdtformatlock" xmlns:w16se="http://schemas.microsoft.com/office/word/2015/wordml/symex" xmlns:wpg="http://schemas.microsoft.com/office/word/2010/wordprocessingGroup" xmlns:wpi="http://schemas.microsoft.com/office/word/2010/wordprocessingInk" xmlns:wne="http://schemas.microsoft.com/office/word/2006/wordml" xmlns:wps="http://schemas.microsoft.com/office/word/2010/wordprocessingShape" mc:Ignorable="w14 w15 w16se w16cid w16 w16cex w16sdtdh w16sdtfl w16du wp14">
+<w:document xmlns:wpc="http://schemas.microsoft.com/office/word/2010/wordprocessingCanvas" xmlns:cx="http://schemas.microsoft.com/office/drawing/2014/chartex" xmlns:cx1="http://schemas.microsoft.com/office/drawing/2015/9/8/chartex" xmlns:cx2="http://schemas.microsoft.com/office/drawing/2015/10/21/chartex" xmlns:cx3="http://schemas.microsoft.com/office/drawing/2016/5/9/chartex" xmlns:cx4="http://schemas.microsoft.com/office/drawing/2016/5/10/chartex" xmlns:cx5="http://schemas.microsoft.com/office/drawing/2016/5/11/chartex" xmlns:cx6="http://schemas.microsoft.com/office/drawing/2016/5/12/chartex" xmlns:cx7="http://schemas.microsoft.com/office/drawing/2016/5/13/chartex" xmlns:cx8="http://schemas.microsoft.com/office/drawing/2016/5/14/chartex" xmlns:mc="http://schemas.openxmlformats.org/markup-compatibility/2006" xmlns:aink="http://schemas.microsoft.com/office/drawing/2016/ink" xmlns:am3d="http://schemas.microsoft.com/office/drawing/2017/model3d" xmlns:o="urn:schemas-microsoft-com:office:office" xmlns:oel="http://schemas.microsoft.com/office/2019/extlst" xmlns:r="http://schemas.openxmlformats.org/officeDocument/2006/relationships" xmlns:m="http://schemas.openxmlformats.org/officeDocument/2006/math" xmlns:v="urn:schemas-microsoft-com:vml" xmlns:wp14="http://schemas.microsoft.com/office/word/2010/wordprocessingDrawing" xmlns:wp="http://schemas.openxmlformats.org/drawingml/2006/wordprocessingDrawing" xmlns:w10="urn:schemas-microsoft-com:office:word" xmlns:w="http://schemas.openxmlformats.org/wordprocessingml/2006/main" xmlns:w14="http://schemas.microsoft.com/office/word/2010/wordml" xmlns:w15="http://schemas.microsoft.com/office/word/2012/wordml" xmlns:w16cei="http://schemas.microsoft.com/office/word/2026/wordml/cei" xmlns:w16cex="http://schemas.microsoft.com/office/word/2018/wordml/cex" xmlns:w16cid="http://schemas.microsoft.com/office/word/2016/wordml/cid" xmlns:w16="http://schemas.microsoft.com/office/word/2018/wordml" xmlns:w16du="http://schemas.microsoft.com/office/word/2023/wordml/word16du" xmlns:w16sdtdh="http://schemas.microsoft.com/office/word/2020/wordml/sdtdatahash" xmlns:w16sdtfl="http://schemas.microsoft.com/office/word/2024/wordml/sdtformatlock" xmlns:w16se="http://schemas.microsoft.com/office/word/2015/wordml/symex" xmlns:wpg="http://schemas.microsoft.com/office/word/2010/wordprocessingGroup" xmlns:wpi="http://schemas.microsoft.com/office/word/2010/wordprocessingInk" xmlns:wne="http://schemas.microsoft.com/office/word/2006/wordml" xmlns:wps="http://schemas.microsoft.com/office/word/2010/wordprocessingShape" mc:Ignorable="w14 w15 w16se w16cid w16 w16cex w16sdtdh w16sdtfl w16du wp14">
   <w:body>
     <w:p>
       <w:pPr>
@@ -230,8 +230,19 @@
             <w:sz w:val="22"/>
             <w:szCs w:val="22"/>
           </w:rPr>
-          <w:t>linkedin.com/in/noahhamblen</w:t>
+          <w:t>linkedin.com/in/</w:t>
         </w:r>
+        <w:proofErr w:type="spellStart"/>
+        <w:r>
+          <w:rPr>
+            <w:rStyle w:val="Hyperlink"/>
+            <w:rFonts w:ascii="Garamond" w:hAnsi="Garamond"/>
+            <w:sz w:val="22"/>
+            <w:szCs w:val="22"/>
+          </w:rPr>
+          <w:t>noahhamblen</w:t>
+        </w:r>
+        <w:proofErr w:type="spellEnd"/>
       </w:hyperlink>
       <w:r>
         <w:rPr>
@@ -284,6 +295,7 @@
           </w:rPr>
           <w:t>github.com/</w:t>
         </w:r>
+        <w:proofErr w:type="spellStart"/>
         <w:r>
           <w:rPr>
             <w:rStyle w:val="Hyperlink"/>
@@ -302,6 +314,7 @@
           </w:rPr>
           <w:t>hamblen</w:t>
         </w:r>
+        <w:proofErr w:type="spellEnd"/>
       </w:hyperlink>
       <w:r>
         <w:t xml:space="preserve"> </w:t>
@@ -1112,34 +1125,50 @@
     <w:p>
       <w:pPr>
         <w:pStyle w:val="Default"/>
-        <w:spacing w:after="3"/>
-        <w:jc w:val="both"/>
-        <w:rPr>
-          <w:rFonts w:ascii="Garamond" w:hAnsi="Garamond"/>
-          <w:b/>
-          <w:bCs/>
-          <w:color w:val="auto"/>
-          <w:sz w:val="22"/>
-          <w:szCs w:val="22"/>
-        </w:rPr>
-      </w:pPr>
-      <w:r>
-        <w:rPr>
-          <w:rFonts w:ascii="Garamond" w:hAnsi="Garamond"/>
-          <w:b/>
-          <w:bCs/>
-          <w:color w:val="auto"/>
-          <w:sz w:val="22"/>
-          <w:szCs w:val="22"/>
-        </w:rPr>
-        <w:t xml:space="preserve">IGEL Certified Professional </w:t>
-      </w:r>
-      <w:r>
-        <w:rPr>
-          <w:rFonts w:ascii="Garamond" w:hAnsi="Garamond"/>
-          <w:b/>
-          <w:bCs/>
-          <w:color w:val="auto"/>
+        <w:rPr>
+          <w:rFonts w:ascii="Garamond" w:hAnsi="Garamond"/>
+          <w:b/>
+          <w:bCs/>
+          <w:color w:val="auto"/>
+          <w:sz w:val="18"/>
+          <w:szCs w:val="22"/>
+        </w:rPr>
+      </w:pPr>
+      <w:r>
+        <w:rPr>
+          <w:rFonts w:ascii="Garamond" w:hAnsi="Garamond"/>
+          <w:b/>
+          <w:bCs/>
+          <w:sz w:val="22"/>
+          <w:szCs w:val="22"/>
+        </w:rPr>
+        <w:t xml:space="preserve">CompTIA </w:t>
+      </w:r>
+      <w:r>
+        <w:rPr>
+          <w:rFonts w:ascii="Garamond" w:hAnsi="Garamond"/>
+          <w:b/>
+          <w:bCs/>
+          <w:sz w:val="22"/>
+          <w:szCs w:val="22"/>
+        </w:rPr>
+        <w:t>Security</w:t>
+      </w:r>
+      <w:r>
+        <w:rPr>
+          <w:rFonts w:ascii="Garamond" w:hAnsi="Garamond"/>
+          <w:b/>
+          <w:bCs/>
+          <w:sz w:val="22"/>
+          <w:szCs w:val="22"/>
+        </w:rPr>
+        <w:t>+</w:t>
+      </w:r>
+      <w:r>
+        <w:rPr>
+          <w:rFonts w:ascii="Garamond" w:hAnsi="Garamond"/>
+          <w:b/>
+          <w:bCs/>
           <w:sz w:val="22"/>
           <w:szCs w:val="22"/>
         </w:rPr>
@@ -1150,7 +1179,6 @@
           <w:rFonts w:ascii="Garamond" w:hAnsi="Garamond"/>
           <w:b/>
           <w:bCs/>
-          <w:color w:val="auto"/>
           <w:sz w:val="22"/>
           <w:szCs w:val="22"/>
         </w:rPr>
@@ -1161,7 +1189,16 @@
           <w:rFonts w:ascii="Garamond" w:hAnsi="Garamond"/>
           <w:b/>
           <w:bCs/>
-          <w:color w:val="auto"/>
+          <w:sz w:val="22"/>
+          <w:szCs w:val="22"/>
+        </w:rPr>
+        <w:t xml:space="preserve">             </w:t>
+      </w:r>
+      <w:r>
+        <w:rPr>
+          <w:rFonts w:ascii="Garamond" w:hAnsi="Garamond"/>
+          <w:b/>
+          <w:bCs/>
           <w:sz w:val="22"/>
           <w:szCs w:val="22"/>
         </w:rPr>
@@ -1172,7 +1209,6 @@
           <w:rFonts w:ascii="Garamond" w:hAnsi="Garamond"/>
           <w:b/>
           <w:bCs/>
-          <w:color w:val="auto"/>
           <w:sz w:val="22"/>
           <w:szCs w:val="22"/>
         </w:rPr>
@@ -1183,7 +1219,6 @@
           <w:rFonts w:ascii="Garamond" w:hAnsi="Garamond"/>
           <w:b/>
           <w:bCs/>
-          <w:color w:val="auto"/>
           <w:sz w:val="22"/>
           <w:szCs w:val="22"/>
         </w:rPr>
@@ -1194,45 +1229,10 @@
           <w:rFonts w:ascii="Garamond" w:hAnsi="Garamond"/>
           <w:b/>
           <w:bCs/>
-          <w:color w:val="auto"/>
           <w:sz w:val="22"/>
           <w:szCs w:val="22"/>
         </w:rPr>
         <w:tab/>
-        <w:t xml:space="preserve">                       </w:t>
-      </w:r>
-      <w:r>
-        <w:rPr>
-          <w:rFonts w:ascii="Garamond" w:hAnsi="Garamond"/>
-          <w:b/>
-          <w:bCs/>
-          <w:sz w:val="22"/>
-          <w:szCs w:val="22"/>
-        </w:rPr>
-        <w:t>December 2025 – December 2027</w:t>
-      </w:r>
-    </w:p>
-    <w:p>
-      <w:pPr>
-        <w:pStyle w:val="Default"/>
-        <w:rPr>
-          <w:rFonts w:ascii="Garamond" w:hAnsi="Garamond"/>
-          <w:b/>
-          <w:bCs/>
-          <w:color w:val="auto"/>
-          <w:sz w:val="18"/>
-          <w:szCs w:val="22"/>
-        </w:rPr>
-      </w:pPr>
-      <w:r>
-        <w:rPr>
-          <w:rFonts w:ascii="Garamond" w:hAnsi="Garamond"/>
-          <w:b/>
-          <w:bCs/>
-          <w:sz w:val="22"/>
-          <w:szCs w:val="22"/>
-        </w:rPr>
-        <w:t>CompTIA Network+</w:t>
       </w:r>
       <w:r>
         <w:rPr>
@@ -1243,67 +1243,77 @@
           <w:szCs w:val="22"/>
         </w:rPr>
         <w:tab/>
-      </w:r>
-      <w:r>
-        <w:rPr>
-          <w:rFonts w:ascii="Garamond" w:hAnsi="Garamond"/>
-          <w:b/>
-          <w:bCs/>
-          <w:sz w:val="22"/>
-          <w:szCs w:val="22"/>
-        </w:rPr>
-        <w:tab/>
-      </w:r>
-      <w:r>
-        <w:rPr>
-          <w:rFonts w:ascii="Garamond" w:hAnsi="Garamond"/>
-          <w:b/>
-          <w:bCs/>
-          <w:sz w:val="22"/>
-          <w:szCs w:val="22"/>
-        </w:rPr>
-        <w:tab/>
-      </w:r>
-      <w:r>
-        <w:rPr>
-          <w:rFonts w:ascii="Garamond" w:hAnsi="Garamond"/>
-          <w:b/>
-          <w:bCs/>
-          <w:sz w:val="22"/>
-          <w:szCs w:val="22"/>
-        </w:rPr>
-        <w:tab/>
-      </w:r>
-      <w:r>
-        <w:rPr>
-          <w:rFonts w:ascii="Garamond" w:hAnsi="Garamond"/>
-          <w:b/>
-          <w:bCs/>
-          <w:sz w:val="22"/>
-          <w:szCs w:val="22"/>
-        </w:rPr>
-        <w:tab/>
-      </w:r>
-      <w:r>
-        <w:rPr>
-          <w:rFonts w:ascii="Garamond" w:hAnsi="Garamond"/>
-          <w:b/>
-          <w:bCs/>
-          <w:sz w:val="22"/>
-          <w:szCs w:val="22"/>
-        </w:rPr>
-        <w:tab/>
-      </w:r>
-      <w:r>
-        <w:rPr>
-          <w:rFonts w:ascii="Garamond" w:hAnsi="Garamond"/>
-          <w:b/>
-          <w:bCs/>
-          <w:sz w:val="22"/>
-          <w:szCs w:val="22"/>
-        </w:rPr>
-        <w:tab/>
-        <w:t xml:space="preserve">                      December 2025 – December 2028</w:t>
+        <w:t xml:space="preserve">                      </w:t>
+      </w:r>
+      <w:r>
+        <w:rPr>
+          <w:rFonts w:ascii="Garamond" w:hAnsi="Garamond"/>
+          <w:b/>
+          <w:bCs/>
+          <w:sz w:val="22"/>
+          <w:szCs w:val="22"/>
+        </w:rPr>
+        <w:t xml:space="preserve">           August</w:t>
+      </w:r>
+      <w:r>
+        <w:rPr>
+          <w:rFonts w:ascii="Garamond" w:hAnsi="Garamond"/>
+          <w:b/>
+          <w:bCs/>
+          <w:sz w:val="22"/>
+          <w:szCs w:val="22"/>
+        </w:rPr>
+        <w:t xml:space="preserve"> 202</w:t>
+      </w:r>
+      <w:r>
+        <w:rPr>
+          <w:rFonts w:ascii="Garamond" w:hAnsi="Garamond"/>
+          <w:b/>
+          <w:bCs/>
+          <w:sz w:val="22"/>
+          <w:szCs w:val="22"/>
+        </w:rPr>
+        <w:t>6</w:t>
+      </w:r>
+      <w:r>
+        <w:rPr>
+          <w:rFonts w:ascii="Garamond" w:hAnsi="Garamond"/>
+          <w:b/>
+          <w:bCs/>
+          <w:sz w:val="22"/>
+          <w:szCs w:val="22"/>
+        </w:rPr>
+        <w:t xml:space="preserve"> – </w:t>
+      </w:r>
+      <w:r>
+        <w:rPr>
+          <w:rFonts w:ascii="Garamond" w:hAnsi="Garamond"/>
+          <w:b/>
+          <w:bCs/>
+          <w:sz w:val="22"/>
+          <w:szCs w:val="22"/>
+        </w:rPr>
+        <w:t>August</w:t>
+      </w:r>
+      <w:r>
+        <w:rPr>
+          <w:rFonts w:ascii="Garamond" w:hAnsi="Garamond"/>
+          <w:b/>
+          <w:bCs/>
+          <w:sz w:val="22"/>
+          <w:szCs w:val="22"/>
+        </w:rPr>
+        <w:t xml:space="preserve"> 202</w:t>
+      </w:r>
+      <w:r>
+        <w:rPr>
+          <w:rFonts w:ascii="Garamond" w:hAnsi="Garamond"/>
+          <w:b/>
+          <w:bCs/>
+          <w:sz w:val="22"/>
+          <w:szCs w:val="22"/>
+        </w:rPr>
+        <w:t>9</w:t>
       </w:r>
     </w:p>
     <w:p>
@@ -1313,76 +1323,320 @@
         <w:jc w:val="both"/>
         <w:rPr>
           <w:rFonts w:ascii="Garamond" w:hAnsi="Garamond"/>
-          <w:color w:val="auto"/>
-          <w:sz w:val="22"/>
-          <w:szCs w:val="22"/>
-        </w:rPr>
-      </w:pPr>
-      <w:r>
-        <w:rPr>
-          <w:rFonts w:ascii="Garamond" w:hAnsi="Garamond"/>
-          <w:b/>
-          <w:bCs/>
-          <w:color w:val="auto"/>
-          <w:sz w:val="22"/>
-          <w:szCs w:val="22"/>
-        </w:rPr>
-        <w:t>CompTIA A+</w:t>
-      </w:r>
-      <w:r>
-        <w:rPr>
-          <w:rFonts w:ascii="Garamond" w:hAnsi="Garamond"/>
-          <w:b/>
-          <w:bCs/>
-          <w:color w:val="auto"/>
-          <w:sz w:val="22"/>
-          <w:szCs w:val="22"/>
-        </w:rPr>
-        <w:t xml:space="preserve">                                                                                                             </w:t>
-      </w:r>
-      <w:r>
-        <w:rPr>
-          <w:rFonts w:ascii="Garamond" w:hAnsi="Garamond"/>
-          <w:b/>
-          <w:bCs/>
-          <w:color w:val="auto"/>
-          <w:sz w:val="22"/>
-          <w:szCs w:val="22"/>
-        </w:rPr>
-        <w:t xml:space="preserve">           </w:t>
-      </w:r>
-      <w:r>
-        <w:rPr>
-          <w:rFonts w:ascii="Garamond" w:hAnsi="Garamond"/>
-          <w:b/>
-          <w:bCs/>
-          <w:color w:val="auto"/>
-          <w:sz w:val="22"/>
-          <w:szCs w:val="22"/>
-        </w:rPr>
-        <w:t xml:space="preserve"> </w:t>
-      </w:r>
-      <w:r>
-        <w:rPr>
-          <w:rFonts w:ascii="Garamond" w:hAnsi="Garamond"/>
-          <w:b/>
-          <w:bCs/>
-          <w:color w:val="auto"/>
-          <w:sz w:val="22"/>
-          <w:szCs w:val="22"/>
-        </w:rPr>
-        <w:t>February 2025</w:t>
-      </w:r>
-      <w:r>
-        <w:rPr>
-          <w:rFonts w:ascii="Garamond" w:hAnsi="Garamond"/>
-          <w:b/>
-          <w:bCs/>
-          <w:color w:val="auto"/>
-          <w:sz w:val="22"/>
-          <w:szCs w:val="22"/>
-        </w:rPr>
-        <w:t xml:space="preserve"> – December 2028</w:t>
+          <w:b/>
+          <w:bCs/>
+          <w:color w:val="auto"/>
+          <w:sz w:val="22"/>
+          <w:szCs w:val="22"/>
+        </w:rPr>
+      </w:pPr>
+      <w:r>
+        <w:rPr>
+          <w:rFonts w:ascii="Garamond" w:hAnsi="Garamond"/>
+          <w:b/>
+          <w:bCs/>
+          <w:color w:val="auto"/>
+          <w:sz w:val="22"/>
+          <w:szCs w:val="22"/>
+        </w:rPr>
+        <w:t xml:space="preserve">IGEL Certified Professional </w:t>
+      </w:r>
+      <w:r>
+        <w:rPr>
+          <w:rFonts w:ascii="Garamond" w:hAnsi="Garamond"/>
+          <w:b/>
+          <w:bCs/>
+          <w:color w:val="auto"/>
+          <w:sz w:val="22"/>
+          <w:szCs w:val="22"/>
+        </w:rPr>
+        <w:tab/>
+      </w:r>
+      <w:r>
+        <w:rPr>
+          <w:rFonts w:ascii="Garamond" w:hAnsi="Garamond"/>
+          <w:b/>
+          <w:bCs/>
+          <w:color w:val="auto"/>
+          <w:sz w:val="22"/>
+          <w:szCs w:val="22"/>
+        </w:rPr>
+        <w:tab/>
+      </w:r>
+      <w:r>
+        <w:rPr>
+          <w:rFonts w:ascii="Garamond" w:hAnsi="Garamond"/>
+          <w:b/>
+          <w:bCs/>
+          <w:color w:val="auto"/>
+          <w:sz w:val="22"/>
+          <w:szCs w:val="22"/>
+        </w:rPr>
+        <w:tab/>
+      </w:r>
+      <w:r>
+        <w:rPr>
+          <w:rFonts w:ascii="Garamond" w:hAnsi="Garamond"/>
+          <w:b/>
+          <w:bCs/>
+          <w:color w:val="auto"/>
+          <w:sz w:val="22"/>
+          <w:szCs w:val="22"/>
+        </w:rPr>
+        <w:tab/>
+      </w:r>
+      <w:r>
+        <w:rPr>
+          <w:rFonts w:ascii="Garamond" w:hAnsi="Garamond"/>
+          <w:b/>
+          <w:bCs/>
+          <w:color w:val="auto"/>
+          <w:sz w:val="22"/>
+          <w:szCs w:val="22"/>
+        </w:rPr>
+        <w:tab/>
+      </w:r>
+      <w:r>
+        <w:rPr>
+          <w:rFonts w:ascii="Garamond" w:hAnsi="Garamond"/>
+          <w:b/>
+          <w:bCs/>
+          <w:color w:val="auto"/>
+          <w:sz w:val="22"/>
+          <w:szCs w:val="22"/>
+        </w:rPr>
+        <w:tab/>
+        <w:t xml:space="preserve">                       </w:t>
+      </w:r>
+      <w:r>
+        <w:rPr>
+          <w:rFonts w:ascii="Garamond" w:hAnsi="Garamond"/>
+          <w:b/>
+          <w:bCs/>
+          <w:sz w:val="22"/>
+          <w:szCs w:val="22"/>
+        </w:rPr>
+        <w:t>December 2025 – December 2027</w:t>
+      </w:r>
+    </w:p>
+    <w:p>
+      <w:pPr>
+        <w:pStyle w:val="Default"/>
+        <w:rPr>
+          <w:rFonts w:ascii="Garamond" w:hAnsi="Garamond"/>
+          <w:b/>
+          <w:bCs/>
+          <w:color w:val="auto"/>
+          <w:sz w:val="18"/>
+          <w:szCs w:val="22"/>
+        </w:rPr>
+      </w:pPr>
+      <w:r>
+        <w:rPr>
+          <w:rFonts w:ascii="Garamond" w:hAnsi="Garamond"/>
+          <w:b/>
+          <w:bCs/>
+          <w:sz w:val="22"/>
+          <w:szCs w:val="22"/>
+        </w:rPr>
+        <w:t>CompTIA Network+</w:t>
+      </w:r>
+      <w:r>
+        <w:rPr>
+          <w:rFonts w:ascii="Garamond" w:hAnsi="Garamond"/>
+          <w:b/>
+          <w:bCs/>
+          <w:sz w:val="22"/>
+          <w:szCs w:val="22"/>
+        </w:rPr>
+        <w:tab/>
+      </w:r>
+      <w:r>
+        <w:rPr>
+          <w:rFonts w:ascii="Garamond" w:hAnsi="Garamond"/>
+          <w:b/>
+          <w:bCs/>
+          <w:sz w:val="22"/>
+          <w:szCs w:val="22"/>
+        </w:rPr>
+        <w:tab/>
+      </w:r>
+      <w:r>
+        <w:rPr>
+          <w:rFonts w:ascii="Garamond" w:hAnsi="Garamond"/>
+          <w:b/>
+          <w:bCs/>
+          <w:sz w:val="22"/>
+          <w:szCs w:val="22"/>
+        </w:rPr>
+        <w:tab/>
+      </w:r>
+      <w:r>
+        <w:rPr>
+          <w:rFonts w:ascii="Garamond" w:hAnsi="Garamond"/>
+          <w:b/>
+          <w:bCs/>
+          <w:sz w:val="22"/>
+          <w:szCs w:val="22"/>
+        </w:rPr>
+        <w:tab/>
+      </w:r>
+      <w:r>
+        <w:rPr>
+          <w:rFonts w:ascii="Garamond" w:hAnsi="Garamond"/>
+          <w:b/>
+          <w:bCs/>
+          <w:sz w:val="22"/>
+          <w:szCs w:val="22"/>
+        </w:rPr>
+        <w:tab/>
+      </w:r>
+      <w:r>
+        <w:rPr>
+          <w:rFonts w:ascii="Garamond" w:hAnsi="Garamond"/>
+          <w:b/>
+          <w:bCs/>
+          <w:sz w:val="22"/>
+          <w:szCs w:val="22"/>
+        </w:rPr>
+        <w:tab/>
+      </w:r>
+      <w:r>
+        <w:rPr>
+          <w:rFonts w:ascii="Garamond" w:hAnsi="Garamond"/>
+          <w:b/>
+          <w:bCs/>
+          <w:sz w:val="22"/>
+          <w:szCs w:val="22"/>
+        </w:rPr>
+        <w:tab/>
+        <w:t xml:space="preserve">                      </w:t>
+      </w:r>
+      <w:r>
+        <w:rPr>
+          <w:rFonts w:ascii="Garamond" w:hAnsi="Garamond"/>
+          <w:b/>
+          <w:bCs/>
+          <w:sz w:val="22"/>
+          <w:szCs w:val="22"/>
+        </w:rPr>
+        <w:t xml:space="preserve">     </w:t>
+      </w:r>
+      <w:r>
+        <w:rPr>
+          <w:rFonts w:ascii="Garamond" w:hAnsi="Garamond"/>
+          <w:b/>
+          <w:bCs/>
+          <w:sz w:val="22"/>
+          <w:szCs w:val="22"/>
+        </w:rPr>
+        <w:t xml:space="preserve">December 2025 – </w:t>
+      </w:r>
+      <w:r>
+        <w:rPr>
+          <w:rFonts w:ascii="Garamond" w:hAnsi="Garamond"/>
+          <w:b/>
+          <w:bCs/>
+          <w:sz w:val="22"/>
+          <w:szCs w:val="22"/>
+        </w:rPr>
+        <w:t>August</w:t>
+      </w:r>
+      <w:r>
+        <w:rPr>
+          <w:rFonts w:ascii="Garamond" w:hAnsi="Garamond"/>
+          <w:b/>
+          <w:bCs/>
+          <w:sz w:val="22"/>
+          <w:szCs w:val="22"/>
+        </w:rPr>
+        <w:t xml:space="preserve"> 202</w:t>
+      </w:r>
+      <w:r>
+        <w:rPr>
+          <w:rFonts w:ascii="Garamond" w:hAnsi="Garamond"/>
+          <w:b/>
+          <w:bCs/>
+          <w:sz w:val="22"/>
+          <w:szCs w:val="22"/>
+        </w:rPr>
+        <w:t>9</w:t>
+      </w:r>
+    </w:p>
+    <w:p>
+      <w:pPr>
+        <w:pStyle w:val="Default"/>
+        <w:rPr>
+          <w:rFonts w:ascii="Garamond" w:hAnsi="Garamond"/>
+          <w:b/>
+          <w:bCs/>
+          <w:color w:val="auto"/>
+          <w:sz w:val="18"/>
+          <w:szCs w:val="22"/>
+        </w:rPr>
+      </w:pPr>
+      <w:r>
+        <w:rPr>
+          <w:rFonts w:ascii="Garamond" w:hAnsi="Garamond"/>
+          <w:b/>
+          <w:bCs/>
+          <w:color w:val="auto"/>
+          <w:sz w:val="22"/>
+          <w:szCs w:val="22"/>
+        </w:rPr>
+        <w:t xml:space="preserve">CompTIA A+                                                                                                                        </w:t>
+      </w:r>
+      <w:r>
+        <w:rPr>
+          <w:rFonts w:ascii="Garamond" w:hAnsi="Garamond"/>
+          <w:b/>
+          <w:bCs/>
+          <w:color w:val="auto"/>
+          <w:sz w:val="22"/>
+          <w:szCs w:val="22"/>
+        </w:rPr>
+        <w:t xml:space="preserve">    </w:t>
+      </w:r>
+      <w:r>
+        <w:rPr>
+          <w:rFonts w:ascii="Garamond" w:hAnsi="Garamond"/>
+          <w:b/>
+          <w:bCs/>
+          <w:color w:val="auto"/>
+          <w:sz w:val="22"/>
+          <w:szCs w:val="22"/>
+        </w:rPr>
+        <w:t xml:space="preserve">February 2025 – </w:t>
+      </w:r>
+      <w:r>
+        <w:rPr>
+          <w:rFonts w:ascii="Garamond" w:hAnsi="Garamond"/>
+          <w:b/>
+          <w:bCs/>
+          <w:sz w:val="22"/>
+          <w:szCs w:val="22"/>
+        </w:rPr>
+        <w:t>August</w:t>
+      </w:r>
+      <w:r>
+        <w:rPr>
+          <w:rFonts w:ascii="Garamond" w:hAnsi="Garamond"/>
+          <w:b/>
+          <w:bCs/>
+          <w:sz w:val="22"/>
+          <w:szCs w:val="22"/>
+        </w:rPr>
+        <w:t xml:space="preserve"> 202</w:t>
+      </w:r>
+      <w:r>
+        <w:rPr>
+          <w:rFonts w:ascii="Garamond" w:hAnsi="Garamond"/>
+          <w:b/>
+          <w:bCs/>
+          <w:sz w:val="22"/>
+          <w:szCs w:val="22"/>
+        </w:rPr>
+        <w:t>9</w:t>
       </w:r>
     </w:p>
     <w:p>
@@ -2857,7 +3111,7 @@
 </file>
 
 <file path=word/endnotes.xml><?xml version="1.0" encoding="utf-8"?>
-<w:endnotes xmlns:wpc="http://schemas.microsoft.com/office/word/2010/wordprocessingCanvas" xmlns:cx="http://schemas.microsoft.com/office/drawing/2014/chartex" xmlns:cx1="http://schemas.microsoft.com/office/drawing/2015/9/8/chartex" xmlns:cx2="http://schemas.microsoft.com/office/drawing/2015/10/21/chartex" xmlns:cx3="http://schemas.microsoft.com/office/drawing/2016/5/9/chartex" xmlns:cx4="http://schemas.microsoft.com/office/drawing/2016/5/10/chartex" xmlns:cx5="http://schemas.microsoft.com/office/drawing/2016/5/11/chartex" xmlns:cx6="http://schemas.microsoft.com/office/drawing/2016/5/12/chartex" xmlns:cx7="http://schemas.microsoft.com/office/drawing/2016/5/13/chartex" xmlns:cx8="http://schemas.microsoft.com/office/drawing/2016/5/14/chartex" xmlns:mc="http://schemas.openxmlformats.org/markup-compatibility/2006" xmlns:aink="http://schemas.microsoft.com/office/drawing/2016/ink" xmlns:am3d="http://schemas.microsoft.com/office/drawing/2017/model3d" xmlns:o="urn:schemas-microsoft-com:office:office" xmlns:oel="http://schemas.microsoft.com/office/2019/extlst" xmlns:r="http://schemas.openxmlformats.org/officeDocument/2006/relationships" xmlns:m="http://schemas.openxmlformats.org/officeDocument/2006/math" xmlns:v="urn:schemas-microsoft-com:vml" xmlns:wp14="http://schemas.microsoft.com/office/word/2010/wordprocessingDrawing" xmlns:wp="http://schemas.openxmlformats.org/drawingml/2006/wordprocessingDrawing" xmlns:w10="urn:schemas-microsoft-com:office:word" xmlns:w="http://schemas.openxmlformats.org/wordprocessingml/2006/main" xmlns:w14="http://schemas.microsoft.com/office/word/2010/wordml" xmlns:w15="http://schemas.microsoft.com/office/word/2012/wordml" xmlns:w16cex="http://schemas.microsoft.com/office/word/2018/wordml/cex" xmlns:w16cid="http://schemas.microsoft.com/office/word/2016/wordml/cid" xmlns:w16="http://schemas.microsoft.com/office/word/2018/wordml" xmlns:w16du="http://schemas.microsoft.com/office/word/2023/wordml/word16du" xmlns:w16sdtdh="http://schemas.microsoft.com/office/word/2020/wordml/sdtdatahash" xmlns:w16sdtfl="http://schemas.microsoft.com/office/word/2024/wordml/sdtformatlock" xmlns:w16se="http://schemas.microsoft.com/office/word/2015/wordml/symex" xmlns:wpg="http://schemas.microsoft.com/office/word/2010/wordprocessingGroup" xmlns:wpi="http://schemas.microsoft.com/office/word/2010/wordprocessingInk" xmlns:wne="http://schemas.microsoft.com/office/word/2006/wordml" xmlns:wps="http://schemas.microsoft.com/office/word/2010/wordprocessingShape" mc:Ignorable="w14 w15 w16se w16cid w16 w16cex w16sdtdh w16sdtfl w16du wp14">
+<w:endnotes xmlns:wpc="http://schemas.microsoft.com/office/word/2010/wordprocessingCanvas" xmlns:cx="http://schemas.microsoft.com/office/drawing/2014/chartex" xmlns:cx1="http://schemas.microsoft.com/office/drawing/2015/9/8/chartex" xmlns:cx2="http://schemas.microsoft.com/office/drawing/2015/10/21/chartex" xmlns:cx3="http://schemas.microsoft.com/office/drawing/2016/5/9/chartex" xmlns:cx4="http://schemas.microsoft.com/office/drawing/2016/5/10/chartex" xmlns:cx5="http://schemas.microsoft.com/office/drawing/2016/5/11/chartex" xmlns:cx6="http://schemas.microsoft.com/office/drawing/2016/5/12/chartex" xmlns:cx7="http://schemas.microsoft.com/office/drawing/2016/5/13/chartex" xmlns:cx8="http://schemas.microsoft.com/office/drawing/2016/5/14/chartex" xmlns:mc="http://schemas.openxmlformats.org/markup-compatibility/2006" xmlns:aink="http://schemas.microsoft.com/office/drawing/2016/ink" xmlns:am3d="http://schemas.microsoft.com/office/drawing/2017/model3d" xmlns:o="urn:schemas-microsoft-com:office:office" xmlns:oel="http://schemas.microsoft.com/office/2019/extlst" xmlns:r="http://schemas.openxmlformats.org/officeDocument/2006/relationships" xmlns:m="http://schemas.openxmlformats.org/officeDocument/2006/math" xmlns:v="urn:schemas-microsoft-com:vml" xmlns:wp14="http://schemas.microsoft.com/office/word/2010/wordprocessingDrawing" xmlns:wp="http://schemas.openxmlformats.org/drawingml/2006/wordprocessingDrawing" xmlns:w10="urn:schemas-microsoft-com:office:word" xmlns:w="http://schemas.openxmlformats.org/wordprocessingml/2006/main" xmlns:w14="http://schemas.microsoft.com/office/word/2010/wordml" xmlns:w15="http://schemas.microsoft.com/office/word/2012/wordml" xmlns:w16cei="http://schemas.microsoft.com/office/word/2026/wordml/cei" xmlns:w16cex="http://schemas.microsoft.com/office/word/2018/wordml/cex" xmlns:w16cid="http://schemas.microsoft.com/office/word/2016/wordml/cid" xmlns:w16="http://schemas.microsoft.com/office/word/2018/wordml" xmlns:w16du="http://schemas.microsoft.com/office/word/2023/wordml/word16du" xmlns:w16sdtdh="http://schemas.microsoft.com/office/word/2020/wordml/sdtdatahash" xmlns:w16sdtfl="http://schemas.microsoft.com/office/word/2024/wordml/sdtformatlock" xmlns:w16se="http://schemas.microsoft.com/office/word/2015/wordml/symex" xmlns:wpg="http://schemas.microsoft.com/office/word/2010/wordprocessingGroup" xmlns:wpi="http://schemas.microsoft.com/office/word/2010/wordprocessingInk" xmlns:wne="http://schemas.microsoft.com/office/word/2006/wordml" xmlns:wps="http://schemas.microsoft.com/office/word/2010/wordprocessingShape" mc:Ignorable="w14 w15 w16se w16cid w16 w16cex w16sdtdh w16sdtfl w16du wp14">
   <w:endnote w:type="separator" w:id="-1">
     <w:p>
       <w:r>
@@ -2876,7 +3130,7 @@
 </file>
 
 <file path=word/footnotes.xml><?xml version="1.0" encoding="utf-8"?>
-<w:footnotes xmlns:wpc="http://schemas.microsoft.com/office/word/2010/wordprocessingCanvas" xmlns:cx="http://schemas.microsoft.com/office/drawing/2014/chartex" xmlns:cx1="http://schemas.microsoft.com/office/drawing/2015/9/8/chartex" xmlns:cx2="http://schemas.microsoft.com/office/drawing/2015/10/21/chartex" xmlns:cx3="http://schemas.microsoft.com/office/drawing/2016/5/9/chartex" xmlns:cx4="http://schemas.microsoft.com/office/drawing/2016/5/10/chartex" xmlns:cx5="http://schemas.microsoft.com/office/drawing/2016/5/11/chartex" xmlns:cx6="http://schemas.microsoft.com/office/drawing/2016/5/12/chartex" xmlns:cx7="http://schemas.microsoft.com/office/drawing/2016/5/13/chartex" xmlns:cx8="http://schemas.microsoft.com/office/drawing/2016/5/14/chartex" xmlns:mc="http://schemas.openxmlformats.org/markup-compatibility/2006" xmlns:aink="http://schemas.microsoft.com/office/drawing/2016/ink" xmlns:am3d="http://schemas.microsoft.com/office/drawing/2017/model3d" xmlns:o="urn:schemas-microsoft-com:office:office" xmlns:oel="http://schemas.microsoft.com/office/2019/extlst" xmlns:r="http://schemas.openxmlformats.org/officeDocument/2006/relationships" xmlns:m="http://schemas.openxmlformats.org/officeDocument/2006/math" xmlns:v="urn:schemas-microsoft-com:vml" xmlns:wp14="http://schemas.microsoft.com/office/word/2010/wordprocessingDrawing" xmlns:wp="http://schemas.openxmlformats.org/drawingml/2006/wordprocessingDrawing" xmlns:w10="urn:schemas-microsoft-com:office:word" xmlns:w="http://schemas.openxmlformats.org/wordprocessingml/2006/main" xmlns:w14="http://schemas.microsoft.com/office/word/2010/wordml" xmlns:w15="http://schemas.microsoft.com/office/word/2012/wordml" xmlns:w16cex="http://schemas.microsoft.com/office/word/2018/wordml/cex" xmlns:w16cid="http://schemas.microsoft.com/office/word/2016/wordml/cid" xmlns:w16="http://schemas.microsoft.com/office/word/2018/wordml" xmlns:w16du="http://schemas.microsoft.com/office/word/2023/wordml/word16du" xmlns:w16sdtdh="http://schemas.microsoft.com/office/word/2020/wordml/sdtdatahash" xmlns:w16sdtfl="http://schemas.microsoft.com/office/word/2024/wordml/sdtformatlock" xmlns:w16se="http://schemas.microsoft.com/office/word/2015/wordml/symex" xmlns:wpg="http://schemas.microsoft.com/office/word/2010/wordprocessingGroup" xmlns:wpi="http://schemas.microsoft.com/office/word/2010/wordprocessingInk" xmlns:wne="http://schemas.microsoft.com/office/word/2006/wordml" xmlns:wps="http://schemas.microsoft.com/office/word/2010/wordprocessingShape" mc:Ignorable="w14 w15 w16se w16cid w16 w16cex w16sdtdh w16sdtfl w16du wp14">
+<w:footnotes xmlns:wpc="http://schemas.microsoft.com/office/word/2010/wordprocessingCanvas" xmlns:cx="http://schemas.microsoft.com/office/drawing/2014/chartex" xmlns:cx1="http://schemas.microsoft.com/office/drawing/2015/9/8/chartex" xmlns:cx2="http://schemas.microsoft.com/office/drawing/2015/10/21/chartex" xmlns:cx3="http://schemas.microsoft.com/office/drawing/2016/5/9/chartex" xmlns:cx4="http://schemas.microsoft.com/office/drawing/2016/5/10/chartex" xmlns:cx5="http://schemas.microsoft.com/office/drawing/2016/5/11/chartex" xmlns:cx6="http://schemas.microsoft.com/office/drawing/2016/5/12/chartex" xmlns:cx7="http://schemas.microsoft.com/office/drawing/2016/5/13/chartex" xmlns:cx8="http://schemas.microsoft.com/office/drawing/2016/5/14/chartex" xmlns:mc="http://schemas.openxmlformats.org/markup-compatibility/2006" xmlns:aink="http://schemas.microsoft.com/office/drawing/2016/ink" xmlns:am3d="http://schemas.microsoft.com/office/drawing/2017/model3d" xmlns:o="urn:schemas-microsoft-com:office:office" xmlns:oel="http://schemas.microsoft.com/office/2019/extlst" xmlns:r="http://schemas.openxmlformats.org/officeDocument/2006/relationships" xmlns:m="http://schemas.openxmlformats.org/officeDocument/2006/math" xmlns:v="urn:schemas-microsoft-com:vml" xmlns:wp14="http://schemas.microsoft.com/office/word/2010/wordprocessingDrawing" xmlns:wp="http://schemas.openxmlformats.org/drawingml/2006/wordprocessingDrawing" xmlns:w10="urn:schemas-microsoft-com:office:word" xmlns:w="http://schemas.openxmlformats.org/wordprocessingml/2006/main" xmlns:w14="http://schemas.microsoft.com/office/word/2010/wordml" xmlns:w15="http://schemas.microsoft.com/office/word/2012/wordml" xmlns:w16cei="http://schemas.microsoft.com/office/word/2026/wordml/cei" xmlns:w16cex="http://schemas.microsoft.com/office/word/2018/wordml/cex" xmlns:w16cid="http://schemas.microsoft.com/office/word/2016/wordml/cid" xmlns:w16="http://schemas.microsoft.com/office/word/2018/wordml" xmlns:w16du="http://schemas.microsoft.com/office/word/2023/wordml/word16du" xmlns:w16sdtdh="http://schemas.microsoft.com/office/word/2020/wordml/sdtdatahash" xmlns:w16sdtfl="http://schemas.microsoft.com/office/word/2024/wordml/sdtformatlock" xmlns:w16se="http://schemas.microsoft.com/office/word/2015/wordml/symex" xmlns:wpg="http://schemas.microsoft.com/office/word/2010/wordprocessingGroup" xmlns:wpi="http://schemas.microsoft.com/office/word/2010/wordprocessingInk" xmlns:wne="http://schemas.microsoft.com/office/word/2006/wordml" xmlns:wps="http://schemas.microsoft.com/office/word/2010/wordprocessingShape" mc:Ignorable="w14 w15 w16se w16cid w16 w16cex w16sdtdh w16sdtfl w16du wp14">
   <w:footnote w:type="separator" w:id="-1">
     <w:p>
       <w:r>
@@ -2895,7 +3149,7 @@
 </file>
 
 <file path=word/numbering.xml><?xml version="1.0" encoding="utf-8"?>
-<w:numbering xmlns:wpc="http://schemas.microsoft.com/office/word/2010/wordprocessingCanvas" xmlns:cx="http://schemas.microsoft.com/office/drawing/2014/chartex" xmlns:cx1="http://schemas.microsoft.com/office/drawing/2015/9/8/chartex" xmlns:cx2="http://schemas.microsoft.com/office/drawing/2015/10/21/chartex" xmlns:cx3="http://schemas.microsoft.com/office/drawing/2016/5/9/chartex" xmlns:cx4="http://schemas.microsoft.com/office/drawing/2016/5/10/chartex" xmlns:cx5="http://schemas.microsoft.com/office/drawing/2016/5/11/chartex" xmlns:cx6="http://schemas.microsoft.com/office/drawing/2016/5/12/chartex" xmlns:cx7="http://schemas.microsoft.com/office/drawing/2016/5/13/chartex" xmlns:cx8="http://schemas.microsoft.com/office/drawing/2016/5/14/chartex" xmlns:mc="http://schemas.openxmlformats.org/markup-compatibility/2006" xmlns:aink="http://schemas.microsoft.com/office/drawing/2016/ink" xmlns:am3d="http://schemas.microsoft.com/office/drawing/2017/model3d" xmlns:o="urn:schemas-microsoft-com:office:office" xmlns:oel="http://schemas.microsoft.com/office/2019/extlst" xmlns:r="http://schemas.openxmlformats.org/officeDocument/2006/relationships" xmlns:m="http://schemas.openxmlformats.org/officeDocument/2006/math" xmlns:v="urn:schemas-microsoft-com:vml" xmlns:wp14="http://schemas.microsoft.com/office/word/2010/wordprocessingDrawing" xmlns:wp="http://schemas.openxmlformats.org/drawingml/2006/wordprocessingDrawing" xmlns:w10="urn:schemas-microsoft-com:office:word" xmlns:w="http://schemas.openxmlformats.org/wordprocessingml/2006/main" xmlns:w14="http://schemas.microsoft.com/office/word/2010/wordml" xmlns:w15="http://schemas.microsoft.com/office/word/2012/wordml" xmlns:w16cex="http://schemas.microsoft.com/office/word/2018/wordml/cex" xmlns:w16cid="http://schemas.microsoft.com/office/word/2016/wordml/cid" xmlns:w16="http://schemas.microsoft.com/office/word/2018/wordml" xmlns:w16du="http://schemas.microsoft.com/office/word/2023/wordml/word16du" xmlns:w16sdtdh="http://schemas.microsoft.com/office/word/2020/wordml/sdtdatahash" xmlns:w16sdtfl="http://schemas.microsoft.com/office/word/2024/wordml/sdtformatlock" xmlns:w16se="http://schemas.microsoft.com/office/word/2015/wordml/symex" xmlns:wpg="http://schemas.microsoft.com/office/word/2010/wordprocessingGroup" xmlns:wpi="http://schemas.microsoft.com/office/word/2010/wordprocessingInk" xmlns:wne="http://schemas.microsoft.com/office/word/2006/wordml" xmlns:wps="http://schemas.microsoft.com/office/word/2010/wordprocessingShape" mc:Ignorable="w14 w15 w16se w16cid w16 w16cex w16sdtdh w16sdtfl w16du wp14">
+<w:numbering xmlns:wpc="http://schemas.microsoft.com/office/word/2010/wordprocessingCanvas" xmlns:cx="http://schemas.microsoft.com/office/drawing/2014/chartex" xmlns:cx1="http://schemas.microsoft.com/office/drawing/2015/9/8/chartex" xmlns:cx2="http://schemas.microsoft.com/office/drawing/2015/10/21/chartex" xmlns:cx3="http://schemas.microsoft.com/office/drawing/2016/5/9/chartex" xmlns:cx4="http://schemas.microsoft.com/office/drawing/2016/5/10/chartex" xmlns:cx5="http://schemas.microsoft.com/office/drawing/2016/5/11/chartex" xmlns:cx6="http://schemas.microsoft.com/office/drawing/2016/5/12/chartex" xmlns:cx7="http://schemas.microsoft.com/office/drawing/2016/5/13/chartex" xmlns:cx8="http://schemas.microsoft.com/office/drawing/2016/5/14/chartex" xmlns:mc="http://schemas.openxmlformats.org/markup-compatibility/2006" xmlns:aink="http://schemas.microsoft.com/office/drawing/2016/ink" xmlns:am3d="http://schemas.microsoft.com/office/drawing/2017/model3d" xmlns:o="urn:schemas-microsoft-com:office:office" xmlns:oel="http://schemas.microsoft.com/office/2019/extlst" xmlns:r="http://schemas.openxmlformats.org/officeDocument/2006/relationships" xmlns:m="http://schemas.openxmlformats.org/officeDocument/2006/math" xmlns:v="urn:schemas-microsoft-com:vml" xmlns:wp14="http://schemas.microsoft.com/office/word/2010/wordprocessingDrawing" xmlns:wp="http://schemas.openxmlformats.org/drawingml/2006/wordprocessingDrawing" xmlns:w10="urn:schemas-microsoft-com:office:word" xmlns:w="http://schemas.openxmlformats.org/wordprocessingml/2006/main" xmlns:w14="http://schemas.microsoft.com/office/word/2010/wordml" xmlns:w15="http://schemas.microsoft.com/office/word/2012/wordml" xmlns:w16cei="http://schemas.microsoft.com/office/word/2026/wordml/cei" xmlns:w16cex="http://schemas.microsoft.com/office/word/2018/wordml/cex" xmlns:w16cid="http://schemas.microsoft.com/office/word/2016/wordml/cid" xmlns:w16="http://schemas.microsoft.com/office/word/2018/wordml" xmlns:w16du="http://schemas.microsoft.com/office/word/2023/wordml/word16du" xmlns:w16sdtdh="http://schemas.microsoft.com/office/word/2020/wordml/sdtdatahash" xmlns:w16sdtfl="http://schemas.microsoft.com/office/word/2024/wordml/sdtformatlock" xmlns:w16se="http://schemas.microsoft.com/office/word/2015/wordml/symex" xmlns:wpg="http://schemas.microsoft.com/office/word/2010/wordprocessingGroup" xmlns:wpi="http://schemas.microsoft.com/office/word/2010/wordprocessingInk" xmlns:wne="http://schemas.microsoft.com/office/word/2006/wordml" xmlns:wps="http://schemas.microsoft.com/office/word/2010/wordprocessingShape" mc:Ignorable="w14 w15 w16se w16cid w16 w16cex w16sdtdh w16sdtfl w16du wp14">
   <w:abstractNum w:abstractNumId="0" w15:restartNumberingAfterBreak="0">
     <w:nsid w:val="02C450BF"/>
     <w:multiLevelType w:val="hybridMultilevel"/>
@@ -6235,6 +6489,7 @@
   <w:style w:type="character" w:default="1" w:styleId="DefaultParagraphFont">
     <w:name w:val="Default Paragraph Font"/>
     <w:uiPriority w:val="1"/>
+    <w:semiHidden/>
     <w:unhideWhenUsed/>
   </w:style>
   <w:style w:type="table" w:default="1" w:styleId="TableNormal">

</xml_diff>

<commit_message>
Update resume, remove button, and update project
Button to swap between web dev and IT resume is removed. Additionally the IT resume has been updated
</commit_message>
<xml_diff>
--- a/assets/pdf/noah_hamblen_portfolio_resume1.docx
+++ b/assets/pdf/noah_hamblen_portfolio_resume1.docx
@@ -1,6 +1,6 @@
 
 <file path=word/document.xml><?xml version="1.0" encoding="utf-8"?>
-<w:document xmlns:wpc="http://schemas.microsoft.com/office/word/2010/wordprocessingCanvas" xmlns:cx="http://schemas.microsoft.com/office/drawing/2014/chartex" xmlns:cx1="http://schemas.microsoft.com/office/drawing/2015/9/8/chartex" xmlns:cx2="http://schemas.microsoft.com/office/drawing/2015/10/21/chartex" xmlns:cx3="http://schemas.microsoft.com/office/drawing/2016/5/9/chartex" xmlns:cx4="http://schemas.microsoft.com/office/drawing/2016/5/10/chartex" xmlns:cx5="http://schemas.microsoft.com/office/drawing/2016/5/11/chartex" xmlns:cx6="http://schemas.microsoft.com/office/drawing/2016/5/12/chartex" xmlns:cx7="http://schemas.microsoft.com/office/drawing/2016/5/13/chartex" xmlns:cx8="http://schemas.microsoft.com/office/drawing/2016/5/14/chartex" xmlns:mc="http://schemas.openxmlformats.org/markup-compatibility/2006" xmlns:aink="http://schemas.microsoft.com/office/drawing/2016/ink" xmlns:am3d="http://schemas.microsoft.com/office/drawing/2017/model3d" xmlns:o="urn:schemas-microsoft-com:office:office" xmlns:oel="http://schemas.microsoft.com/office/2019/extlst" xmlns:r="http://schemas.openxmlformats.org/officeDocument/2006/relationships" xmlns:m="http://schemas.openxmlformats.org/officeDocument/2006/math" xmlns:v="urn:schemas-microsoft-com:vml" xmlns:wp14="http://schemas.microsoft.com/office/word/2010/wordprocessingDrawing" xmlns:wp="http://schemas.openxmlformats.org/drawingml/2006/wordprocessingDrawing" xmlns:w10="urn:schemas-microsoft-com:office:word" xmlns:w="http://schemas.openxmlformats.org/wordprocessingml/2006/main" xmlns:w14="http://schemas.microsoft.com/office/word/2010/wordml" xmlns:w15="http://schemas.microsoft.com/office/word/2012/wordml" xmlns:w16cei="http://schemas.microsoft.com/office/word/2026/wordml/cei" xmlns:w16cex="http://schemas.microsoft.com/office/word/2018/wordml/cex" xmlns:w16cid="http://schemas.microsoft.com/office/word/2016/wordml/cid" xmlns:w16="http://schemas.microsoft.com/office/word/2018/wordml" xmlns:w16du="http://schemas.microsoft.com/office/word/2023/wordml/word16du" xmlns:w16sdtdh="http://schemas.microsoft.com/office/word/2020/wordml/sdtdatahash" xmlns:w16sdtfl="http://schemas.microsoft.com/office/word/2024/wordml/sdtformatlock" xmlns:w16se="http://schemas.microsoft.com/office/word/2015/wordml/symex" xmlns:wpg="http://schemas.microsoft.com/office/word/2010/wordprocessingGroup" xmlns:wpi="http://schemas.microsoft.com/office/word/2010/wordprocessingInk" xmlns:wne="http://schemas.microsoft.com/office/word/2006/wordml" xmlns:wps="http://schemas.microsoft.com/office/word/2010/wordprocessingShape" mc:Ignorable="w14 w15 w16se w16cid w16 w16cex w16sdtdh w16sdtfl w16du wp14">
+<w:document xmlns:wpc="http://schemas.microsoft.com/office/word/2010/wordprocessingCanvas" xmlns:cx="http://schemas.microsoft.com/office/drawing/2014/chartex" xmlns:cx1="http://schemas.microsoft.com/office/drawing/2015/9/8/chartex" xmlns:cx2="http://schemas.microsoft.com/office/drawing/2015/10/21/chartex" xmlns:cx3="http://schemas.microsoft.com/office/drawing/2016/5/9/chartex" xmlns:cx4="http://schemas.microsoft.com/office/drawing/2016/5/10/chartex" xmlns:cx5="http://schemas.microsoft.com/office/drawing/2016/5/11/chartex" xmlns:cx6="http://schemas.microsoft.com/office/drawing/2016/5/12/chartex" xmlns:cx7="http://schemas.microsoft.com/office/drawing/2016/5/13/chartex" xmlns:cx8="http://schemas.microsoft.com/office/drawing/2016/5/14/chartex" xmlns:mc="http://schemas.openxmlformats.org/markup-compatibility/2006" xmlns:aink="http://schemas.microsoft.com/office/drawing/2016/ink" xmlns:am3d="http://schemas.microsoft.com/office/drawing/2017/model3d" xmlns:o="urn:schemas-microsoft-com:office:office" xmlns:oel="http://schemas.microsoft.com/office/2019/extlst" xmlns:r="http://schemas.openxmlformats.org/officeDocument/2006/relationships" xmlns:m="http://schemas.openxmlformats.org/officeDocument/2006/math" xmlns:v="urn:schemas-microsoft-com:vml" xmlns:wp14="http://schemas.microsoft.com/office/word/2010/wordprocessingDrawing" xmlns:wp="http://schemas.openxmlformats.org/drawingml/2006/wordprocessingDrawing" xmlns:w10="urn:schemas-microsoft-com:office:word" xmlns:w="http://schemas.openxmlformats.org/wordprocessingml/2006/main" xmlns:w14="http://schemas.microsoft.com/office/word/2010/wordml" xmlns:w15="http://schemas.microsoft.com/office/word/2012/wordml" xmlns:w16cex="http://schemas.microsoft.com/office/word/2018/wordml/cex" xmlns:w16cid="http://schemas.microsoft.com/office/word/2016/wordml/cid" xmlns:w16="http://schemas.microsoft.com/office/word/2018/wordml" xmlns:w16du="http://schemas.microsoft.com/office/word/2023/wordml/word16du" xmlns:w16sdtdh="http://schemas.microsoft.com/office/word/2020/wordml/sdtdatahash" xmlns:w16sdtfl="http://schemas.microsoft.com/office/word/2024/wordml/sdtformatlock" xmlns:w16se="http://schemas.microsoft.com/office/word/2015/wordml/symex" xmlns:wpg="http://schemas.microsoft.com/office/word/2010/wordprocessingGroup" xmlns:wpi="http://schemas.microsoft.com/office/word/2010/wordprocessingInk" xmlns:wne="http://schemas.microsoft.com/office/word/2006/wordml" xmlns:wps="http://schemas.microsoft.com/office/word/2010/wordprocessingShape" mc:Ignorable="w14 w15 w16se w16cid w16 w16cex w16sdtdh w16sdtfl w16du wp14">
   <w:body>
     <w:p>
       <w:pPr>
@@ -12,21 +12,6 @@
           <w:rFonts w:ascii="Garamond" w:hAnsi="Garamond"/>
           <w:b/>
           <w:color w:val="auto"/>
-          <w:sz w:val="22"/>
-          <w:szCs w:val="14"/>
-        </w:rPr>
-      </w:pPr>
-    </w:p>
-    <w:p>
-      <w:pPr>
-        <w:pStyle w:val="Default"/>
-        <w:pBdr>
-          <w:bottom w:val="single" w:sz="6" w:space="1" w:color="auto"/>
-        </w:pBdr>
-        <w:rPr>
-          <w:rFonts w:ascii="Garamond" w:hAnsi="Garamond"/>
-          <w:b/>
-          <w:color w:val="auto"/>
           <w:sz w:val="60"/>
           <w:szCs w:val="60"/>
         </w:rPr>
@@ -41,17 +26,6 @@
         </w:rPr>
         <w:t>Noah Hamblen</w:t>
       </w:r>
-    </w:p>
-    <w:p>
-      <w:pPr>
-        <w:pStyle w:val="Default"/>
-        <w:rPr>
-          <w:rFonts w:ascii="Garamond" w:hAnsi="Garamond"/>
-          <w:color w:val="auto"/>
-          <w:sz w:val="22"/>
-          <w:szCs w:val="28"/>
-        </w:rPr>
-      </w:pPr>
     </w:p>
     <w:p>
       <w:pPr>
@@ -99,34 +73,7 @@
           <w:sz w:val="22"/>
           <w:szCs w:val="22"/>
         </w:rPr>
-        <w:t xml:space="preserve"> </w:t>
-      </w:r>
-      <w:r>
-        <w:rPr>
-          <w:rFonts w:ascii="Garamond" w:hAnsi="Garamond"/>
-          <w:color w:val="auto"/>
-          <w:sz w:val="22"/>
-          <w:szCs w:val="22"/>
-        </w:rPr>
-        <w:t>Omaha</w:t>
-      </w:r>
-      <w:r>
-        <w:rPr>
-          <w:rFonts w:ascii="Garamond" w:hAnsi="Garamond"/>
-          <w:color w:val="auto"/>
-          <w:sz w:val="22"/>
-          <w:szCs w:val="22"/>
-        </w:rPr>
-        <w:t xml:space="preserve">, </w:t>
-      </w:r>
-      <w:r>
-        <w:rPr>
-          <w:rFonts w:ascii="Garamond" w:hAnsi="Garamond"/>
-          <w:color w:val="auto"/>
-          <w:sz w:val="22"/>
-          <w:szCs w:val="22"/>
-        </w:rPr>
-        <w:t xml:space="preserve">NE </w:t>
+        <w:t xml:space="preserve"> Omaha, NE </w:t>
       </w:r>
       <w:r>
         <w:rPr>
@@ -212,15 +159,7 @@
           <w:sz w:val="22"/>
           <w:szCs w:val="22"/>
         </w:rPr>
-        <w:t>LinkedIn</w:t>
-      </w:r>
-      <w:r>
-        <w:rPr>
-          <w:rFonts w:ascii="Garamond" w:hAnsi="Garamond"/>
-          <w:sz w:val="22"/>
-          <w:szCs w:val="22"/>
-        </w:rPr>
-        <w:t xml:space="preserve">: </w:t>
+        <w:t xml:space="preserve">LinkedIn: </w:t>
       </w:r>
       <w:hyperlink r:id="rId10" w:history="1">
         <w:r>
@@ -275,15 +214,7 @@
           <w:sz w:val="22"/>
           <w:szCs w:val="22"/>
         </w:rPr>
-        <w:t>GitHub</w:t>
-      </w:r>
-      <w:r>
-        <w:rPr>
-          <w:rFonts w:ascii="Garamond" w:hAnsi="Garamond"/>
-          <w:sz w:val="22"/>
-          <w:szCs w:val="22"/>
-        </w:rPr>
-        <w:t xml:space="preserve">: </w:t>
+        <w:t xml:space="preserve">GitHub: </w:t>
       </w:r>
       <w:hyperlink r:id="rId11" w:history="1">
         <w:r>
@@ -303,16 +234,7 @@
             <w:sz w:val="22"/>
             <w:szCs w:val="22"/>
           </w:rPr>
-          <w:t>n</w:t>
-        </w:r>
-        <w:r>
-          <w:rPr>
-            <w:rStyle w:val="Hyperlink"/>
-            <w:rFonts w:ascii="Garamond" w:hAnsi="Garamond"/>
-            <w:sz w:val="22"/>
-            <w:szCs w:val="22"/>
-          </w:rPr>
-          <w:t>hamblen</w:t>
+          <w:t>nhamblen</w:t>
         </w:r>
         <w:proofErr w:type="spellEnd"/>
       </w:hyperlink>
@@ -349,36 +271,114 @@
         </w:pBdr>
         <w:rPr>
           <w:rFonts w:ascii="Garamond" w:hAnsi="Garamond"/>
-          <w:sz w:val="22"/>
-          <w:szCs w:val="22"/>
-        </w:rPr>
-      </w:pPr>
+          <w:b/>
+          <w:bCs/>
+          <w:color w:val="auto"/>
+          <w:sz w:val="28"/>
+          <w:szCs w:val="28"/>
+        </w:rPr>
+      </w:pPr>
+      <w:r>
+        <w:rPr>
+          <w:rFonts w:ascii="Garamond" w:hAnsi="Garamond"/>
+          <w:b/>
+          <w:bCs/>
+          <w:color w:val="auto"/>
+          <w:sz w:val="28"/>
+          <w:szCs w:val="28"/>
+        </w:rPr>
+        <w:t>WORK EXPERIENCE</w:t>
+      </w:r>
     </w:p>
     <w:p>
       <w:pPr>
         <w:pStyle w:val="Default"/>
-        <w:pBdr>
-          <w:bottom w:val="single" w:sz="6" w:space="1" w:color="auto"/>
-        </w:pBdr>
-        <w:rPr>
-          <w:rFonts w:ascii="Garamond" w:hAnsi="Garamond"/>
-          <w:b/>
-          <w:bCs/>
-          <w:color w:val="auto"/>
-          <w:sz w:val="28"/>
-          <w:szCs w:val="28"/>
-        </w:rPr>
-      </w:pPr>
-      <w:r>
-        <w:rPr>
-          <w:rFonts w:ascii="Garamond" w:hAnsi="Garamond"/>
-          <w:b/>
-          <w:bCs/>
-          <w:color w:val="auto"/>
-          <w:sz w:val="28"/>
-          <w:szCs w:val="28"/>
-        </w:rPr>
-        <w:t>WORK EXPERIENCE</w:t>
+        <w:rPr>
+          <w:rFonts w:ascii="Garamond" w:hAnsi="Garamond"/>
+          <w:b/>
+          <w:bCs/>
+          <w:color w:val="auto"/>
+          <w:sz w:val="22"/>
+          <w:szCs w:val="22"/>
+        </w:rPr>
+      </w:pPr>
+      <w:r>
+        <w:rPr>
+          <w:rFonts w:ascii="Garamond" w:hAnsi="Garamond"/>
+          <w:b/>
+          <w:bCs/>
+          <w:color w:val="auto"/>
+          <w:sz w:val="22"/>
+          <w:szCs w:val="22"/>
+        </w:rPr>
+        <w:t>Baird Holm</w:t>
+      </w:r>
+      <w:r>
+        <w:rPr>
+          <w:rFonts w:ascii="Garamond" w:hAnsi="Garamond"/>
+          <w:b/>
+          <w:bCs/>
+          <w:color w:val="auto"/>
+          <w:sz w:val="22"/>
+          <w:szCs w:val="22"/>
+        </w:rPr>
+        <w:tab/>
+      </w:r>
+      <w:r>
+        <w:rPr>
+          <w:rFonts w:ascii="Garamond" w:hAnsi="Garamond"/>
+          <w:b/>
+          <w:bCs/>
+          <w:color w:val="auto"/>
+          <w:sz w:val="22"/>
+          <w:szCs w:val="22"/>
+        </w:rPr>
+        <w:tab/>
+      </w:r>
+      <w:r>
+        <w:rPr>
+          <w:rFonts w:ascii="Garamond" w:hAnsi="Garamond"/>
+          <w:b/>
+          <w:bCs/>
+          <w:color w:val="auto"/>
+          <w:sz w:val="22"/>
+          <w:szCs w:val="22"/>
+        </w:rPr>
+        <w:tab/>
+      </w:r>
+      <w:r>
+        <w:rPr>
+          <w:rFonts w:ascii="Garamond" w:hAnsi="Garamond"/>
+          <w:b/>
+          <w:bCs/>
+          <w:color w:val="auto"/>
+          <w:sz w:val="22"/>
+          <w:szCs w:val="22"/>
+        </w:rPr>
+        <w:tab/>
+        <w:t xml:space="preserve">                                                                                       </w:t>
+      </w:r>
+      <w:r>
+        <w:rPr>
+          <w:rFonts w:ascii="Garamond" w:hAnsi="Garamond"/>
+          <w:b/>
+          <w:bCs/>
+          <w:color w:val="auto"/>
+          <w:sz w:val="22"/>
+          <w:szCs w:val="22"/>
+        </w:rPr>
+        <w:t>September</w:t>
+      </w:r>
+      <w:r>
+        <w:rPr>
+          <w:rFonts w:ascii="Garamond" w:hAnsi="Garamond"/>
+          <w:b/>
+          <w:bCs/>
+          <w:color w:val="auto"/>
+          <w:sz w:val="22"/>
+          <w:szCs w:val="22"/>
+        </w:rPr>
+        <w:t xml:space="preserve"> 2025 – Present</w:t>
       </w:r>
     </w:p>
     <w:p>
@@ -386,124 +386,6 @@
         <w:pStyle w:val="Default"/>
         <w:rPr>
           <w:rFonts w:ascii="Garamond" w:hAnsi="Garamond"/>
-          <w:b/>
-          <w:bCs/>
-          <w:color w:val="auto"/>
-          <w:sz w:val="2"/>
-          <w:szCs w:val="2"/>
-          <w:u w:val="single"/>
-        </w:rPr>
-      </w:pPr>
-    </w:p>
-    <w:p>
-      <w:pPr>
-        <w:pStyle w:val="Default"/>
-        <w:rPr>
-          <w:rFonts w:ascii="Garamond" w:hAnsi="Garamond"/>
-          <w:b/>
-          <w:bCs/>
-          <w:color w:val="auto"/>
-          <w:sz w:val="22"/>
-          <w:szCs w:val="22"/>
-        </w:rPr>
-      </w:pPr>
-    </w:p>
-    <w:p>
-      <w:pPr>
-        <w:pStyle w:val="Default"/>
-        <w:rPr>
-          <w:rFonts w:ascii="Garamond" w:hAnsi="Garamond"/>
-          <w:b/>
-          <w:bCs/>
-          <w:color w:val="auto"/>
-          <w:sz w:val="22"/>
-          <w:szCs w:val="22"/>
-        </w:rPr>
-      </w:pPr>
-      <w:r>
-        <w:rPr>
-          <w:rFonts w:ascii="Garamond" w:hAnsi="Garamond"/>
-          <w:b/>
-          <w:bCs/>
-          <w:color w:val="auto"/>
-          <w:sz w:val="22"/>
-          <w:szCs w:val="22"/>
-        </w:rPr>
-        <w:t>Baird Holm</w:t>
-      </w:r>
-      <w:r>
-        <w:rPr>
-          <w:rFonts w:ascii="Garamond" w:hAnsi="Garamond"/>
-          <w:b/>
-          <w:bCs/>
-          <w:color w:val="auto"/>
-          <w:sz w:val="22"/>
-          <w:szCs w:val="22"/>
-        </w:rPr>
-        <w:tab/>
-      </w:r>
-      <w:r>
-        <w:rPr>
-          <w:rFonts w:ascii="Garamond" w:hAnsi="Garamond"/>
-          <w:b/>
-          <w:bCs/>
-          <w:color w:val="auto"/>
-          <w:sz w:val="22"/>
-          <w:szCs w:val="22"/>
-        </w:rPr>
-        <w:tab/>
-      </w:r>
-      <w:r>
-        <w:rPr>
-          <w:rFonts w:ascii="Garamond" w:hAnsi="Garamond"/>
-          <w:b/>
-          <w:bCs/>
-          <w:color w:val="auto"/>
-          <w:sz w:val="22"/>
-          <w:szCs w:val="22"/>
-        </w:rPr>
-        <w:tab/>
-      </w:r>
-      <w:r>
-        <w:rPr>
-          <w:rFonts w:ascii="Garamond" w:hAnsi="Garamond"/>
-          <w:b/>
-          <w:bCs/>
-          <w:color w:val="auto"/>
-          <w:sz w:val="22"/>
-          <w:szCs w:val="22"/>
-        </w:rPr>
-        <w:tab/>
-        <w:t xml:space="preserve">                                                                                       </w:t>
-      </w:r>
-      <w:r>
-        <w:rPr>
-          <w:rFonts w:ascii="Garamond" w:hAnsi="Garamond"/>
-          <w:b/>
-          <w:bCs/>
-          <w:color w:val="auto"/>
-          <w:sz w:val="22"/>
-          <w:szCs w:val="22"/>
-        </w:rPr>
-        <w:t>September</w:t>
-      </w:r>
-      <w:r>
-        <w:rPr>
-          <w:rFonts w:ascii="Garamond" w:hAnsi="Garamond"/>
-          <w:b/>
-          <w:bCs/>
-          <w:color w:val="auto"/>
-          <w:sz w:val="22"/>
-          <w:szCs w:val="22"/>
-        </w:rPr>
-        <w:t xml:space="preserve"> 2025 – Present</w:t>
-      </w:r>
-    </w:p>
-    <w:p>
-      <w:pPr>
-        <w:pStyle w:val="Default"/>
-        <w:rPr>
-          <w:rFonts w:ascii="Garamond" w:hAnsi="Garamond"/>
           <w:bCs/>
           <w:i/>
           <w:sz w:val="22"/>
@@ -520,355 +402,6 @@
           <w:szCs w:val="22"/>
         </w:rPr>
         <w:t xml:space="preserve">IT Help Desk Specialist                          </w:t>
-      </w:r>
-      <w:r>
-        <w:rPr>
-          <w:rFonts w:ascii="Garamond" w:hAnsi="Garamond"/>
-          <w:bCs/>
-          <w:i/>
-          <w:color w:val="auto"/>
-          <w:sz w:val="22"/>
-          <w:szCs w:val="22"/>
-        </w:rPr>
-        <w:tab/>
-      </w:r>
-      <w:r>
-        <w:rPr>
-          <w:rFonts w:ascii="Garamond" w:hAnsi="Garamond"/>
-          <w:bCs/>
-          <w:i/>
-          <w:color w:val="auto"/>
-          <w:sz w:val="22"/>
-          <w:szCs w:val="22"/>
-        </w:rPr>
-        <w:tab/>
-      </w:r>
-      <w:r>
-        <w:rPr>
-          <w:rFonts w:ascii="Garamond" w:hAnsi="Garamond"/>
-          <w:bCs/>
-          <w:i/>
-          <w:color w:val="auto"/>
-          <w:sz w:val="22"/>
-          <w:szCs w:val="22"/>
-        </w:rPr>
-        <w:tab/>
-      </w:r>
-      <w:r>
-        <w:rPr>
-          <w:rFonts w:ascii="Garamond" w:hAnsi="Garamond"/>
-          <w:bCs/>
-          <w:i/>
-          <w:color w:val="auto"/>
-          <w:sz w:val="22"/>
-          <w:szCs w:val="22"/>
-        </w:rPr>
-        <w:tab/>
-        <w:t xml:space="preserve"> </w:t>
-      </w:r>
-      <w:r>
-        <w:rPr>
-          <w:rFonts w:ascii="Garamond" w:hAnsi="Garamond"/>
-          <w:bCs/>
-          <w:i/>
-          <w:color w:val="auto"/>
-          <w:sz w:val="22"/>
-          <w:szCs w:val="22"/>
-        </w:rPr>
-        <w:tab/>
-      </w:r>
-      <w:r>
-        <w:rPr>
-          <w:rFonts w:ascii="Garamond" w:hAnsi="Garamond"/>
-          <w:bCs/>
-          <w:i/>
-          <w:color w:val="auto"/>
-          <w:sz w:val="22"/>
-          <w:szCs w:val="22"/>
-        </w:rPr>
-        <w:tab/>
-      </w:r>
-      <w:r>
-        <w:rPr>
-          <w:rFonts w:ascii="Garamond" w:hAnsi="Garamond"/>
-          <w:bCs/>
-          <w:i/>
-          <w:color w:val="auto"/>
-          <w:sz w:val="22"/>
-          <w:szCs w:val="22"/>
-        </w:rPr>
-        <w:tab/>
-        <w:t xml:space="preserve">          </w:t>
-      </w:r>
-      <w:r>
-        <w:rPr>
-          <w:rFonts w:ascii="Garamond" w:hAnsi="Garamond"/>
-          <w:bCs/>
-          <w:i/>
-          <w:color w:val="auto"/>
-          <w:sz w:val="22"/>
-          <w:szCs w:val="22"/>
-        </w:rPr>
-        <w:tab/>
-        <w:t xml:space="preserve">                     Omaha, NE</w:t>
-      </w:r>
-    </w:p>
-    <w:p>
-      <w:pPr>
-        <w:pStyle w:val="Default"/>
-        <w:numPr>
-          <w:ilvl w:val="0"/>
-          <w:numId w:val="26"/>
-        </w:numPr>
-        <w:rPr>
-          <w:rFonts w:ascii="Garamond" w:hAnsi="Garamond"/>
-          <w:sz w:val="22"/>
-          <w:szCs w:val="22"/>
-        </w:rPr>
-      </w:pPr>
-      <w:r>
-        <w:rPr>
-          <w:rFonts w:ascii="Garamond" w:hAnsi="Garamond"/>
-          <w:sz w:val="22"/>
-          <w:szCs w:val="22"/>
-        </w:rPr>
-        <w:t>Authored comprehensive technical documentation from scratch, establishing standardized troubleshooting for the firm.</w:t>
-      </w:r>
-    </w:p>
-    <w:p>
-      <w:pPr>
-        <w:pStyle w:val="Default"/>
-        <w:numPr>
-          <w:ilvl w:val="0"/>
-          <w:numId w:val="26"/>
-        </w:numPr>
-        <w:rPr>
-          <w:rFonts w:ascii="Garamond" w:hAnsi="Garamond"/>
-          <w:sz w:val="22"/>
-          <w:szCs w:val="22"/>
-        </w:rPr>
-      </w:pPr>
-      <w:r>
-        <w:rPr>
-          <w:rFonts w:ascii="Garamond" w:hAnsi="Garamond"/>
-          <w:sz w:val="22"/>
-          <w:szCs w:val="22"/>
-        </w:rPr>
-        <w:t>Resolve complex hardware, software, and connectivity issues for legal professionals in a fast-paced environment.</w:t>
-      </w:r>
-    </w:p>
-    <w:p>
-      <w:pPr>
-        <w:pStyle w:val="Default"/>
-        <w:numPr>
-          <w:ilvl w:val="0"/>
-          <w:numId w:val="26"/>
-        </w:numPr>
-        <w:rPr>
-          <w:rFonts w:ascii="Garamond" w:hAnsi="Garamond"/>
-          <w:sz w:val="22"/>
-          <w:szCs w:val="22"/>
-        </w:rPr>
-      </w:pPr>
-      <w:r>
-        <w:rPr>
-          <w:rFonts w:ascii="Garamond" w:hAnsi="Garamond"/>
-          <w:sz w:val="22"/>
-          <w:szCs w:val="22"/>
-        </w:rPr>
-        <w:t>Manage the full lifecycle of IT assets, including procurement, tracking, and auditing of inventory.</w:t>
-      </w:r>
-    </w:p>
-    <w:p>
-      <w:pPr>
-        <w:pStyle w:val="Default"/>
-        <w:numPr>
-          <w:ilvl w:val="0"/>
-          <w:numId w:val="26"/>
-        </w:numPr>
-        <w:rPr>
-          <w:rFonts w:ascii="Garamond" w:hAnsi="Garamond"/>
-          <w:sz w:val="22"/>
-          <w:szCs w:val="22"/>
-        </w:rPr>
-      </w:pPr>
-      <w:r>
-        <w:rPr>
-          <w:rFonts w:ascii="Garamond" w:hAnsi="Garamond"/>
-          <w:sz w:val="22"/>
-          <w:szCs w:val="22"/>
-        </w:rPr>
-        <w:t>Lead the deployment and configuration of IGEL thin-client environments and MDM solutions.</w:t>
-      </w:r>
-    </w:p>
-    <w:p>
-      <w:pPr>
-        <w:pStyle w:val="Default"/>
-        <w:numPr>
-          <w:ilvl w:val="0"/>
-          <w:numId w:val="26"/>
-        </w:numPr>
-        <w:rPr>
-          <w:rFonts w:ascii="Garamond" w:hAnsi="Garamond"/>
-          <w:sz w:val="22"/>
-          <w:szCs w:val="22"/>
-        </w:rPr>
-      </w:pPr>
-      <w:r>
-        <w:rPr>
-          <w:rFonts w:ascii="Garamond" w:hAnsi="Garamond"/>
-          <w:sz w:val="22"/>
-          <w:szCs w:val="22"/>
-        </w:rPr>
-        <w:t>Assisted with the technical setup and network configuration for the new Lincoln office expansion.</w:t>
-      </w:r>
-    </w:p>
-    <w:p>
-      <w:pPr>
-        <w:pStyle w:val="Default"/>
-        <w:rPr>
-          <w:rFonts w:ascii="Garamond" w:hAnsi="Garamond"/>
-          <w:b/>
-          <w:bCs/>
-          <w:color w:val="auto"/>
-          <w:sz w:val="22"/>
-          <w:szCs w:val="22"/>
-        </w:rPr>
-      </w:pPr>
-    </w:p>
-    <w:p>
-      <w:pPr>
-        <w:pStyle w:val="Default"/>
-        <w:rPr>
-          <w:rFonts w:ascii="Garamond" w:hAnsi="Garamond"/>
-          <w:b/>
-          <w:bCs/>
-          <w:color w:val="auto"/>
-          <w:sz w:val="22"/>
-          <w:szCs w:val="22"/>
-        </w:rPr>
-      </w:pPr>
-      <w:r>
-        <w:rPr>
-          <w:rFonts w:ascii="Garamond" w:hAnsi="Garamond"/>
-          <w:b/>
-          <w:bCs/>
-          <w:color w:val="auto"/>
-          <w:sz w:val="22"/>
-          <w:szCs w:val="22"/>
-        </w:rPr>
-        <w:t>FedEx Office</w:t>
-      </w:r>
-      <w:r>
-        <w:rPr>
-          <w:rFonts w:ascii="Garamond" w:hAnsi="Garamond"/>
-          <w:b/>
-          <w:bCs/>
-          <w:color w:val="auto"/>
-          <w:sz w:val="22"/>
-          <w:szCs w:val="22"/>
-        </w:rPr>
-        <w:tab/>
-      </w:r>
-      <w:r>
-        <w:rPr>
-          <w:rFonts w:ascii="Garamond" w:hAnsi="Garamond"/>
-          <w:b/>
-          <w:bCs/>
-          <w:color w:val="auto"/>
-          <w:sz w:val="22"/>
-          <w:szCs w:val="22"/>
-        </w:rPr>
-        <w:tab/>
-      </w:r>
-      <w:r>
-        <w:rPr>
-          <w:rFonts w:ascii="Garamond" w:hAnsi="Garamond"/>
-          <w:b/>
-          <w:bCs/>
-          <w:color w:val="auto"/>
-          <w:sz w:val="22"/>
-          <w:szCs w:val="22"/>
-        </w:rPr>
-        <w:tab/>
-      </w:r>
-      <w:r>
-        <w:rPr>
-          <w:rFonts w:ascii="Garamond" w:hAnsi="Garamond"/>
-          <w:b/>
-          <w:bCs/>
-          <w:color w:val="auto"/>
-          <w:sz w:val="22"/>
-          <w:szCs w:val="22"/>
-        </w:rPr>
-        <w:tab/>
-      </w:r>
-      <w:r>
-        <w:rPr>
-          <w:rFonts w:ascii="Garamond" w:hAnsi="Garamond"/>
-          <w:b/>
-          <w:bCs/>
-          <w:color w:val="auto"/>
-          <w:sz w:val="22"/>
-          <w:szCs w:val="22"/>
-        </w:rPr>
-        <w:tab/>
-        <w:t xml:space="preserve">                                                                   March 2025 – </w:t>
-      </w:r>
-      <w:r>
-        <w:rPr>
-          <w:rFonts w:ascii="Garamond" w:hAnsi="Garamond"/>
-          <w:b/>
-          <w:bCs/>
-          <w:color w:val="auto"/>
-          <w:sz w:val="22"/>
-          <w:szCs w:val="22"/>
-        </w:rPr>
-        <w:t>September</w:t>
-      </w:r>
-      <w:r>
-        <w:rPr>
-          <w:rFonts w:ascii="Garamond" w:hAnsi="Garamond"/>
-          <w:b/>
-          <w:bCs/>
-          <w:color w:val="auto"/>
-          <w:sz w:val="22"/>
-          <w:szCs w:val="22"/>
-        </w:rPr>
-        <w:t xml:space="preserve"> 2025</w:t>
-      </w:r>
-    </w:p>
-    <w:p>
-      <w:pPr>
-        <w:pStyle w:val="Default"/>
-        <w:rPr>
-          <w:rFonts w:ascii="Garamond" w:hAnsi="Garamond"/>
-          <w:bCs/>
-          <w:i/>
-          <w:sz w:val="22"/>
-          <w:szCs w:val="22"/>
-        </w:rPr>
-      </w:pPr>
-      <w:r>
-        <w:rPr>
-          <w:rFonts w:ascii="Garamond" w:hAnsi="Garamond"/>
-          <w:bCs/>
-          <w:i/>
-          <w:color w:val="auto"/>
-          <w:sz w:val="22"/>
-          <w:szCs w:val="22"/>
-        </w:rPr>
-        <w:t>Retail Customer Service Associate</w:t>
-      </w:r>
-      <w:r>
-        <w:rPr>
-          <w:rFonts w:ascii="Garamond" w:hAnsi="Garamond"/>
-          <w:bCs/>
-          <w:i/>
-          <w:sz w:val="22"/>
-          <w:szCs w:val="22"/>
-        </w:rPr>
-        <w:tab/>
       </w:r>
       <w:r>
         <w:rPr>
@@ -971,19 +504,105 @@
         </w:numPr>
         <w:rPr>
           <w:rFonts w:ascii="Garamond" w:hAnsi="Garamond"/>
-          <w:bCs/>
-          <w:sz w:val="22"/>
-          <w:szCs w:val="22"/>
-        </w:rPr>
-      </w:pPr>
-      <w:r>
-        <w:rPr>
-          <w:rFonts w:ascii="Garamond" w:hAnsi="Garamond"/>
-          <w:bCs/>
-          <w:sz w:val="22"/>
-          <w:szCs w:val="22"/>
-        </w:rPr>
-        <w:t>Provided consultation for digital printing services and file formatting for clients.</w:t>
+          <w:sz w:val="22"/>
+          <w:szCs w:val="22"/>
+        </w:rPr>
+      </w:pPr>
+      <w:r>
+        <w:rPr>
+          <w:rFonts w:ascii="Garamond" w:hAnsi="Garamond"/>
+          <w:sz w:val="22"/>
+          <w:szCs w:val="22"/>
+        </w:rPr>
+        <w:t>Maintain</w:t>
+      </w:r>
+      <w:r>
+        <w:rPr>
+          <w:rFonts w:ascii="Garamond" w:hAnsi="Garamond"/>
+          <w:sz w:val="22"/>
+          <w:szCs w:val="22"/>
+        </w:rPr>
+        <w:t xml:space="preserve"> </w:t>
+      </w:r>
+      <w:r>
+        <w:rPr>
+          <w:rFonts w:ascii="Garamond" w:hAnsi="Garamond"/>
+          <w:sz w:val="22"/>
+          <w:szCs w:val="22"/>
+        </w:rPr>
+        <w:t xml:space="preserve">a </w:t>
+      </w:r>
+      <w:r>
+        <w:rPr>
+          <w:rFonts w:ascii="Garamond" w:hAnsi="Garamond"/>
+          <w:sz w:val="22"/>
+          <w:szCs w:val="22"/>
+        </w:rPr>
+        <w:t xml:space="preserve">comprehensive </w:t>
+      </w:r>
+      <w:r>
+        <w:rPr>
+          <w:rFonts w:ascii="Garamond" w:hAnsi="Garamond"/>
+          <w:sz w:val="22"/>
+          <w:szCs w:val="22"/>
+        </w:rPr>
+        <w:t xml:space="preserve">centralized </w:t>
+      </w:r>
+      <w:r>
+        <w:rPr>
+          <w:rFonts w:ascii="Garamond" w:hAnsi="Garamond"/>
+          <w:sz w:val="22"/>
+          <w:szCs w:val="22"/>
+        </w:rPr>
+        <w:t>technical documentation</w:t>
+      </w:r>
+      <w:r>
+        <w:rPr>
+          <w:rFonts w:ascii="Garamond" w:hAnsi="Garamond"/>
+          <w:sz w:val="22"/>
+          <w:szCs w:val="22"/>
+        </w:rPr>
+        <w:t xml:space="preserve"> manual</w:t>
+      </w:r>
+      <w:r>
+        <w:rPr>
+          <w:rFonts w:ascii="Garamond" w:hAnsi="Garamond"/>
+          <w:sz w:val="22"/>
+          <w:szCs w:val="22"/>
+        </w:rPr>
+        <w:t>, establish</w:t>
+      </w:r>
+      <w:r>
+        <w:rPr>
+          <w:rFonts w:ascii="Garamond" w:hAnsi="Garamond"/>
+          <w:sz w:val="22"/>
+          <w:szCs w:val="22"/>
+        </w:rPr>
+        <w:t>ing</w:t>
+      </w:r>
+      <w:r>
+        <w:rPr>
+          <w:rFonts w:ascii="Garamond" w:hAnsi="Garamond"/>
+          <w:sz w:val="22"/>
+          <w:szCs w:val="22"/>
+        </w:rPr>
+        <w:t xml:space="preserve"> standardized troubleshooting</w:t>
+      </w:r>
+      <w:r>
+        <w:rPr>
+          <w:rFonts w:ascii="Garamond" w:hAnsi="Garamond"/>
+          <w:sz w:val="22"/>
+          <w:szCs w:val="22"/>
+        </w:rPr>
+        <w:t xml:space="preserve"> workflows and internal IT knowledge references</w:t>
+      </w:r>
+      <w:r>
+        <w:rPr>
+          <w:rFonts w:ascii="Garamond" w:hAnsi="Garamond"/>
+          <w:sz w:val="22"/>
+          <w:szCs w:val="22"/>
+        </w:rPr>
+        <w:t xml:space="preserve"> for the firm.</w:t>
       </w:r>
     </w:p>
     <w:p>
@@ -995,37 +614,17 @@
         </w:numPr>
         <w:rPr>
           <w:rFonts w:ascii="Garamond" w:hAnsi="Garamond"/>
-          <w:bCs/>
-          <w:sz w:val="22"/>
-          <w:szCs w:val="22"/>
-        </w:rPr>
-      </w:pPr>
-      <w:r>
-        <w:rPr>
-          <w:rFonts w:ascii="Garamond" w:hAnsi="Garamond"/>
-          <w:bCs/>
-          <w:sz w:val="22"/>
-          <w:szCs w:val="22"/>
-        </w:rPr>
-        <w:t>Operated</w:t>
-      </w:r>
-      <w:r>
-        <w:rPr>
-          <w:rFonts w:ascii="Garamond" w:hAnsi="Garamond"/>
-          <w:bCs/>
-          <w:sz w:val="22"/>
-          <w:szCs w:val="22"/>
-        </w:rPr>
-        <w:t xml:space="preserve"> </w:t>
-      </w:r>
-      <w:r>
-        <w:rPr>
-          <w:rFonts w:ascii="Garamond" w:hAnsi="Garamond"/>
-          <w:bCs/>
-          <w:sz w:val="22"/>
-          <w:szCs w:val="22"/>
-        </w:rPr>
-        <w:t>networked printers, copiers, and shipping systems.</w:t>
+          <w:sz w:val="22"/>
+          <w:szCs w:val="22"/>
+        </w:rPr>
+      </w:pPr>
+      <w:r>
+        <w:rPr>
+          <w:rFonts w:ascii="Garamond" w:hAnsi="Garamond"/>
+          <w:sz w:val="22"/>
+          <w:szCs w:val="22"/>
+        </w:rPr>
+        <w:t>Resolve complex hardware, software, and connectivity issues for legal professionals in a fast-paced environment.</w:t>
       </w:r>
     </w:p>
     <w:p>
@@ -1037,21 +636,109 @@
         </w:numPr>
         <w:rPr>
           <w:rFonts w:ascii="Garamond" w:hAnsi="Garamond"/>
-          <w:b/>
-          <w:bCs/>
-          <w:color w:val="auto"/>
-          <w:sz w:val="20"/>
-          <w:szCs w:val="20"/>
-        </w:rPr>
-      </w:pPr>
-      <w:r>
-        <w:rPr>
-          <w:rFonts w:ascii="Garamond" w:hAnsi="Garamond"/>
-          <w:bCs/>
-          <w:sz w:val="22"/>
-          <w:szCs w:val="22"/>
-        </w:rPr>
-        <w:t>Utilized internal systems to manage orders, track shipments, and resolve technical or service-related inquiries.</w:t>
+          <w:sz w:val="22"/>
+          <w:szCs w:val="22"/>
+        </w:rPr>
+      </w:pPr>
+      <w:r>
+        <w:rPr>
+          <w:rFonts w:ascii="Garamond" w:hAnsi="Garamond"/>
+          <w:sz w:val="22"/>
+          <w:szCs w:val="22"/>
+        </w:rPr>
+        <w:t>Manage the full lifecycle of IT assets, including procurement, tracking, and auditing of inventory</w:t>
+      </w:r>
+      <w:r>
+        <w:rPr>
+          <w:rFonts w:ascii="Garamond" w:hAnsi="Garamond"/>
+          <w:sz w:val="22"/>
+          <w:szCs w:val="22"/>
+        </w:rPr>
+        <w:t xml:space="preserve"> utilizing ManageEngine ServiceDesk</w:t>
+      </w:r>
+      <w:r>
+        <w:rPr>
+          <w:rFonts w:ascii="Garamond" w:hAnsi="Garamond"/>
+          <w:sz w:val="22"/>
+          <w:szCs w:val="22"/>
+        </w:rPr>
+        <w:t>.</w:t>
+      </w:r>
+    </w:p>
+    <w:p>
+      <w:pPr>
+        <w:pStyle w:val="Default"/>
+        <w:numPr>
+          <w:ilvl w:val="0"/>
+          <w:numId w:val="19"/>
+        </w:numPr>
+        <w:rPr>
+          <w:rFonts w:ascii="Garamond" w:hAnsi="Garamond"/>
+          <w:sz w:val="22"/>
+          <w:szCs w:val="22"/>
+        </w:rPr>
+      </w:pPr>
+      <w:r>
+        <w:rPr>
+          <w:rFonts w:ascii="Garamond" w:hAnsi="Garamond"/>
+          <w:sz w:val="22"/>
+          <w:szCs w:val="22"/>
+        </w:rPr>
+        <w:t>Le</w:t>
+      </w:r>
+      <w:r>
+        <w:rPr>
+          <w:rFonts w:ascii="Garamond" w:hAnsi="Garamond"/>
+          <w:sz w:val="22"/>
+          <w:szCs w:val="22"/>
+        </w:rPr>
+        <w:t>ad</w:t>
+      </w:r>
+      <w:r>
+        <w:rPr>
+          <w:rFonts w:ascii="Garamond" w:hAnsi="Garamond"/>
+          <w:sz w:val="22"/>
+          <w:szCs w:val="22"/>
+        </w:rPr>
+        <w:t xml:space="preserve"> the deployment and configuration of IGEL thin-client environments</w:t>
+      </w:r>
+      <w:r>
+        <w:rPr>
+          <w:rFonts w:ascii="Garamond" w:hAnsi="Garamond"/>
+          <w:sz w:val="22"/>
+          <w:szCs w:val="22"/>
+        </w:rPr>
+        <w:t xml:space="preserve"> and MDM solutions using Universal Management Suite (UMS) and Ivanti</w:t>
+      </w:r>
+      <w:r>
+        <w:rPr>
+          <w:rFonts w:ascii="Garamond" w:hAnsi="Garamond"/>
+          <w:sz w:val="22"/>
+          <w:szCs w:val="22"/>
+        </w:rPr>
+        <w:t>.</w:t>
+      </w:r>
+    </w:p>
+    <w:p>
+      <w:pPr>
+        <w:pStyle w:val="Default"/>
+        <w:numPr>
+          <w:ilvl w:val="0"/>
+          <w:numId w:val="19"/>
+        </w:numPr>
+        <w:rPr>
+          <w:rFonts w:ascii="Garamond" w:hAnsi="Garamond"/>
+          <w:sz w:val="22"/>
+          <w:szCs w:val="22"/>
+        </w:rPr>
+      </w:pPr>
+      <w:r>
+        <w:rPr>
+          <w:rFonts w:ascii="Garamond" w:hAnsi="Garamond"/>
+          <w:sz w:val="22"/>
+          <w:szCs w:val="22"/>
+        </w:rPr>
+        <w:t>Executed technical setup and configuration for the Lincoln office expansion, deploying workstations, thin clients, and printers.</w:t>
       </w:r>
     </w:p>
     <w:p>
@@ -1075,10 +762,277 @@
         </w:pBdr>
         <w:rPr>
           <w:rFonts w:ascii="Garamond" w:hAnsi="Garamond"/>
-          <w:sz w:val="22"/>
-          <w:szCs w:val="22"/>
-        </w:rPr>
-      </w:pPr>
+          <w:b/>
+          <w:bCs/>
+          <w:color w:val="auto"/>
+          <w:sz w:val="28"/>
+          <w:szCs w:val="28"/>
+        </w:rPr>
+      </w:pPr>
+      <w:r>
+        <w:rPr>
+          <w:rFonts w:ascii="Garamond" w:hAnsi="Garamond"/>
+          <w:b/>
+          <w:bCs/>
+          <w:color w:val="auto"/>
+          <w:sz w:val="28"/>
+          <w:szCs w:val="28"/>
+        </w:rPr>
+        <w:t>TECHNICAL PROJECTS</w:t>
+      </w:r>
+    </w:p>
+    <w:p>
+      <w:pPr>
+        <w:pStyle w:val="Default"/>
+        <w:rPr>
+          <w:rFonts w:ascii="Garamond" w:hAnsi="Garamond"/>
+          <w:b/>
+          <w:bCs/>
+          <w:color w:val="auto"/>
+          <w:sz w:val="22"/>
+          <w:szCs w:val="22"/>
+        </w:rPr>
+      </w:pPr>
+      <w:r>
+        <w:rPr>
+          <w:rFonts w:ascii="Garamond" w:hAnsi="Garamond"/>
+          <w:b/>
+          <w:bCs/>
+          <w:color w:val="auto"/>
+          <w:sz w:val="22"/>
+          <w:szCs w:val="22"/>
+        </w:rPr>
+        <w:t>Automated Hybrid Identity &amp; Azure Cloud Infrastructure</w:t>
+      </w:r>
+      <w:r>
+        <w:rPr>
+          <w:rFonts w:ascii="Garamond" w:hAnsi="Garamond"/>
+          <w:b/>
+          <w:bCs/>
+          <w:color w:val="auto"/>
+          <w:sz w:val="22"/>
+          <w:szCs w:val="22"/>
+        </w:rPr>
+        <w:tab/>
+      </w:r>
+      <w:r>
+        <w:rPr>
+          <w:rFonts w:ascii="Garamond" w:hAnsi="Garamond"/>
+          <w:b/>
+          <w:bCs/>
+          <w:color w:val="auto"/>
+          <w:sz w:val="22"/>
+          <w:szCs w:val="22"/>
+        </w:rPr>
+        <w:tab/>
+      </w:r>
+      <w:r>
+        <w:rPr>
+          <w:rFonts w:ascii="Garamond" w:hAnsi="Garamond"/>
+          <w:b/>
+          <w:bCs/>
+          <w:color w:val="auto"/>
+          <w:sz w:val="22"/>
+          <w:szCs w:val="22"/>
+        </w:rPr>
+        <w:tab/>
+      </w:r>
+      <w:r>
+        <w:rPr>
+          <w:rFonts w:ascii="Garamond" w:hAnsi="Garamond"/>
+          <w:b/>
+          <w:bCs/>
+          <w:color w:val="auto"/>
+          <w:sz w:val="22"/>
+          <w:szCs w:val="22"/>
+        </w:rPr>
+        <w:tab/>
+      </w:r>
+      <w:r>
+        <w:rPr>
+          <w:rFonts w:ascii="Garamond" w:hAnsi="Garamond"/>
+          <w:b/>
+          <w:bCs/>
+          <w:color w:val="auto"/>
+          <w:sz w:val="22"/>
+          <w:szCs w:val="22"/>
+        </w:rPr>
+        <w:tab/>
+        <w:t xml:space="preserve">                  August 2026</w:t>
+      </w:r>
+    </w:p>
+    <w:p>
+      <w:pPr>
+        <w:pStyle w:val="Default"/>
+        <w:rPr>
+          <w:rFonts w:ascii="Garamond" w:hAnsi="Garamond"/>
+          <w:i/>
+          <w:iCs/>
+          <w:sz w:val="22"/>
+          <w:szCs w:val="22"/>
+        </w:rPr>
+      </w:pPr>
+      <w:hyperlink r:id="rId12" w:history="1">
+        <w:r>
+          <w:rPr>
+            <w:rStyle w:val="Hyperlink"/>
+            <w:rFonts w:ascii="Garamond" w:hAnsi="Garamond"/>
+            <w:i/>
+            <w:iCs/>
+            <w:sz w:val="22"/>
+            <w:szCs w:val="22"/>
+          </w:rPr>
+          <w:t>View Project</w:t>
+        </w:r>
+      </w:hyperlink>
+      <w:r>
+        <w:rPr>
+          <w:rFonts w:ascii="Garamond" w:hAnsi="Garamond"/>
+          <w:i/>
+          <w:iCs/>
+          <w:sz w:val="22"/>
+          <w:szCs w:val="22"/>
+        </w:rPr>
+        <w:tab/>
+      </w:r>
+      <w:r>
+        <w:rPr>
+          <w:rFonts w:ascii="Garamond" w:hAnsi="Garamond"/>
+          <w:i/>
+          <w:iCs/>
+          <w:sz w:val="22"/>
+          <w:szCs w:val="22"/>
+        </w:rPr>
+        <w:tab/>
+      </w:r>
+      <w:r>
+        <w:rPr>
+          <w:rFonts w:ascii="Garamond" w:hAnsi="Garamond"/>
+          <w:i/>
+          <w:iCs/>
+          <w:sz w:val="22"/>
+          <w:szCs w:val="22"/>
+        </w:rPr>
+        <w:tab/>
+      </w:r>
+      <w:r>
+        <w:rPr>
+          <w:rFonts w:ascii="Garamond" w:hAnsi="Garamond"/>
+          <w:i/>
+          <w:iCs/>
+          <w:sz w:val="22"/>
+          <w:szCs w:val="22"/>
+        </w:rPr>
+        <w:tab/>
+      </w:r>
+      <w:r>
+        <w:rPr>
+          <w:rFonts w:ascii="Garamond" w:hAnsi="Garamond"/>
+          <w:i/>
+          <w:iCs/>
+          <w:sz w:val="22"/>
+          <w:szCs w:val="22"/>
+        </w:rPr>
+        <w:tab/>
+      </w:r>
+      <w:r>
+        <w:rPr>
+          <w:rFonts w:ascii="Garamond" w:hAnsi="Garamond"/>
+          <w:i/>
+          <w:iCs/>
+          <w:sz w:val="22"/>
+          <w:szCs w:val="22"/>
+        </w:rPr>
+        <w:tab/>
+      </w:r>
+    </w:p>
+    <w:p>
+      <w:pPr>
+        <w:pStyle w:val="Default"/>
+        <w:numPr>
+          <w:ilvl w:val="0"/>
+          <w:numId w:val="19"/>
+        </w:numPr>
+        <w:rPr>
+          <w:rFonts w:ascii="Garamond" w:hAnsi="Garamond"/>
+          <w:sz w:val="22"/>
+          <w:szCs w:val="22"/>
+        </w:rPr>
+      </w:pPr>
+      <w:r>
+        <w:rPr>
+          <w:rFonts w:ascii="Garamond" w:hAnsi="Garamond"/>
+          <w:sz w:val="22"/>
+          <w:szCs w:val="22"/>
+        </w:rPr>
+        <w:t>Provisioned a Windows Server 2022 domain controller with structured departmental OUs and automated user creation via PowerShell scripts.</w:t>
+      </w:r>
+    </w:p>
+    <w:p>
+      <w:pPr>
+        <w:pStyle w:val="Default"/>
+        <w:numPr>
+          <w:ilvl w:val="0"/>
+          <w:numId w:val="19"/>
+        </w:numPr>
+        <w:rPr>
+          <w:rFonts w:ascii="Garamond" w:hAnsi="Garamond"/>
+          <w:sz w:val="22"/>
+          <w:szCs w:val="22"/>
+        </w:rPr>
+      </w:pPr>
+      <w:r>
+        <w:rPr>
+          <w:rFonts w:ascii="Garamond" w:hAnsi="Garamond"/>
+          <w:sz w:val="22"/>
+          <w:szCs w:val="22"/>
+        </w:rPr>
+        <w:t>Configured Microsoft Entra Connect Sync to local Active Directory accounts with Microsoft Entra ID.</w:t>
+      </w:r>
+    </w:p>
+    <w:p>
+      <w:pPr>
+        <w:pStyle w:val="Default"/>
+        <w:numPr>
+          <w:ilvl w:val="0"/>
+          <w:numId w:val="19"/>
+        </w:numPr>
+        <w:rPr>
+          <w:rFonts w:ascii="Garamond" w:hAnsi="Garamond"/>
+          <w:sz w:val="22"/>
+          <w:szCs w:val="22"/>
+        </w:rPr>
+      </w:pPr>
+      <w:r>
+        <w:rPr>
+          <w:rFonts w:ascii="Garamond" w:hAnsi="Garamond"/>
+          <w:sz w:val="22"/>
+          <w:szCs w:val="22"/>
+        </w:rPr>
+        <w:t>Resolved hypervisor NAT routing, local DNS forwarders, and IE security policies to enable secure outbound HTTPS cloud sync.</w:t>
+      </w:r>
+    </w:p>
+    <w:p>
+      <w:pPr>
+        <w:pStyle w:val="Default"/>
+        <w:numPr>
+          <w:ilvl w:val="0"/>
+          <w:numId w:val="19"/>
+        </w:numPr>
+        <w:rPr>
+          <w:rFonts w:ascii="Garamond" w:hAnsi="Garamond"/>
+          <w:sz w:val="22"/>
+          <w:szCs w:val="22"/>
+        </w:rPr>
+      </w:pPr>
+      <w:r>
+        <w:rPr>
+          <w:rFonts w:ascii="Garamond" w:hAnsi="Garamond"/>
+          <w:sz w:val="22"/>
+          <w:szCs w:val="22"/>
+        </w:rPr>
+        <w:t>Managed UPN routing fallbacks and validated real-time identity attribute synchronization across hybrid directory environments.</w:t>
+      </w:r>
     </w:p>
     <w:p>
       <w:pPr>
@@ -1088,576 +1042,8 @@
         </w:pBdr>
         <w:rPr>
           <w:rFonts w:ascii="Garamond" w:hAnsi="Garamond"/>
-          <w:b/>
-          <w:bCs/>
-          <w:color w:val="auto"/>
-          <w:sz w:val="28"/>
-          <w:szCs w:val="28"/>
-        </w:rPr>
-      </w:pPr>
-      <w:r>
-        <w:rPr>
-          <w:rFonts w:ascii="Garamond" w:hAnsi="Garamond"/>
-          <w:b/>
-          <w:bCs/>
-          <w:color w:val="auto"/>
-          <w:sz w:val="28"/>
-          <w:szCs w:val="28"/>
-        </w:rPr>
-        <w:t>CERTIFICATIONS</w:t>
-      </w:r>
-    </w:p>
-    <w:p>
-      <w:pPr>
-        <w:pStyle w:val="Default"/>
-        <w:spacing w:after="3"/>
-        <w:jc w:val="both"/>
-        <w:rPr>
-          <w:rFonts w:ascii="Garamond" w:hAnsi="Garamond"/>
-          <w:b/>
-          <w:bCs/>
-          <w:color w:val="auto"/>
-          <w:sz w:val="22"/>
-          <w:szCs w:val="22"/>
-        </w:rPr>
-      </w:pPr>
-    </w:p>
-    <w:p>
-      <w:pPr>
-        <w:pStyle w:val="Default"/>
-        <w:rPr>
-          <w:rFonts w:ascii="Garamond" w:hAnsi="Garamond"/>
-          <w:b/>
-          <w:bCs/>
-          <w:color w:val="auto"/>
-          <w:sz w:val="18"/>
-          <w:szCs w:val="22"/>
-        </w:rPr>
-      </w:pPr>
-      <w:r>
-        <w:rPr>
-          <w:rFonts w:ascii="Garamond" w:hAnsi="Garamond"/>
-          <w:b/>
-          <w:bCs/>
-          <w:sz w:val="22"/>
-          <w:szCs w:val="22"/>
-        </w:rPr>
-        <w:t xml:space="preserve">CompTIA </w:t>
-      </w:r>
-      <w:r>
-        <w:rPr>
-          <w:rFonts w:ascii="Garamond" w:hAnsi="Garamond"/>
-          <w:b/>
-          <w:bCs/>
-          <w:sz w:val="22"/>
-          <w:szCs w:val="22"/>
-        </w:rPr>
-        <w:t>Security</w:t>
-      </w:r>
-      <w:r>
-        <w:rPr>
-          <w:rFonts w:ascii="Garamond" w:hAnsi="Garamond"/>
-          <w:b/>
-          <w:bCs/>
-          <w:sz w:val="22"/>
-          <w:szCs w:val="22"/>
-        </w:rPr>
-        <w:t>+</w:t>
-      </w:r>
-      <w:r>
-        <w:rPr>
-          <w:rFonts w:ascii="Garamond" w:hAnsi="Garamond"/>
-          <w:b/>
-          <w:bCs/>
-          <w:sz w:val="22"/>
-          <w:szCs w:val="22"/>
-        </w:rPr>
-        <w:tab/>
-      </w:r>
-      <w:r>
-        <w:rPr>
-          <w:rFonts w:ascii="Garamond" w:hAnsi="Garamond"/>
-          <w:b/>
-          <w:bCs/>
-          <w:sz w:val="22"/>
-          <w:szCs w:val="22"/>
-        </w:rPr>
-        <w:tab/>
-      </w:r>
-      <w:r>
-        <w:rPr>
-          <w:rFonts w:ascii="Garamond" w:hAnsi="Garamond"/>
-          <w:b/>
-          <w:bCs/>
-          <w:sz w:val="22"/>
-          <w:szCs w:val="22"/>
-        </w:rPr>
-        <w:t xml:space="preserve">             </w:t>
-      </w:r>
-      <w:r>
-        <w:rPr>
-          <w:rFonts w:ascii="Garamond" w:hAnsi="Garamond"/>
-          <w:b/>
-          <w:bCs/>
-          <w:sz w:val="22"/>
-          <w:szCs w:val="22"/>
-        </w:rPr>
-        <w:tab/>
-      </w:r>
-      <w:r>
-        <w:rPr>
-          <w:rFonts w:ascii="Garamond" w:hAnsi="Garamond"/>
-          <w:b/>
-          <w:bCs/>
-          <w:sz w:val="22"/>
-          <w:szCs w:val="22"/>
-        </w:rPr>
-        <w:tab/>
-      </w:r>
-      <w:r>
-        <w:rPr>
-          <w:rFonts w:ascii="Garamond" w:hAnsi="Garamond"/>
-          <w:b/>
-          <w:bCs/>
-          <w:sz w:val="22"/>
-          <w:szCs w:val="22"/>
-        </w:rPr>
-        <w:tab/>
-      </w:r>
-      <w:r>
-        <w:rPr>
-          <w:rFonts w:ascii="Garamond" w:hAnsi="Garamond"/>
-          <w:b/>
-          <w:bCs/>
-          <w:sz w:val="22"/>
-          <w:szCs w:val="22"/>
-        </w:rPr>
-        <w:tab/>
-      </w:r>
-      <w:r>
-        <w:rPr>
-          <w:rFonts w:ascii="Garamond" w:hAnsi="Garamond"/>
-          <w:b/>
-          <w:bCs/>
-          <w:sz w:val="22"/>
-          <w:szCs w:val="22"/>
-        </w:rPr>
-        <w:tab/>
-        <w:t xml:space="preserve">                      </w:t>
-      </w:r>
-      <w:r>
-        <w:rPr>
-          <w:rFonts w:ascii="Garamond" w:hAnsi="Garamond"/>
-          <w:b/>
-          <w:bCs/>
-          <w:sz w:val="22"/>
-          <w:szCs w:val="22"/>
-        </w:rPr>
-        <w:t xml:space="preserve">           August</w:t>
-      </w:r>
-      <w:r>
-        <w:rPr>
-          <w:rFonts w:ascii="Garamond" w:hAnsi="Garamond"/>
-          <w:b/>
-          <w:bCs/>
-          <w:sz w:val="22"/>
-          <w:szCs w:val="22"/>
-        </w:rPr>
-        <w:t xml:space="preserve"> 202</w:t>
-      </w:r>
-      <w:r>
-        <w:rPr>
-          <w:rFonts w:ascii="Garamond" w:hAnsi="Garamond"/>
-          <w:b/>
-          <w:bCs/>
-          <w:sz w:val="22"/>
-          <w:szCs w:val="22"/>
-        </w:rPr>
-        <w:t>6</w:t>
-      </w:r>
-      <w:r>
-        <w:rPr>
-          <w:rFonts w:ascii="Garamond" w:hAnsi="Garamond"/>
-          <w:b/>
-          <w:bCs/>
-          <w:sz w:val="22"/>
-          <w:szCs w:val="22"/>
-        </w:rPr>
-        <w:t xml:space="preserve"> – </w:t>
-      </w:r>
-      <w:r>
-        <w:rPr>
-          <w:rFonts w:ascii="Garamond" w:hAnsi="Garamond"/>
-          <w:b/>
-          <w:bCs/>
-          <w:sz w:val="22"/>
-          <w:szCs w:val="22"/>
-        </w:rPr>
-        <w:t>August</w:t>
-      </w:r>
-      <w:r>
-        <w:rPr>
-          <w:rFonts w:ascii="Garamond" w:hAnsi="Garamond"/>
-          <w:b/>
-          <w:bCs/>
-          <w:sz w:val="22"/>
-          <w:szCs w:val="22"/>
-        </w:rPr>
-        <w:t xml:space="preserve"> 202</w:t>
-      </w:r>
-      <w:r>
-        <w:rPr>
-          <w:rFonts w:ascii="Garamond" w:hAnsi="Garamond"/>
-          <w:b/>
-          <w:bCs/>
-          <w:sz w:val="22"/>
-          <w:szCs w:val="22"/>
-        </w:rPr>
-        <w:t>9</w:t>
-      </w:r>
-    </w:p>
-    <w:p>
-      <w:pPr>
-        <w:pStyle w:val="Default"/>
-        <w:spacing w:after="3"/>
-        <w:jc w:val="both"/>
-        <w:rPr>
-          <w:rFonts w:ascii="Garamond" w:hAnsi="Garamond"/>
-          <w:b/>
-          <w:bCs/>
-          <w:color w:val="auto"/>
-          <w:sz w:val="22"/>
-          <w:szCs w:val="22"/>
-        </w:rPr>
-      </w:pPr>
-      <w:r>
-        <w:rPr>
-          <w:rFonts w:ascii="Garamond" w:hAnsi="Garamond"/>
-          <w:b/>
-          <w:bCs/>
-          <w:color w:val="auto"/>
-          <w:sz w:val="22"/>
-          <w:szCs w:val="22"/>
-        </w:rPr>
-        <w:t xml:space="preserve">IGEL Certified Professional </w:t>
-      </w:r>
-      <w:r>
-        <w:rPr>
-          <w:rFonts w:ascii="Garamond" w:hAnsi="Garamond"/>
-          <w:b/>
-          <w:bCs/>
-          <w:color w:val="auto"/>
-          <w:sz w:val="22"/>
-          <w:szCs w:val="22"/>
-        </w:rPr>
-        <w:tab/>
-      </w:r>
-      <w:r>
-        <w:rPr>
-          <w:rFonts w:ascii="Garamond" w:hAnsi="Garamond"/>
-          <w:b/>
-          <w:bCs/>
-          <w:color w:val="auto"/>
-          <w:sz w:val="22"/>
-          <w:szCs w:val="22"/>
-        </w:rPr>
-        <w:tab/>
-      </w:r>
-      <w:r>
-        <w:rPr>
-          <w:rFonts w:ascii="Garamond" w:hAnsi="Garamond"/>
-          <w:b/>
-          <w:bCs/>
-          <w:color w:val="auto"/>
-          <w:sz w:val="22"/>
-          <w:szCs w:val="22"/>
-        </w:rPr>
-        <w:tab/>
-      </w:r>
-      <w:r>
-        <w:rPr>
-          <w:rFonts w:ascii="Garamond" w:hAnsi="Garamond"/>
-          <w:b/>
-          <w:bCs/>
-          <w:color w:val="auto"/>
-          <w:sz w:val="22"/>
-          <w:szCs w:val="22"/>
-        </w:rPr>
-        <w:tab/>
-      </w:r>
-      <w:r>
-        <w:rPr>
-          <w:rFonts w:ascii="Garamond" w:hAnsi="Garamond"/>
-          <w:b/>
-          <w:bCs/>
-          <w:color w:val="auto"/>
-          <w:sz w:val="22"/>
-          <w:szCs w:val="22"/>
-        </w:rPr>
-        <w:tab/>
-      </w:r>
-      <w:r>
-        <w:rPr>
-          <w:rFonts w:ascii="Garamond" w:hAnsi="Garamond"/>
-          <w:b/>
-          <w:bCs/>
-          <w:color w:val="auto"/>
-          <w:sz w:val="22"/>
-          <w:szCs w:val="22"/>
-        </w:rPr>
-        <w:tab/>
-        <w:t xml:space="preserve">                       </w:t>
-      </w:r>
-      <w:r>
-        <w:rPr>
-          <w:rFonts w:ascii="Garamond" w:hAnsi="Garamond"/>
-          <w:b/>
-          <w:bCs/>
-          <w:sz w:val="22"/>
-          <w:szCs w:val="22"/>
-        </w:rPr>
-        <w:t>December 2025 – December 2027</w:t>
-      </w:r>
-    </w:p>
-    <w:p>
-      <w:pPr>
-        <w:pStyle w:val="Default"/>
-        <w:rPr>
-          <w:rFonts w:ascii="Garamond" w:hAnsi="Garamond"/>
-          <w:b/>
-          <w:bCs/>
-          <w:color w:val="auto"/>
-          <w:sz w:val="18"/>
-          <w:szCs w:val="22"/>
-        </w:rPr>
-      </w:pPr>
-      <w:r>
-        <w:rPr>
-          <w:rFonts w:ascii="Garamond" w:hAnsi="Garamond"/>
-          <w:b/>
-          <w:bCs/>
-          <w:sz w:val="22"/>
-          <w:szCs w:val="22"/>
-        </w:rPr>
-        <w:t>CompTIA Network+</w:t>
-      </w:r>
-      <w:r>
-        <w:rPr>
-          <w:rFonts w:ascii="Garamond" w:hAnsi="Garamond"/>
-          <w:b/>
-          <w:bCs/>
-          <w:sz w:val="22"/>
-          <w:szCs w:val="22"/>
-        </w:rPr>
-        <w:tab/>
-      </w:r>
-      <w:r>
-        <w:rPr>
-          <w:rFonts w:ascii="Garamond" w:hAnsi="Garamond"/>
-          <w:b/>
-          <w:bCs/>
-          <w:sz w:val="22"/>
-          <w:szCs w:val="22"/>
-        </w:rPr>
-        <w:tab/>
-      </w:r>
-      <w:r>
-        <w:rPr>
-          <w:rFonts w:ascii="Garamond" w:hAnsi="Garamond"/>
-          <w:b/>
-          <w:bCs/>
-          <w:sz w:val="22"/>
-          <w:szCs w:val="22"/>
-        </w:rPr>
-        <w:tab/>
-      </w:r>
-      <w:r>
-        <w:rPr>
-          <w:rFonts w:ascii="Garamond" w:hAnsi="Garamond"/>
-          <w:b/>
-          <w:bCs/>
-          <w:sz w:val="22"/>
-          <w:szCs w:val="22"/>
-        </w:rPr>
-        <w:tab/>
-      </w:r>
-      <w:r>
-        <w:rPr>
-          <w:rFonts w:ascii="Garamond" w:hAnsi="Garamond"/>
-          <w:b/>
-          <w:bCs/>
-          <w:sz w:val="22"/>
-          <w:szCs w:val="22"/>
-        </w:rPr>
-        <w:tab/>
-      </w:r>
-      <w:r>
-        <w:rPr>
-          <w:rFonts w:ascii="Garamond" w:hAnsi="Garamond"/>
-          <w:b/>
-          <w:bCs/>
-          <w:sz w:val="22"/>
-          <w:szCs w:val="22"/>
-        </w:rPr>
-        <w:tab/>
-      </w:r>
-      <w:r>
-        <w:rPr>
-          <w:rFonts w:ascii="Garamond" w:hAnsi="Garamond"/>
-          <w:b/>
-          <w:bCs/>
-          <w:sz w:val="22"/>
-          <w:szCs w:val="22"/>
-        </w:rPr>
-        <w:tab/>
-        <w:t xml:space="preserve">                      </w:t>
-      </w:r>
-      <w:r>
-        <w:rPr>
-          <w:rFonts w:ascii="Garamond" w:hAnsi="Garamond"/>
-          <w:b/>
-          <w:bCs/>
-          <w:sz w:val="22"/>
-          <w:szCs w:val="22"/>
-        </w:rPr>
-        <w:t xml:space="preserve">     </w:t>
-      </w:r>
-      <w:r>
-        <w:rPr>
-          <w:rFonts w:ascii="Garamond" w:hAnsi="Garamond"/>
-          <w:b/>
-          <w:bCs/>
-          <w:sz w:val="22"/>
-          <w:szCs w:val="22"/>
-        </w:rPr>
-        <w:t xml:space="preserve">December 2025 – </w:t>
-      </w:r>
-      <w:r>
-        <w:rPr>
-          <w:rFonts w:ascii="Garamond" w:hAnsi="Garamond"/>
-          <w:b/>
-          <w:bCs/>
-          <w:sz w:val="22"/>
-          <w:szCs w:val="22"/>
-        </w:rPr>
-        <w:t>August</w:t>
-      </w:r>
-      <w:r>
-        <w:rPr>
-          <w:rFonts w:ascii="Garamond" w:hAnsi="Garamond"/>
-          <w:b/>
-          <w:bCs/>
-          <w:sz w:val="22"/>
-          <w:szCs w:val="22"/>
-        </w:rPr>
-        <w:t xml:space="preserve"> 202</w:t>
-      </w:r>
-      <w:r>
-        <w:rPr>
-          <w:rFonts w:ascii="Garamond" w:hAnsi="Garamond"/>
-          <w:b/>
-          <w:bCs/>
-          <w:sz w:val="22"/>
-          <w:szCs w:val="22"/>
-        </w:rPr>
-        <w:t>9</w:t>
-      </w:r>
-    </w:p>
-    <w:p>
-      <w:pPr>
-        <w:pStyle w:val="Default"/>
-        <w:rPr>
-          <w:rFonts w:ascii="Garamond" w:hAnsi="Garamond"/>
-          <w:b/>
-          <w:bCs/>
-          <w:color w:val="auto"/>
-          <w:sz w:val="18"/>
-          <w:szCs w:val="22"/>
-        </w:rPr>
-      </w:pPr>
-      <w:r>
-        <w:rPr>
-          <w:rFonts w:ascii="Garamond" w:hAnsi="Garamond"/>
-          <w:b/>
-          <w:bCs/>
-          <w:color w:val="auto"/>
-          <w:sz w:val="22"/>
-          <w:szCs w:val="22"/>
-        </w:rPr>
-        <w:t xml:space="preserve">CompTIA A+                                                                                                                        </w:t>
-      </w:r>
-      <w:r>
-        <w:rPr>
-          <w:rFonts w:ascii="Garamond" w:hAnsi="Garamond"/>
-          <w:b/>
-          <w:bCs/>
-          <w:color w:val="auto"/>
-          <w:sz w:val="22"/>
-          <w:szCs w:val="22"/>
-        </w:rPr>
-        <w:t xml:space="preserve">    </w:t>
-      </w:r>
-      <w:r>
-        <w:rPr>
-          <w:rFonts w:ascii="Garamond" w:hAnsi="Garamond"/>
-          <w:b/>
-          <w:bCs/>
-          <w:color w:val="auto"/>
-          <w:sz w:val="22"/>
-          <w:szCs w:val="22"/>
-        </w:rPr>
-        <w:t xml:space="preserve">February 2025 – </w:t>
-      </w:r>
-      <w:r>
-        <w:rPr>
-          <w:rFonts w:ascii="Garamond" w:hAnsi="Garamond"/>
-          <w:b/>
-          <w:bCs/>
-          <w:sz w:val="22"/>
-          <w:szCs w:val="22"/>
-        </w:rPr>
-        <w:t>August</w:t>
-      </w:r>
-      <w:r>
-        <w:rPr>
-          <w:rFonts w:ascii="Garamond" w:hAnsi="Garamond"/>
-          <w:b/>
-          <w:bCs/>
-          <w:sz w:val="22"/>
-          <w:szCs w:val="22"/>
-        </w:rPr>
-        <w:t xml:space="preserve"> 202</w:t>
-      </w:r>
-      <w:r>
-        <w:rPr>
-          <w:rFonts w:ascii="Garamond" w:hAnsi="Garamond"/>
-          <w:b/>
-          <w:bCs/>
-          <w:sz w:val="22"/>
-          <w:szCs w:val="22"/>
-        </w:rPr>
-        <w:t>9</w:t>
-      </w:r>
-    </w:p>
-    <w:p>
-      <w:pPr>
-        <w:pStyle w:val="Default"/>
-        <w:rPr>
-          <w:rFonts w:ascii="Garamond" w:hAnsi="Garamond"/>
-          <w:color w:val="auto"/>
-          <w:sz w:val="22"/>
-          <w:szCs w:val="28"/>
-        </w:rPr>
-      </w:pPr>
-    </w:p>
-    <w:p>
-      <w:pPr>
-        <w:pStyle w:val="Default"/>
-        <w:rPr>
-          <w:rFonts w:ascii="Garamond" w:hAnsi="Garamond"/>
-          <w:color w:val="auto"/>
-          <w:sz w:val="22"/>
-          <w:szCs w:val="28"/>
+          <w:sz w:val="22"/>
+          <w:szCs w:val="22"/>
         </w:rPr>
       </w:pPr>
     </w:p>
@@ -1669,6 +1055,561 @@
         </w:pBdr>
         <w:rPr>
           <w:rFonts w:ascii="Garamond" w:hAnsi="Garamond"/>
+          <w:b/>
+          <w:bCs/>
+          <w:color w:val="auto"/>
+          <w:sz w:val="28"/>
+          <w:szCs w:val="28"/>
+        </w:rPr>
+      </w:pPr>
+      <w:r>
+        <w:rPr>
+          <w:rFonts w:ascii="Garamond" w:hAnsi="Garamond"/>
+          <w:b/>
+          <w:bCs/>
+          <w:color w:val="auto"/>
+          <w:sz w:val="28"/>
+          <w:szCs w:val="28"/>
+        </w:rPr>
+        <w:t>CERTIFICATIONS</w:t>
+      </w:r>
+    </w:p>
+    <w:p>
+      <w:pPr>
+        <w:pStyle w:val="Default"/>
+        <w:rPr>
+          <w:rFonts w:ascii="Garamond" w:hAnsi="Garamond"/>
+          <w:b/>
+          <w:bCs/>
+          <w:color w:val="auto"/>
+          <w:sz w:val="18"/>
+          <w:szCs w:val="22"/>
+        </w:rPr>
+      </w:pPr>
+      <w:r>
+        <w:rPr>
+          <w:rFonts w:ascii="Garamond" w:hAnsi="Garamond"/>
+          <w:b/>
+          <w:bCs/>
+          <w:sz w:val="22"/>
+          <w:szCs w:val="22"/>
+        </w:rPr>
+        <w:t xml:space="preserve">CompTIA </w:t>
+      </w:r>
+      <w:r>
+        <w:rPr>
+          <w:rFonts w:ascii="Garamond" w:hAnsi="Garamond"/>
+          <w:b/>
+          <w:bCs/>
+          <w:sz w:val="22"/>
+          <w:szCs w:val="22"/>
+        </w:rPr>
+        <w:t>Security</w:t>
+      </w:r>
+      <w:r>
+        <w:rPr>
+          <w:rFonts w:ascii="Garamond" w:hAnsi="Garamond"/>
+          <w:b/>
+          <w:bCs/>
+          <w:sz w:val="22"/>
+          <w:szCs w:val="22"/>
+        </w:rPr>
+        <w:t>+</w:t>
+      </w:r>
+      <w:r>
+        <w:rPr>
+          <w:rFonts w:ascii="Garamond" w:hAnsi="Garamond"/>
+          <w:b/>
+          <w:bCs/>
+          <w:sz w:val="22"/>
+          <w:szCs w:val="22"/>
+        </w:rPr>
+        <w:tab/>
+      </w:r>
+      <w:r>
+        <w:rPr>
+          <w:rFonts w:ascii="Garamond" w:hAnsi="Garamond"/>
+          <w:b/>
+          <w:bCs/>
+          <w:sz w:val="22"/>
+          <w:szCs w:val="22"/>
+        </w:rPr>
+        <w:tab/>
+      </w:r>
+      <w:r>
+        <w:rPr>
+          <w:rFonts w:ascii="Garamond" w:hAnsi="Garamond"/>
+          <w:b/>
+          <w:bCs/>
+          <w:sz w:val="22"/>
+          <w:szCs w:val="22"/>
+        </w:rPr>
+        <w:t xml:space="preserve">             </w:t>
+      </w:r>
+      <w:r>
+        <w:rPr>
+          <w:rFonts w:ascii="Garamond" w:hAnsi="Garamond"/>
+          <w:b/>
+          <w:bCs/>
+          <w:sz w:val="22"/>
+          <w:szCs w:val="22"/>
+        </w:rPr>
+        <w:tab/>
+      </w:r>
+      <w:r>
+        <w:rPr>
+          <w:rFonts w:ascii="Garamond" w:hAnsi="Garamond"/>
+          <w:b/>
+          <w:bCs/>
+          <w:sz w:val="22"/>
+          <w:szCs w:val="22"/>
+        </w:rPr>
+        <w:tab/>
+      </w:r>
+      <w:r>
+        <w:rPr>
+          <w:rFonts w:ascii="Garamond" w:hAnsi="Garamond"/>
+          <w:b/>
+          <w:bCs/>
+          <w:sz w:val="22"/>
+          <w:szCs w:val="22"/>
+        </w:rPr>
+        <w:tab/>
+      </w:r>
+      <w:r>
+        <w:rPr>
+          <w:rFonts w:ascii="Garamond" w:hAnsi="Garamond"/>
+          <w:b/>
+          <w:bCs/>
+          <w:sz w:val="22"/>
+          <w:szCs w:val="22"/>
+        </w:rPr>
+        <w:tab/>
+      </w:r>
+      <w:r>
+        <w:rPr>
+          <w:rFonts w:ascii="Garamond" w:hAnsi="Garamond"/>
+          <w:b/>
+          <w:bCs/>
+          <w:sz w:val="22"/>
+          <w:szCs w:val="22"/>
+        </w:rPr>
+        <w:tab/>
+        <w:t xml:space="preserve">                      </w:t>
+      </w:r>
+      <w:r>
+        <w:rPr>
+          <w:rFonts w:ascii="Garamond" w:hAnsi="Garamond"/>
+          <w:b/>
+          <w:bCs/>
+          <w:sz w:val="22"/>
+          <w:szCs w:val="22"/>
+        </w:rPr>
+        <w:t xml:space="preserve">           August</w:t>
+      </w:r>
+      <w:r>
+        <w:rPr>
+          <w:rFonts w:ascii="Garamond" w:hAnsi="Garamond"/>
+          <w:b/>
+          <w:bCs/>
+          <w:sz w:val="22"/>
+          <w:szCs w:val="22"/>
+        </w:rPr>
+        <w:t xml:space="preserve"> 202</w:t>
+      </w:r>
+      <w:r>
+        <w:rPr>
+          <w:rFonts w:ascii="Garamond" w:hAnsi="Garamond"/>
+          <w:b/>
+          <w:bCs/>
+          <w:sz w:val="22"/>
+          <w:szCs w:val="22"/>
+        </w:rPr>
+        <w:t>6</w:t>
+      </w:r>
+      <w:r>
+        <w:rPr>
+          <w:rFonts w:ascii="Garamond" w:hAnsi="Garamond"/>
+          <w:b/>
+          <w:bCs/>
+          <w:sz w:val="22"/>
+          <w:szCs w:val="22"/>
+        </w:rPr>
+        <w:t xml:space="preserve"> – </w:t>
+      </w:r>
+      <w:r>
+        <w:rPr>
+          <w:rFonts w:ascii="Garamond" w:hAnsi="Garamond"/>
+          <w:b/>
+          <w:bCs/>
+          <w:sz w:val="22"/>
+          <w:szCs w:val="22"/>
+        </w:rPr>
+        <w:t>August</w:t>
+      </w:r>
+      <w:r>
+        <w:rPr>
+          <w:rFonts w:ascii="Garamond" w:hAnsi="Garamond"/>
+          <w:b/>
+          <w:bCs/>
+          <w:sz w:val="22"/>
+          <w:szCs w:val="22"/>
+        </w:rPr>
+        <w:t xml:space="preserve"> 202</w:t>
+      </w:r>
+      <w:r>
+        <w:rPr>
+          <w:rFonts w:ascii="Garamond" w:hAnsi="Garamond"/>
+          <w:b/>
+          <w:bCs/>
+          <w:sz w:val="22"/>
+          <w:szCs w:val="22"/>
+        </w:rPr>
+        <w:t>9</w:t>
+      </w:r>
+    </w:p>
+    <w:p>
+      <w:pPr>
+        <w:pStyle w:val="Default"/>
+        <w:spacing w:after="3"/>
+        <w:jc w:val="both"/>
+        <w:rPr>
+          <w:rFonts w:ascii="Garamond" w:hAnsi="Garamond"/>
+          <w:b/>
+          <w:bCs/>
+          <w:color w:val="auto"/>
+          <w:sz w:val="22"/>
+          <w:szCs w:val="22"/>
+        </w:rPr>
+      </w:pPr>
+      <w:r>
+        <w:rPr>
+          <w:rFonts w:ascii="Garamond" w:hAnsi="Garamond"/>
+          <w:b/>
+          <w:bCs/>
+          <w:color w:val="auto"/>
+          <w:sz w:val="22"/>
+          <w:szCs w:val="22"/>
+        </w:rPr>
+        <w:t xml:space="preserve">IGEL Certified Professional </w:t>
+      </w:r>
+      <w:r>
+        <w:rPr>
+          <w:rFonts w:ascii="Garamond" w:hAnsi="Garamond"/>
+          <w:b/>
+          <w:bCs/>
+          <w:color w:val="auto"/>
+          <w:sz w:val="22"/>
+          <w:szCs w:val="22"/>
+        </w:rPr>
+        <w:tab/>
+      </w:r>
+      <w:r>
+        <w:rPr>
+          <w:rFonts w:ascii="Garamond" w:hAnsi="Garamond"/>
+          <w:b/>
+          <w:bCs/>
+          <w:color w:val="auto"/>
+          <w:sz w:val="22"/>
+          <w:szCs w:val="22"/>
+        </w:rPr>
+        <w:tab/>
+      </w:r>
+      <w:r>
+        <w:rPr>
+          <w:rFonts w:ascii="Garamond" w:hAnsi="Garamond"/>
+          <w:b/>
+          <w:bCs/>
+          <w:color w:val="auto"/>
+          <w:sz w:val="22"/>
+          <w:szCs w:val="22"/>
+        </w:rPr>
+        <w:tab/>
+      </w:r>
+      <w:r>
+        <w:rPr>
+          <w:rFonts w:ascii="Garamond" w:hAnsi="Garamond"/>
+          <w:b/>
+          <w:bCs/>
+          <w:color w:val="auto"/>
+          <w:sz w:val="22"/>
+          <w:szCs w:val="22"/>
+        </w:rPr>
+        <w:tab/>
+      </w:r>
+      <w:r>
+        <w:rPr>
+          <w:rFonts w:ascii="Garamond" w:hAnsi="Garamond"/>
+          <w:b/>
+          <w:bCs/>
+          <w:color w:val="auto"/>
+          <w:sz w:val="22"/>
+          <w:szCs w:val="22"/>
+        </w:rPr>
+        <w:tab/>
+      </w:r>
+      <w:r>
+        <w:rPr>
+          <w:rFonts w:ascii="Garamond" w:hAnsi="Garamond"/>
+          <w:b/>
+          <w:bCs/>
+          <w:color w:val="auto"/>
+          <w:sz w:val="22"/>
+          <w:szCs w:val="22"/>
+        </w:rPr>
+        <w:tab/>
+        <w:t xml:space="preserve">                       </w:t>
+      </w:r>
+      <w:r>
+        <w:rPr>
+          <w:rFonts w:ascii="Garamond" w:hAnsi="Garamond"/>
+          <w:b/>
+          <w:bCs/>
+          <w:sz w:val="22"/>
+          <w:szCs w:val="22"/>
+        </w:rPr>
+        <w:t>December 2025 – December 2027</w:t>
+      </w:r>
+    </w:p>
+    <w:p>
+      <w:pPr>
+        <w:pStyle w:val="Default"/>
+        <w:rPr>
+          <w:rFonts w:ascii="Garamond" w:hAnsi="Garamond"/>
+          <w:b/>
+          <w:bCs/>
+          <w:color w:val="auto"/>
+          <w:sz w:val="18"/>
+          <w:szCs w:val="22"/>
+        </w:rPr>
+      </w:pPr>
+      <w:r>
+        <w:rPr>
+          <w:rFonts w:ascii="Garamond" w:hAnsi="Garamond"/>
+          <w:b/>
+          <w:bCs/>
+          <w:sz w:val="22"/>
+          <w:szCs w:val="22"/>
+        </w:rPr>
+        <w:t>CompTIA Network+</w:t>
+      </w:r>
+      <w:r>
+        <w:rPr>
+          <w:rFonts w:ascii="Garamond" w:hAnsi="Garamond"/>
+          <w:b/>
+          <w:bCs/>
+          <w:sz w:val="22"/>
+          <w:szCs w:val="22"/>
+        </w:rPr>
+        <w:tab/>
+      </w:r>
+      <w:r>
+        <w:rPr>
+          <w:rFonts w:ascii="Garamond" w:hAnsi="Garamond"/>
+          <w:b/>
+          <w:bCs/>
+          <w:sz w:val="22"/>
+          <w:szCs w:val="22"/>
+        </w:rPr>
+        <w:tab/>
+      </w:r>
+      <w:r>
+        <w:rPr>
+          <w:rFonts w:ascii="Garamond" w:hAnsi="Garamond"/>
+          <w:b/>
+          <w:bCs/>
+          <w:sz w:val="22"/>
+          <w:szCs w:val="22"/>
+        </w:rPr>
+        <w:tab/>
+      </w:r>
+      <w:r>
+        <w:rPr>
+          <w:rFonts w:ascii="Garamond" w:hAnsi="Garamond"/>
+          <w:b/>
+          <w:bCs/>
+          <w:sz w:val="22"/>
+          <w:szCs w:val="22"/>
+        </w:rPr>
+        <w:tab/>
+      </w:r>
+      <w:r>
+        <w:rPr>
+          <w:rFonts w:ascii="Garamond" w:hAnsi="Garamond"/>
+          <w:b/>
+          <w:bCs/>
+          <w:sz w:val="22"/>
+          <w:szCs w:val="22"/>
+        </w:rPr>
+        <w:tab/>
+      </w:r>
+      <w:r>
+        <w:rPr>
+          <w:rFonts w:ascii="Garamond" w:hAnsi="Garamond"/>
+          <w:b/>
+          <w:bCs/>
+          <w:sz w:val="22"/>
+          <w:szCs w:val="22"/>
+        </w:rPr>
+        <w:tab/>
+      </w:r>
+      <w:r>
+        <w:rPr>
+          <w:rFonts w:ascii="Garamond" w:hAnsi="Garamond"/>
+          <w:b/>
+          <w:bCs/>
+          <w:sz w:val="22"/>
+          <w:szCs w:val="22"/>
+        </w:rPr>
+        <w:tab/>
+        <w:t xml:space="preserve">                      </w:t>
+      </w:r>
+      <w:r>
+        <w:rPr>
+          <w:rFonts w:ascii="Garamond" w:hAnsi="Garamond"/>
+          <w:b/>
+          <w:bCs/>
+          <w:sz w:val="22"/>
+          <w:szCs w:val="22"/>
+        </w:rPr>
+        <w:t xml:space="preserve">     </w:t>
+      </w:r>
+      <w:r>
+        <w:rPr>
+          <w:rFonts w:ascii="Garamond" w:hAnsi="Garamond"/>
+          <w:b/>
+          <w:bCs/>
+          <w:sz w:val="22"/>
+          <w:szCs w:val="22"/>
+        </w:rPr>
+        <w:t xml:space="preserve">December 2025 – </w:t>
+      </w:r>
+      <w:r>
+        <w:rPr>
+          <w:rFonts w:ascii="Garamond" w:hAnsi="Garamond"/>
+          <w:b/>
+          <w:bCs/>
+          <w:sz w:val="22"/>
+          <w:szCs w:val="22"/>
+        </w:rPr>
+        <w:t>August</w:t>
+      </w:r>
+      <w:r>
+        <w:rPr>
+          <w:rFonts w:ascii="Garamond" w:hAnsi="Garamond"/>
+          <w:b/>
+          <w:bCs/>
+          <w:sz w:val="22"/>
+          <w:szCs w:val="22"/>
+        </w:rPr>
+        <w:t xml:space="preserve"> 202</w:t>
+      </w:r>
+      <w:r>
+        <w:rPr>
+          <w:rFonts w:ascii="Garamond" w:hAnsi="Garamond"/>
+          <w:b/>
+          <w:bCs/>
+          <w:sz w:val="22"/>
+          <w:szCs w:val="22"/>
+        </w:rPr>
+        <w:t>9</w:t>
+      </w:r>
+    </w:p>
+    <w:p>
+      <w:pPr>
+        <w:pStyle w:val="Default"/>
+        <w:rPr>
+          <w:rFonts w:ascii="Garamond" w:hAnsi="Garamond"/>
+          <w:b/>
+          <w:bCs/>
+          <w:color w:val="auto"/>
+          <w:sz w:val="18"/>
+          <w:szCs w:val="22"/>
+        </w:rPr>
+      </w:pPr>
+      <w:r>
+        <w:rPr>
+          <w:rFonts w:ascii="Garamond" w:hAnsi="Garamond"/>
+          <w:b/>
+          <w:bCs/>
+          <w:color w:val="auto"/>
+          <w:sz w:val="22"/>
+          <w:szCs w:val="22"/>
+        </w:rPr>
+        <w:t xml:space="preserve">CompTIA A+                                                                                                                        </w:t>
+      </w:r>
+      <w:r>
+        <w:rPr>
+          <w:rFonts w:ascii="Garamond" w:hAnsi="Garamond"/>
+          <w:b/>
+          <w:bCs/>
+          <w:color w:val="auto"/>
+          <w:sz w:val="22"/>
+          <w:szCs w:val="22"/>
+        </w:rPr>
+        <w:t xml:space="preserve">    </w:t>
+      </w:r>
+      <w:r>
+        <w:rPr>
+          <w:rFonts w:ascii="Garamond" w:hAnsi="Garamond"/>
+          <w:b/>
+          <w:bCs/>
+          <w:color w:val="auto"/>
+          <w:sz w:val="22"/>
+          <w:szCs w:val="22"/>
+        </w:rPr>
+        <w:t xml:space="preserve">February 2025 – </w:t>
+      </w:r>
+      <w:r>
+        <w:rPr>
+          <w:rFonts w:ascii="Garamond" w:hAnsi="Garamond"/>
+          <w:b/>
+          <w:bCs/>
+          <w:sz w:val="22"/>
+          <w:szCs w:val="22"/>
+        </w:rPr>
+        <w:t>August</w:t>
+      </w:r>
+      <w:r>
+        <w:rPr>
+          <w:rFonts w:ascii="Garamond" w:hAnsi="Garamond"/>
+          <w:b/>
+          <w:bCs/>
+          <w:sz w:val="22"/>
+          <w:szCs w:val="22"/>
+        </w:rPr>
+        <w:t xml:space="preserve"> 202</w:t>
+      </w:r>
+      <w:r>
+        <w:rPr>
+          <w:rFonts w:ascii="Garamond" w:hAnsi="Garamond"/>
+          <w:b/>
+          <w:bCs/>
+          <w:sz w:val="22"/>
+          <w:szCs w:val="22"/>
+        </w:rPr>
+        <w:t>9</w:t>
+      </w:r>
+    </w:p>
+    <w:p>
+      <w:pPr>
+        <w:pStyle w:val="Default"/>
+        <w:rPr>
+          <w:rFonts w:ascii="Garamond" w:hAnsi="Garamond"/>
+          <w:color w:val="auto"/>
+          <w:sz w:val="22"/>
+          <w:szCs w:val="28"/>
+        </w:rPr>
+      </w:pPr>
+    </w:p>
+    <w:p>
+      <w:pPr>
+        <w:pStyle w:val="Default"/>
+        <w:pBdr>
+          <w:bottom w:val="single" w:sz="6" w:space="1" w:color="auto"/>
+        </w:pBdr>
+        <w:rPr>
+          <w:rFonts w:ascii="Garamond" w:hAnsi="Garamond"/>
           <w:color w:val="auto"/>
           <w:sz w:val="28"/>
           <w:szCs w:val="28"/>
@@ -1725,209 +1666,154 @@
           <w:szCs w:val="22"/>
         </w:rPr>
       </w:pPr>
+      <w:r>
+        <w:rPr>
+          <w:rFonts w:ascii="Garamond" w:hAnsi="Garamond"/>
+          <w:b/>
+          <w:bCs/>
+          <w:color w:val="auto"/>
+          <w:sz w:val="22"/>
+          <w:szCs w:val="22"/>
+        </w:rPr>
+        <w:t xml:space="preserve">Bellevue University </w:t>
+      </w:r>
+      <w:r>
+        <w:rPr>
+          <w:rFonts w:ascii="Garamond" w:hAnsi="Garamond"/>
+          <w:b/>
+          <w:bCs/>
+          <w:color w:val="auto"/>
+          <w:sz w:val="22"/>
+          <w:szCs w:val="22"/>
+        </w:rPr>
+        <w:tab/>
+      </w:r>
+      <w:r>
+        <w:rPr>
+          <w:rFonts w:ascii="Garamond" w:hAnsi="Garamond"/>
+          <w:b/>
+          <w:bCs/>
+          <w:color w:val="auto"/>
+          <w:sz w:val="22"/>
+          <w:szCs w:val="22"/>
+        </w:rPr>
+        <w:tab/>
+      </w:r>
+      <w:r>
+        <w:rPr>
+          <w:rFonts w:ascii="Garamond" w:hAnsi="Garamond"/>
+          <w:b/>
+          <w:bCs/>
+          <w:color w:val="auto"/>
+          <w:sz w:val="22"/>
+          <w:szCs w:val="22"/>
+        </w:rPr>
+        <w:tab/>
+      </w:r>
+      <w:r>
+        <w:rPr>
+          <w:rFonts w:ascii="Garamond" w:hAnsi="Garamond"/>
+          <w:b/>
+          <w:bCs/>
+          <w:color w:val="auto"/>
+          <w:sz w:val="22"/>
+          <w:szCs w:val="22"/>
+        </w:rPr>
+        <w:tab/>
+        <w:t xml:space="preserve">          </w:t>
+      </w:r>
+      <w:r>
+        <w:rPr>
+          <w:rFonts w:ascii="Garamond" w:hAnsi="Garamond"/>
+          <w:b/>
+          <w:bCs/>
+          <w:color w:val="auto"/>
+          <w:sz w:val="22"/>
+          <w:szCs w:val="22"/>
+        </w:rPr>
+        <w:tab/>
+        <w:t xml:space="preserve">        </w:t>
+      </w:r>
+      <w:r>
+        <w:rPr>
+          <w:rFonts w:ascii="Garamond" w:hAnsi="Garamond"/>
+          <w:b/>
+          <w:bCs/>
+          <w:color w:val="auto"/>
+          <w:sz w:val="22"/>
+          <w:szCs w:val="22"/>
+        </w:rPr>
+        <w:tab/>
+      </w:r>
+      <w:r>
+        <w:rPr>
+          <w:rFonts w:ascii="Garamond" w:hAnsi="Garamond"/>
+          <w:b/>
+          <w:bCs/>
+          <w:color w:val="auto"/>
+          <w:sz w:val="22"/>
+          <w:szCs w:val="22"/>
+        </w:rPr>
+        <w:tab/>
+        <w:t xml:space="preserve">                                       </w:t>
+      </w:r>
+      <w:r>
+        <w:rPr>
+          <w:rFonts w:ascii="Garamond" w:hAnsi="Garamond"/>
+          <w:b/>
+          <w:bCs/>
+          <w:color w:val="auto"/>
+          <w:sz w:val="22"/>
+          <w:szCs w:val="22"/>
+        </w:rPr>
+        <w:tab/>
+      </w:r>
+      <w:r>
+        <w:rPr>
+          <w:rFonts w:ascii="Garamond" w:hAnsi="Garamond"/>
+          <w:b/>
+          <w:bCs/>
+          <w:color w:val="auto"/>
+          <w:sz w:val="22"/>
+          <w:szCs w:val="22"/>
+        </w:rPr>
+        <w:tab/>
+        <w:t xml:space="preserve">         April 2026</w:t>
+      </w:r>
+      <w:r>
+        <w:rPr>
+          <w:rFonts w:ascii="Garamond" w:hAnsi="Garamond"/>
+          <w:b/>
+          <w:bCs/>
+          <w:color w:val="auto"/>
+          <w:sz w:val="22"/>
+          <w:szCs w:val="22"/>
+        </w:rPr>
+        <w:t xml:space="preserve"> </w:t>
+      </w:r>
     </w:p>
     <w:p>
       <w:pPr>
         <w:pStyle w:val="Default"/>
         <w:rPr>
           <w:rFonts w:ascii="Garamond" w:hAnsi="Garamond"/>
-          <w:b/>
-          <w:bCs/>
-          <w:color w:val="auto"/>
-          <w:sz w:val="22"/>
-          <w:szCs w:val="22"/>
-        </w:rPr>
-      </w:pPr>
-      <w:r>
-        <w:rPr>
-          <w:rFonts w:ascii="Garamond" w:hAnsi="Garamond"/>
-          <w:b/>
-          <w:bCs/>
-          <w:color w:val="auto"/>
-          <w:sz w:val="22"/>
-          <w:szCs w:val="22"/>
-        </w:rPr>
-        <w:t xml:space="preserve">Bellevue University </w:t>
-      </w:r>
-      <w:r>
-        <w:rPr>
-          <w:rFonts w:ascii="Garamond" w:hAnsi="Garamond"/>
-          <w:b/>
-          <w:bCs/>
-          <w:color w:val="auto"/>
-          <w:sz w:val="22"/>
-          <w:szCs w:val="22"/>
-        </w:rPr>
-        <w:tab/>
-      </w:r>
-      <w:r>
-        <w:rPr>
-          <w:rFonts w:ascii="Garamond" w:hAnsi="Garamond"/>
-          <w:b/>
-          <w:bCs/>
-          <w:color w:val="auto"/>
-          <w:sz w:val="22"/>
-          <w:szCs w:val="22"/>
-        </w:rPr>
-        <w:tab/>
-      </w:r>
-      <w:r>
-        <w:rPr>
-          <w:rFonts w:ascii="Garamond" w:hAnsi="Garamond"/>
-          <w:b/>
-          <w:bCs/>
-          <w:color w:val="auto"/>
-          <w:sz w:val="22"/>
-          <w:szCs w:val="22"/>
-        </w:rPr>
-        <w:tab/>
-      </w:r>
-      <w:r>
-        <w:rPr>
-          <w:rFonts w:ascii="Garamond" w:hAnsi="Garamond"/>
-          <w:b/>
-          <w:bCs/>
-          <w:color w:val="auto"/>
-          <w:sz w:val="22"/>
-          <w:szCs w:val="22"/>
-        </w:rPr>
-        <w:tab/>
-        <w:t xml:space="preserve">        </w:t>
-      </w:r>
-      <w:r>
-        <w:rPr>
-          <w:rFonts w:ascii="Garamond" w:hAnsi="Garamond"/>
-          <w:b/>
-          <w:bCs/>
-          <w:color w:val="auto"/>
-          <w:sz w:val="22"/>
-          <w:szCs w:val="22"/>
-        </w:rPr>
-        <w:t xml:space="preserve"> </w:t>
-      </w:r>
-      <w:r>
-        <w:rPr>
-          <w:rFonts w:ascii="Garamond" w:hAnsi="Garamond"/>
-          <w:b/>
-          <w:bCs/>
-          <w:color w:val="auto"/>
-          <w:sz w:val="22"/>
-          <w:szCs w:val="22"/>
-        </w:rPr>
-        <w:t xml:space="preserve"> </w:t>
-      </w:r>
-      <w:r>
-        <w:rPr>
-          <w:rFonts w:ascii="Garamond" w:hAnsi="Garamond"/>
-          <w:b/>
-          <w:bCs/>
-          <w:color w:val="auto"/>
-          <w:sz w:val="22"/>
-          <w:szCs w:val="22"/>
-        </w:rPr>
-        <w:tab/>
-        <w:t xml:space="preserve">        </w:t>
-      </w:r>
-      <w:r>
-        <w:rPr>
-          <w:rFonts w:ascii="Garamond" w:hAnsi="Garamond"/>
-          <w:b/>
-          <w:bCs/>
-          <w:color w:val="auto"/>
-          <w:sz w:val="22"/>
-          <w:szCs w:val="22"/>
-        </w:rPr>
-        <w:tab/>
-      </w:r>
-      <w:r>
-        <w:rPr>
-          <w:rFonts w:ascii="Garamond" w:hAnsi="Garamond"/>
-          <w:b/>
-          <w:bCs/>
-          <w:color w:val="auto"/>
-          <w:sz w:val="22"/>
-          <w:szCs w:val="22"/>
-        </w:rPr>
-        <w:tab/>
-        <w:t xml:space="preserve">   </w:t>
-      </w:r>
-      <w:r>
-        <w:rPr>
-          <w:rFonts w:ascii="Garamond" w:hAnsi="Garamond"/>
-          <w:b/>
-          <w:bCs/>
-          <w:color w:val="auto"/>
-          <w:sz w:val="22"/>
-          <w:szCs w:val="22"/>
-        </w:rPr>
-        <w:t xml:space="preserve">     </w:t>
-      </w:r>
-      <w:r>
-        <w:rPr>
-          <w:rFonts w:ascii="Garamond" w:hAnsi="Garamond"/>
-          <w:b/>
-          <w:bCs/>
-          <w:color w:val="auto"/>
-          <w:sz w:val="22"/>
-          <w:szCs w:val="22"/>
-        </w:rPr>
-        <w:t xml:space="preserve">    </w:t>
-      </w:r>
-      <w:r>
-        <w:rPr>
-          <w:rFonts w:ascii="Garamond" w:hAnsi="Garamond"/>
-          <w:b/>
-          <w:bCs/>
-          <w:color w:val="auto"/>
-          <w:sz w:val="22"/>
-          <w:szCs w:val="22"/>
-        </w:rPr>
-        <w:t xml:space="preserve">                    </w:t>
-      </w:r>
-      <w:r>
-        <w:rPr>
-          <w:rFonts w:ascii="Garamond" w:hAnsi="Garamond"/>
-          <w:b/>
-          <w:bCs/>
-          <w:color w:val="auto"/>
-          <w:sz w:val="22"/>
-          <w:szCs w:val="22"/>
-        </w:rPr>
-        <w:t xml:space="preserve">       </w:t>
-      </w:r>
-      <w:r>
-        <w:rPr>
-          <w:rFonts w:ascii="Garamond" w:hAnsi="Garamond"/>
-          <w:b/>
-          <w:bCs/>
-          <w:color w:val="auto"/>
-          <w:sz w:val="22"/>
-          <w:szCs w:val="22"/>
-        </w:rPr>
-        <w:tab/>
-      </w:r>
-      <w:r>
-        <w:rPr>
-          <w:rFonts w:ascii="Garamond" w:hAnsi="Garamond"/>
-          <w:b/>
-          <w:bCs/>
-          <w:color w:val="auto"/>
-          <w:sz w:val="22"/>
-          <w:szCs w:val="22"/>
-        </w:rPr>
-        <w:tab/>
-        <w:t xml:space="preserve">         April 2026</w:t>
-      </w:r>
-      <w:r>
-        <w:rPr>
-          <w:rFonts w:ascii="Garamond" w:hAnsi="Garamond"/>
-          <w:b/>
-          <w:bCs/>
-          <w:color w:val="auto"/>
-          <w:sz w:val="22"/>
-          <w:szCs w:val="22"/>
-        </w:rPr>
-        <w:t xml:space="preserve"> </w:t>
+          <w:i/>
+          <w:iCs/>
+          <w:color w:val="auto"/>
+          <w:sz w:val="22"/>
+          <w:szCs w:val="22"/>
+        </w:rPr>
+      </w:pPr>
+      <w:r>
+        <w:rPr>
+          <w:rFonts w:ascii="Garamond" w:hAnsi="Garamond"/>
+          <w:i/>
+          <w:iCs/>
+          <w:color w:val="auto"/>
+          <w:sz w:val="22"/>
+          <w:szCs w:val="22"/>
+        </w:rPr>
+        <w:t>Bachelor of Science (B.S.) in Web Development                                                                                                                           Remote</w:t>
       </w:r>
     </w:p>
     <w:p>
@@ -1935,6 +1821,78 @@
         <w:pStyle w:val="Default"/>
         <w:rPr>
           <w:rFonts w:ascii="Garamond" w:hAnsi="Garamond"/>
+          <w:b/>
+          <w:bCs/>
+          <w:color w:val="auto"/>
+          <w:sz w:val="22"/>
+          <w:szCs w:val="22"/>
+        </w:rPr>
+      </w:pPr>
+    </w:p>
+    <w:p>
+      <w:pPr>
+        <w:pStyle w:val="Default"/>
+        <w:rPr>
+          <w:rFonts w:ascii="Garamond" w:hAnsi="Garamond"/>
+          <w:b/>
+          <w:bCs/>
+          <w:color w:val="auto"/>
+          <w:sz w:val="22"/>
+          <w:szCs w:val="22"/>
+        </w:rPr>
+      </w:pPr>
+      <w:r>
+        <w:rPr>
+          <w:rFonts w:ascii="Garamond" w:hAnsi="Garamond"/>
+          <w:b/>
+          <w:bCs/>
+          <w:color w:val="auto"/>
+          <w:sz w:val="22"/>
+          <w:szCs w:val="22"/>
+        </w:rPr>
+        <w:t xml:space="preserve">Metropolitan Community College </w:t>
+      </w:r>
+      <w:r>
+        <w:rPr>
+          <w:rFonts w:ascii="Garamond" w:hAnsi="Garamond"/>
+          <w:b/>
+          <w:bCs/>
+          <w:color w:val="auto"/>
+          <w:sz w:val="22"/>
+          <w:szCs w:val="22"/>
+        </w:rPr>
+        <w:tab/>
+      </w:r>
+      <w:r>
+        <w:rPr>
+          <w:rFonts w:ascii="Garamond" w:hAnsi="Garamond"/>
+          <w:b/>
+          <w:bCs/>
+          <w:color w:val="auto"/>
+          <w:sz w:val="22"/>
+          <w:szCs w:val="22"/>
+        </w:rPr>
+        <w:tab/>
+        <w:t xml:space="preserve">                     </w:t>
+      </w:r>
+      <w:r>
+        <w:rPr>
+          <w:rFonts w:ascii="Garamond" w:hAnsi="Garamond"/>
+          <w:b/>
+          <w:bCs/>
+          <w:color w:val="auto"/>
+          <w:sz w:val="22"/>
+          <w:szCs w:val="22"/>
+        </w:rPr>
+        <w:tab/>
+        <w:t xml:space="preserve">                                                                           May 2024  </w:t>
+      </w:r>
+    </w:p>
+    <w:p>
+      <w:pPr>
+        <w:pStyle w:val="Default"/>
+        <w:rPr>
+          <w:rFonts w:ascii="Garamond" w:hAnsi="Garamond"/>
           <w:i/>
           <w:iCs/>
           <w:color w:val="auto"/>
@@ -1951,7 +1909,7 @@
           <w:sz w:val="22"/>
           <w:szCs w:val="22"/>
         </w:rPr>
-        <w:t xml:space="preserve">Bachelor of Science (B.S.) </w:t>
+        <w:t>Associate of Applied Science (A.A.S.) in Information Technology – Computer Programming                                                       Oma</w:t>
       </w:r>
       <w:r>
         <w:rPr>
@@ -1962,7 +1920,7 @@
           <w:sz w:val="22"/>
           <w:szCs w:val="22"/>
         </w:rPr>
-        <w:t>in Web Developmen</w:t>
+        <w:t>h</w:t>
       </w:r>
       <w:r>
         <w:rPr>
@@ -1973,324 +1931,8 @@
           <w:sz w:val="22"/>
           <w:szCs w:val="22"/>
         </w:rPr>
-        <w:t xml:space="preserve">t           </w:t>
-      </w:r>
-      <w:r>
-        <w:rPr>
-          <w:rFonts w:ascii="Garamond" w:hAnsi="Garamond"/>
-          <w:i/>
-          <w:iCs/>
-          <w:color w:val="auto"/>
-          <w:sz w:val="22"/>
-          <w:szCs w:val="22"/>
-        </w:rPr>
-        <w:t xml:space="preserve"> </w:t>
-      </w:r>
-      <w:r>
-        <w:rPr>
-          <w:rFonts w:ascii="Garamond" w:hAnsi="Garamond"/>
-          <w:i/>
-          <w:iCs/>
-          <w:color w:val="auto"/>
-          <w:sz w:val="22"/>
-          <w:szCs w:val="22"/>
-        </w:rPr>
-        <w:t xml:space="preserve">                           </w:t>
-      </w:r>
-      <w:r>
-        <w:rPr>
-          <w:rFonts w:ascii="Garamond" w:hAnsi="Garamond"/>
-          <w:i/>
-          <w:iCs/>
-          <w:color w:val="auto"/>
-          <w:sz w:val="22"/>
-          <w:szCs w:val="22"/>
-        </w:rPr>
-        <w:t xml:space="preserve"> </w:t>
-      </w:r>
-      <w:r>
-        <w:rPr>
-          <w:rFonts w:ascii="Garamond" w:hAnsi="Garamond"/>
-          <w:i/>
-          <w:iCs/>
-          <w:color w:val="auto"/>
-          <w:sz w:val="22"/>
-          <w:szCs w:val="22"/>
-        </w:rPr>
-        <w:t xml:space="preserve">                        </w:t>
-      </w:r>
-      <w:r>
-        <w:rPr>
-          <w:rFonts w:ascii="Garamond" w:hAnsi="Garamond"/>
-          <w:i/>
-          <w:iCs/>
-          <w:color w:val="auto"/>
-          <w:sz w:val="22"/>
-          <w:szCs w:val="22"/>
-        </w:rPr>
-        <w:t xml:space="preserve">              </w:t>
-      </w:r>
-      <w:r>
-        <w:rPr>
-          <w:rFonts w:ascii="Garamond" w:hAnsi="Garamond"/>
-          <w:i/>
-          <w:iCs/>
-          <w:color w:val="auto"/>
-          <w:sz w:val="22"/>
-          <w:szCs w:val="22"/>
-        </w:rPr>
-        <w:t xml:space="preserve">   </w:t>
-      </w:r>
-      <w:r>
-        <w:rPr>
-          <w:rFonts w:ascii="Garamond" w:hAnsi="Garamond"/>
-          <w:i/>
-          <w:iCs/>
-          <w:color w:val="auto"/>
-          <w:sz w:val="22"/>
-          <w:szCs w:val="22"/>
-        </w:rPr>
-        <w:t xml:space="preserve">                          </w:t>
-      </w:r>
-      <w:r>
-        <w:rPr>
-          <w:rFonts w:ascii="Garamond" w:hAnsi="Garamond"/>
-          <w:i/>
-          <w:iCs/>
-          <w:color w:val="auto"/>
-          <w:sz w:val="22"/>
-          <w:szCs w:val="22"/>
-        </w:rPr>
-        <w:t xml:space="preserve">                </w:t>
-      </w:r>
-      <w:r>
-        <w:rPr>
-          <w:rFonts w:ascii="Garamond" w:hAnsi="Garamond"/>
-          <w:i/>
-          <w:iCs/>
-          <w:color w:val="auto"/>
-          <w:sz w:val="22"/>
-          <w:szCs w:val="22"/>
-        </w:rPr>
-        <w:t>Remote</w:t>
-      </w:r>
-    </w:p>
-    <w:p>
-      <w:pPr>
-        <w:pStyle w:val="Default"/>
-        <w:rPr>
-          <w:rFonts w:ascii="Garamond" w:hAnsi="Garamond"/>
-          <w:b/>
-          <w:bCs/>
-          <w:color w:val="auto"/>
-          <w:sz w:val="22"/>
-          <w:szCs w:val="22"/>
-        </w:rPr>
-      </w:pPr>
-    </w:p>
-    <w:p>
-      <w:pPr>
-        <w:pStyle w:val="Default"/>
-        <w:rPr>
-          <w:rFonts w:ascii="Garamond" w:hAnsi="Garamond"/>
-          <w:b/>
-          <w:bCs/>
-          <w:color w:val="auto"/>
-          <w:sz w:val="22"/>
-          <w:szCs w:val="22"/>
-        </w:rPr>
-      </w:pPr>
-      <w:r>
-        <w:rPr>
-          <w:rFonts w:ascii="Garamond" w:hAnsi="Garamond"/>
-          <w:b/>
-          <w:bCs/>
-          <w:color w:val="auto"/>
-          <w:sz w:val="22"/>
-          <w:szCs w:val="22"/>
-        </w:rPr>
-        <w:t xml:space="preserve">Metropolitan Community College </w:t>
-      </w:r>
-      <w:r>
-        <w:rPr>
-          <w:rFonts w:ascii="Garamond" w:hAnsi="Garamond"/>
-          <w:b/>
-          <w:bCs/>
-          <w:color w:val="auto"/>
-          <w:sz w:val="22"/>
-          <w:szCs w:val="22"/>
-        </w:rPr>
-        <w:tab/>
-      </w:r>
-      <w:r>
-        <w:rPr>
-          <w:rFonts w:ascii="Garamond" w:hAnsi="Garamond"/>
-          <w:b/>
-          <w:bCs/>
-          <w:color w:val="auto"/>
-          <w:sz w:val="22"/>
-          <w:szCs w:val="22"/>
-        </w:rPr>
-        <w:tab/>
-        <w:t xml:space="preserve">                     </w:t>
-      </w:r>
-      <w:r>
-        <w:rPr>
-          <w:rFonts w:ascii="Garamond" w:hAnsi="Garamond"/>
-          <w:b/>
-          <w:bCs/>
-          <w:color w:val="auto"/>
-          <w:sz w:val="22"/>
-          <w:szCs w:val="22"/>
-        </w:rPr>
-        <w:tab/>
-        <w:t xml:space="preserve">                     </w:t>
-      </w:r>
-      <w:r>
-        <w:rPr>
-          <w:rFonts w:ascii="Garamond" w:hAnsi="Garamond"/>
-          <w:b/>
-          <w:bCs/>
-          <w:color w:val="auto"/>
-          <w:sz w:val="22"/>
-          <w:szCs w:val="22"/>
-        </w:rPr>
-        <w:t xml:space="preserve">    </w:t>
-      </w:r>
-      <w:r>
-        <w:rPr>
-          <w:rFonts w:ascii="Garamond" w:hAnsi="Garamond"/>
-          <w:b/>
-          <w:bCs/>
-          <w:color w:val="auto"/>
-          <w:sz w:val="22"/>
-          <w:szCs w:val="22"/>
-        </w:rPr>
-        <w:t xml:space="preserve">         </w:t>
-      </w:r>
-      <w:r>
-        <w:rPr>
-          <w:rFonts w:ascii="Garamond" w:hAnsi="Garamond"/>
-          <w:b/>
-          <w:bCs/>
-          <w:color w:val="auto"/>
-          <w:sz w:val="22"/>
-          <w:szCs w:val="22"/>
-        </w:rPr>
-        <w:t xml:space="preserve"> </w:t>
-      </w:r>
-      <w:r>
-        <w:rPr>
-          <w:rFonts w:ascii="Garamond" w:hAnsi="Garamond"/>
-          <w:b/>
-          <w:bCs/>
-          <w:color w:val="auto"/>
-          <w:sz w:val="22"/>
-          <w:szCs w:val="22"/>
-        </w:rPr>
-        <w:t xml:space="preserve">                                 </w:t>
-      </w:r>
-      <w:r>
-        <w:rPr>
-          <w:rFonts w:ascii="Garamond" w:hAnsi="Garamond"/>
-          <w:b/>
-          <w:bCs/>
-          <w:color w:val="auto"/>
-          <w:sz w:val="22"/>
-          <w:szCs w:val="22"/>
-        </w:rPr>
-        <w:t xml:space="preserve">       </w:t>
-      </w:r>
-      <w:r>
-        <w:rPr>
-          <w:rFonts w:ascii="Garamond" w:hAnsi="Garamond"/>
-          <w:b/>
-          <w:bCs/>
-          <w:color w:val="auto"/>
-          <w:sz w:val="22"/>
-          <w:szCs w:val="22"/>
-        </w:rPr>
-        <w:t xml:space="preserve">May 2024  </w:t>
-      </w:r>
-    </w:p>
-    <w:p>
-      <w:pPr>
-        <w:pStyle w:val="Default"/>
-        <w:rPr>
-          <w:rFonts w:ascii="Garamond" w:hAnsi="Garamond"/>
-          <w:i/>
-          <w:iCs/>
-          <w:color w:val="auto"/>
-          <w:sz w:val="22"/>
-          <w:szCs w:val="22"/>
-        </w:rPr>
-      </w:pPr>
-      <w:r>
-        <w:rPr>
-          <w:rFonts w:ascii="Garamond" w:hAnsi="Garamond"/>
-          <w:i/>
-          <w:iCs/>
-          <w:color w:val="auto"/>
-          <w:sz w:val="22"/>
-          <w:szCs w:val="22"/>
-        </w:rPr>
-        <w:t xml:space="preserve">Associate of Applied Science (A.A.S.) </w:t>
-      </w:r>
-      <w:r>
-        <w:rPr>
-          <w:rFonts w:ascii="Garamond" w:hAnsi="Garamond"/>
-          <w:i/>
-          <w:iCs/>
-          <w:color w:val="auto"/>
-          <w:sz w:val="22"/>
-          <w:szCs w:val="22"/>
-        </w:rPr>
-        <w:t xml:space="preserve">in Information Technology – Computer Programming             </w:t>
-      </w:r>
-      <w:r>
-        <w:rPr>
-          <w:rFonts w:ascii="Garamond" w:hAnsi="Garamond"/>
-          <w:i/>
-          <w:iCs/>
-          <w:color w:val="auto"/>
-          <w:sz w:val="22"/>
-          <w:szCs w:val="22"/>
-        </w:rPr>
-        <w:t xml:space="preserve">                         </w:t>
-      </w:r>
-      <w:r>
-        <w:rPr>
-          <w:rFonts w:ascii="Garamond" w:hAnsi="Garamond"/>
-          <w:i/>
-          <w:iCs/>
-          <w:color w:val="auto"/>
-          <w:sz w:val="22"/>
-          <w:szCs w:val="22"/>
-        </w:rPr>
-        <w:t xml:space="preserve">                 </w:t>
-      </w:r>
-      <w:r>
-        <w:rPr>
-          <w:rFonts w:ascii="Garamond" w:hAnsi="Garamond"/>
-          <w:i/>
-          <w:iCs/>
-          <w:color w:val="auto"/>
-          <w:sz w:val="22"/>
-          <w:szCs w:val="22"/>
-        </w:rPr>
-        <w:t>Omaha, NE</w:t>
-      </w:r>
-    </w:p>
-    <w:p>
-      <w:pPr>
-        <w:pStyle w:val="Default"/>
-        <w:rPr>
-          <w:rFonts w:ascii="Garamond" w:hAnsi="Garamond"/>
-          <w:color w:val="auto"/>
-          <w:sz w:val="22"/>
-          <w:szCs w:val="28"/>
-        </w:rPr>
-      </w:pPr>
+        <w:t>a, NE</w:t>
+      </w:r>
     </w:p>
     <w:p>
       <w:pPr>
@@ -2336,11 +1978,43 @@
         <w:jc w:val="both"/>
         <w:rPr>
           <w:rFonts w:ascii="Garamond" w:hAnsi="Garamond"/>
-          <w:color w:val="auto"/>
-          <w:sz w:val="22"/>
-          <w:szCs w:val="22"/>
-        </w:rPr>
-      </w:pPr>
+          <w:bCs/>
+          <w:color w:val="auto"/>
+          <w:sz w:val="22"/>
+          <w:szCs w:val="22"/>
+        </w:rPr>
+      </w:pPr>
+      <w:r>
+        <w:rPr>
+          <w:rFonts w:ascii="Garamond" w:hAnsi="Garamond"/>
+          <w:b/>
+          <w:bCs/>
+          <w:color w:val="auto"/>
+          <w:sz w:val="22"/>
+          <w:szCs w:val="22"/>
+        </w:rPr>
+        <w:t>Skills:</w:t>
+      </w:r>
+      <w:r>
+        <w:rPr>
+          <w:rFonts w:ascii="Garamond" w:hAnsi="Garamond"/>
+          <w:bCs/>
+          <w:color w:val="auto"/>
+          <w:sz w:val="22"/>
+          <w:szCs w:val="22"/>
+        </w:rPr>
+        <w:t xml:space="preserve"> </w:t>
+      </w:r>
+      <w:r>
+        <w:rPr>
+          <w:rFonts w:ascii="Garamond" w:hAnsi="Garamond"/>
+          <w:bCs/>
+          <w:color w:val="auto"/>
+          <w:sz w:val="22"/>
+          <w:szCs w:val="22"/>
+        </w:rPr>
+        <w:t>Active Directory (AD), Azure, Entra ID, Automation, PowerShell, Python, JavaScript, HTML/CSS, SQL, Operating Systems (Windows, Linux, macOS), Network Security, Protocols (TCP/IP, UDP, DNS, HTTP/HTTPS), IGEL/thin client support, Technical Support, Troubleshooting (Hardware, Software), Printer Troubleshooting, PC Building, CRM/CMS, Microsoft Office</w:t>
+      </w:r>
     </w:p>
     <w:p>
       <w:pPr>
@@ -2349,303 +2023,11 @@
         <w:jc w:val="both"/>
         <w:rPr>
           <w:rFonts w:ascii="Garamond" w:hAnsi="Garamond"/>
-          <w:bCs/>
-          <w:color w:val="auto"/>
-          <w:sz w:val="22"/>
-          <w:szCs w:val="22"/>
-        </w:rPr>
-      </w:pPr>
-      <w:r>
-        <w:rPr>
-          <w:rFonts w:ascii="Garamond" w:hAnsi="Garamond"/>
-          <w:b/>
-          <w:bCs/>
-          <w:color w:val="auto"/>
-          <w:sz w:val="22"/>
-          <w:szCs w:val="22"/>
-        </w:rPr>
-        <w:t>Skills:</w:t>
-      </w:r>
-      <w:r>
-        <w:rPr>
-          <w:rFonts w:ascii="Garamond" w:hAnsi="Garamond"/>
-          <w:bCs/>
-          <w:color w:val="auto"/>
-          <w:sz w:val="22"/>
-          <w:szCs w:val="22"/>
-        </w:rPr>
-        <w:t xml:space="preserve"> </w:t>
-      </w:r>
-      <w:r>
-        <w:rPr>
-          <w:rFonts w:ascii="Garamond" w:hAnsi="Garamond"/>
-          <w:bCs/>
-          <w:color w:val="auto"/>
-          <w:sz w:val="22"/>
-          <w:szCs w:val="22"/>
-        </w:rPr>
-        <w:t>Operating Systems (Windows, Linux, macOS)</w:t>
-      </w:r>
-      <w:r>
-        <w:rPr>
-          <w:rFonts w:ascii="Garamond" w:hAnsi="Garamond"/>
-          <w:bCs/>
-          <w:color w:val="auto"/>
-          <w:sz w:val="22"/>
-          <w:szCs w:val="22"/>
-        </w:rPr>
-        <w:t>,</w:t>
-      </w:r>
-      <w:r>
-        <w:rPr>
-          <w:rFonts w:ascii="Garamond" w:hAnsi="Garamond"/>
-          <w:bCs/>
-          <w:color w:val="auto"/>
-          <w:sz w:val="22"/>
-          <w:szCs w:val="22"/>
-        </w:rPr>
-        <w:t xml:space="preserve"> Microsoft </w:t>
-      </w:r>
-      <w:r>
-        <w:rPr>
-          <w:rFonts w:ascii="Garamond" w:hAnsi="Garamond"/>
-          <w:bCs/>
-          <w:color w:val="auto"/>
-          <w:sz w:val="22"/>
-          <w:szCs w:val="22"/>
-        </w:rPr>
-        <w:t>Office</w:t>
-      </w:r>
-      <w:r>
-        <w:rPr>
-          <w:rFonts w:ascii="Garamond" w:hAnsi="Garamond"/>
-          <w:bCs/>
-          <w:color w:val="auto"/>
-          <w:sz w:val="22"/>
-          <w:szCs w:val="22"/>
-        </w:rPr>
-        <w:t>,</w:t>
-      </w:r>
-      <w:r>
-        <w:rPr>
-          <w:rFonts w:ascii="Garamond" w:hAnsi="Garamond"/>
-          <w:bCs/>
-          <w:color w:val="auto"/>
-          <w:sz w:val="22"/>
-          <w:szCs w:val="22"/>
-        </w:rPr>
-        <w:t xml:space="preserve"> Network</w:t>
-      </w:r>
-      <w:r>
-        <w:rPr>
-          <w:rFonts w:ascii="Garamond" w:hAnsi="Garamond"/>
-          <w:bCs/>
-          <w:color w:val="auto"/>
-          <w:sz w:val="22"/>
-          <w:szCs w:val="22"/>
-        </w:rPr>
-        <w:t xml:space="preserve"> Security</w:t>
-      </w:r>
-      <w:r>
-        <w:rPr>
-          <w:rFonts w:ascii="Garamond" w:hAnsi="Garamond"/>
-          <w:bCs/>
-          <w:color w:val="auto"/>
-          <w:sz w:val="22"/>
-          <w:szCs w:val="22"/>
-        </w:rPr>
-        <w:t>,</w:t>
-      </w:r>
-      <w:r>
-        <w:rPr>
-          <w:rFonts w:ascii="Garamond" w:hAnsi="Garamond"/>
-          <w:bCs/>
-          <w:color w:val="auto"/>
-          <w:sz w:val="22"/>
-          <w:szCs w:val="22"/>
-        </w:rPr>
-        <w:t xml:space="preserve"> Protocols</w:t>
-      </w:r>
-      <w:r>
-        <w:rPr>
-          <w:rFonts w:ascii="Garamond" w:hAnsi="Garamond"/>
-          <w:bCs/>
-          <w:color w:val="auto"/>
-          <w:sz w:val="22"/>
-          <w:szCs w:val="22"/>
-        </w:rPr>
-        <w:t xml:space="preserve"> (TCP/IP, UDP, DNS, HTTP/HTTPS)</w:t>
-      </w:r>
-      <w:r>
-        <w:rPr>
-          <w:rFonts w:ascii="Garamond" w:hAnsi="Garamond"/>
-          <w:bCs/>
-          <w:color w:val="auto"/>
-          <w:sz w:val="22"/>
-          <w:szCs w:val="22"/>
-        </w:rPr>
-        <w:t>,</w:t>
-      </w:r>
-      <w:r>
-        <w:rPr>
-          <w:rFonts w:ascii="Garamond" w:hAnsi="Garamond"/>
-          <w:bCs/>
-          <w:color w:val="auto"/>
-          <w:sz w:val="22"/>
-          <w:szCs w:val="22"/>
-        </w:rPr>
-        <w:t xml:space="preserve"> Troubleshooting</w:t>
-      </w:r>
-      <w:r>
-        <w:rPr>
-          <w:rFonts w:ascii="Garamond" w:hAnsi="Garamond"/>
-          <w:bCs/>
-          <w:color w:val="auto"/>
-          <w:sz w:val="22"/>
-          <w:szCs w:val="22"/>
-        </w:rPr>
-        <w:t xml:space="preserve"> (Hardware, Software)</w:t>
-      </w:r>
-      <w:r>
-        <w:rPr>
-          <w:rFonts w:ascii="Garamond" w:hAnsi="Garamond"/>
-          <w:bCs/>
-          <w:color w:val="auto"/>
-          <w:sz w:val="22"/>
-          <w:szCs w:val="22"/>
-        </w:rPr>
-        <w:t>,</w:t>
-      </w:r>
-      <w:r>
-        <w:rPr>
-          <w:rFonts w:ascii="Garamond" w:hAnsi="Garamond"/>
-          <w:bCs/>
-          <w:color w:val="auto"/>
-          <w:sz w:val="22"/>
-          <w:szCs w:val="22"/>
-        </w:rPr>
-        <w:t xml:space="preserve"> </w:t>
-      </w:r>
-      <w:r>
-        <w:rPr>
-          <w:rFonts w:ascii="Garamond" w:hAnsi="Garamond"/>
-          <w:bCs/>
-          <w:color w:val="auto"/>
-          <w:sz w:val="22"/>
-          <w:szCs w:val="22"/>
-        </w:rPr>
-        <w:t>Technical Support</w:t>
-      </w:r>
-      <w:r>
-        <w:rPr>
-          <w:rFonts w:ascii="Garamond" w:hAnsi="Garamond"/>
-          <w:bCs/>
-          <w:color w:val="auto"/>
-          <w:sz w:val="22"/>
-          <w:szCs w:val="22"/>
-        </w:rPr>
-        <w:t>,</w:t>
-      </w:r>
-      <w:r>
-        <w:rPr>
-          <w:rFonts w:ascii="Garamond" w:hAnsi="Garamond"/>
-          <w:bCs/>
-          <w:color w:val="auto"/>
-          <w:sz w:val="22"/>
-          <w:szCs w:val="22"/>
-        </w:rPr>
-        <w:t xml:space="preserve"> </w:t>
-      </w:r>
-      <w:r>
-        <w:rPr>
-          <w:rFonts w:ascii="Garamond" w:hAnsi="Garamond"/>
-          <w:bCs/>
-          <w:color w:val="auto"/>
-          <w:sz w:val="22"/>
-          <w:szCs w:val="22"/>
-        </w:rPr>
-        <w:t xml:space="preserve">Printer </w:t>
-      </w:r>
-      <w:r>
-        <w:rPr>
-          <w:rFonts w:ascii="Garamond" w:hAnsi="Garamond"/>
-          <w:bCs/>
-          <w:color w:val="auto"/>
-          <w:sz w:val="22"/>
-          <w:szCs w:val="22"/>
-        </w:rPr>
-        <w:t>Troubleshooting</w:t>
-      </w:r>
-      <w:r>
-        <w:rPr>
-          <w:rFonts w:ascii="Garamond" w:hAnsi="Garamond"/>
-          <w:bCs/>
-          <w:color w:val="auto"/>
-          <w:sz w:val="22"/>
-          <w:szCs w:val="22"/>
-        </w:rPr>
-        <w:t>, PC Building</w:t>
-      </w:r>
-      <w:r>
-        <w:rPr>
-          <w:rFonts w:ascii="Garamond" w:hAnsi="Garamond"/>
-          <w:bCs/>
-          <w:color w:val="auto"/>
-          <w:sz w:val="22"/>
-          <w:szCs w:val="22"/>
-        </w:rPr>
-        <w:t xml:space="preserve">, </w:t>
-      </w:r>
-      <w:r>
-        <w:rPr>
-          <w:rFonts w:ascii="Garamond" w:hAnsi="Garamond"/>
-          <w:bCs/>
-          <w:color w:val="auto"/>
-          <w:sz w:val="22"/>
-          <w:szCs w:val="22"/>
-        </w:rPr>
-        <w:t>IGEL</w:t>
-      </w:r>
-      <w:r>
-        <w:rPr>
-          <w:rFonts w:ascii="Garamond" w:hAnsi="Garamond"/>
-          <w:bCs/>
-          <w:color w:val="auto"/>
-          <w:sz w:val="22"/>
-          <w:szCs w:val="22"/>
-        </w:rPr>
-        <w:t>/thin client</w:t>
-      </w:r>
-      <w:r>
-        <w:rPr>
-          <w:rFonts w:ascii="Garamond" w:hAnsi="Garamond"/>
-          <w:bCs/>
-          <w:color w:val="auto"/>
-          <w:sz w:val="22"/>
-          <w:szCs w:val="22"/>
-        </w:rPr>
-        <w:t xml:space="preserve"> support</w:t>
-      </w:r>
-      <w:r>
-        <w:rPr>
-          <w:rFonts w:ascii="Garamond" w:hAnsi="Garamond"/>
-          <w:bCs/>
-          <w:color w:val="auto"/>
-          <w:sz w:val="22"/>
-          <w:szCs w:val="22"/>
-        </w:rPr>
-        <w:t>, Python, PowerShell, JavaScript, HTML/CSS</w:t>
-      </w:r>
-      <w:r>
-        <w:rPr>
-          <w:rFonts w:ascii="Garamond" w:hAnsi="Garamond"/>
-          <w:bCs/>
-          <w:color w:val="auto"/>
-          <w:sz w:val="22"/>
-          <w:szCs w:val="22"/>
-        </w:rPr>
-        <w:t>, SQL, CRM/CMS</w:t>
-      </w:r>
+          <w:color w:val="auto"/>
+          <w:sz w:val="22"/>
+          <w:szCs w:val="22"/>
+        </w:rPr>
+      </w:pPr>
     </w:p>
     <w:p>
       <w:pPr>
@@ -2659,6 +2041,27 @@
           <w:szCs w:val="22"/>
         </w:rPr>
       </w:pPr>
+      <w:r>
+        <w:rPr>
+          <w:rFonts w:ascii="Garamond" w:hAnsi="Garamond"/>
+          <w:b/>
+          <w:bCs/>
+          <w:color w:val="auto"/>
+          <w:sz w:val="22"/>
+          <w:szCs w:val="22"/>
+        </w:rPr>
+        <w:t>Soft Skills:</w:t>
+      </w:r>
+      <w:r>
+        <w:rPr>
+          <w:rFonts w:ascii="Garamond" w:hAnsi="Garamond"/>
+          <w:bCs/>
+          <w:color w:val="auto"/>
+          <w:sz w:val="22"/>
+          <w:szCs w:val="22"/>
+        </w:rPr>
+        <w:t xml:space="preserve"> Time Management, Teamwork, Collaboration, Communication, Customer Service, Adaptability, Problem-Solving, Attention to Detail, Self-Motivation, Analytical Thinking</w:t>
+      </w:r>
     </w:p>
     <w:p>
       <w:pPr>
@@ -2672,434 +2075,39 @@
           <w:szCs w:val="22"/>
         </w:rPr>
       </w:pPr>
-      <w:r>
-        <w:rPr>
-          <w:rFonts w:ascii="Garamond" w:hAnsi="Garamond"/>
-          <w:b/>
-          <w:bCs/>
-          <w:color w:val="auto"/>
-          <w:sz w:val="22"/>
-          <w:szCs w:val="22"/>
-        </w:rPr>
-        <w:t>Soft</w:t>
-      </w:r>
-      <w:r>
-        <w:rPr>
-          <w:rFonts w:ascii="Garamond" w:hAnsi="Garamond"/>
-          <w:b/>
-          <w:bCs/>
-          <w:color w:val="auto"/>
-          <w:sz w:val="22"/>
-          <w:szCs w:val="22"/>
-        </w:rPr>
-        <w:t xml:space="preserve"> </w:t>
-      </w:r>
-      <w:r>
-        <w:rPr>
-          <w:rFonts w:ascii="Garamond" w:hAnsi="Garamond"/>
-          <w:b/>
-          <w:bCs/>
-          <w:color w:val="auto"/>
-          <w:sz w:val="22"/>
-          <w:szCs w:val="22"/>
-        </w:rPr>
-        <w:t>Skills:</w:t>
-      </w:r>
-      <w:r>
-        <w:rPr>
-          <w:rFonts w:ascii="Garamond" w:hAnsi="Garamond"/>
-          <w:bCs/>
-          <w:color w:val="auto"/>
-          <w:sz w:val="22"/>
-          <w:szCs w:val="22"/>
-        </w:rPr>
-        <w:t xml:space="preserve"> </w:t>
-      </w:r>
-      <w:r>
-        <w:rPr>
-          <w:rFonts w:ascii="Garamond" w:hAnsi="Garamond"/>
-          <w:bCs/>
-          <w:color w:val="auto"/>
-          <w:sz w:val="22"/>
-          <w:szCs w:val="22"/>
-        </w:rPr>
-        <w:t>Time Management</w:t>
-      </w:r>
-      <w:r>
-        <w:rPr>
-          <w:rFonts w:ascii="Garamond" w:hAnsi="Garamond"/>
-          <w:bCs/>
-          <w:color w:val="auto"/>
-          <w:sz w:val="22"/>
-          <w:szCs w:val="22"/>
-        </w:rPr>
-        <w:t>,</w:t>
-      </w:r>
-      <w:r>
-        <w:rPr>
-          <w:rFonts w:ascii="Garamond" w:hAnsi="Garamond"/>
-          <w:bCs/>
-          <w:color w:val="auto"/>
-          <w:sz w:val="22"/>
-          <w:szCs w:val="22"/>
-        </w:rPr>
-        <w:t xml:space="preserve"> Teamwork</w:t>
-      </w:r>
-      <w:r>
-        <w:rPr>
-          <w:rFonts w:ascii="Garamond" w:hAnsi="Garamond"/>
-          <w:bCs/>
-          <w:color w:val="auto"/>
-          <w:sz w:val="22"/>
-          <w:szCs w:val="22"/>
-        </w:rPr>
-        <w:t>,</w:t>
-      </w:r>
-      <w:r>
-        <w:rPr>
-          <w:rFonts w:ascii="Garamond" w:hAnsi="Garamond"/>
-          <w:bCs/>
-          <w:color w:val="auto"/>
-          <w:sz w:val="22"/>
-          <w:szCs w:val="22"/>
-        </w:rPr>
-        <w:t xml:space="preserve"> Collaboration</w:t>
-      </w:r>
-      <w:r>
-        <w:rPr>
-          <w:rFonts w:ascii="Garamond" w:hAnsi="Garamond"/>
-          <w:bCs/>
-          <w:color w:val="auto"/>
-          <w:sz w:val="22"/>
-          <w:szCs w:val="22"/>
-        </w:rPr>
-        <w:t>,</w:t>
-      </w:r>
-      <w:r>
-        <w:rPr>
-          <w:rFonts w:ascii="Garamond" w:hAnsi="Garamond"/>
-          <w:bCs/>
-          <w:color w:val="auto"/>
-          <w:sz w:val="22"/>
-          <w:szCs w:val="22"/>
-        </w:rPr>
-        <w:t xml:space="preserve"> Communication</w:t>
-      </w:r>
-      <w:r>
-        <w:rPr>
-          <w:rFonts w:ascii="Garamond" w:hAnsi="Garamond"/>
-          <w:bCs/>
-          <w:color w:val="auto"/>
-          <w:sz w:val="22"/>
-          <w:szCs w:val="22"/>
-        </w:rPr>
-        <w:t>,</w:t>
-      </w:r>
-      <w:r>
-        <w:rPr>
-          <w:rFonts w:ascii="Garamond" w:hAnsi="Garamond"/>
-          <w:bCs/>
-          <w:color w:val="auto"/>
-          <w:sz w:val="22"/>
-          <w:szCs w:val="22"/>
-        </w:rPr>
-        <w:t xml:space="preserve"> </w:t>
-      </w:r>
-      <w:r>
-        <w:rPr>
-          <w:rFonts w:ascii="Garamond" w:hAnsi="Garamond"/>
-          <w:bCs/>
-          <w:color w:val="auto"/>
-          <w:sz w:val="22"/>
-          <w:szCs w:val="22"/>
-        </w:rPr>
-        <w:t xml:space="preserve">Customer Service, </w:t>
-      </w:r>
-      <w:r>
-        <w:rPr>
-          <w:rFonts w:ascii="Garamond" w:hAnsi="Garamond"/>
-          <w:bCs/>
-          <w:color w:val="auto"/>
-          <w:sz w:val="22"/>
-          <w:szCs w:val="22"/>
-        </w:rPr>
-        <w:t>Adaptability</w:t>
-      </w:r>
-      <w:r>
-        <w:rPr>
-          <w:rFonts w:ascii="Garamond" w:hAnsi="Garamond"/>
-          <w:bCs/>
-          <w:color w:val="auto"/>
-          <w:sz w:val="22"/>
-          <w:szCs w:val="22"/>
-        </w:rPr>
-        <w:t>,</w:t>
-      </w:r>
-      <w:r>
-        <w:rPr>
-          <w:rFonts w:ascii="Garamond" w:hAnsi="Garamond"/>
-          <w:bCs/>
-          <w:color w:val="auto"/>
-          <w:sz w:val="22"/>
-          <w:szCs w:val="22"/>
-        </w:rPr>
-        <w:t xml:space="preserve"> </w:t>
-      </w:r>
-      <w:r>
-        <w:rPr>
-          <w:rFonts w:ascii="Garamond" w:hAnsi="Garamond"/>
-          <w:bCs/>
-          <w:color w:val="auto"/>
-          <w:sz w:val="22"/>
-          <w:szCs w:val="22"/>
-        </w:rPr>
-        <w:t>Problem-Solving</w:t>
-      </w:r>
-      <w:r>
-        <w:rPr>
-          <w:rFonts w:ascii="Garamond" w:hAnsi="Garamond"/>
-          <w:bCs/>
-          <w:color w:val="auto"/>
-          <w:sz w:val="22"/>
-          <w:szCs w:val="22"/>
-        </w:rPr>
-        <w:t>,</w:t>
-      </w:r>
-      <w:r>
-        <w:rPr>
-          <w:rFonts w:ascii="Garamond" w:hAnsi="Garamond"/>
-          <w:bCs/>
-          <w:color w:val="auto"/>
-          <w:sz w:val="22"/>
-          <w:szCs w:val="22"/>
-        </w:rPr>
-        <w:t xml:space="preserve"> </w:t>
-      </w:r>
-      <w:r>
-        <w:rPr>
-          <w:rFonts w:ascii="Garamond" w:hAnsi="Garamond"/>
-          <w:bCs/>
-          <w:color w:val="auto"/>
-          <w:sz w:val="22"/>
-          <w:szCs w:val="22"/>
-        </w:rPr>
-        <w:t>Attention to Detail</w:t>
-      </w:r>
-      <w:r>
-        <w:rPr>
-          <w:rFonts w:ascii="Garamond" w:hAnsi="Garamond"/>
-          <w:bCs/>
-          <w:color w:val="auto"/>
-          <w:sz w:val="22"/>
-          <w:szCs w:val="22"/>
-        </w:rPr>
-        <w:t>,</w:t>
-      </w:r>
-      <w:r>
-        <w:rPr>
-          <w:rFonts w:ascii="Garamond" w:hAnsi="Garamond"/>
-          <w:bCs/>
-          <w:color w:val="auto"/>
-          <w:sz w:val="22"/>
-          <w:szCs w:val="22"/>
-        </w:rPr>
-        <w:t xml:space="preserve"> Self-Motivation</w:t>
-      </w:r>
-      <w:r>
-        <w:rPr>
-          <w:rFonts w:ascii="Garamond" w:hAnsi="Garamond"/>
-          <w:bCs/>
-          <w:color w:val="auto"/>
-          <w:sz w:val="22"/>
-          <w:szCs w:val="22"/>
-        </w:rPr>
-        <w:t>,</w:t>
-      </w:r>
-      <w:r>
-        <w:rPr>
-          <w:rFonts w:ascii="Garamond" w:hAnsi="Garamond"/>
-          <w:bCs/>
-          <w:color w:val="auto"/>
-          <w:sz w:val="22"/>
-          <w:szCs w:val="22"/>
-        </w:rPr>
-        <w:t xml:space="preserve"> Analytical Thinking</w:t>
-      </w:r>
     </w:p>
     <w:p>
       <w:pPr>
         <w:pStyle w:val="Default"/>
-        <w:spacing w:after="3"/>
-        <w:jc w:val="both"/>
-        <w:rPr>
-          <w:rFonts w:ascii="Garamond" w:hAnsi="Garamond"/>
-          <w:color w:val="auto"/>
-          <w:sz w:val="22"/>
-          <w:szCs w:val="22"/>
-        </w:rPr>
-      </w:pPr>
+        <w:rPr>
+          <w:rFonts w:ascii="Garamond" w:hAnsi="Garamond"/>
+          <w:color w:val="auto"/>
+          <w:sz w:val="22"/>
+          <w:szCs w:val="22"/>
+        </w:rPr>
+      </w:pPr>
+      <w:r>
+        <w:rPr>
+          <w:rFonts w:ascii="Garamond" w:hAnsi="Garamond"/>
+          <w:b/>
+          <w:bCs/>
+          <w:color w:val="auto"/>
+          <w:sz w:val="22"/>
+          <w:szCs w:val="22"/>
+        </w:rPr>
+        <w:t xml:space="preserve">Interests: </w:t>
+      </w:r>
+      <w:r>
+        <w:rPr>
+          <w:rFonts w:ascii="Garamond" w:hAnsi="Garamond"/>
+          <w:color w:val="auto"/>
+          <w:sz w:val="22"/>
+          <w:szCs w:val="22"/>
+        </w:rPr>
+        <w:t>Gaming, Tech, Web, Reading, Running, Hiking, Meditation</w:t>
+      </w:r>
     </w:p>
-    <w:p>
-      <w:pPr>
-        <w:pStyle w:val="Default"/>
-        <w:rPr>
-          <w:rFonts w:ascii="Garamond" w:hAnsi="Garamond"/>
-          <w:color w:val="auto"/>
-          <w:sz w:val="22"/>
-          <w:szCs w:val="22"/>
-        </w:rPr>
-      </w:pPr>
-      <w:r>
-        <w:rPr>
-          <w:rFonts w:ascii="Garamond" w:hAnsi="Garamond"/>
-          <w:b/>
-          <w:bCs/>
-          <w:color w:val="auto"/>
-          <w:sz w:val="22"/>
-          <w:szCs w:val="22"/>
-        </w:rPr>
-        <w:t>Interests</w:t>
-      </w:r>
-      <w:r>
-        <w:rPr>
-          <w:rFonts w:ascii="Garamond" w:hAnsi="Garamond"/>
-          <w:b/>
-          <w:bCs/>
-          <w:color w:val="auto"/>
-          <w:sz w:val="22"/>
-          <w:szCs w:val="22"/>
-        </w:rPr>
-        <w:t>:</w:t>
-      </w:r>
-      <w:r>
-        <w:rPr>
-          <w:rFonts w:ascii="Garamond" w:hAnsi="Garamond"/>
-          <w:b/>
-          <w:bCs/>
-          <w:color w:val="auto"/>
-          <w:sz w:val="22"/>
-          <w:szCs w:val="22"/>
-        </w:rPr>
-        <w:t xml:space="preserve"> </w:t>
-      </w:r>
-      <w:r>
-        <w:rPr>
-          <w:rFonts w:ascii="Garamond" w:hAnsi="Garamond"/>
-          <w:color w:val="auto"/>
-          <w:sz w:val="22"/>
-          <w:szCs w:val="22"/>
-        </w:rPr>
-        <w:t>Gaming</w:t>
-      </w:r>
-      <w:r>
-        <w:rPr>
-          <w:rFonts w:ascii="Garamond" w:hAnsi="Garamond"/>
-          <w:color w:val="auto"/>
-          <w:sz w:val="22"/>
-          <w:szCs w:val="22"/>
-        </w:rPr>
-        <w:t>,</w:t>
-      </w:r>
-      <w:r>
-        <w:rPr>
-          <w:rFonts w:ascii="Garamond" w:hAnsi="Garamond"/>
-          <w:color w:val="auto"/>
-          <w:sz w:val="22"/>
-          <w:szCs w:val="22"/>
-        </w:rPr>
-        <w:t xml:space="preserve"> Tech,</w:t>
-      </w:r>
-      <w:r>
-        <w:rPr>
-          <w:rFonts w:ascii="Garamond" w:hAnsi="Garamond"/>
-          <w:color w:val="auto"/>
-          <w:sz w:val="22"/>
-          <w:szCs w:val="22"/>
-        </w:rPr>
-        <w:t xml:space="preserve"> </w:t>
-      </w:r>
-      <w:r>
-        <w:rPr>
-          <w:rFonts w:ascii="Garamond" w:hAnsi="Garamond"/>
-          <w:color w:val="auto"/>
-          <w:sz w:val="22"/>
-          <w:szCs w:val="22"/>
-        </w:rPr>
-        <w:t xml:space="preserve">Web, </w:t>
-      </w:r>
-      <w:r>
-        <w:rPr>
-          <w:rFonts w:ascii="Garamond" w:hAnsi="Garamond"/>
-          <w:color w:val="auto"/>
-          <w:sz w:val="22"/>
-          <w:szCs w:val="22"/>
-        </w:rPr>
-        <w:t>Reading</w:t>
-      </w:r>
-      <w:r>
-        <w:rPr>
-          <w:rFonts w:ascii="Garamond" w:hAnsi="Garamond"/>
-          <w:color w:val="auto"/>
-          <w:sz w:val="22"/>
-          <w:szCs w:val="22"/>
-        </w:rPr>
-        <w:t>,</w:t>
-      </w:r>
-      <w:r>
-        <w:rPr>
-          <w:rFonts w:ascii="Garamond" w:hAnsi="Garamond"/>
-          <w:color w:val="auto"/>
-          <w:sz w:val="22"/>
-          <w:szCs w:val="22"/>
-        </w:rPr>
-        <w:t xml:space="preserve"> </w:t>
-      </w:r>
-      <w:r>
-        <w:rPr>
-          <w:rFonts w:ascii="Garamond" w:hAnsi="Garamond"/>
-          <w:color w:val="auto"/>
-          <w:sz w:val="22"/>
-          <w:szCs w:val="22"/>
-        </w:rPr>
-        <w:t>Running</w:t>
-      </w:r>
-      <w:r>
-        <w:rPr>
-          <w:rFonts w:ascii="Garamond" w:hAnsi="Garamond"/>
-          <w:color w:val="auto"/>
-          <w:sz w:val="22"/>
-          <w:szCs w:val="22"/>
-        </w:rPr>
-        <w:t>,</w:t>
-      </w:r>
-      <w:r>
-        <w:rPr>
-          <w:rFonts w:ascii="Garamond" w:hAnsi="Garamond"/>
-          <w:color w:val="auto"/>
-          <w:sz w:val="22"/>
-          <w:szCs w:val="22"/>
-        </w:rPr>
-        <w:t xml:space="preserve"> Hiking</w:t>
-      </w:r>
-      <w:r>
-        <w:rPr>
-          <w:rFonts w:ascii="Garamond" w:hAnsi="Garamond"/>
-          <w:color w:val="auto"/>
-          <w:sz w:val="22"/>
-          <w:szCs w:val="22"/>
-        </w:rPr>
-        <w:t>,</w:t>
-      </w:r>
-      <w:r>
-        <w:rPr>
-          <w:rFonts w:ascii="Garamond" w:hAnsi="Garamond"/>
-          <w:color w:val="auto"/>
-          <w:sz w:val="22"/>
-          <w:szCs w:val="22"/>
-        </w:rPr>
-        <w:t xml:space="preserve"> Meditation</w:t>
-      </w:r>
-    </w:p>
+    <w:p/>
     <w:sectPr>
       <w:pgSz w:w="12240" w:h="15840"/>
       <w:pgMar w:top="432" w:right="720" w:bottom="432" w:left="720" w:header="720" w:footer="346" w:gutter="0"/>
@@ -3111,7 +2119,7 @@
 </file>
 
 <file path=word/endnotes.xml><?xml version="1.0" encoding="utf-8"?>
-<w:endnotes xmlns:wpc="http://schemas.microsoft.com/office/word/2010/wordprocessingCanvas" xmlns:cx="http://schemas.microsoft.com/office/drawing/2014/chartex" xmlns:cx1="http://schemas.microsoft.com/office/drawing/2015/9/8/chartex" xmlns:cx2="http://schemas.microsoft.com/office/drawing/2015/10/21/chartex" xmlns:cx3="http://schemas.microsoft.com/office/drawing/2016/5/9/chartex" xmlns:cx4="http://schemas.microsoft.com/office/drawing/2016/5/10/chartex" xmlns:cx5="http://schemas.microsoft.com/office/drawing/2016/5/11/chartex" xmlns:cx6="http://schemas.microsoft.com/office/drawing/2016/5/12/chartex" xmlns:cx7="http://schemas.microsoft.com/office/drawing/2016/5/13/chartex" xmlns:cx8="http://schemas.microsoft.com/office/drawing/2016/5/14/chartex" xmlns:mc="http://schemas.openxmlformats.org/markup-compatibility/2006" xmlns:aink="http://schemas.microsoft.com/office/drawing/2016/ink" xmlns:am3d="http://schemas.microsoft.com/office/drawing/2017/model3d" xmlns:o="urn:schemas-microsoft-com:office:office" xmlns:oel="http://schemas.microsoft.com/office/2019/extlst" xmlns:r="http://schemas.openxmlformats.org/officeDocument/2006/relationships" xmlns:m="http://schemas.openxmlformats.org/officeDocument/2006/math" xmlns:v="urn:schemas-microsoft-com:vml" xmlns:wp14="http://schemas.microsoft.com/office/word/2010/wordprocessingDrawing" xmlns:wp="http://schemas.openxmlformats.org/drawingml/2006/wordprocessingDrawing" xmlns:w10="urn:schemas-microsoft-com:office:word" xmlns:w="http://schemas.openxmlformats.org/wordprocessingml/2006/main" xmlns:w14="http://schemas.microsoft.com/office/word/2010/wordml" xmlns:w15="http://schemas.microsoft.com/office/word/2012/wordml" xmlns:w16cei="http://schemas.microsoft.com/office/word/2026/wordml/cei" xmlns:w16cex="http://schemas.microsoft.com/office/word/2018/wordml/cex" xmlns:w16cid="http://schemas.microsoft.com/office/word/2016/wordml/cid" xmlns:w16="http://schemas.microsoft.com/office/word/2018/wordml" xmlns:w16du="http://schemas.microsoft.com/office/word/2023/wordml/word16du" xmlns:w16sdtdh="http://schemas.microsoft.com/office/word/2020/wordml/sdtdatahash" xmlns:w16sdtfl="http://schemas.microsoft.com/office/word/2024/wordml/sdtformatlock" xmlns:w16se="http://schemas.microsoft.com/office/word/2015/wordml/symex" xmlns:wpg="http://schemas.microsoft.com/office/word/2010/wordprocessingGroup" xmlns:wpi="http://schemas.microsoft.com/office/word/2010/wordprocessingInk" xmlns:wne="http://schemas.microsoft.com/office/word/2006/wordml" xmlns:wps="http://schemas.microsoft.com/office/word/2010/wordprocessingShape" mc:Ignorable="w14 w15 w16se w16cid w16 w16cex w16sdtdh w16sdtfl w16du wp14">
+<w:endnotes xmlns:wpc="http://schemas.microsoft.com/office/word/2010/wordprocessingCanvas" xmlns:cx="http://schemas.microsoft.com/office/drawing/2014/chartex" xmlns:cx1="http://schemas.microsoft.com/office/drawing/2015/9/8/chartex" xmlns:cx2="http://schemas.microsoft.com/office/drawing/2015/10/21/chartex" xmlns:cx3="http://schemas.microsoft.com/office/drawing/2016/5/9/chartex" xmlns:cx4="http://schemas.microsoft.com/office/drawing/2016/5/10/chartex" xmlns:cx5="http://schemas.microsoft.com/office/drawing/2016/5/11/chartex" xmlns:cx6="http://schemas.microsoft.com/office/drawing/2016/5/12/chartex" xmlns:cx7="http://schemas.microsoft.com/office/drawing/2016/5/13/chartex" xmlns:cx8="http://schemas.microsoft.com/office/drawing/2016/5/14/chartex" xmlns:mc="http://schemas.openxmlformats.org/markup-compatibility/2006" xmlns:aink="http://schemas.microsoft.com/office/drawing/2016/ink" xmlns:am3d="http://schemas.microsoft.com/office/drawing/2017/model3d" xmlns:o="urn:schemas-microsoft-com:office:office" xmlns:oel="http://schemas.microsoft.com/office/2019/extlst" xmlns:r="http://schemas.openxmlformats.org/officeDocument/2006/relationships" xmlns:m="http://schemas.openxmlformats.org/officeDocument/2006/math" xmlns:v="urn:schemas-microsoft-com:vml" xmlns:wp14="http://schemas.microsoft.com/office/word/2010/wordprocessingDrawing" xmlns:wp="http://schemas.openxmlformats.org/drawingml/2006/wordprocessingDrawing" xmlns:w10="urn:schemas-microsoft-com:office:word" xmlns:w="http://schemas.openxmlformats.org/wordprocessingml/2006/main" xmlns:w14="http://schemas.microsoft.com/office/word/2010/wordml" xmlns:w15="http://schemas.microsoft.com/office/word/2012/wordml" xmlns:w16cex="http://schemas.microsoft.com/office/word/2018/wordml/cex" xmlns:w16cid="http://schemas.microsoft.com/office/word/2016/wordml/cid" xmlns:w16="http://schemas.microsoft.com/office/word/2018/wordml" xmlns:w16du="http://schemas.microsoft.com/office/word/2023/wordml/word16du" xmlns:w16sdtdh="http://schemas.microsoft.com/office/word/2020/wordml/sdtdatahash" xmlns:w16sdtfl="http://schemas.microsoft.com/office/word/2024/wordml/sdtformatlock" xmlns:w16se="http://schemas.microsoft.com/office/word/2015/wordml/symex" xmlns:wpg="http://schemas.microsoft.com/office/word/2010/wordprocessingGroup" xmlns:wpi="http://schemas.microsoft.com/office/word/2010/wordprocessingInk" xmlns:wne="http://schemas.microsoft.com/office/word/2006/wordml" xmlns:wps="http://schemas.microsoft.com/office/word/2010/wordprocessingShape" mc:Ignorable="w14 w15 w16se w16cid w16 w16cex w16sdtdh w16sdtfl w16du wp14">
   <w:endnote w:type="separator" w:id="-1">
     <w:p>
       <w:r>
@@ -3130,7 +2138,7 @@
 </file>
 
 <file path=word/footnotes.xml><?xml version="1.0" encoding="utf-8"?>
-<w:footnotes xmlns:wpc="http://schemas.microsoft.com/office/word/2010/wordprocessingCanvas" xmlns:cx="http://schemas.microsoft.com/office/drawing/2014/chartex" xmlns:cx1="http://schemas.microsoft.com/office/drawing/2015/9/8/chartex" xmlns:cx2="http://schemas.microsoft.com/office/drawing/2015/10/21/chartex" xmlns:cx3="http://schemas.microsoft.com/office/drawing/2016/5/9/chartex" xmlns:cx4="http://schemas.microsoft.com/office/drawing/2016/5/10/chartex" xmlns:cx5="http://schemas.microsoft.com/office/drawing/2016/5/11/chartex" xmlns:cx6="http://schemas.microsoft.com/office/drawing/2016/5/12/chartex" xmlns:cx7="http://schemas.microsoft.com/office/drawing/2016/5/13/chartex" xmlns:cx8="http://schemas.microsoft.com/office/drawing/2016/5/14/chartex" xmlns:mc="http://schemas.openxmlformats.org/markup-compatibility/2006" xmlns:aink="http://schemas.microsoft.com/office/drawing/2016/ink" xmlns:am3d="http://schemas.microsoft.com/office/drawing/2017/model3d" xmlns:o="urn:schemas-microsoft-com:office:office" xmlns:oel="http://schemas.microsoft.com/office/2019/extlst" xmlns:r="http://schemas.openxmlformats.org/officeDocument/2006/relationships" xmlns:m="http://schemas.openxmlformats.org/officeDocument/2006/math" xmlns:v="urn:schemas-microsoft-com:vml" xmlns:wp14="http://schemas.microsoft.com/office/word/2010/wordprocessingDrawing" xmlns:wp="http://schemas.openxmlformats.org/drawingml/2006/wordprocessingDrawing" xmlns:w10="urn:schemas-microsoft-com:office:word" xmlns:w="http://schemas.openxmlformats.org/wordprocessingml/2006/main" xmlns:w14="http://schemas.microsoft.com/office/word/2010/wordml" xmlns:w15="http://schemas.microsoft.com/office/word/2012/wordml" xmlns:w16cei="http://schemas.microsoft.com/office/word/2026/wordml/cei" xmlns:w16cex="http://schemas.microsoft.com/office/word/2018/wordml/cex" xmlns:w16cid="http://schemas.microsoft.com/office/word/2016/wordml/cid" xmlns:w16="http://schemas.microsoft.com/office/word/2018/wordml" xmlns:w16du="http://schemas.microsoft.com/office/word/2023/wordml/word16du" xmlns:w16sdtdh="http://schemas.microsoft.com/office/word/2020/wordml/sdtdatahash" xmlns:w16sdtfl="http://schemas.microsoft.com/office/word/2024/wordml/sdtformatlock" xmlns:w16se="http://schemas.microsoft.com/office/word/2015/wordml/symex" xmlns:wpg="http://schemas.microsoft.com/office/word/2010/wordprocessingGroup" xmlns:wpi="http://schemas.microsoft.com/office/word/2010/wordprocessingInk" xmlns:wne="http://schemas.microsoft.com/office/word/2006/wordml" xmlns:wps="http://schemas.microsoft.com/office/word/2010/wordprocessingShape" mc:Ignorable="w14 w15 w16se w16cid w16 w16cex w16sdtdh w16sdtfl w16du wp14">
+<w:footnotes xmlns:wpc="http://schemas.microsoft.com/office/word/2010/wordprocessingCanvas" xmlns:cx="http://schemas.microsoft.com/office/drawing/2014/chartex" xmlns:cx1="http://schemas.microsoft.com/office/drawing/2015/9/8/chartex" xmlns:cx2="http://schemas.microsoft.com/office/drawing/2015/10/21/chartex" xmlns:cx3="http://schemas.microsoft.com/office/drawing/2016/5/9/chartex" xmlns:cx4="http://schemas.microsoft.com/office/drawing/2016/5/10/chartex" xmlns:cx5="http://schemas.microsoft.com/office/drawing/2016/5/11/chartex" xmlns:cx6="http://schemas.microsoft.com/office/drawing/2016/5/12/chartex" xmlns:cx7="http://schemas.microsoft.com/office/drawing/2016/5/13/chartex" xmlns:cx8="http://schemas.microsoft.com/office/drawing/2016/5/14/chartex" xmlns:mc="http://schemas.openxmlformats.org/markup-compatibility/2006" xmlns:aink="http://schemas.microsoft.com/office/drawing/2016/ink" xmlns:am3d="http://schemas.microsoft.com/office/drawing/2017/model3d" xmlns:o="urn:schemas-microsoft-com:office:office" xmlns:oel="http://schemas.microsoft.com/office/2019/extlst" xmlns:r="http://schemas.openxmlformats.org/officeDocument/2006/relationships" xmlns:m="http://schemas.openxmlformats.org/officeDocument/2006/math" xmlns:v="urn:schemas-microsoft-com:vml" xmlns:wp14="http://schemas.microsoft.com/office/word/2010/wordprocessingDrawing" xmlns:wp="http://schemas.openxmlformats.org/drawingml/2006/wordprocessingDrawing" xmlns:w10="urn:schemas-microsoft-com:office:word" xmlns:w="http://schemas.openxmlformats.org/wordprocessingml/2006/main" xmlns:w14="http://schemas.microsoft.com/office/word/2010/wordml" xmlns:w15="http://schemas.microsoft.com/office/word/2012/wordml" xmlns:w16cex="http://schemas.microsoft.com/office/word/2018/wordml/cex" xmlns:w16cid="http://schemas.microsoft.com/office/word/2016/wordml/cid" xmlns:w16="http://schemas.microsoft.com/office/word/2018/wordml" xmlns:w16du="http://schemas.microsoft.com/office/word/2023/wordml/word16du" xmlns:w16sdtdh="http://schemas.microsoft.com/office/word/2020/wordml/sdtdatahash" xmlns:w16sdtfl="http://schemas.microsoft.com/office/word/2024/wordml/sdtformatlock" xmlns:w16se="http://schemas.microsoft.com/office/word/2015/wordml/symex" xmlns:wpg="http://schemas.microsoft.com/office/word/2010/wordprocessingGroup" xmlns:wpi="http://schemas.microsoft.com/office/word/2010/wordprocessingInk" xmlns:wne="http://schemas.microsoft.com/office/word/2006/wordml" xmlns:wps="http://schemas.microsoft.com/office/word/2010/wordprocessingShape" mc:Ignorable="w14 w15 w16se w16cid w16 w16cex w16sdtdh w16sdtfl w16du wp14">
   <w:footnote w:type="separator" w:id="-1">
     <w:p>
       <w:r>
@@ -3149,7 +2157,7 @@
 </file>
 
 <file path=word/numbering.xml><?xml version="1.0" encoding="utf-8"?>
-<w:numbering xmlns:wpc="http://schemas.microsoft.com/office/word/2010/wordprocessingCanvas" xmlns:cx="http://schemas.microsoft.com/office/drawing/2014/chartex" xmlns:cx1="http://schemas.microsoft.com/office/drawing/2015/9/8/chartex" xmlns:cx2="http://schemas.microsoft.com/office/drawing/2015/10/21/chartex" xmlns:cx3="http://schemas.microsoft.com/office/drawing/2016/5/9/chartex" xmlns:cx4="http://schemas.microsoft.com/office/drawing/2016/5/10/chartex" xmlns:cx5="http://schemas.microsoft.com/office/drawing/2016/5/11/chartex" xmlns:cx6="http://schemas.microsoft.com/office/drawing/2016/5/12/chartex" xmlns:cx7="http://schemas.microsoft.com/office/drawing/2016/5/13/chartex" xmlns:cx8="http://schemas.microsoft.com/office/drawing/2016/5/14/chartex" xmlns:mc="http://schemas.openxmlformats.org/markup-compatibility/2006" xmlns:aink="http://schemas.microsoft.com/office/drawing/2016/ink" xmlns:am3d="http://schemas.microsoft.com/office/drawing/2017/model3d" xmlns:o="urn:schemas-microsoft-com:office:office" xmlns:oel="http://schemas.microsoft.com/office/2019/extlst" xmlns:r="http://schemas.openxmlformats.org/officeDocument/2006/relationships" xmlns:m="http://schemas.openxmlformats.org/officeDocument/2006/math" xmlns:v="urn:schemas-microsoft-com:vml" xmlns:wp14="http://schemas.microsoft.com/office/word/2010/wordprocessingDrawing" xmlns:wp="http://schemas.openxmlformats.org/drawingml/2006/wordprocessingDrawing" xmlns:w10="urn:schemas-microsoft-com:office:word" xmlns:w="http://schemas.openxmlformats.org/wordprocessingml/2006/main" xmlns:w14="http://schemas.microsoft.com/office/word/2010/wordml" xmlns:w15="http://schemas.microsoft.com/office/word/2012/wordml" xmlns:w16cei="http://schemas.microsoft.com/office/word/2026/wordml/cei" xmlns:w16cex="http://schemas.microsoft.com/office/word/2018/wordml/cex" xmlns:w16cid="http://schemas.microsoft.com/office/word/2016/wordml/cid" xmlns:w16="http://schemas.microsoft.com/office/word/2018/wordml" xmlns:w16du="http://schemas.microsoft.com/office/word/2023/wordml/word16du" xmlns:w16sdtdh="http://schemas.microsoft.com/office/word/2020/wordml/sdtdatahash" xmlns:w16sdtfl="http://schemas.microsoft.com/office/word/2024/wordml/sdtformatlock" xmlns:w16se="http://schemas.microsoft.com/office/word/2015/wordml/symex" xmlns:wpg="http://schemas.microsoft.com/office/word/2010/wordprocessingGroup" xmlns:wpi="http://schemas.microsoft.com/office/word/2010/wordprocessingInk" xmlns:wne="http://schemas.microsoft.com/office/word/2006/wordml" xmlns:wps="http://schemas.microsoft.com/office/word/2010/wordprocessingShape" mc:Ignorable="w14 w15 w16se w16cid w16 w16cex w16sdtdh w16sdtfl w16du wp14">
+<w:numbering xmlns:wpc="http://schemas.microsoft.com/office/word/2010/wordprocessingCanvas" xmlns:cx="http://schemas.microsoft.com/office/drawing/2014/chartex" xmlns:cx1="http://schemas.microsoft.com/office/drawing/2015/9/8/chartex" xmlns:cx2="http://schemas.microsoft.com/office/drawing/2015/10/21/chartex" xmlns:cx3="http://schemas.microsoft.com/office/drawing/2016/5/9/chartex" xmlns:cx4="http://schemas.microsoft.com/office/drawing/2016/5/10/chartex" xmlns:cx5="http://schemas.microsoft.com/office/drawing/2016/5/11/chartex" xmlns:cx6="http://schemas.microsoft.com/office/drawing/2016/5/12/chartex" xmlns:cx7="http://schemas.microsoft.com/office/drawing/2016/5/13/chartex" xmlns:cx8="http://schemas.microsoft.com/office/drawing/2016/5/14/chartex" xmlns:mc="http://schemas.openxmlformats.org/markup-compatibility/2006" xmlns:aink="http://schemas.microsoft.com/office/drawing/2016/ink" xmlns:am3d="http://schemas.microsoft.com/office/drawing/2017/model3d" xmlns:o="urn:schemas-microsoft-com:office:office" xmlns:oel="http://schemas.microsoft.com/office/2019/extlst" xmlns:r="http://schemas.openxmlformats.org/officeDocument/2006/relationships" xmlns:m="http://schemas.openxmlformats.org/officeDocument/2006/math" xmlns:v="urn:schemas-microsoft-com:vml" xmlns:wp14="http://schemas.microsoft.com/office/word/2010/wordprocessingDrawing" xmlns:wp="http://schemas.openxmlformats.org/drawingml/2006/wordprocessingDrawing" xmlns:w10="urn:schemas-microsoft-com:office:word" xmlns:w="http://schemas.openxmlformats.org/wordprocessingml/2006/main" xmlns:w14="http://schemas.microsoft.com/office/word/2010/wordml" xmlns:w15="http://schemas.microsoft.com/office/word/2012/wordml" xmlns:w16cex="http://schemas.microsoft.com/office/word/2018/wordml/cex" xmlns:w16cid="http://schemas.microsoft.com/office/word/2016/wordml/cid" xmlns:w16="http://schemas.microsoft.com/office/word/2018/wordml" xmlns:w16du="http://schemas.microsoft.com/office/word/2023/wordml/word16du" xmlns:w16sdtdh="http://schemas.microsoft.com/office/word/2020/wordml/sdtdatahash" xmlns:w16sdtfl="http://schemas.microsoft.com/office/word/2024/wordml/sdtformatlock" xmlns:w16se="http://schemas.microsoft.com/office/word/2015/wordml/symex" xmlns:wpg="http://schemas.microsoft.com/office/word/2010/wordprocessingGroup" xmlns:wpi="http://schemas.microsoft.com/office/word/2010/wordprocessingInk" xmlns:wne="http://schemas.microsoft.com/office/word/2006/wordml" xmlns:wps="http://schemas.microsoft.com/office/word/2010/wordprocessingShape" mc:Ignorable="w14 w15 w16se w16cid w16 w16cex w16sdtdh w16sdtfl w16du wp14">
   <w:abstractNum w:abstractNumId="0" w15:restartNumberingAfterBreak="0">
     <w:nsid w:val="02C450BF"/>
     <w:multiLevelType w:val="hybridMultilevel"/>

</xml_diff>

<commit_message>
Update project with RBAC (content WIP)
</commit_message>
<xml_diff>
--- a/assets/pdf/noah_hamblen_portfolio_resume1.docx
+++ b/assets/pdf/noah_hamblen_portfolio_resume1.docx
@@ -249,6 +249,19 @@
         </w:pBdr>
         <w:rPr>
           <w:rFonts w:ascii="Garamond" w:hAnsi="Garamond"/>
+          <w:sz w:val="22"/>
+          <w:szCs w:val="22"/>
+        </w:rPr>
+      </w:pPr>
+    </w:p>
+    <w:p>
+      <w:pPr>
+        <w:pStyle w:val="Default"/>
+        <w:pBdr>
+          <w:bottom w:val="single" w:sz="6" w:space="1" w:color="auto"/>
+        </w:pBdr>
+        <w:rPr>
+          <w:rFonts w:ascii="Garamond" w:hAnsi="Garamond"/>
           <w:b/>
           <w:bCs/>
           <w:color w:val="auto"/>
@@ -718,6 +731,19 @@
         </w:rPr>
         <w:t>Executed technical setup and configuration for the Lincoln office expansion, deploying workstations, thin clients, and printers.</w:t>
       </w:r>
+    </w:p>
+    <w:p>
+      <w:pPr>
+        <w:pStyle w:val="Default"/>
+        <w:pBdr>
+          <w:bottom w:val="single" w:sz="6" w:space="1" w:color="auto"/>
+        </w:pBdr>
+        <w:rPr>
+          <w:rFonts w:ascii="Garamond" w:hAnsi="Garamond"/>
+          <w:sz w:val="22"/>
+          <w:szCs w:val="22"/>
+        </w:rPr>
+      </w:pPr>
     </w:p>
     <w:p>
       <w:pPr>
@@ -1031,15 +1057,24 @@
     <w:p>
       <w:pPr>
         <w:pStyle w:val="Default"/>
-        <w:pBdr>
-          <w:bottom w:val="single" w:sz="6" w:space="1" w:color="auto"/>
-        </w:pBdr>
-        <w:rPr>
-          <w:rFonts w:ascii="Garamond" w:hAnsi="Garamond"/>
-          <w:sz w:val="22"/>
-          <w:szCs w:val="22"/>
-        </w:rPr>
-      </w:pPr>
+        <w:numPr>
+          <w:ilvl w:val="0"/>
+          <w:numId w:val="19"/>
+        </w:numPr>
+        <w:rPr>
+          <w:rFonts w:ascii="Garamond" w:hAnsi="Garamond"/>
+          <w:sz w:val="22"/>
+          <w:szCs w:val="22"/>
+        </w:rPr>
+      </w:pPr>
+      <w:r>
+        <w:rPr>
+          <w:rFonts w:ascii="Garamond" w:hAnsi="Garamond"/>
+          <w:sz w:val="22"/>
+          <w:szCs w:val="22"/>
+        </w:rPr>
+        <w:t>Enforced least-privilege administrative access by configuring Microsoft Entra ID Role-Based Access Control (RBAC) and managing on-premises Active Directory security groups.</w:t>
+      </w:r>
     </w:p>
     <w:p>
       <w:pPr>
@@ -1049,550 +1084,8 @@
         </w:pBdr>
         <w:rPr>
           <w:rFonts w:ascii="Garamond" w:hAnsi="Garamond"/>
-          <w:b/>
-          <w:bCs/>
-          <w:color w:val="auto"/>
-          <w:sz w:val="28"/>
-          <w:szCs w:val="28"/>
-        </w:rPr>
-      </w:pPr>
-      <w:r>
-        <w:rPr>
-          <w:rFonts w:ascii="Garamond" w:hAnsi="Garamond"/>
-          <w:b/>
-          <w:bCs/>
-          <w:color w:val="auto"/>
-          <w:sz w:val="28"/>
-          <w:szCs w:val="28"/>
-        </w:rPr>
-        <w:t>CERTIFICATIONS</w:t>
-      </w:r>
-    </w:p>
-    <w:p>
-      <w:pPr>
-        <w:pStyle w:val="Default"/>
-        <w:rPr>
-          <w:rFonts w:ascii="Garamond" w:hAnsi="Garamond"/>
-          <w:b/>
-          <w:bCs/>
-          <w:color w:val="auto"/>
-          <w:sz w:val="18"/>
-          <w:szCs w:val="22"/>
-        </w:rPr>
-      </w:pPr>
-      <w:r>
-        <w:rPr>
-          <w:rFonts w:ascii="Garamond" w:hAnsi="Garamond"/>
-          <w:b/>
-          <w:bCs/>
-          <w:sz w:val="22"/>
-          <w:szCs w:val="22"/>
-        </w:rPr>
-        <w:t xml:space="preserve">CompTIA </w:t>
-      </w:r>
-      <w:r>
-        <w:rPr>
-          <w:rFonts w:ascii="Garamond" w:hAnsi="Garamond"/>
-          <w:b/>
-          <w:bCs/>
-          <w:sz w:val="22"/>
-          <w:szCs w:val="22"/>
-        </w:rPr>
-        <w:t>Security</w:t>
-      </w:r>
-      <w:r>
-        <w:rPr>
-          <w:rFonts w:ascii="Garamond" w:hAnsi="Garamond"/>
-          <w:b/>
-          <w:bCs/>
-          <w:sz w:val="22"/>
-          <w:szCs w:val="22"/>
-        </w:rPr>
-        <w:t>+</w:t>
-      </w:r>
-      <w:r>
-        <w:rPr>
-          <w:rFonts w:ascii="Garamond" w:hAnsi="Garamond"/>
-          <w:b/>
-          <w:bCs/>
-          <w:sz w:val="22"/>
-          <w:szCs w:val="22"/>
-        </w:rPr>
-        <w:tab/>
-      </w:r>
-      <w:r>
-        <w:rPr>
-          <w:rFonts w:ascii="Garamond" w:hAnsi="Garamond"/>
-          <w:b/>
-          <w:bCs/>
-          <w:sz w:val="22"/>
-          <w:szCs w:val="22"/>
-        </w:rPr>
-        <w:tab/>
-      </w:r>
-      <w:r>
-        <w:rPr>
-          <w:rFonts w:ascii="Garamond" w:hAnsi="Garamond"/>
-          <w:b/>
-          <w:bCs/>
-          <w:sz w:val="22"/>
-          <w:szCs w:val="22"/>
-        </w:rPr>
-        <w:t xml:space="preserve">             </w:t>
-      </w:r>
-      <w:r>
-        <w:rPr>
-          <w:rFonts w:ascii="Garamond" w:hAnsi="Garamond"/>
-          <w:b/>
-          <w:bCs/>
-          <w:sz w:val="22"/>
-          <w:szCs w:val="22"/>
-        </w:rPr>
-        <w:tab/>
-      </w:r>
-      <w:r>
-        <w:rPr>
-          <w:rFonts w:ascii="Garamond" w:hAnsi="Garamond"/>
-          <w:b/>
-          <w:bCs/>
-          <w:sz w:val="22"/>
-          <w:szCs w:val="22"/>
-        </w:rPr>
-        <w:tab/>
-      </w:r>
-      <w:r>
-        <w:rPr>
-          <w:rFonts w:ascii="Garamond" w:hAnsi="Garamond"/>
-          <w:b/>
-          <w:bCs/>
-          <w:sz w:val="22"/>
-          <w:szCs w:val="22"/>
-        </w:rPr>
-        <w:tab/>
-      </w:r>
-      <w:r>
-        <w:rPr>
-          <w:rFonts w:ascii="Garamond" w:hAnsi="Garamond"/>
-          <w:b/>
-          <w:bCs/>
-          <w:sz w:val="22"/>
-          <w:szCs w:val="22"/>
-        </w:rPr>
-        <w:tab/>
-      </w:r>
-      <w:r>
-        <w:rPr>
-          <w:rFonts w:ascii="Garamond" w:hAnsi="Garamond"/>
-          <w:b/>
-          <w:bCs/>
-          <w:sz w:val="22"/>
-          <w:szCs w:val="22"/>
-        </w:rPr>
-        <w:tab/>
-        <w:t xml:space="preserve">                      </w:t>
-      </w:r>
-      <w:r>
-        <w:rPr>
-          <w:rFonts w:ascii="Garamond" w:hAnsi="Garamond"/>
-          <w:b/>
-          <w:bCs/>
-          <w:sz w:val="22"/>
-          <w:szCs w:val="22"/>
-        </w:rPr>
-        <w:t xml:space="preserve">           August</w:t>
-      </w:r>
-      <w:r>
-        <w:rPr>
-          <w:rFonts w:ascii="Garamond" w:hAnsi="Garamond"/>
-          <w:b/>
-          <w:bCs/>
-          <w:sz w:val="22"/>
-          <w:szCs w:val="22"/>
-        </w:rPr>
-        <w:t xml:space="preserve"> 202</w:t>
-      </w:r>
-      <w:r>
-        <w:rPr>
-          <w:rFonts w:ascii="Garamond" w:hAnsi="Garamond"/>
-          <w:b/>
-          <w:bCs/>
-          <w:sz w:val="22"/>
-          <w:szCs w:val="22"/>
-        </w:rPr>
-        <w:t>6</w:t>
-      </w:r>
-      <w:r>
-        <w:rPr>
-          <w:rFonts w:ascii="Garamond" w:hAnsi="Garamond"/>
-          <w:b/>
-          <w:bCs/>
-          <w:sz w:val="22"/>
-          <w:szCs w:val="22"/>
-        </w:rPr>
-        <w:t xml:space="preserve"> – </w:t>
-      </w:r>
-      <w:r>
-        <w:rPr>
-          <w:rFonts w:ascii="Garamond" w:hAnsi="Garamond"/>
-          <w:b/>
-          <w:bCs/>
-          <w:sz w:val="22"/>
-          <w:szCs w:val="22"/>
-        </w:rPr>
-        <w:t>August</w:t>
-      </w:r>
-      <w:r>
-        <w:rPr>
-          <w:rFonts w:ascii="Garamond" w:hAnsi="Garamond"/>
-          <w:b/>
-          <w:bCs/>
-          <w:sz w:val="22"/>
-          <w:szCs w:val="22"/>
-        </w:rPr>
-        <w:t xml:space="preserve"> 202</w:t>
-      </w:r>
-      <w:r>
-        <w:rPr>
-          <w:rFonts w:ascii="Garamond" w:hAnsi="Garamond"/>
-          <w:b/>
-          <w:bCs/>
-          <w:sz w:val="22"/>
-          <w:szCs w:val="22"/>
-        </w:rPr>
-        <w:t>9</w:t>
-      </w:r>
-    </w:p>
-    <w:p>
-      <w:pPr>
-        <w:pStyle w:val="Default"/>
-        <w:spacing w:after="3"/>
-        <w:jc w:val="both"/>
-        <w:rPr>
-          <w:rFonts w:ascii="Garamond" w:hAnsi="Garamond"/>
-          <w:b/>
-          <w:bCs/>
-          <w:color w:val="auto"/>
-          <w:sz w:val="22"/>
-          <w:szCs w:val="22"/>
-        </w:rPr>
-      </w:pPr>
-      <w:r>
-        <w:rPr>
-          <w:rFonts w:ascii="Garamond" w:hAnsi="Garamond"/>
-          <w:b/>
-          <w:bCs/>
-          <w:color w:val="auto"/>
-          <w:sz w:val="22"/>
-          <w:szCs w:val="22"/>
-        </w:rPr>
-        <w:t xml:space="preserve">IGEL Certified Professional </w:t>
-      </w:r>
-      <w:r>
-        <w:rPr>
-          <w:rFonts w:ascii="Garamond" w:hAnsi="Garamond"/>
-          <w:b/>
-          <w:bCs/>
-          <w:color w:val="auto"/>
-          <w:sz w:val="22"/>
-          <w:szCs w:val="22"/>
-        </w:rPr>
-        <w:tab/>
-      </w:r>
-      <w:r>
-        <w:rPr>
-          <w:rFonts w:ascii="Garamond" w:hAnsi="Garamond"/>
-          <w:b/>
-          <w:bCs/>
-          <w:color w:val="auto"/>
-          <w:sz w:val="22"/>
-          <w:szCs w:val="22"/>
-        </w:rPr>
-        <w:tab/>
-      </w:r>
-      <w:r>
-        <w:rPr>
-          <w:rFonts w:ascii="Garamond" w:hAnsi="Garamond"/>
-          <w:b/>
-          <w:bCs/>
-          <w:color w:val="auto"/>
-          <w:sz w:val="22"/>
-          <w:szCs w:val="22"/>
-        </w:rPr>
-        <w:tab/>
-      </w:r>
-      <w:r>
-        <w:rPr>
-          <w:rFonts w:ascii="Garamond" w:hAnsi="Garamond"/>
-          <w:b/>
-          <w:bCs/>
-          <w:color w:val="auto"/>
-          <w:sz w:val="22"/>
-          <w:szCs w:val="22"/>
-        </w:rPr>
-        <w:tab/>
-      </w:r>
-      <w:r>
-        <w:rPr>
-          <w:rFonts w:ascii="Garamond" w:hAnsi="Garamond"/>
-          <w:b/>
-          <w:bCs/>
-          <w:color w:val="auto"/>
-          <w:sz w:val="22"/>
-          <w:szCs w:val="22"/>
-        </w:rPr>
-        <w:tab/>
-      </w:r>
-      <w:r>
-        <w:rPr>
-          <w:rFonts w:ascii="Garamond" w:hAnsi="Garamond"/>
-          <w:b/>
-          <w:bCs/>
-          <w:color w:val="auto"/>
-          <w:sz w:val="22"/>
-          <w:szCs w:val="22"/>
-        </w:rPr>
-        <w:tab/>
-        <w:t xml:space="preserve">                       </w:t>
-      </w:r>
-      <w:r>
-        <w:rPr>
-          <w:rFonts w:ascii="Garamond" w:hAnsi="Garamond"/>
-          <w:b/>
-          <w:bCs/>
-          <w:sz w:val="22"/>
-          <w:szCs w:val="22"/>
-        </w:rPr>
-        <w:t>December 2025 – December 2027</w:t>
-      </w:r>
-    </w:p>
-    <w:p>
-      <w:pPr>
-        <w:pStyle w:val="Default"/>
-        <w:rPr>
-          <w:rFonts w:ascii="Garamond" w:hAnsi="Garamond"/>
-          <w:b/>
-          <w:bCs/>
-          <w:color w:val="auto"/>
-          <w:sz w:val="18"/>
-          <w:szCs w:val="22"/>
-        </w:rPr>
-      </w:pPr>
-      <w:r>
-        <w:rPr>
-          <w:rFonts w:ascii="Garamond" w:hAnsi="Garamond"/>
-          <w:b/>
-          <w:bCs/>
-          <w:sz w:val="22"/>
-          <w:szCs w:val="22"/>
-        </w:rPr>
-        <w:t>CompTIA Network+</w:t>
-      </w:r>
-      <w:r>
-        <w:rPr>
-          <w:rFonts w:ascii="Garamond" w:hAnsi="Garamond"/>
-          <w:b/>
-          <w:bCs/>
-          <w:sz w:val="22"/>
-          <w:szCs w:val="22"/>
-        </w:rPr>
-        <w:tab/>
-      </w:r>
-      <w:r>
-        <w:rPr>
-          <w:rFonts w:ascii="Garamond" w:hAnsi="Garamond"/>
-          <w:b/>
-          <w:bCs/>
-          <w:sz w:val="22"/>
-          <w:szCs w:val="22"/>
-        </w:rPr>
-        <w:tab/>
-      </w:r>
-      <w:r>
-        <w:rPr>
-          <w:rFonts w:ascii="Garamond" w:hAnsi="Garamond"/>
-          <w:b/>
-          <w:bCs/>
-          <w:sz w:val="22"/>
-          <w:szCs w:val="22"/>
-        </w:rPr>
-        <w:tab/>
-      </w:r>
-      <w:r>
-        <w:rPr>
-          <w:rFonts w:ascii="Garamond" w:hAnsi="Garamond"/>
-          <w:b/>
-          <w:bCs/>
-          <w:sz w:val="22"/>
-          <w:szCs w:val="22"/>
-        </w:rPr>
-        <w:tab/>
-      </w:r>
-      <w:r>
-        <w:rPr>
-          <w:rFonts w:ascii="Garamond" w:hAnsi="Garamond"/>
-          <w:b/>
-          <w:bCs/>
-          <w:sz w:val="22"/>
-          <w:szCs w:val="22"/>
-        </w:rPr>
-        <w:tab/>
-      </w:r>
-      <w:r>
-        <w:rPr>
-          <w:rFonts w:ascii="Garamond" w:hAnsi="Garamond"/>
-          <w:b/>
-          <w:bCs/>
-          <w:sz w:val="22"/>
-          <w:szCs w:val="22"/>
-        </w:rPr>
-        <w:tab/>
-      </w:r>
-      <w:r>
-        <w:rPr>
-          <w:rFonts w:ascii="Garamond" w:hAnsi="Garamond"/>
-          <w:b/>
-          <w:bCs/>
-          <w:sz w:val="22"/>
-          <w:szCs w:val="22"/>
-        </w:rPr>
-        <w:tab/>
-        <w:t xml:space="preserve">                      </w:t>
-      </w:r>
-      <w:r>
-        <w:rPr>
-          <w:rFonts w:ascii="Garamond" w:hAnsi="Garamond"/>
-          <w:b/>
-          <w:bCs/>
-          <w:sz w:val="22"/>
-          <w:szCs w:val="22"/>
-        </w:rPr>
-        <w:t xml:space="preserve">     </w:t>
-      </w:r>
-      <w:r>
-        <w:rPr>
-          <w:rFonts w:ascii="Garamond" w:hAnsi="Garamond"/>
-          <w:b/>
-          <w:bCs/>
-          <w:sz w:val="22"/>
-          <w:szCs w:val="22"/>
-        </w:rPr>
-        <w:t xml:space="preserve">December 2025 – </w:t>
-      </w:r>
-      <w:r>
-        <w:rPr>
-          <w:rFonts w:ascii="Garamond" w:hAnsi="Garamond"/>
-          <w:b/>
-          <w:bCs/>
-          <w:sz w:val="22"/>
-          <w:szCs w:val="22"/>
-        </w:rPr>
-        <w:t>August</w:t>
-      </w:r>
-      <w:r>
-        <w:rPr>
-          <w:rFonts w:ascii="Garamond" w:hAnsi="Garamond"/>
-          <w:b/>
-          <w:bCs/>
-          <w:sz w:val="22"/>
-          <w:szCs w:val="22"/>
-        </w:rPr>
-        <w:t xml:space="preserve"> 202</w:t>
-      </w:r>
-      <w:r>
-        <w:rPr>
-          <w:rFonts w:ascii="Garamond" w:hAnsi="Garamond"/>
-          <w:b/>
-          <w:bCs/>
-          <w:sz w:val="22"/>
-          <w:szCs w:val="22"/>
-        </w:rPr>
-        <w:t>9</w:t>
-      </w:r>
-    </w:p>
-    <w:p>
-      <w:pPr>
-        <w:pStyle w:val="Default"/>
-        <w:rPr>
-          <w:rFonts w:ascii="Garamond" w:hAnsi="Garamond"/>
-          <w:b/>
-          <w:bCs/>
-          <w:color w:val="auto"/>
-          <w:sz w:val="18"/>
-          <w:szCs w:val="22"/>
-        </w:rPr>
-      </w:pPr>
-      <w:r>
-        <w:rPr>
-          <w:rFonts w:ascii="Garamond" w:hAnsi="Garamond"/>
-          <w:b/>
-          <w:bCs/>
-          <w:color w:val="auto"/>
-          <w:sz w:val="22"/>
-          <w:szCs w:val="22"/>
-        </w:rPr>
-        <w:t xml:space="preserve">CompTIA A+                                                                                                                        </w:t>
-      </w:r>
-      <w:r>
-        <w:rPr>
-          <w:rFonts w:ascii="Garamond" w:hAnsi="Garamond"/>
-          <w:b/>
-          <w:bCs/>
-          <w:color w:val="auto"/>
-          <w:sz w:val="22"/>
-          <w:szCs w:val="22"/>
-        </w:rPr>
-        <w:t xml:space="preserve">    </w:t>
-      </w:r>
-      <w:r>
-        <w:rPr>
-          <w:rFonts w:ascii="Garamond" w:hAnsi="Garamond"/>
-          <w:b/>
-          <w:bCs/>
-          <w:color w:val="auto"/>
-          <w:sz w:val="22"/>
-          <w:szCs w:val="22"/>
-        </w:rPr>
-        <w:t xml:space="preserve">February 2025 – </w:t>
-      </w:r>
-      <w:r>
-        <w:rPr>
-          <w:rFonts w:ascii="Garamond" w:hAnsi="Garamond"/>
-          <w:b/>
-          <w:bCs/>
-          <w:sz w:val="22"/>
-          <w:szCs w:val="22"/>
-        </w:rPr>
-        <w:t>August</w:t>
-      </w:r>
-      <w:r>
-        <w:rPr>
-          <w:rFonts w:ascii="Garamond" w:hAnsi="Garamond"/>
-          <w:b/>
-          <w:bCs/>
-          <w:sz w:val="22"/>
-          <w:szCs w:val="22"/>
-        </w:rPr>
-        <w:t xml:space="preserve"> 202</w:t>
-      </w:r>
-      <w:r>
-        <w:rPr>
-          <w:rFonts w:ascii="Garamond" w:hAnsi="Garamond"/>
-          <w:b/>
-          <w:bCs/>
-          <w:sz w:val="22"/>
-          <w:szCs w:val="22"/>
-        </w:rPr>
-        <w:t>9</w:t>
-      </w:r>
-    </w:p>
-    <w:p>
-      <w:pPr>
-        <w:pStyle w:val="Default"/>
-        <w:rPr>
-          <w:rFonts w:ascii="Garamond" w:hAnsi="Garamond"/>
-          <w:color w:val="auto"/>
-          <w:sz w:val="22"/>
-          <w:szCs w:val="28"/>
+          <w:sz w:val="22"/>
+          <w:szCs w:val="22"/>
         </w:rPr>
       </w:pPr>
     </w:p>
@@ -1604,6 +1097,585 @@
         </w:pBdr>
         <w:rPr>
           <w:rFonts w:ascii="Garamond" w:hAnsi="Garamond"/>
+          <w:sz w:val="22"/>
+          <w:szCs w:val="22"/>
+        </w:rPr>
+      </w:pPr>
+    </w:p>
+    <w:p>
+      <w:pPr>
+        <w:pStyle w:val="Default"/>
+        <w:pBdr>
+          <w:bottom w:val="single" w:sz="6" w:space="1" w:color="auto"/>
+        </w:pBdr>
+        <w:rPr>
+          <w:rFonts w:ascii="Garamond" w:hAnsi="Garamond"/>
+          <w:b/>
+          <w:bCs/>
+          <w:color w:val="auto"/>
+          <w:sz w:val="28"/>
+          <w:szCs w:val="28"/>
+        </w:rPr>
+      </w:pPr>
+      <w:r>
+        <w:rPr>
+          <w:rFonts w:ascii="Garamond" w:hAnsi="Garamond"/>
+          <w:b/>
+          <w:bCs/>
+          <w:color w:val="auto"/>
+          <w:sz w:val="28"/>
+          <w:szCs w:val="28"/>
+        </w:rPr>
+        <w:t>CERTIFICATIONS</w:t>
+      </w:r>
+    </w:p>
+    <w:p>
+      <w:pPr>
+        <w:pStyle w:val="Default"/>
+        <w:rPr>
+          <w:rFonts w:ascii="Garamond" w:hAnsi="Garamond"/>
+          <w:b/>
+          <w:bCs/>
+          <w:color w:val="auto"/>
+          <w:sz w:val="18"/>
+          <w:szCs w:val="22"/>
+        </w:rPr>
+      </w:pPr>
+      <w:r>
+        <w:rPr>
+          <w:rFonts w:ascii="Garamond" w:hAnsi="Garamond"/>
+          <w:b/>
+          <w:bCs/>
+          <w:sz w:val="22"/>
+          <w:szCs w:val="22"/>
+        </w:rPr>
+        <w:t xml:space="preserve">CompTIA </w:t>
+      </w:r>
+      <w:r>
+        <w:rPr>
+          <w:rFonts w:ascii="Garamond" w:hAnsi="Garamond"/>
+          <w:b/>
+          <w:bCs/>
+          <w:sz w:val="22"/>
+          <w:szCs w:val="22"/>
+        </w:rPr>
+        <w:t>Security</w:t>
+      </w:r>
+      <w:r>
+        <w:rPr>
+          <w:rFonts w:ascii="Garamond" w:hAnsi="Garamond"/>
+          <w:b/>
+          <w:bCs/>
+          <w:sz w:val="22"/>
+          <w:szCs w:val="22"/>
+        </w:rPr>
+        <w:t>+</w:t>
+      </w:r>
+      <w:r>
+        <w:rPr>
+          <w:rFonts w:ascii="Garamond" w:hAnsi="Garamond"/>
+          <w:b/>
+          <w:bCs/>
+          <w:sz w:val="22"/>
+          <w:szCs w:val="22"/>
+        </w:rPr>
+        <w:tab/>
+      </w:r>
+      <w:r>
+        <w:rPr>
+          <w:rFonts w:ascii="Garamond" w:hAnsi="Garamond"/>
+          <w:b/>
+          <w:bCs/>
+          <w:sz w:val="22"/>
+          <w:szCs w:val="22"/>
+        </w:rPr>
+        <w:tab/>
+      </w:r>
+      <w:r>
+        <w:rPr>
+          <w:rFonts w:ascii="Garamond" w:hAnsi="Garamond"/>
+          <w:b/>
+          <w:bCs/>
+          <w:sz w:val="22"/>
+          <w:szCs w:val="22"/>
+        </w:rPr>
+        <w:t xml:space="preserve">             </w:t>
+      </w:r>
+      <w:r>
+        <w:rPr>
+          <w:rFonts w:ascii="Garamond" w:hAnsi="Garamond"/>
+          <w:b/>
+          <w:bCs/>
+          <w:sz w:val="22"/>
+          <w:szCs w:val="22"/>
+        </w:rPr>
+        <w:tab/>
+      </w:r>
+      <w:r>
+        <w:rPr>
+          <w:rFonts w:ascii="Garamond" w:hAnsi="Garamond"/>
+          <w:b/>
+          <w:bCs/>
+          <w:sz w:val="22"/>
+          <w:szCs w:val="22"/>
+        </w:rPr>
+        <w:tab/>
+      </w:r>
+      <w:r>
+        <w:rPr>
+          <w:rFonts w:ascii="Garamond" w:hAnsi="Garamond"/>
+          <w:b/>
+          <w:bCs/>
+          <w:sz w:val="22"/>
+          <w:szCs w:val="22"/>
+        </w:rPr>
+        <w:tab/>
+      </w:r>
+      <w:r>
+        <w:rPr>
+          <w:rFonts w:ascii="Garamond" w:hAnsi="Garamond"/>
+          <w:b/>
+          <w:bCs/>
+          <w:sz w:val="22"/>
+          <w:szCs w:val="22"/>
+        </w:rPr>
+        <w:tab/>
+      </w:r>
+      <w:r>
+        <w:rPr>
+          <w:rFonts w:ascii="Garamond" w:hAnsi="Garamond"/>
+          <w:b/>
+          <w:bCs/>
+          <w:sz w:val="22"/>
+          <w:szCs w:val="22"/>
+        </w:rPr>
+        <w:tab/>
+        <w:t xml:space="preserve">                      </w:t>
+      </w:r>
+      <w:r>
+        <w:rPr>
+          <w:rFonts w:ascii="Garamond" w:hAnsi="Garamond"/>
+          <w:b/>
+          <w:bCs/>
+          <w:sz w:val="22"/>
+          <w:szCs w:val="22"/>
+        </w:rPr>
+        <w:t xml:space="preserve">           August</w:t>
+      </w:r>
+      <w:r>
+        <w:rPr>
+          <w:rFonts w:ascii="Garamond" w:hAnsi="Garamond"/>
+          <w:b/>
+          <w:bCs/>
+          <w:sz w:val="22"/>
+          <w:szCs w:val="22"/>
+        </w:rPr>
+        <w:t xml:space="preserve"> 202</w:t>
+      </w:r>
+      <w:r>
+        <w:rPr>
+          <w:rFonts w:ascii="Garamond" w:hAnsi="Garamond"/>
+          <w:b/>
+          <w:bCs/>
+          <w:sz w:val="22"/>
+          <w:szCs w:val="22"/>
+        </w:rPr>
+        <w:t>6</w:t>
+      </w:r>
+      <w:r>
+        <w:rPr>
+          <w:rFonts w:ascii="Garamond" w:hAnsi="Garamond"/>
+          <w:b/>
+          <w:bCs/>
+          <w:sz w:val="22"/>
+          <w:szCs w:val="22"/>
+        </w:rPr>
+        <w:t xml:space="preserve"> – </w:t>
+      </w:r>
+      <w:r>
+        <w:rPr>
+          <w:rFonts w:ascii="Garamond" w:hAnsi="Garamond"/>
+          <w:b/>
+          <w:bCs/>
+          <w:sz w:val="22"/>
+          <w:szCs w:val="22"/>
+        </w:rPr>
+        <w:t>August</w:t>
+      </w:r>
+      <w:r>
+        <w:rPr>
+          <w:rFonts w:ascii="Garamond" w:hAnsi="Garamond"/>
+          <w:b/>
+          <w:bCs/>
+          <w:sz w:val="22"/>
+          <w:szCs w:val="22"/>
+        </w:rPr>
+        <w:t xml:space="preserve"> 202</w:t>
+      </w:r>
+      <w:r>
+        <w:rPr>
+          <w:rFonts w:ascii="Garamond" w:hAnsi="Garamond"/>
+          <w:b/>
+          <w:bCs/>
+          <w:sz w:val="22"/>
+          <w:szCs w:val="22"/>
+        </w:rPr>
+        <w:t>9</w:t>
+      </w:r>
+    </w:p>
+    <w:p>
+      <w:pPr>
+        <w:pStyle w:val="Default"/>
+        <w:spacing w:after="3"/>
+        <w:jc w:val="both"/>
+        <w:rPr>
+          <w:rFonts w:ascii="Garamond" w:hAnsi="Garamond"/>
+          <w:b/>
+          <w:bCs/>
+          <w:color w:val="auto"/>
+          <w:sz w:val="22"/>
+          <w:szCs w:val="22"/>
+        </w:rPr>
+      </w:pPr>
+      <w:r>
+        <w:rPr>
+          <w:rFonts w:ascii="Garamond" w:hAnsi="Garamond"/>
+          <w:b/>
+          <w:bCs/>
+          <w:color w:val="auto"/>
+          <w:sz w:val="22"/>
+          <w:szCs w:val="22"/>
+        </w:rPr>
+        <w:t xml:space="preserve">IGEL Certified Professional </w:t>
+      </w:r>
+      <w:r>
+        <w:rPr>
+          <w:rFonts w:ascii="Garamond" w:hAnsi="Garamond"/>
+          <w:b/>
+          <w:bCs/>
+          <w:color w:val="auto"/>
+          <w:sz w:val="22"/>
+          <w:szCs w:val="22"/>
+        </w:rPr>
+        <w:tab/>
+      </w:r>
+      <w:r>
+        <w:rPr>
+          <w:rFonts w:ascii="Garamond" w:hAnsi="Garamond"/>
+          <w:b/>
+          <w:bCs/>
+          <w:color w:val="auto"/>
+          <w:sz w:val="22"/>
+          <w:szCs w:val="22"/>
+        </w:rPr>
+        <w:tab/>
+      </w:r>
+      <w:r>
+        <w:rPr>
+          <w:rFonts w:ascii="Garamond" w:hAnsi="Garamond"/>
+          <w:b/>
+          <w:bCs/>
+          <w:color w:val="auto"/>
+          <w:sz w:val="22"/>
+          <w:szCs w:val="22"/>
+        </w:rPr>
+        <w:tab/>
+      </w:r>
+      <w:r>
+        <w:rPr>
+          <w:rFonts w:ascii="Garamond" w:hAnsi="Garamond"/>
+          <w:b/>
+          <w:bCs/>
+          <w:color w:val="auto"/>
+          <w:sz w:val="22"/>
+          <w:szCs w:val="22"/>
+        </w:rPr>
+        <w:tab/>
+      </w:r>
+      <w:r>
+        <w:rPr>
+          <w:rFonts w:ascii="Garamond" w:hAnsi="Garamond"/>
+          <w:b/>
+          <w:bCs/>
+          <w:color w:val="auto"/>
+          <w:sz w:val="22"/>
+          <w:szCs w:val="22"/>
+        </w:rPr>
+        <w:tab/>
+      </w:r>
+      <w:r>
+        <w:rPr>
+          <w:rFonts w:ascii="Garamond" w:hAnsi="Garamond"/>
+          <w:b/>
+          <w:bCs/>
+          <w:color w:val="auto"/>
+          <w:sz w:val="22"/>
+          <w:szCs w:val="22"/>
+        </w:rPr>
+        <w:tab/>
+        <w:t xml:space="preserve">                       </w:t>
+      </w:r>
+      <w:r>
+        <w:rPr>
+          <w:rFonts w:ascii="Garamond" w:hAnsi="Garamond"/>
+          <w:b/>
+          <w:bCs/>
+          <w:sz w:val="22"/>
+          <w:szCs w:val="22"/>
+        </w:rPr>
+        <w:t>December 2025 – December 2027</w:t>
+      </w:r>
+    </w:p>
+    <w:p>
+      <w:pPr>
+        <w:pStyle w:val="Default"/>
+        <w:rPr>
+          <w:rFonts w:ascii="Garamond" w:hAnsi="Garamond"/>
+          <w:b/>
+          <w:bCs/>
+          <w:color w:val="auto"/>
+          <w:sz w:val="18"/>
+          <w:szCs w:val="22"/>
+        </w:rPr>
+      </w:pPr>
+      <w:r>
+        <w:rPr>
+          <w:rFonts w:ascii="Garamond" w:hAnsi="Garamond"/>
+          <w:b/>
+          <w:bCs/>
+          <w:sz w:val="22"/>
+          <w:szCs w:val="22"/>
+        </w:rPr>
+        <w:t>CompTIA Network+</w:t>
+      </w:r>
+      <w:r>
+        <w:rPr>
+          <w:rFonts w:ascii="Garamond" w:hAnsi="Garamond"/>
+          <w:b/>
+          <w:bCs/>
+          <w:sz w:val="22"/>
+          <w:szCs w:val="22"/>
+        </w:rPr>
+        <w:tab/>
+      </w:r>
+      <w:r>
+        <w:rPr>
+          <w:rFonts w:ascii="Garamond" w:hAnsi="Garamond"/>
+          <w:b/>
+          <w:bCs/>
+          <w:sz w:val="22"/>
+          <w:szCs w:val="22"/>
+        </w:rPr>
+        <w:tab/>
+      </w:r>
+      <w:r>
+        <w:rPr>
+          <w:rFonts w:ascii="Garamond" w:hAnsi="Garamond"/>
+          <w:b/>
+          <w:bCs/>
+          <w:sz w:val="22"/>
+          <w:szCs w:val="22"/>
+        </w:rPr>
+        <w:tab/>
+      </w:r>
+      <w:r>
+        <w:rPr>
+          <w:rFonts w:ascii="Garamond" w:hAnsi="Garamond"/>
+          <w:b/>
+          <w:bCs/>
+          <w:sz w:val="22"/>
+          <w:szCs w:val="22"/>
+        </w:rPr>
+        <w:tab/>
+      </w:r>
+      <w:r>
+        <w:rPr>
+          <w:rFonts w:ascii="Garamond" w:hAnsi="Garamond"/>
+          <w:b/>
+          <w:bCs/>
+          <w:sz w:val="22"/>
+          <w:szCs w:val="22"/>
+        </w:rPr>
+        <w:tab/>
+      </w:r>
+      <w:r>
+        <w:rPr>
+          <w:rFonts w:ascii="Garamond" w:hAnsi="Garamond"/>
+          <w:b/>
+          <w:bCs/>
+          <w:sz w:val="22"/>
+          <w:szCs w:val="22"/>
+        </w:rPr>
+        <w:tab/>
+      </w:r>
+      <w:r>
+        <w:rPr>
+          <w:rFonts w:ascii="Garamond" w:hAnsi="Garamond"/>
+          <w:b/>
+          <w:bCs/>
+          <w:sz w:val="22"/>
+          <w:szCs w:val="22"/>
+        </w:rPr>
+        <w:tab/>
+        <w:t xml:space="preserve">                      </w:t>
+      </w:r>
+      <w:r>
+        <w:rPr>
+          <w:rFonts w:ascii="Garamond" w:hAnsi="Garamond"/>
+          <w:b/>
+          <w:bCs/>
+          <w:sz w:val="22"/>
+          <w:szCs w:val="22"/>
+        </w:rPr>
+        <w:t xml:space="preserve">     </w:t>
+      </w:r>
+      <w:r>
+        <w:rPr>
+          <w:rFonts w:ascii="Garamond" w:hAnsi="Garamond"/>
+          <w:b/>
+          <w:bCs/>
+          <w:sz w:val="22"/>
+          <w:szCs w:val="22"/>
+        </w:rPr>
+        <w:t xml:space="preserve">December 2025 – </w:t>
+      </w:r>
+      <w:r>
+        <w:rPr>
+          <w:rFonts w:ascii="Garamond" w:hAnsi="Garamond"/>
+          <w:b/>
+          <w:bCs/>
+          <w:sz w:val="22"/>
+          <w:szCs w:val="22"/>
+        </w:rPr>
+        <w:t>August</w:t>
+      </w:r>
+      <w:r>
+        <w:rPr>
+          <w:rFonts w:ascii="Garamond" w:hAnsi="Garamond"/>
+          <w:b/>
+          <w:bCs/>
+          <w:sz w:val="22"/>
+          <w:szCs w:val="22"/>
+        </w:rPr>
+        <w:t xml:space="preserve"> 202</w:t>
+      </w:r>
+      <w:r>
+        <w:rPr>
+          <w:rFonts w:ascii="Garamond" w:hAnsi="Garamond"/>
+          <w:b/>
+          <w:bCs/>
+          <w:sz w:val="22"/>
+          <w:szCs w:val="22"/>
+        </w:rPr>
+        <w:t>9</w:t>
+      </w:r>
+    </w:p>
+    <w:p>
+      <w:pPr>
+        <w:pStyle w:val="Default"/>
+        <w:rPr>
+          <w:rFonts w:ascii="Garamond" w:hAnsi="Garamond"/>
+          <w:b/>
+          <w:bCs/>
+          <w:color w:val="auto"/>
+          <w:sz w:val="18"/>
+          <w:szCs w:val="22"/>
+        </w:rPr>
+      </w:pPr>
+      <w:r>
+        <w:rPr>
+          <w:rFonts w:ascii="Garamond" w:hAnsi="Garamond"/>
+          <w:b/>
+          <w:bCs/>
+          <w:color w:val="auto"/>
+          <w:sz w:val="22"/>
+          <w:szCs w:val="22"/>
+        </w:rPr>
+        <w:t xml:space="preserve">CompTIA A+                                                                                                                        </w:t>
+      </w:r>
+      <w:r>
+        <w:rPr>
+          <w:rFonts w:ascii="Garamond" w:hAnsi="Garamond"/>
+          <w:b/>
+          <w:bCs/>
+          <w:color w:val="auto"/>
+          <w:sz w:val="22"/>
+          <w:szCs w:val="22"/>
+        </w:rPr>
+        <w:t xml:space="preserve">    </w:t>
+      </w:r>
+      <w:r>
+        <w:rPr>
+          <w:rFonts w:ascii="Garamond" w:hAnsi="Garamond"/>
+          <w:b/>
+          <w:bCs/>
+          <w:color w:val="auto"/>
+          <w:sz w:val="22"/>
+          <w:szCs w:val="22"/>
+        </w:rPr>
+        <w:t xml:space="preserve">February 2025 – </w:t>
+      </w:r>
+      <w:r>
+        <w:rPr>
+          <w:rFonts w:ascii="Garamond" w:hAnsi="Garamond"/>
+          <w:b/>
+          <w:bCs/>
+          <w:sz w:val="22"/>
+          <w:szCs w:val="22"/>
+        </w:rPr>
+        <w:t>August</w:t>
+      </w:r>
+      <w:r>
+        <w:rPr>
+          <w:rFonts w:ascii="Garamond" w:hAnsi="Garamond"/>
+          <w:b/>
+          <w:bCs/>
+          <w:sz w:val="22"/>
+          <w:szCs w:val="22"/>
+        </w:rPr>
+        <w:t xml:space="preserve"> 202</w:t>
+      </w:r>
+      <w:r>
+        <w:rPr>
+          <w:rFonts w:ascii="Garamond" w:hAnsi="Garamond"/>
+          <w:b/>
+          <w:bCs/>
+          <w:sz w:val="22"/>
+          <w:szCs w:val="22"/>
+        </w:rPr>
+        <w:t>9</w:t>
+      </w:r>
+    </w:p>
+    <w:p>
+      <w:pPr>
+        <w:pStyle w:val="Default"/>
+        <w:rPr>
+          <w:rFonts w:ascii="Garamond" w:hAnsi="Garamond"/>
+          <w:color w:val="auto"/>
+          <w:sz w:val="22"/>
+          <w:szCs w:val="28"/>
+        </w:rPr>
+      </w:pPr>
+    </w:p>
+    <w:p>
+      <w:pPr>
+        <w:pStyle w:val="Default"/>
+        <w:rPr>
+          <w:rFonts w:ascii="Garamond" w:hAnsi="Garamond"/>
+          <w:color w:val="auto"/>
+          <w:sz w:val="22"/>
+          <w:szCs w:val="28"/>
+        </w:rPr>
+      </w:pPr>
+    </w:p>
+    <w:p>
+      <w:pPr>
+        <w:pStyle w:val="Default"/>
+        <w:pBdr>
+          <w:bottom w:val="single" w:sz="6" w:space="1" w:color="auto"/>
+        </w:pBdr>
+        <w:rPr>
+          <w:rFonts w:ascii="Garamond" w:hAnsi="Garamond"/>
           <w:color w:val="auto"/>
           <w:sz w:val="28"/>
           <w:szCs w:val="28"/>
@@ -1941,6 +2013,16 @@
     <w:p>
       <w:pPr>
         <w:pStyle w:val="Default"/>
+        <w:rPr>
+          <w:rFonts w:ascii="Garamond" w:hAnsi="Garamond"/>
+          <w:sz w:val="22"/>
+          <w:szCs w:val="22"/>
+        </w:rPr>
+      </w:pPr>
+    </w:p>
+    <w:p>
+      <w:pPr>
+        <w:pStyle w:val="Default"/>
         <w:pBdr>
           <w:bottom w:val="single" w:sz="6" w:space="1" w:color="auto"/>
         </w:pBdr>
@@ -2026,82 +2108,34 @@
     <w:p>
       <w:pPr>
         <w:pStyle w:val="Default"/>
-        <w:spacing w:after="3"/>
-        <w:jc w:val="both"/>
-        <w:rPr>
-          <w:rFonts w:ascii="Garamond" w:hAnsi="Garamond"/>
-          <w:color w:val="auto"/>
-          <w:sz w:val="22"/>
-          <w:szCs w:val="22"/>
-        </w:rPr>
-      </w:pPr>
-      <w:r>
-        <w:rPr>
-          <w:rFonts w:ascii="Garamond" w:hAnsi="Garamond"/>
-          <w:b/>
-          <w:bCs/>
-          <w:color w:val="auto"/>
-          <w:sz w:val="22"/>
-          <w:szCs w:val="22"/>
-        </w:rPr>
-        <w:t>Soft Skills:</w:t>
-      </w:r>
-      <w:r>
-        <w:rPr>
-          <w:rFonts w:ascii="Garamond" w:hAnsi="Garamond"/>
-          <w:bCs/>
-          <w:color w:val="auto"/>
-          <w:sz w:val="22"/>
-          <w:szCs w:val="22"/>
-        </w:rPr>
-        <w:t xml:space="preserve"> Time Management, Teamwork, Collaboration, Communication, Customer Service, Adaptability, Problem-Solving, Attention to Detail, Self-Motivation, Analytical Thinking</w:t>
+        <w:rPr>
+          <w:rFonts w:ascii="Garamond" w:hAnsi="Garamond"/>
+          <w:color w:val="auto"/>
+          <w:sz w:val="22"/>
+          <w:szCs w:val="22"/>
+        </w:rPr>
+      </w:pPr>
+      <w:r>
+        <w:rPr>
+          <w:rFonts w:ascii="Garamond" w:hAnsi="Garamond"/>
+          <w:b/>
+          <w:bCs/>
+          <w:color w:val="auto"/>
+          <w:sz w:val="22"/>
+          <w:szCs w:val="22"/>
+        </w:rPr>
+        <w:t xml:space="preserve">Interests: </w:t>
+      </w:r>
+      <w:r>
+        <w:rPr>
+          <w:rFonts w:ascii="Garamond" w:hAnsi="Garamond"/>
+          <w:color w:val="auto"/>
+          <w:sz w:val="22"/>
+          <w:szCs w:val="22"/>
+        </w:rPr>
+        <w:t>Gaming, Tech, Web, Reading, Running, Hiking, Meditation</w:t>
       </w:r>
     </w:p>
-    <w:p>
-      <w:pPr>
-        <w:pStyle w:val="Default"/>
-        <w:spacing w:after="3"/>
-        <w:jc w:val="both"/>
-        <w:rPr>
-          <w:rFonts w:ascii="Garamond" w:hAnsi="Garamond"/>
-          <w:color w:val="auto"/>
-          <w:sz w:val="22"/>
-          <w:szCs w:val="22"/>
-        </w:rPr>
-      </w:pPr>
-    </w:p>
-    <w:p>
-      <w:pPr>
-        <w:pStyle w:val="Default"/>
-        <w:rPr>
-          <w:rFonts w:ascii="Garamond" w:hAnsi="Garamond"/>
-          <w:color w:val="auto"/>
-          <w:sz w:val="22"/>
-          <w:szCs w:val="22"/>
-        </w:rPr>
-      </w:pPr>
-      <w:r>
-        <w:rPr>
-          <w:rFonts w:ascii="Garamond" w:hAnsi="Garamond"/>
-          <w:b/>
-          <w:bCs/>
-          <w:color w:val="auto"/>
-          <w:sz w:val="22"/>
-          <w:szCs w:val="22"/>
-        </w:rPr>
-        <w:t xml:space="preserve">Interests: </w:t>
-      </w:r>
-      <w:r>
-        <w:rPr>
-          <w:rFonts w:ascii="Garamond" w:hAnsi="Garamond"/>
-          <w:color w:val="auto"/>
-          <w:sz w:val="22"/>
-          <w:szCs w:val="22"/>
-        </w:rPr>
-        <w:t>Gaming, Tech, Web, Reading, Running, Hiking, Meditation</w:t>
-      </w:r>
-    </w:p>
-    <w:p/>
     <w:sectPr>
       <w:pgSz w:w="12240" w:h="15840"/>
       <w:pgMar w:top="432" w:right="720" w:bottom="432" w:left="720" w:header="720" w:footer="346" w:gutter="0"/>

</xml_diff>